<commit_message>
feat: implementar listado de Pokémon utilizando Stored Procedure y GridView personalizado.
- Creación de Stored Procedure (SP_ListarPokemons) en SQL Server para optimizar y encapsular la consulta relacional.
- Actualización de la clase Acceso_a_datos para soportar la ejecución mediante CommandType.StoredProcedure.
- Creación del método ObtenerPokemonesConSP en PokemonNegocio, implementando instanciación previa de objetos complejos y mapeo seguro por nombre de columna.
- Desarrollo de la vista PokemonLista.aspx utilizando el control GridView con AutoGenerateColumns="false".
- Configuración de BoundField en el front-end para renderizar correctamente propiedades de objetos anidados (Tipo.Descripcion y Debilidad.Descripcion).
- Resolución de conflictos de dependencias (DLL Hell) mediante la consolidación y sincronización de versiones del paquete Microsoft.Data.SqlClient en toda la solución.
</commit_message>
<xml_diff>
--- a/Unidad 5 - Pokedex Web/Documentación de Pokedex.docx
+++ b/Unidad 5 - Pokedex Web/Documentación de Pokedex.docx
@@ -140,6 +140,306 @@
       </w:r>
     </w:p>
     <w:p/>
+    <w:p>
+      <w:r>
+        <w:rPr>
+          <w:b/>
+          <w:bCs/>
+        </w:rPr>
+        <w:t>TEMA: Organización de la Interfaz en ASP.NET con Master Pages</w:t>
+      </w:r>
+    </w:p>
+    <w:p>
+      <w:pPr>
+        <w:numPr>
+          <w:ilvl w:val="0"/>
+          <w:numId w:val="2"/>
+        </w:numPr>
+      </w:pPr>
+      <w:r>
+        <w:rPr>
+          <w:b/>
+          <w:bCs/>
+        </w:rPr>
+        <w:t>Concepto de Master Page:</w:t>
+      </w:r>
+      <w:r>
+        <w:t xml:space="preserve"> Es un archivo de plantilla que permite definir una estructura común (</w:t>
+      </w:r>
+      <w:proofErr w:type="spellStart"/>
+      <w:r>
+        <w:t>Header</w:t>
+      </w:r>
+      <w:proofErr w:type="spellEnd"/>
+      <w:r>
+        <w:t xml:space="preserve">, </w:t>
+      </w:r>
+      <w:proofErr w:type="spellStart"/>
+      <w:r>
+        <w:t>Footer</w:t>
+      </w:r>
+      <w:proofErr w:type="spellEnd"/>
+      <w:r>
+        <w:t xml:space="preserve">, </w:t>
+      </w:r>
+      <w:proofErr w:type="spellStart"/>
+      <w:r>
+        <w:t>Nav</w:t>
+      </w:r>
+      <w:proofErr w:type="spellEnd"/>
+      <w:r>
+        <w:t>) para todas las páginas del sitio, evitando la duplicación de código HTML.</w:t>
+      </w:r>
+    </w:p>
+    <w:p>
+      <w:pPr>
+        <w:numPr>
+          <w:ilvl w:val="0"/>
+          <w:numId w:val="2"/>
+        </w:numPr>
+      </w:pPr>
+      <w:proofErr w:type="spellStart"/>
+      <w:r>
+        <w:rPr>
+          <w:b/>
+          <w:bCs/>
+        </w:rPr>
+        <w:t>ContentPlaceHolder</w:t>
+      </w:r>
+      <w:proofErr w:type="spellEnd"/>
+      <w:r>
+        <w:rPr>
+          <w:b/>
+          <w:bCs/>
+        </w:rPr>
+        <w:t>:</w:t>
+      </w:r>
+      <w:r>
+        <w:t xml:space="preserve"> Son los "espacios reservados" dentro de la Master Page donde se renderizará el contenido específico de cada página hija (Default.aspx, PokemonLista.aspx, etc.).</w:t>
+      </w:r>
+    </w:p>
+    <w:p>
+      <w:pPr>
+        <w:numPr>
+          <w:ilvl w:val="0"/>
+          <w:numId w:val="2"/>
+        </w:numPr>
+      </w:pPr>
+      <w:r>
+        <w:rPr>
+          <w:b/>
+          <w:bCs/>
+        </w:rPr>
+        <w:t xml:space="preserve">Integración de </w:t>
+      </w:r>
+      <w:proofErr w:type="spellStart"/>
+      <w:r>
+        <w:rPr>
+          <w:b/>
+          <w:bCs/>
+        </w:rPr>
+        <w:t>Frameworks</w:t>
+      </w:r>
+      <w:proofErr w:type="spellEnd"/>
+      <w:r>
+        <w:rPr>
+          <w:b/>
+          <w:bCs/>
+        </w:rPr>
+        <w:t xml:space="preserve"> (Bootstrap):</w:t>
+      </w:r>
+      <w:r>
+        <w:t xml:space="preserve"> Al referenciar Bootstrap en la Master Page, todas las páginas hijas heredan automáticamente los estilos, permitiendo un diseño responsivo y moderno de forma centralizada.</w:t>
+      </w:r>
+    </w:p>
+    <w:p>
+      <w:pPr>
+        <w:numPr>
+          <w:ilvl w:val="0"/>
+          <w:numId w:val="2"/>
+        </w:numPr>
+      </w:pPr>
+      <w:r>
+        <w:rPr>
+          <w:b/>
+          <w:bCs/>
+        </w:rPr>
+        <w:t>Separación de Responsabilidades:</w:t>
+      </w:r>
+      <w:r>
+        <w:t xml:space="preserve"> Mientras la Master Page se encarga del marco visual, las páginas hijas se enfocan exclusivamente en la funcionalidad o datos específicos de cada sección.</w:t>
+      </w:r>
+    </w:p>
+    <w:p>
+      <w:r>
+        <w:rPr>
+          <w:b/>
+          <w:bCs/>
+        </w:rPr>
+        <w:t xml:space="preserve">1. ¿Qué es un </w:t>
+      </w:r>
+      <w:proofErr w:type="spellStart"/>
+      <w:r>
+        <w:rPr>
+          <w:b/>
+          <w:bCs/>
+        </w:rPr>
+        <w:t>Stored</w:t>
+      </w:r>
+      <w:proofErr w:type="spellEnd"/>
+      <w:r>
+        <w:rPr>
+          <w:b/>
+          <w:bCs/>
+        </w:rPr>
+        <w:t xml:space="preserve"> </w:t>
+      </w:r>
+      <w:proofErr w:type="spellStart"/>
+      <w:r>
+        <w:rPr>
+          <w:b/>
+          <w:bCs/>
+        </w:rPr>
+        <w:t>Procedure</w:t>
+      </w:r>
+      <w:proofErr w:type="spellEnd"/>
+      <w:r>
+        <w:rPr>
+          <w:b/>
+          <w:bCs/>
+        </w:rPr>
+        <w:t xml:space="preserve"> (SP)?:</w:t>
+      </w:r>
+      <w:r>
+        <w:t xml:space="preserve"> Es una función o conjunto de instrucciones SQL </w:t>
+      </w:r>
+      <w:proofErr w:type="spellStart"/>
+      <w:r>
+        <w:t>precompiladas</w:t>
+      </w:r>
+      <w:proofErr w:type="spellEnd"/>
+      <w:r>
+        <w:t xml:space="preserve"> y guardadas directamente en el motor de la base de datos. Se invocan por su nombre y pueden recibir parámetros de entrada y devolver resultados.</w:t>
+      </w:r>
+    </w:p>
+    <w:p>
+      <w:r>
+        <w:rPr>
+          <w:b/>
+          <w:bCs/>
+        </w:rPr>
+        <w:t>2. Ventajas Arquitectónicas:</w:t>
+      </w:r>
+    </w:p>
+    <w:p>
+      <w:pPr>
+        <w:numPr>
+          <w:ilvl w:val="0"/>
+          <w:numId w:val="3"/>
+        </w:numPr>
+      </w:pPr>
+      <w:r>
+        <w:rPr>
+          <w:b/>
+          <w:bCs/>
+        </w:rPr>
+        <w:t>Mantenibilidad:</w:t>
+      </w:r>
+      <w:r>
+        <w:t xml:space="preserve"> Evita tener consultas SQL (SELECT, INSERT, UPDATE) "embebidas" (</w:t>
+      </w:r>
+      <w:proofErr w:type="spellStart"/>
+      <w:r>
+        <w:t>hardcodeadas</w:t>
+      </w:r>
+      <w:proofErr w:type="spellEnd"/>
+      <w:r>
+        <w:t xml:space="preserve">) como </w:t>
+      </w:r>
+      <w:proofErr w:type="spellStart"/>
+      <w:r>
+        <w:t>strings</w:t>
+      </w:r>
+      <w:proofErr w:type="spellEnd"/>
+      <w:r>
+        <w:t xml:space="preserve"> dentro del código C#. Si la consulta debe cambiar, se modifica directamente en la base de datos sin necesidad de recompilar y redesplegar la aplicación web.</w:t>
+      </w:r>
+    </w:p>
+    <w:p>
+      <w:pPr>
+        <w:numPr>
+          <w:ilvl w:val="0"/>
+          <w:numId w:val="3"/>
+        </w:numPr>
+      </w:pPr>
+      <w:proofErr w:type="spellStart"/>
+      <w:r>
+        <w:rPr>
+          <w:b/>
+          <w:bCs/>
+        </w:rPr>
+        <w:t>Testing</w:t>
+      </w:r>
+      <w:proofErr w:type="spellEnd"/>
+      <w:r>
+        <w:rPr>
+          <w:b/>
+          <w:bCs/>
+        </w:rPr>
+        <w:t xml:space="preserve"> Independiente:</w:t>
+      </w:r>
+      <w:r>
+        <w:t xml:space="preserve"> Permite probar la lógica de extracción de datos directamente en el motor SQL (ej. SSMS) antes de integrarlo a la aplicación.</w:t>
+      </w:r>
+    </w:p>
+    <w:p>
+      <w:r>
+        <w:rPr>
+          <w:b/>
+          <w:bCs/>
+        </w:rPr>
+        <w:t>3. Implementación en ADO.NET:</w:t>
+      </w:r>
+      <w:r>
+        <w:t xml:space="preserve"> Para ejecutar un SP desde C#, es imperativo cambiar la propiedad </w:t>
+      </w:r>
+      <w:proofErr w:type="spellStart"/>
+      <w:r>
+        <w:t>CommandType</w:t>
+      </w:r>
+      <w:proofErr w:type="spellEnd"/>
+      <w:r>
+        <w:t xml:space="preserve"> del objeto </w:t>
+      </w:r>
+      <w:proofErr w:type="spellStart"/>
+      <w:r>
+        <w:t>SqlCommand</w:t>
+      </w:r>
+      <w:proofErr w:type="spellEnd"/>
+      <w:r>
+        <w:t xml:space="preserve">. Su valor por defecto es Text (para consultas crudas), y debe </w:t>
+      </w:r>
+      <w:r>
+        <w:lastRenderedPageBreak/>
+        <w:t xml:space="preserve">cambiarse a </w:t>
+      </w:r>
+      <w:proofErr w:type="spellStart"/>
+      <w:r>
+        <w:t>CommandType.StoredProcedure</w:t>
+      </w:r>
+      <w:proofErr w:type="spellEnd"/>
+      <w:r>
+        <w:t xml:space="preserve"> para que el motor SQL interprete el </w:t>
+      </w:r>
+      <w:proofErr w:type="spellStart"/>
+      <w:r>
+        <w:t>CommandText</w:t>
+      </w:r>
+      <w:proofErr w:type="spellEnd"/>
+      <w:r>
+        <w:t xml:space="preserve"> como el nombre de un SP y no como una sintaxis inválida.</w:t>
+      </w:r>
+    </w:p>
     <w:p/>
     <w:p/>
     <w:p/>
@@ -156,6 +456,155 @@
 <file path=word/numbering.xml><?xml version="1.0" encoding="utf-8"?>
 <w:numbering xmlns:wpc="http://schemas.microsoft.com/office/word/2010/wordprocessingCanvas" xmlns:cx="http://schemas.microsoft.com/office/drawing/2014/chartex" xmlns:cx1="http://schemas.microsoft.com/office/drawing/2015/9/8/chartex" xmlns:cx2="http://schemas.microsoft.com/office/drawing/2015/10/21/chartex" xmlns:cx3="http://schemas.microsoft.com/office/drawing/2016/5/9/chartex" xmlns:cx4="http://schemas.microsoft.com/office/drawing/2016/5/10/chartex" xmlns:cx5="http://schemas.microsoft.com/office/drawing/2016/5/11/chartex" xmlns:cx6="http://schemas.microsoft.com/office/drawing/2016/5/12/chartex" xmlns:cx7="http://schemas.microsoft.com/office/drawing/2016/5/13/chartex" xmlns:cx8="http://schemas.microsoft.com/office/drawing/2016/5/14/chartex" xmlns:mc="http://schemas.openxmlformats.org/markup-compatibility/2006" xmlns:aink="http://schemas.microsoft.com/office/drawing/2016/ink" xmlns:am3d="http://schemas.microsoft.com/office/drawing/2017/model3d" xmlns:o="urn:schemas-microsoft-com:office:office" xmlns:oel="http://schemas.microsoft.com/office/2019/extlst" xmlns:r="http://schemas.openxmlformats.org/officeDocument/2006/relationships" xmlns:m="http://schemas.openxmlformats.org/officeDocument/2006/math" xmlns:v="urn:schemas-microsoft-com:vml" xmlns:wp14="http://schemas.microsoft.com/office/word/2010/wordprocessingDrawing" xmlns:wp="http://schemas.openxmlformats.org/drawingml/2006/wordprocessingDrawing" xmlns:w10="urn:schemas-microsoft-com:office:word" xmlns:w="http://schemas.openxmlformats.org/wordprocessingml/2006/main" xmlns:w14="http://schemas.microsoft.com/office/word/2010/wordml" xmlns:w15="http://schemas.microsoft.com/office/word/2012/wordml" xmlns:w16cex="http://schemas.microsoft.com/office/word/2018/wordml/cex" xmlns:w16cid="http://schemas.microsoft.com/office/word/2016/wordml/cid" xmlns:w16="http://schemas.microsoft.com/office/word/2018/wordml" xmlns:w16sdtdh="http://schemas.microsoft.com/office/word/2020/wordml/sdtdatahash" xmlns:w16se="http://schemas.microsoft.com/office/word/2015/wordml/symex" xmlns:wpg="http://schemas.microsoft.com/office/word/2010/wordprocessingGroup" xmlns:wpi="http://schemas.microsoft.com/office/word/2010/wordprocessingInk" xmlns:wne="http://schemas.microsoft.com/office/word/2006/wordml" xmlns:wps="http://schemas.microsoft.com/office/word/2010/wordprocessingShape" mc:Ignorable="w14 w15 w16se w16cid w16 w16cex w16sdtdh wp14">
   <w:abstractNum w:abstractNumId="0" w15:restartNumberingAfterBreak="0">
+    <w:nsid w:val="0ACD07DE"/>
+    <w:multiLevelType w:val="multilevel"/>
+    <w:tmpl w:val="DD209A82"/>
+    <w:lvl w:ilvl="0">
+      <w:start w:val="1"/>
+      <w:numFmt w:val="bullet"/>
+      <w:lvlText w:val=""/>
+      <w:lvlJc w:val="left"/>
+      <w:pPr>
+        <w:tabs>
+          <w:tab w:val="num" w:pos="720"/>
+        </w:tabs>
+        <w:ind w:left="720" w:hanging="360"/>
+      </w:pPr>
+      <w:rPr>
+        <w:rFonts w:ascii="Symbol" w:hAnsi="Symbol" w:hint="default"/>
+        <w:sz w:val="20"/>
+      </w:rPr>
+    </w:lvl>
+    <w:lvl w:ilvl="1" w:tentative="1">
+      <w:start w:val="1"/>
+      <w:numFmt w:val="bullet"/>
+      <w:lvlText w:val="o"/>
+      <w:lvlJc w:val="left"/>
+      <w:pPr>
+        <w:tabs>
+          <w:tab w:val="num" w:pos="1440"/>
+        </w:tabs>
+        <w:ind w:left="1440" w:hanging="360"/>
+      </w:pPr>
+      <w:rPr>
+        <w:rFonts w:ascii="Courier New" w:hAnsi="Courier New" w:hint="default"/>
+        <w:sz w:val="20"/>
+      </w:rPr>
+    </w:lvl>
+    <w:lvl w:ilvl="2" w:tentative="1">
+      <w:start w:val="1"/>
+      <w:numFmt w:val="bullet"/>
+      <w:lvlText w:val=""/>
+      <w:lvlJc w:val="left"/>
+      <w:pPr>
+        <w:tabs>
+          <w:tab w:val="num" w:pos="2160"/>
+        </w:tabs>
+        <w:ind w:left="2160" w:hanging="360"/>
+      </w:pPr>
+      <w:rPr>
+        <w:rFonts w:ascii="Wingdings" w:hAnsi="Wingdings" w:hint="default"/>
+        <w:sz w:val="20"/>
+      </w:rPr>
+    </w:lvl>
+    <w:lvl w:ilvl="3" w:tentative="1">
+      <w:start w:val="1"/>
+      <w:numFmt w:val="bullet"/>
+      <w:lvlText w:val=""/>
+      <w:lvlJc w:val="left"/>
+      <w:pPr>
+        <w:tabs>
+          <w:tab w:val="num" w:pos="2880"/>
+        </w:tabs>
+        <w:ind w:left="2880" w:hanging="360"/>
+      </w:pPr>
+      <w:rPr>
+        <w:rFonts w:ascii="Wingdings" w:hAnsi="Wingdings" w:hint="default"/>
+        <w:sz w:val="20"/>
+      </w:rPr>
+    </w:lvl>
+    <w:lvl w:ilvl="4" w:tentative="1">
+      <w:start w:val="1"/>
+      <w:numFmt w:val="bullet"/>
+      <w:lvlText w:val=""/>
+      <w:lvlJc w:val="left"/>
+      <w:pPr>
+        <w:tabs>
+          <w:tab w:val="num" w:pos="3600"/>
+        </w:tabs>
+        <w:ind w:left="3600" w:hanging="360"/>
+      </w:pPr>
+      <w:rPr>
+        <w:rFonts w:ascii="Wingdings" w:hAnsi="Wingdings" w:hint="default"/>
+        <w:sz w:val="20"/>
+      </w:rPr>
+    </w:lvl>
+    <w:lvl w:ilvl="5" w:tentative="1">
+      <w:start w:val="1"/>
+      <w:numFmt w:val="bullet"/>
+      <w:lvlText w:val=""/>
+      <w:lvlJc w:val="left"/>
+      <w:pPr>
+        <w:tabs>
+          <w:tab w:val="num" w:pos="4320"/>
+        </w:tabs>
+        <w:ind w:left="4320" w:hanging="360"/>
+      </w:pPr>
+      <w:rPr>
+        <w:rFonts w:ascii="Wingdings" w:hAnsi="Wingdings" w:hint="default"/>
+        <w:sz w:val="20"/>
+      </w:rPr>
+    </w:lvl>
+    <w:lvl w:ilvl="6" w:tentative="1">
+      <w:start w:val="1"/>
+      <w:numFmt w:val="bullet"/>
+      <w:lvlText w:val=""/>
+      <w:lvlJc w:val="left"/>
+      <w:pPr>
+        <w:tabs>
+          <w:tab w:val="num" w:pos="5040"/>
+        </w:tabs>
+        <w:ind w:left="5040" w:hanging="360"/>
+      </w:pPr>
+      <w:rPr>
+        <w:rFonts w:ascii="Wingdings" w:hAnsi="Wingdings" w:hint="default"/>
+        <w:sz w:val="20"/>
+      </w:rPr>
+    </w:lvl>
+    <w:lvl w:ilvl="7" w:tentative="1">
+      <w:start w:val="1"/>
+      <w:numFmt w:val="bullet"/>
+      <w:lvlText w:val=""/>
+      <w:lvlJc w:val="left"/>
+      <w:pPr>
+        <w:tabs>
+          <w:tab w:val="num" w:pos="5760"/>
+        </w:tabs>
+        <w:ind w:left="5760" w:hanging="360"/>
+      </w:pPr>
+      <w:rPr>
+        <w:rFonts w:ascii="Wingdings" w:hAnsi="Wingdings" w:hint="default"/>
+        <w:sz w:val="20"/>
+      </w:rPr>
+    </w:lvl>
+    <w:lvl w:ilvl="8" w:tentative="1">
+      <w:start w:val="1"/>
+      <w:numFmt w:val="bullet"/>
+      <w:lvlText w:val=""/>
+      <w:lvlJc w:val="left"/>
+      <w:pPr>
+        <w:tabs>
+          <w:tab w:val="num" w:pos="6480"/>
+        </w:tabs>
+        <w:ind w:left="6480" w:hanging="360"/>
+      </w:pPr>
+      <w:rPr>
+        <w:rFonts w:ascii="Wingdings" w:hAnsi="Wingdings" w:hint="default"/>
+        <w:sz w:val="20"/>
+      </w:rPr>
+    </w:lvl>
+  </w:abstractNum>
+  <w:abstractNum w:abstractNumId="1" w15:restartNumberingAfterBreak="0">
     <w:nsid w:val="3EC2497A"/>
     <w:multiLevelType w:val="multilevel"/>
     <w:tmpl w:val="038669AA"/>
@@ -304,8 +753,163 @@
       </w:rPr>
     </w:lvl>
   </w:abstractNum>
+  <w:abstractNum w:abstractNumId="2" w15:restartNumberingAfterBreak="0">
+    <w:nsid w:val="5D612526"/>
+    <w:multiLevelType w:val="multilevel"/>
+    <w:tmpl w:val="DB62DC76"/>
+    <w:lvl w:ilvl="0">
+      <w:start w:val="1"/>
+      <w:numFmt w:val="bullet"/>
+      <w:lvlText w:val=""/>
+      <w:lvlJc w:val="left"/>
+      <w:pPr>
+        <w:tabs>
+          <w:tab w:val="num" w:pos="720"/>
+        </w:tabs>
+        <w:ind w:left="720" w:hanging="360"/>
+      </w:pPr>
+      <w:rPr>
+        <w:rFonts w:ascii="Symbol" w:hAnsi="Symbol" w:hint="default"/>
+        <w:sz w:val="20"/>
+      </w:rPr>
+    </w:lvl>
+    <w:lvl w:ilvl="1" w:tentative="1">
+      <w:start w:val="1"/>
+      <w:numFmt w:val="bullet"/>
+      <w:lvlText w:val="o"/>
+      <w:lvlJc w:val="left"/>
+      <w:pPr>
+        <w:tabs>
+          <w:tab w:val="num" w:pos="1440"/>
+        </w:tabs>
+        <w:ind w:left="1440" w:hanging="360"/>
+      </w:pPr>
+      <w:rPr>
+        <w:rFonts w:ascii="Courier New" w:hAnsi="Courier New" w:hint="default"/>
+        <w:sz w:val="20"/>
+      </w:rPr>
+    </w:lvl>
+    <w:lvl w:ilvl="2" w:tentative="1">
+      <w:start w:val="1"/>
+      <w:numFmt w:val="bullet"/>
+      <w:lvlText w:val=""/>
+      <w:lvlJc w:val="left"/>
+      <w:pPr>
+        <w:tabs>
+          <w:tab w:val="num" w:pos="2160"/>
+        </w:tabs>
+        <w:ind w:left="2160" w:hanging="360"/>
+      </w:pPr>
+      <w:rPr>
+        <w:rFonts w:ascii="Wingdings" w:hAnsi="Wingdings" w:hint="default"/>
+        <w:sz w:val="20"/>
+      </w:rPr>
+    </w:lvl>
+    <w:lvl w:ilvl="3" w:tentative="1">
+      <w:start w:val="1"/>
+      <w:numFmt w:val="bullet"/>
+      <w:lvlText w:val=""/>
+      <w:lvlJc w:val="left"/>
+      <w:pPr>
+        <w:tabs>
+          <w:tab w:val="num" w:pos="2880"/>
+        </w:tabs>
+        <w:ind w:left="2880" w:hanging="360"/>
+      </w:pPr>
+      <w:rPr>
+        <w:rFonts w:ascii="Wingdings" w:hAnsi="Wingdings" w:hint="default"/>
+        <w:sz w:val="20"/>
+      </w:rPr>
+    </w:lvl>
+    <w:lvl w:ilvl="4" w:tentative="1">
+      <w:start w:val="1"/>
+      <w:numFmt w:val="bullet"/>
+      <w:lvlText w:val=""/>
+      <w:lvlJc w:val="left"/>
+      <w:pPr>
+        <w:tabs>
+          <w:tab w:val="num" w:pos="3600"/>
+        </w:tabs>
+        <w:ind w:left="3600" w:hanging="360"/>
+      </w:pPr>
+      <w:rPr>
+        <w:rFonts w:ascii="Wingdings" w:hAnsi="Wingdings" w:hint="default"/>
+        <w:sz w:val="20"/>
+      </w:rPr>
+    </w:lvl>
+    <w:lvl w:ilvl="5" w:tentative="1">
+      <w:start w:val="1"/>
+      <w:numFmt w:val="bullet"/>
+      <w:lvlText w:val=""/>
+      <w:lvlJc w:val="left"/>
+      <w:pPr>
+        <w:tabs>
+          <w:tab w:val="num" w:pos="4320"/>
+        </w:tabs>
+        <w:ind w:left="4320" w:hanging="360"/>
+      </w:pPr>
+      <w:rPr>
+        <w:rFonts w:ascii="Wingdings" w:hAnsi="Wingdings" w:hint="default"/>
+        <w:sz w:val="20"/>
+      </w:rPr>
+    </w:lvl>
+    <w:lvl w:ilvl="6" w:tentative="1">
+      <w:start w:val="1"/>
+      <w:numFmt w:val="bullet"/>
+      <w:lvlText w:val=""/>
+      <w:lvlJc w:val="left"/>
+      <w:pPr>
+        <w:tabs>
+          <w:tab w:val="num" w:pos="5040"/>
+        </w:tabs>
+        <w:ind w:left="5040" w:hanging="360"/>
+      </w:pPr>
+      <w:rPr>
+        <w:rFonts w:ascii="Wingdings" w:hAnsi="Wingdings" w:hint="default"/>
+        <w:sz w:val="20"/>
+      </w:rPr>
+    </w:lvl>
+    <w:lvl w:ilvl="7" w:tentative="1">
+      <w:start w:val="1"/>
+      <w:numFmt w:val="bullet"/>
+      <w:lvlText w:val=""/>
+      <w:lvlJc w:val="left"/>
+      <w:pPr>
+        <w:tabs>
+          <w:tab w:val="num" w:pos="5760"/>
+        </w:tabs>
+        <w:ind w:left="5760" w:hanging="360"/>
+      </w:pPr>
+      <w:rPr>
+        <w:rFonts w:ascii="Wingdings" w:hAnsi="Wingdings" w:hint="default"/>
+        <w:sz w:val="20"/>
+      </w:rPr>
+    </w:lvl>
+    <w:lvl w:ilvl="8" w:tentative="1">
+      <w:start w:val="1"/>
+      <w:numFmt w:val="bullet"/>
+      <w:lvlText w:val=""/>
+      <w:lvlJc w:val="left"/>
+      <w:pPr>
+        <w:tabs>
+          <w:tab w:val="num" w:pos="6480"/>
+        </w:tabs>
+        <w:ind w:left="6480" w:hanging="360"/>
+      </w:pPr>
+      <w:rPr>
+        <w:rFonts w:ascii="Wingdings" w:hAnsi="Wingdings" w:hint="default"/>
+        <w:sz w:val="20"/>
+      </w:rPr>
+    </w:lvl>
+  </w:abstractNum>
   <w:num w:numId="1" w16cid:durableId="340132085">
+    <w:abstractNumId w:val="1"/>
+  </w:num>
+  <w:num w:numId="2" w16cid:durableId="1890527785">
     <w:abstractNumId w:val="0"/>
+  </w:num>
+  <w:num w:numId="3" w16cid:durableId="564411841">
+    <w:abstractNumId w:val="2"/>
   </w:num>
 </w:numbering>
 </file>

</xml_diff>

<commit_message>
feat: implementar alta de Pokémon con Procedimiento Almacenado - Creación del Stored Procedure 'StoreAltaPokemon' en SQL Server para manejar la inserción segura de datos. - Desarrollo del método 'AgregarPokemonConSP' en la capa PokemonNegocio utilizando setearParametro() para evitar inyecciones SQL. - Implementación del evento btnAceptar_Click en PokemonForm.aspx.cs. - Mapeo manual de tipos de datos de la interfaz (texto) hacia la entidad Pokemon (int.Parse para números y relaciones). - Resolución de instanciación de objetos anidados (Tipo y Debilidad) para capturar los SelectedValue de los DropDownLists. - Integración de bloque try-catch-finally para el manejo de excepciones de base de datos y redirección segura hacia PokemonLista.aspx.
</commit_message>
<xml_diff>
--- a/Unidad 5 - Pokedex Web/Documentación de Pokedex.docx
+++ b/Unidad 5 - Pokedex Web/Documentación de Pokedex.docx
@@ -3070,13 +3070,7 @@
       </w:r>
       <w:proofErr w:type="spellEnd"/>
       <w:r>
-        <w:t xml:space="preserve"> para modificar datos directamente sobre las celdas de la </w:t>
-      </w:r>
-      <w:r>
-        <w:t>grilla.</w:t>
-      </w:r>
-      <w:r>
-        <w:t xml:space="preserve"> Sin embargo, a nivel arquitectónico y de UX, esta práctica se desaconseja para tablas con muchas columnas, ya que genera una interfaz similar a una hoja de cálculo de Excel, resultando tediosa y poco </w:t>
+        <w:t xml:space="preserve"> para modificar datos directamente sobre las celdas de la grilla. Sin embargo, a nivel arquitectónico y de UX, esta práctica se desaconseja para tablas con muchas columnas, ya que genera una interfaz similar a una hoja de cálculo de Excel, resultando tediosa y poco </w:t>
       </w:r>
       <w:proofErr w:type="gramStart"/>
       <w:r>
@@ -3123,10 +3117,7 @@
       </w:r>
       <w:proofErr w:type="spellEnd"/>
       <w:r>
-        <w:t xml:space="preserve">) a una vista de detalle dedicada (formulario) donde se expone la totalidad de los campos de manera </w:t>
-      </w:r>
-      <w:r>
-        <w:t>ordenada.</w:t>
+        <w:t>) a una vista de detalle dedicada (formulario) donde se expone la totalidad de los campos de manera ordenada.</w:t>
       </w:r>
     </w:p>
     <w:p>
@@ -3753,12 +3744,884 @@
       </w:r>
       <w:proofErr w:type="spellEnd"/>
       <w:r>
-        <w:t xml:space="preserve">, la cual almacena el índice base-cero de la nueva página que el usuario solicitó </w:t>
-      </w:r>
-      <w:r>
-        <w:t>visualizar.</w:t>
-      </w:r>
-    </w:p>
+        <w:t>, la cual almacena el índice base-cero de la nueva página que el usuario solicitó visualizar.</w:t>
+      </w:r>
+    </w:p>
+    <w:p>
+      <w:r>
+        <w:rPr>
+          <w:b/>
+          <w:bCs/>
+        </w:rPr>
+        <w:t>TEMA: Patrón de Formulario Dedicado (ABM/CRUD)</w:t>
+      </w:r>
+    </w:p>
+    <w:p>
+      <w:pPr>
+        <w:numPr>
+          <w:ilvl w:val="0"/>
+          <w:numId w:val="17"/>
+        </w:numPr>
+      </w:pPr>
+      <w:r>
+        <w:rPr>
+          <w:b/>
+          <w:bCs/>
+        </w:rPr>
+        <w:t>Separación de Responsabilidades:</w:t>
+      </w:r>
+      <w:r>
+        <w:t xml:space="preserve"> En aplicaciones </w:t>
+      </w:r>
+      <w:proofErr w:type="spellStart"/>
+      <w:r>
+        <w:t>WebForms</w:t>
+      </w:r>
+      <w:proofErr w:type="spellEnd"/>
+      <w:r>
+        <w:t>, es una buena práctica separar la vista de listado (Lectura) de la vista de edición/creación (Escritura). Esto permite tener interfaces de usuario más limpias y específicas.</w:t>
+      </w:r>
+    </w:p>
+    <w:p>
+      <w:pPr>
+        <w:numPr>
+          <w:ilvl w:val="0"/>
+          <w:numId w:val="17"/>
+        </w:numPr>
+      </w:pPr>
+      <w:r>
+        <w:rPr>
+          <w:b/>
+          <w:bCs/>
+        </w:rPr>
+        <w:t>Reutilización de Interfaz:</w:t>
+      </w:r>
+      <w:r>
+        <w:t xml:space="preserve"> Un mismo </w:t>
+      </w:r>
+      <w:proofErr w:type="spellStart"/>
+      <w:r>
+        <w:t>WebForm</w:t>
+      </w:r>
+      <w:proofErr w:type="spellEnd"/>
+      <w:r>
+        <w:t xml:space="preserve"> (Formulario.aspx) se utiliza tanto para la operación de Alta (</w:t>
+      </w:r>
+      <w:proofErr w:type="spellStart"/>
+      <w:r>
+        <w:t>Insert</w:t>
+      </w:r>
+      <w:proofErr w:type="spellEnd"/>
+      <w:r>
+        <w:t>) como para la Modificación (</w:t>
+      </w:r>
+      <w:proofErr w:type="spellStart"/>
+      <w:r>
+        <w:t>Update</w:t>
+      </w:r>
+      <w:proofErr w:type="spellEnd"/>
+      <w:r>
+        <w:t xml:space="preserve">). La aplicación determina en el </w:t>
+      </w:r>
+      <w:proofErr w:type="spellStart"/>
+      <w:r>
+        <w:t>Page_Load</w:t>
+      </w:r>
+      <w:proofErr w:type="spellEnd"/>
+      <w:r>
+        <w:t xml:space="preserve"> qué acción ejecutar evaluando la existencia de un parámetro identificador (</w:t>
+      </w:r>
+      <w:proofErr w:type="gramStart"/>
+      <w:r>
+        <w:t>ej. ?id</w:t>
+      </w:r>
+      <w:proofErr w:type="gramEnd"/>
+      <w:r>
+        <w:t xml:space="preserve">=X) en el </w:t>
+      </w:r>
+      <w:proofErr w:type="spellStart"/>
+      <w:r>
+        <w:t>QueryString</w:t>
+      </w:r>
+      <w:proofErr w:type="spellEnd"/>
+      <w:r>
+        <w:t xml:space="preserve"> (URL).</w:t>
+      </w:r>
+    </w:p>
+    <w:p>
+      <w:pPr>
+        <w:numPr>
+          <w:ilvl w:val="0"/>
+          <w:numId w:val="17"/>
+        </w:numPr>
+      </w:pPr>
+      <w:r>
+        <w:rPr>
+          <w:b/>
+          <w:bCs/>
+        </w:rPr>
+        <w:t>Componentes Clave:</w:t>
+      </w:r>
+      <w:r>
+        <w:t xml:space="preserve"> Un formulario de entidad estándar requiere controles de entrada de texto (</w:t>
+      </w:r>
+      <w:proofErr w:type="spellStart"/>
+      <w:r>
+        <w:t>TextBox</w:t>
+      </w:r>
+      <w:proofErr w:type="spellEnd"/>
+      <w:r>
+        <w:t>), selectores de relaciones (</w:t>
+      </w:r>
+      <w:proofErr w:type="spellStart"/>
+      <w:r>
+        <w:t>DropDownList</w:t>
+      </w:r>
+      <w:proofErr w:type="spellEnd"/>
+      <w:r>
+        <w:t xml:space="preserve"> para claves foráneas como "Tipo"), y controles de acción (</w:t>
+      </w:r>
+      <w:proofErr w:type="spellStart"/>
+      <w:r>
+        <w:t>Button</w:t>
+      </w:r>
+      <w:proofErr w:type="spellEnd"/>
+      <w:r>
+        <w:t>) para confirmar (</w:t>
+      </w:r>
+      <w:proofErr w:type="spellStart"/>
+      <w:r>
+        <w:t>Submit</w:t>
+      </w:r>
+      <w:proofErr w:type="spellEnd"/>
+      <w:r>
+        <w:t>) o cancelar el envío de datos al servidor.</w:t>
+      </w:r>
+    </w:p>
+    <w:p>
+      <w:r>
+        <w:rPr>
+          <w:b/>
+          <w:bCs/>
+        </w:rPr>
+        <w:t xml:space="preserve">TEMA: Controles de Estado y Renderizado Parcial en </w:t>
+      </w:r>
+      <w:proofErr w:type="spellStart"/>
+      <w:r>
+        <w:rPr>
+          <w:b/>
+          <w:bCs/>
+        </w:rPr>
+        <w:t>WebForms</w:t>
+      </w:r>
+      <w:proofErr w:type="spellEnd"/>
+    </w:p>
+    <w:p>
+      <w:pPr>
+        <w:numPr>
+          <w:ilvl w:val="0"/>
+          <w:numId w:val="19"/>
+        </w:numPr>
+      </w:pPr>
+      <w:proofErr w:type="spellStart"/>
+      <w:r>
+        <w:rPr>
+          <w:b/>
+          <w:bCs/>
+        </w:rPr>
+        <w:t>DropDownList</w:t>
+      </w:r>
+      <w:proofErr w:type="spellEnd"/>
+      <w:r>
+        <w:rPr>
+          <w:b/>
+          <w:bCs/>
+        </w:rPr>
+        <w:t xml:space="preserve"> (Enlace a Datos):</w:t>
+      </w:r>
+      <w:r>
+        <w:t xml:space="preserve"> A diferencia de las aplicaciones de escritorio donde un ComboBox puede almacenar el objeto complejo completo, en </w:t>
+      </w:r>
+      <w:proofErr w:type="spellStart"/>
+      <w:r>
+        <w:t>WebForms</w:t>
+      </w:r>
+      <w:proofErr w:type="spellEnd"/>
+      <w:r>
+        <w:t xml:space="preserve"> todo se renderiza como HTML (texto plano). Para que un </w:t>
+      </w:r>
+      <w:proofErr w:type="spellStart"/>
+      <w:r>
+        <w:t>DropDownList</w:t>
+      </w:r>
+      <w:proofErr w:type="spellEnd"/>
+      <w:r>
+        <w:t xml:space="preserve"> funcione correctamente con una base de datos, se debe configurar como un diccionario "Clave-Valor" estableciendo dos propiedades vitales:</w:t>
+      </w:r>
+    </w:p>
+    <w:p>
+      <w:pPr>
+        <w:numPr>
+          <w:ilvl w:val="1"/>
+          <w:numId w:val="19"/>
+        </w:numPr>
+      </w:pPr>
+      <w:proofErr w:type="spellStart"/>
+      <w:r>
+        <w:t>DataTextField</w:t>
+      </w:r>
+      <w:proofErr w:type="spellEnd"/>
+      <w:r>
+        <w:t>: La propiedad del objeto que el usuario verá en pantalla (ej. "Descripción").</w:t>
+      </w:r>
+    </w:p>
+    <w:p>
+      <w:pPr>
+        <w:numPr>
+          <w:ilvl w:val="1"/>
+          <w:numId w:val="19"/>
+        </w:numPr>
+      </w:pPr>
+      <w:proofErr w:type="spellStart"/>
+      <w:r>
+        <w:t>DataValueField</w:t>
+      </w:r>
+      <w:proofErr w:type="spellEnd"/>
+      <w:r>
+        <w:t>: La propiedad del objeto que funciona como identificador oculto (ej. "Id").</w:t>
+      </w:r>
+    </w:p>
+    <w:p>
+      <w:pPr>
+        <w:numPr>
+          <w:ilvl w:val="0"/>
+          <w:numId w:val="19"/>
+        </w:numPr>
+      </w:pPr>
+      <w:proofErr w:type="spellStart"/>
+      <w:r>
+        <w:rPr>
+          <w:b/>
+          <w:bCs/>
+        </w:rPr>
+        <w:lastRenderedPageBreak/>
+        <w:t>AutoPostBack</w:t>
+      </w:r>
+      <w:proofErr w:type="spellEnd"/>
+      <w:r>
+        <w:rPr>
+          <w:b/>
+          <w:bCs/>
+        </w:rPr>
+        <w:t>:</w:t>
+      </w:r>
+      <w:r>
+        <w:t xml:space="preserve"> Por defecto, controles como </w:t>
+      </w:r>
+      <w:proofErr w:type="spellStart"/>
+      <w:r>
+        <w:t>DropDownList</w:t>
+      </w:r>
+      <w:proofErr w:type="spellEnd"/>
+      <w:r>
+        <w:t xml:space="preserve"> o </w:t>
+      </w:r>
+      <w:proofErr w:type="spellStart"/>
+      <w:r>
+        <w:t>TextBox</w:t>
+      </w:r>
+      <w:proofErr w:type="spellEnd"/>
+      <w:r>
+        <w:t xml:space="preserve"> no envían información al servidor cuando el usuario interactúa con ellos. Para que disparen un evento (como recargar otra lista o validar un dato), se debe habilitar la propiedad </w:t>
+      </w:r>
+      <w:proofErr w:type="spellStart"/>
+      <w:r>
+        <w:t>AutoPostBack</w:t>
+      </w:r>
+      <w:proofErr w:type="spellEnd"/>
+      <w:r>
+        <w:t>="true".</w:t>
+      </w:r>
+    </w:p>
+    <w:p>
+      <w:pPr>
+        <w:numPr>
+          <w:ilvl w:val="0"/>
+          <w:numId w:val="19"/>
+        </w:numPr>
+      </w:pPr>
+      <w:proofErr w:type="spellStart"/>
+      <w:r>
+        <w:rPr>
+          <w:b/>
+          <w:bCs/>
+        </w:rPr>
+        <w:t>UpdatePanel</w:t>
+      </w:r>
+      <w:proofErr w:type="spellEnd"/>
+      <w:r>
+        <w:rPr>
+          <w:b/>
+          <w:bCs/>
+        </w:rPr>
+        <w:t xml:space="preserve"> (Renderizado Parcial / AJAX):</w:t>
+      </w:r>
+      <w:r>
+        <w:t xml:space="preserve"> Cuando un control ejecuta un </w:t>
+      </w:r>
+      <w:proofErr w:type="spellStart"/>
+      <w:r>
+        <w:t>PostBack</w:t>
+      </w:r>
+      <w:proofErr w:type="spellEnd"/>
+      <w:r>
+        <w:t xml:space="preserve">, el ciclo de vida de ASP.NET redibuja la página entera, causando un "parpadeo" y reiniciando el </w:t>
+      </w:r>
+      <w:proofErr w:type="spellStart"/>
+      <w:r>
+        <w:t>scroll</w:t>
+      </w:r>
+      <w:proofErr w:type="spellEnd"/>
+      <w:r>
+        <w:t xml:space="preserve">. El </w:t>
+      </w:r>
+      <w:proofErr w:type="spellStart"/>
+      <w:r>
+        <w:t>UpdatePanel</w:t>
+      </w:r>
+      <w:proofErr w:type="spellEnd"/>
+      <w:r>
+        <w:t xml:space="preserve"> (junto con un </w:t>
+      </w:r>
+      <w:proofErr w:type="spellStart"/>
+      <w:r>
+        <w:t>ScriptManager</w:t>
+      </w:r>
+      <w:proofErr w:type="spellEnd"/>
+      <w:r>
+        <w:t xml:space="preserve">) utiliza tecnología AJAX subyacente para interceptar ese </w:t>
+      </w:r>
+      <w:proofErr w:type="spellStart"/>
+      <w:r>
+        <w:t>PostBack</w:t>
+      </w:r>
+      <w:proofErr w:type="spellEnd"/>
+      <w:r>
+        <w:t xml:space="preserve"> y actualizar únicamente el fragmento de HTML (el &lt;</w:t>
+      </w:r>
+      <w:proofErr w:type="spellStart"/>
+      <w:r>
+        <w:t>ContentTemplate</w:t>
+      </w:r>
+      <w:proofErr w:type="spellEnd"/>
+      <w:r>
+        <w:t>&gt;) que cambió, mejorando drásticamente la Experiencia de Usuario (UX).</w:t>
+      </w:r>
+    </w:p>
+    <w:p/>
+    <w:p>
+      <w:r>
+        <w:rPr>
+          <w:b/>
+          <w:bCs/>
+        </w:rPr>
+        <w:t xml:space="preserve">TEMA: Criterios de Uso de </w:t>
+      </w:r>
+      <w:proofErr w:type="spellStart"/>
+      <w:r>
+        <w:rPr>
+          <w:b/>
+          <w:bCs/>
+        </w:rPr>
+        <w:t>AutoPostBack</w:t>
+      </w:r>
+      <w:proofErr w:type="spellEnd"/>
+      <w:r>
+        <w:rPr>
+          <w:b/>
+          <w:bCs/>
+        </w:rPr>
+        <w:t xml:space="preserve"> y Renderizado Parcial (</w:t>
+      </w:r>
+      <w:proofErr w:type="spellStart"/>
+      <w:r>
+        <w:rPr>
+          <w:b/>
+          <w:bCs/>
+        </w:rPr>
+        <w:t>UpdatePanel</w:t>
+      </w:r>
+      <w:proofErr w:type="spellEnd"/>
+      <w:r>
+        <w:rPr>
+          <w:b/>
+          <w:bCs/>
+        </w:rPr>
+        <w:t>)</w:t>
+      </w:r>
+    </w:p>
+    <w:p>
+      <w:pPr>
+        <w:numPr>
+          <w:ilvl w:val="0"/>
+          <w:numId w:val="18"/>
+        </w:numPr>
+      </w:pPr>
+      <w:r>
+        <w:rPr>
+          <w:b/>
+          <w:bCs/>
+        </w:rPr>
+        <w:t>Sobrecarga del Servidor:</w:t>
+      </w:r>
+      <w:r>
+        <w:t xml:space="preserve"> Activar </w:t>
+      </w:r>
+      <w:proofErr w:type="spellStart"/>
+      <w:r>
+        <w:t>AutoPostBack</w:t>
+      </w:r>
+      <w:proofErr w:type="spellEnd"/>
+      <w:r>
+        <w:t>="true" en campos de entrada de texto regulares obliga al cliente a realizar peticiones HTTP (</w:t>
+      </w:r>
+      <w:proofErr w:type="spellStart"/>
+      <w:r>
+        <w:t>PostBacks</w:t>
+      </w:r>
+      <w:proofErr w:type="spellEnd"/>
+      <w:r>
+        <w:t>) innecesarias cada vez que el control pierde el foco (</w:t>
+      </w:r>
+      <w:proofErr w:type="spellStart"/>
+      <w:r>
+        <w:t>OnTextChanged</w:t>
+      </w:r>
+      <w:proofErr w:type="spellEnd"/>
+      <w:r>
+        <w:t>). Esto consume ancho de banda y degrada la fluidez de la interfaz.</w:t>
+      </w:r>
+    </w:p>
+    <w:p>
+      <w:pPr>
+        <w:numPr>
+          <w:ilvl w:val="0"/>
+          <w:numId w:val="18"/>
+        </w:numPr>
+      </w:pPr>
+      <w:r>
+        <w:rPr>
+          <w:b/>
+          <w:bCs/>
+        </w:rPr>
+        <w:t>El Principio del Procesamiento en Lote (</w:t>
+      </w:r>
+      <w:proofErr w:type="spellStart"/>
+      <w:r>
+        <w:rPr>
+          <w:b/>
+          <w:bCs/>
+        </w:rPr>
+        <w:t>Batching</w:t>
+      </w:r>
+      <w:proofErr w:type="spellEnd"/>
+      <w:r>
+        <w:rPr>
+          <w:b/>
+          <w:bCs/>
+        </w:rPr>
+        <w:t>):</w:t>
+      </w:r>
+      <w:r>
+        <w:t xml:space="preserve"> La mejor práctica de rendimiento web dicta que los datos de un formulario (como cadenas de texto o números) deben recolectarse localmente en el cliente y enviarse en una única petición al servidor mediante un control de envío (ej. &lt;</w:t>
+      </w:r>
+      <w:proofErr w:type="spellStart"/>
+      <w:proofErr w:type="gramStart"/>
+      <w:r>
+        <w:t>asp:Button</w:t>
+      </w:r>
+      <w:proofErr w:type="spellEnd"/>
+      <w:proofErr w:type="gramEnd"/>
+      <w:r>
+        <w:t xml:space="preserve"> ID="</w:t>
+      </w:r>
+      <w:proofErr w:type="spellStart"/>
+      <w:r>
+        <w:t>btnAceptar</w:t>
+      </w:r>
+      <w:proofErr w:type="spellEnd"/>
+      <w:r>
+        <w:t>"&gt;).</w:t>
+      </w:r>
+    </w:p>
+    <w:p>
+      <w:pPr>
+        <w:numPr>
+          <w:ilvl w:val="0"/>
+          <w:numId w:val="18"/>
+        </w:numPr>
+      </w:pPr>
+      <w:r>
+        <w:rPr>
+          <w:b/>
+          <w:bCs/>
+        </w:rPr>
+        <w:t>Casos de Uso Justificados:</w:t>
+      </w:r>
+      <w:r>
+        <w:t xml:space="preserve"> El uso de la combinación </w:t>
+      </w:r>
+      <w:proofErr w:type="spellStart"/>
+      <w:r>
+        <w:t>AutoPostBack</w:t>
+      </w:r>
+      <w:proofErr w:type="spellEnd"/>
+      <w:r>
+        <w:t xml:space="preserve"> + </w:t>
+      </w:r>
+      <w:proofErr w:type="spellStart"/>
+      <w:r>
+        <w:t>UpdatePanel</w:t>
+      </w:r>
+      <w:proofErr w:type="spellEnd"/>
+      <w:r>
+        <w:t xml:space="preserve"> debe reservarse exclusivamente para </w:t>
+      </w:r>
+      <w:r>
+        <w:rPr>
+          <w:b/>
+          <w:bCs/>
+        </w:rPr>
+        <w:t>eventos asíncronos que requieren lógica de servidor inmediata</w:t>
+      </w:r>
+      <w:r>
+        <w:t>, tales como:</w:t>
+      </w:r>
+    </w:p>
+    <w:p>
+      <w:pPr>
+        <w:numPr>
+          <w:ilvl w:val="1"/>
+          <w:numId w:val="18"/>
+        </w:numPr>
+      </w:pPr>
+      <w:r>
+        <w:t>Carga de datos dependientes (ej. Listas desplegables enlazadas/anidadas).</w:t>
+      </w:r>
+    </w:p>
+    <w:p>
+      <w:pPr>
+        <w:numPr>
+          <w:ilvl w:val="1"/>
+          <w:numId w:val="18"/>
+        </w:numPr>
+      </w:pPr>
+      <w:r>
+        <w:t>Previsualización dinámica de recursos multimedia (ej. renderizado de imágenes mediante URL externa).</w:t>
+      </w:r>
+    </w:p>
+    <w:p>
+      <w:pPr>
+        <w:numPr>
+          <w:ilvl w:val="1"/>
+          <w:numId w:val="18"/>
+        </w:numPr>
+      </w:pPr>
+      <w:r>
+        <w:t>Validaciones asíncronas en tiempo real contra la base de datos (ej. verificación de disponibilidad de un nombre de usuario).</w:t>
+      </w:r>
+    </w:p>
+    <w:p>
+      <w:r>
+        <w:rPr>
+          <w:b/>
+          <w:bCs/>
+        </w:rPr>
+        <w:t xml:space="preserve">TEMA: Inserción de Datos (Alta) y Mapeo Objeto-Relacional en </w:t>
+      </w:r>
+      <w:proofErr w:type="spellStart"/>
+      <w:r>
+        <w:rPr>
+          <w:b/>
+          <w:bCs/>
+        </w:rPr>
+        <w:t>WebForms</w:t>
+      </w:r>
+      <w:proofErr w:type="spellEnd"/>
+    </w:p>
+    <w:p>
+      <w:pPr>
+        <w:numPr>
+          <w:ilvl w:val="0"/>
+          <w:numId w:val="20"/>
+        </w:numPr>
+      </w:pPr>
+      <w:r>
+        <w:rPr>
+          <w:b/>
+          <w:bCs/>
+        </w:rPr>
+        <w:t>Mapeo de Datos (UI a Entidades):</w:t>
+      </w:r>
+      <w:r>
+        <w:t xml:space="preserve"> En el patrón </w:t>
+      </w:r>
+      <w:proofErr w:type="spellStart"/>
+      <w:r>
+        <w:t>WebForms</w:t>
+      </w:r>
+      <w:proofErr w:type="spellEnd"/>
+      <w:r>
+        <w:t xml:space="preserve">, la información ingresada por el usuario reside en propiedades de texto de los controles (ej. </w:t>
+      </w:r>
+      <w:proofErr w:type="spellStart"/>
+      <w:r>
+        <w:t>TextBox.Text</w:t>
+      </w:r>
+      <w:proofErr w:type="spellEnd"/>
+      <w:r>
+        <w:t xml:space="preserve"> o </w:t>
+      </w:r>
+      <w:proofErr w:type="spellStart"/>
+      <w:r>
+        <w:t>DropDownList.SelectedValue</w:t>
+      </w:r>
+      <w:proofErr w:type="spellEnd"/>
+      <w:r>
+        <w:t xml:space="preserve">). Es responsabilidad del desarrollador instanciar el objeto de dominio correspondiente (ej. new </w:t>
+      </w:r>
+      <w:proofErr w:type="spellStart"/>
+      <w:proofErr w:type="gramStart"/>
+      <w:r>
+        <w:t>Pokemon</w:t>
+      </w:r>
+      <w:proofErr w:type="spellEnd"/>
+      <w:r>
+        <w:t>(</w:t>
+      </w:r>
+      <w:proofErr w:type="gramEnd"/>
+      <w:r>
+        <w:t xml:space="preserve">)) y realizar el mapeo manual, aplicando las conversiones de tipo necesarias (como </w:t>
+      </w:r>
+      <w:proofErr w:type="spellStart"/>
+      <w:r>
+        <w:t>int.Parse</w:t>
+      </w:r>
+      <w:proofErr w:type="spellEnd"/>
+      <w:r>
+        <w:t>()) para transformar las cadenas de texto en los tipos de datos requeridos por la entidad .</w:t>
+      </w:r>
+    </w:p>
+    <w:p>
+      <w:pPr>
+        <w:numPr>
+          <w:ilvl w:val="0"/>
+          <w:numId w:val="20"/>
+        </w:numPr>
+      </w:pPr>
+      <w:r>
+        <w:rPr>
+          <w:b/>
+          <w:bCs/>
+        </w:rPr>
+        <w:t xml:space="preserve">Selección en </w:t>
+      </w:r>
+      <w:proofErr w:type="spellStart"/>
+      <w:r>
+        <w:rPr>
+          <w:b/>
+          <w:bCs/>
+        </w:rPr>
+        <w:t>DropDownLists</w:t>
+      </w:r>
+      <w:proofErr w:type="spellEnd"/>
+      <w:r>
+        <w:rPr>
+          <w:b/>
+          <w:bCs/>
+        </w:rPr>
+        <w:t xml:space="preserve"> (El problema del Objeto):</w:t>
+      </w:r>
+      <w:r>
+        <w:t xml:space="preserve"> A diferencia de las aplicaciones de escritorio (WinForms) donde un ComboBox puede contener el objeto subyacente en memoria, en la arquitectura cliente-servidor de la web, el control se renderiza como HTML plano. Por lo tanto, al capturar la selección, no se obtiene el objeto completo, sino únicamente su valor escalar (</w:t>
+      </w:r>
+      <w:proofErr w:type="spellStart"/>
+      <w:r>
+        <w:t>SelectedValue</w:t>
+      </w:r>
+      <w:proofErr w:type="spellEnd"/>
+      <w:r>
+        <w:t xml:space="preserve">, que suele ser un ID en formato </w:t>
+      </w:r>
+      <w:proofErr w:type="spellStart"/>
+      <w:r>
+        <w:t>string</w:t>
+      </w:r>
+      <w:proofErr w:type="spellEnd"/>
+      <w:r>
+        <w:t xml:space="preserve">). Para reconstruir las relaciones, </w:t>
+      </w:r>
+      <w:r>
+        <w:lastRenderedPageBreak/>
+        <w:t xml:space="preserve">se debe instanciar manualmente el objeto anidado e inyectarle dicho ID (ej. </w:t>
+      </w:r>
+      <w:proofErr w:type="spellStart"/>
+      <w:proofErr w:type="gramStart"/>
+      <w:r>
+        <w:t>nuevo.Tipo</w:t>
+      </w:r>
+      <w:proofErr w:type="spellEnd"/>
+      <w:proofErr w:type="gramEnd"/>
+      <w:r>
+        <w:t xml:space="preserve"> = new Elemento(); </w:t>
+      </w:r>
+      <w:proofErr w:type="spellStart"/>
+      <w:r>
+        <w:t>nuevo.Tipo.Id</w:t>
+      </w:r>
+      <w:proofErr w:type="spellEnd"/>
+      <w:r>
+        <w:t xml:space="preserve"> = </w:t>
+      </w:r>
+      <w:proofErr w:type="spellStart"/>
+      <w:r>
+        <w:t>int.Parse</w:t>
+      </w:r>
+      <w:proofErr w:type="spellEnd"/>
+      <w:r>
+        <w:t>(</w:t>
+      </w:r>
+      <w:proofErr w:type="spellStart"/>
+      <w:r>
+        <w:t>ddl.SelectedValue</w:t>
+      </w:r>
+      <w:proofErr w:type="spellEnd"/>
+      <w:r>
+        <w:t>)) .</w:t>
+      </w:r>
+    </w:p>
+    <w:p>
+      <w:pPr>
+        <w:numPr>
+          <w:ilvl w:val="0"/>
+          <w:numId w:val="20"/>
+        </w:numPr>
+      </w:pPr>
+      <w:r>
+        <w:rPr>
+          <w:b/>
+          <w:bCs/>
+        </w:rPr>
+        <w:t>Manejo de Excepciones (Try-Catch en Capa Web):</w:t>
+      </w:r>
+      <w:r>
+        <w:t xml:space="preserve"> Toda operación que involucre interactuar con recursos externos (bases de datos, red, archivos) debe envolverse en un bloque try-catch. Si ocurre una excepción (ej. desconexión del servidor SQL), el error puede guardarse temporalmente en el objeto </w:t>
+      </w:r>
+      <w:proofErr w:type="spellStart"/>
+      <w:r>
+        <w:t>Session</w:t>
+      </w:r>
+      <w:proofErr w:type="spellEnd"/>
+      <w:r>
+        <w:t xml:space="preserve"> (ej. </w:t>
+      </w:r>
+      <w:proofErr w:type="spellStart"/>
+      <w:r>
+        <w:t>Session.Add</w:t>
+      </w:r>
+      <w:proofErr w:type="spellEnd"/>
+      <w:r>
+        <w:t xml:space="preserve">("error", ex)) para luego redirigir al usuario a una pantalla de error genérica controlada, evitando exponer información sensible de la arquitectura de la aplicación al </w:t>
+      </w:r>
+      <w:r>
+        <w:t>cliente.</w:t>
+      </w:r>
+    </w:p>
+    <w:p>
+      <w:pPr>
+        <w:numPr>
+          <w:ilvl w:val="0"/>
+          <w:numId w:val="20"/>
+        </w:numPr>
+      </w:pPr>
+      <w:proofErr w:type="spellStart"/>
+      <w:r>
+        <w:rPr>
+          <w:b/>
+          <w:bCs/>
+        </w:rPr>
+        <w:t>Stored</w:t>
+      </w:r>
+      <w:proofErr w:type="spellEnd"/>
+      <w:r>
+        <w:rPr>
+          <w:b/>
+          <w:bCs/>
+        </w:rPr>
+        <w:t xml:space="preserve"> </w:t>
+      </w:r>
+      <w:proofErr w:type="spellStart"/>
+      <w:r>
+        <w:rPr>
+          <w:b/>
+          <w:bCs/>
+        </w:rPr>
+        <w:t>Procedures</w:t>
+      </w:r>
+      <w:proofErr w:type="spellEnd"/>
+      <w:r>
+        <w:rPr>
+          <w:b/>
+          <w:bCs/>
+        </w:rPr>
+        <w:t xml:space="preserve"> Parametrizados:</w:t>
+      </w:r>
+      <w:r>
+        <w:t xml:space="preserve"> Para realizar operaciones de modificación de datos (INSERT, UPDATE, DELETE), se delega la lógica SQL al motor de base de datos creando un </w:t>
+      </w:r>
+      <w:proofErr w:type="spellStart"/>
+      <w:r>
+        <w:rPr>
+          <w:i/>
+          <w:iCs/>
+        </w:rPr>
+        <w:t>Stored</w:t>
+      </w:r>
+      <w:proofErr w:type="spellEnd"/>
+      <w:r>
+        <w:rPr>
+          <w:i/>
+          <w:iCs/>
+        </w:rPr>
+        <w:t xml:space="preserve"> </w:t>
+      </w:r>
+      <w:proofErr w:type="spellStart"/>
+      <w:r>
+        <w:rPr>
+          <w:i/>
+          <w:iCs/>
+        </w:rPr>
+        <w:t>Procedure</w:t>
+      </w:r>
+      <w:proofErr w:type="spellEnd"/>
+      <w:r>
+        <w:t xml:space="preserve">. C# se comunica enviando variables fuertemente </w:t>
+      </w:r>
+      <w:proofErr w:type="spellStart"/>
+      <w:r>
+        <w:t>tipadas</w:t>
+      </w:r>
+      <w:proofErr w:type="spellEnd"/>
+      <w:r>
+        <w:t xml:space="preserve"> llamadas parámetros (@nombre, @numero). Esto previene vulnerabilidades de Inyección SQL y facilita el </w:t>
+      </w:r>
+      <w:r>
+        <w:t>mantenimiento.</w:t>
+      </w:r>
+    </w:p>
+    <w:p/>
+    <w:p/>
+    <w:p/>
     <w:p/>
     <w:p/>
     <w:p>
@@ -5244,6 +6107,304 @@
     </w:lvl>
   </w:abstractNum>
   <w:abstractNum w:abstractNumId="10" w15:restartNumberingAfterBreak="0">
+    <w:nsid w:val="43D6285F"/>
+    <w:multiLevelType w:val="multilevel"/>
+    <w:tmpl w:val="0CF470C0"/>
+    <w:lvl w:ilvl="0">
+      <w:start w:val="1"/>
+      <w:numFmt w:val="bullet"/>
+      <w:lvlText w:val=""/>
+      <w:lvlJc w:val="left"/>
+      <w:pPr>
+        <w:tabs>
+          <w:tab w:val="num" w:pos="720"/>
+        </w:tabs>
+        <w:ind w:left="720" w:hanging="360"/>
+      </w:pPr>
+      <w:rPr>
+        <w:rFonts w:ascii="Symbol" w:hAnsi="Symbol" w:hint="default"/>
+        <w:sz w:val="20"/>
+      </w:rPr>
+    </w:lvl>
+    <w:lvl w:ilvl="1" w:tentative="1">
+      <w:start w:val="1"/>
+      <w:numFmt w:val="bullet"/>
+      <w:lvlText w:val="o"/>
+      <w:lvlJc w:val="left"/>
+      <w:pPr>
+        <w:tabs>
+          <w:tab w:val="num" w:pos="1440"/>
+        </w:tabs>
+        <w:ind w:left="1440" w:hanging="360"/>
+      </w:pPr>
+      <w:rPr>
+        <w:rFonts w:ascii="Courier New" w:hAnsi="Courier New" w:hint="default"/>
+        <w:sz w:val="20"/>
+      </w:rPr>
+    </w:lvl>
+    <w:lvl w:ilvl="2" w:tentative="1">
+      <w:start w:val="1"/>
+      <w:numFmt w:val="bullet"/>
+      <w:lvlText w:val=""/>
+      <w:lvlJc w:val="left"/>
+      <w:pPr>
+        <w:tabs>
+          <w:tab w:val="num" w:pos="2160"/>
+        </w:tabs>
+        <w:ind w:left="2160" w:hanging="360"/>
+      </w:pPr>
+      <w:rPr>
+        <w:rFonts w:ascii="Wingdings" w:hAnsi="Wingdings" w:hint="default"/>
+        <w:sz w:val="20"/>
+      </w:rPr>
+    </w:lvl>
+    <w:lvl w:ilvl="3" w:tentative="1">
+      <w:start w:val="1"/>
+      <w:numFmt w:val="bullet"/>
+      <w:lvlText w:val=""/>
+      <w:lvlJc w:val="left"/>
+      <w:pPr>
+        <w:tabs>
+          <w:tab w:val="num" w:pos="2880"/>
+        </w:tabs>
+        <w:ind w:left="2880" w:hanging="360"/>
+      </w:pPr>
+      <w:rPr>
+        <w:rFonts w:ascii="Wingdings" w:hAnsi="Wingdings" w:hint="default"/>
+        <w:sz w:val="20"/>
+      </w:rPr>
+    </w:lvl>
+    <w:lvl w:ilvl="4" w:tentative="1">
+      <w:start w:val="1"/>
+      <w:numFmt w:val="bullet"/>
+      <w:lvlText w:val=""/>
+      <w:lvlJc w:val="left"/>
+      <w:pPr>
+        <w:tabs>
+          <w:tab w:val="num" w:pos="3600"/>
+        </w:tabs>
+        <w:ind w:left="3600" w:hanging="360"/>
+      </w:pPr>
+      <w:rPr>
+        <w:rFonts w:ascii="Wingdings" w:hAnsi="Wingdings" w:hint="default"/>
+        <w:sz w:val="20"/>
+      </w:rPr>
+    </w:lvl>
+    <w:lvl w:ilvl="5" w:tentative="1">
+      <w:start w:val="1"/>
+      <w:numFmt w:val="bullet"/>
+      <w:lvlText w:val=""/>
+      <w:lvlJc w:val="left"/>
+      <w:pPr>
+        <w:tabs>
+          <w:tab w:val="num" w:pos="4320"/>
+        </w:tabs>
+        <w:ind w:left="4320" w:hanging="360"/>
+      </w:pPr>
+      <w:rPr>
+        <w:rFonts w:ascii="Wingdings" w:hAnsi="Wingdings" w:hint="default"/>
+        <w:sz w:val="20"/>
+      </w:rPr>
+    </w:lvl>
+    <w:lvl w:ilvl="6" w:tentative="1">
+      <w:start w:val="1"/>
+      <w:numFmt w:val="bullet"/>
+      <w:lvlText w:val=""/>
+      <w:lvlJc w:val="left"/>
+      <w:pPr>
+        <w:tabs>
+          <w:tab w:val="num" w:pos="5040"/>
+        </w:tabs>
+        <w:ind w:left="5040" w:hanging="360"/>
+      </w:pPr>
+      <w:rPr>
+        <w:rFonts w:ascii="Wingdings" w:hAnsi="Wingdings" w:hint="default"/>
+        <w:sz w:val="20"/>
+      </w:rPr>
+    </w:lvl>
+    <w:lvl w:ilvl="7" w:tentative="1">
+      <w:start w:val="1"/>
+      <w:numFmt w:val="bullet"/>
+      <w:lvlText w:val=""/>
+      <w:lvlJc w:val="left"/>
+      <w:pPr>
+        <w:tabs>
+          <w:tab w:val="num" w:pos="5760"/>
+        </w:tabs>
+        <w:ind w:left="5760" w:hanging="360"/>
+      </w:pPr>
+      <w:rPr>
+        <w:rFonts w:ascii="Wingdings" w:hAnsi="Wingdings" w:hint="default"/>
+        <w:sz w:val="20"/>
+      </w:rPr>
+    </w:lvl>
+    <w:lvl w:ilvl="8" w:tentative="1">
+      <w:start w:val="1"/>
+      <w:numFmt w:val="bullet"/>
+      <w:lvlText w:val=""/>
+      <w:lvlJc w:val="left"/>
+      <w:pPr>
+        <w:tabs>
+          <w:tab w:val="num" w:pos="6480"/>
+        </w:tabs>
+        <w:ind w:left="6480" w:hanging="360"/>
+      </w:pPr>
+      <w:rPr>
+        <w:rFonts w:ascii="Wingdings" w:hAnsi="Wingdings" w:hint="default"/>
+        <w:sz w:val="20"/>
+      </w:rPr>
+    </w:lvl>
+  </w:abstractNum>
+  <w:abstractNum w:abstractNumId="11" w15:restartNumberingAfterBreak="0">
+    <w:nsid w:val="47A256AC"/>
+    <w:multiLevelType w:val="multilevel"/>
+    <w:tmpl w:val="94784BE8"/>
+    <w:lvl w:ilvl="0">
+      <w:start w:val="1"/>
+      <w:numFmt w:val="bullet"/>
+      <w:lvlText w:val=""/>
+      <w:lvlJc w:val="left"/>
+      <w:pPr>
+        <w:tabs>
+          <w:tab w:val="num" w:pos="720"/>
+        </w:tabs>
+        <w:ind w:left="720" w:hanging="360"/>
+      </w:pPr>
+      <w:rPr>
+        <w:rFonts w:ascii="Symbol" w:hAnsi="Symbol" w:hint="default"/>
+        <w:sz w:val="20"/>
+      </w:rPr>
+    </w:lvl>
+    <w:lvl w:ilvl="1" w:tentative="1">
+      <w:start w:val="1"/>
+      <w:numFmt w:val="bullet"/>
+      <w:lvlText w:val="o"/>
+      <w:lvlJc w:val="left"/>
+      <w:pPr>
+        <w:tabs>
+          <w:tab w:val="num" w:pos="1440"/>
+        </w:tabs>
+        <w:ind w:left="1440" w:hanging="360"/>
+      </w:pPr>
+      <w:rPr>
+        <w:rFonts w:ascii="Courier New" w:hAnsi="Courier New" w:hint="default"/>
+        <w:sz w:val="20"/>
+      </w:rPr>
+    </w:lvl>
+    <w:lvl w:ilvl="2" w:tentative="1">
+      <w:start w:val="1"/>
+      <w:numFmt w:val="bullet"/>
+      <w:lvlText w:val=""/>
+      <w:lvlJc w:val="left"/>
+      <w:pPr>
+        <w:tabs>
+          <w:tab w:val="num" w:pos="2160"/>
+        </w:tabs>
+        <w:ind w:left="2160" w:hanging="360"/>
+      </w:pPr>
+      <w:rPr>
+        <w:rFonts w:ascii="Wingdings" w:hAnsi="Wingdings" w:hint="default"/>
+        <w:sz w:val="20"/>
+      </w:rPr>
+    </w:lvl>
+    <w:lvl w:ilvl="3" w:tentative="1">
+      <w:start w:val="1"/>
+      <w:numFmt w:val="bullet"/>
+      <w:lvlText w:val=""/>
+      <w:lvlJc w:val="left"/>
+      <w:pPr>
+        <w:tabs>
+          <w:tab w:val="num" w:pos="2880"/>
+        </w:tabs>
+        <w:ind w:left="2880" w:hanging="360"/>
+      </w:pPr>
+      <w:rPr>
+        <w:rFonts w:ascii="Wingdings" w:hAnsi="Wingdings" w:hint="default"/>
+        <w:sz w:val="20"/>
+      </w:rPr>
+    </w:lvl>
+    <w:lvl w:ilvl="4" w:tentative="1">
+      <w:start w:val="1"/>
+      <w:numFmt w:val="bullet"/>
+      <w:lvlText w:val=""/>
+      <w:lvlJc w:val="left"/>
+      <w:pPr>
+        <w:tabs>
+          <w:tab w:val="num" w:pos="3600"/>
+        </w:tabs>
+        <w:ind w:left="3600" w:hanging="360"/>
+      </w:pPr>
+      <w:rPr>
+        <w:rFonts w:ascii="Wingdings" w:hAnsi="Wingdings" w:hint="default"/>
+        <w:sz w:val="20"/>
+      </w:rPr>
+    </w:lvl>
+    <w:lvl w:ilvl="5" w:tentative="1">
+      <w:start w:val="1"/>
+      <w:numFmt w:val="bullet"/>
+      <w:lvlText w:val=""/>
+      <w:lvlJc w:val="left"/>
+      <w:pPr>
+        <w:tabs>
+          <w:tab w:val="num" w:pos="4320"/>
+        </w:tabs>
+        <w:ind w:left="4320" w:hanging="360"/>
+      </w:pPr>
+      <w:rPr>
+        <w:rFonts w:ascii="Wingdings" w:hAnsi="Wingdings" w:hint="default"/>
+        <w:sz w:val="20"/>
+      </w:rPr>
+    </w:lvl>
+    <w:lvl w:ilvl="6" w:tentative="1">
+      <w:start w:val="1"/>
+      <w:numFmt w:val="bullet"/>
+      <w:lvlText w:val=""/>
+      <w:lvlJc w:val="left"/>
+      <w:pPr>
+        <w:tabs>
+          <w:tab w:val="num" w:pos="5040"/>
+        </w:tabs>
+        <w:ind w:left="5040" w:hanging="360"/>
+      </w:pPr>
+      <w:rPr>
+        <w:rFonts w:ascii="Wingdings" w:hAnsi="Wingdings" w:hint="default"/>
+        <w:sz w:val="20"/>
+      </w:rPr>
+    </w:lvl>
+    <w:lvl w:ilvl="7" w:tentative="1">
+      <w:start w:val="1"/>
+      <w:numFmt w:val="bullet"/>
+      <w:lvlText w:val=""/>
+      <w:lvlJc w:val="left"/>
+      <w:pPr>
+        <w:tabs>
+          <w:tab w:val="num" w:pos="5760"/>
+        </w:tabs>
+        <w:ind w:left="5760" w:hanging="360"/>
+      </w:pPr>
+      <w:rPr>
+        <w:rFonts w:ascii="Wingdings" w:hAnsi="Wingdings" w:hint="default"/>
+        <w:sz w:val="20"/>
+      </w:rPr>
+    </w:lvl>
+    <w:lvl w:ilvl="8" w:tentative="1">
+      <w:start w:val="1"/>
+      <w:numFmt w:val="bullet"/>
+      <w:lvlText w:val=""/>
+      <w:lvlJc w:val="left"/>
+      <w:pPr>
+        <w:tabs>
+          <w:tab w:val="num" w:pos="6480"/>
+        </w:tabs>
+        <w:ind w:left="6480" w:hanging="360"/>
+      </w:pPr>
+      <w:rPr>
+        <w:rFonts w:ascii="Wingdings" w:hAnsi="Wingdings" w:hint="default"/>
+        <w:sz w:val="20"/>
+      </w:rPr>
+    </w:lvl>
+  </w:abstractNum>
+  <w:abstractNum w:abstractNumId="12" w15:restartNumberingAfterBreak="0">
     <w:nsid w:val="496B4294"/>
     <w:multiLevelType w:val="multilevel"/>
     <w:tmpl w:val="EEAAA56C"/>
@@ -5392,7 +6553,7 @@
       </w:rPr>
     </w:lvl>
   </w:abstractNum>
-  <w:abstractNum w:abstractNumId="11" w15:restartNumberingAfterBreak="0">
+  <w:abstractNum w:abstractNumId="13" w15:restartNumberingAfterBreak="0">
     <w:nsid w:val="5AFF2E8D"/>
     <w:multiLevelType w:val="multilevel"/>
     <w:tmpl w:val="00E82A94"/>
@@ -5541,7 +6702,7 @@
       </w:rPr>
     </w:lvl>
   </w:abstractNum>
-  <w:abstractNum w:abstractNumId="12" w15:restartNumberingAfterBreak="0">
+  <w:abstractNum w:abstractNumId="14" w15:restartNumberingAfterBreak="0">
     <w:nsid w:val="5D612526"/>
     <w:multiLevelType w:val="multilevel"/>
     <w:tmpl w:val="DB62DC76"/>
@@ -5690,7 +6851,7 @@
       </w:rPr>
     </w:lvl>
   </w:abstractNum>
-  <w:abstractNum w:abstractNumId="13" w15:restartNumberingAfterBreak="0">
+  <w:abstractNum w:abstractNumId="15" w15:restartNumberingAfterBreak="0">
     <w:nsid w:val="6DBF7670"/>
     <w:multiLevelType w:val="multilevel"/>
     <w:tmpl w:val="CC963EBA"/>
@@ -5839,7 +7000,7 @@
       </w:rPr>
     </w:lvl>
   </w:abstractNum>
-  <w:abstractNum w:abstractNumId="14" w15:restartNumberingAfterBreak="0">
+  <w:abstractNum w:abstractNumId="16" w15:restartNumberingAfterBreak="0">
     <w:nsid w:val="6F4C7C29"/>
     <w:multiLevelType w:val="multilevel"/>
     <w:tmpl w:val="0CC08082"/>
@@ -5952,7 +7113,152 @@
       </w:pPr>
     </w:lvl>
   </w:abstractNum>
-  <w:abstractNum w:abstractNumId="15" w15:restartNumberingAfterBreak="0">
+  <w:abstractNum w:abstractNumId="17" w15:restartNumberingAfterBreak="0">
+    <w:nsid w:val="71B169B8"/>
+    <w:multiLevelType w:val="multilevel"/>
+    <w:tmpl w:val="124416DC"/>
+    <w:lvl w:ilvl="0">
+      <w:start w:val="1"/>
+      <w:numFmt w:val="bullet"/>
+      <w:lvlText w:val=""/>
+      <w:lvlJc w:val="left"/>
+      <w:pPr>
+        <w:tabs>
+          <w:tab w:val="num" w:pos="720"/>
+        </w:tabs>
+        <w:ind w:left="720" w:hanging="360"/>
+      </w:pPr>
+      <w:rPr>
+        <w:rFonts w:ascii="Symbol" w:hAnsi="Symbol" w:hint="default"/>
+        <w:sz w:val="20"/>
+      </w:rPr>
+    </w:lvl>
+    <w:lvl w:ilvl="1">
+      <w:start w:val="1"/>
+      <w:numFmt w:val="decimal"/>
+      <w:lvlText w:val="%2."/>
+      <w:lvlJc w:val="left"/>
+      <w:pPr>
+        <w:tabs>
+          <w:tab w:val="num" w:pos="1440"/>
+        </w:tabs>
+        <w:ind w:left="1440" w:hanging="360"/>
+      </w:pPr>
+    </w:lvl>
+    <w:lvl w:ilvl="2" w:tentative="1">
+      <w:start w:val="1"/>
+      <w:numFmt w:val="bullet"/>
+      <w:lvlText w:val=""/>
+      <w:lvlJc w:val="left"/>
+      <w:pPr>
+        <w:tabs>
+          <w:tab w:val="num" w:pos="2160"/>
+        </w:tabs>
+        <w:ind w:left="2160" w:hanging="360"/>
+      </w:pPr>
+      <w:rPr>
+        <w:rFonts w:ascii="Wingdings" w:hAnsi="Wingdings" w:hint="default"/>
+        <w:sz w:val="20"/>
+      </w:rPr>
+    </w:lvl>
+    <w:lvl w:ilvl="3" w:tentative="1">
+      <w:start w:val="1"/>
+      <w:numFmt w:val="bullet"/>
+      <w:lvlText w:val=""/>
+      <w:lvlJc w:val="left"/>
+      <w:pPr>
+        <w:tabs>
+          <w:tab w:val="num" w:pos="2880"/>
+        </w:tabs>
+        <w:ind w:left="2880" w:hanging="360"/>
+      </w:pPr>
+      <w:rPr>
+        <w:rFonts w:ascii="Wingdings" w:hAnsi="Wingdings" w:hint="default"/>
+        <w:sz w:val="20"/>
+      </w:rPr>
+    </w:lvl>
+    <w:lvl w:ilvl="4" w:tentative="1">
+      <w:start w:val="1"/>
+      <w:numFmt w:val="bullet"/>
+      <w:lvlText w:val=""/>
+      <w:lvlJc w:val="left"/>
+      <w:pPr>
+        <w:tabs>
+          <w:tab w:val="num" w:pos="3600"/>
+        </w:tabs>
+        <w:ind w:left="3600" w:hanging="360"/>
+      </w:pPr>
+      <w:rPr>
+        <w:rFonts w:ascii="Wingdings" w:hAnsi="Wingdings" w:hint="default"/>
+        <w:sz w:val="20"/>
+      </w:rPr>
+    </w:lvl>
+    <w:lvl w:ilvl="5" w:tentative="1">
+      <w:start w:val="1"/>
+      <w:numFmt w:val="bullet"/>
+      <w:lvlText w:val=""/>
+      <w:lvlJc w:val="left"/>
+      <w:pPr>
+        <w:tabs>
+          <w:tab w:val="num" w:pos="4320"/>
+        </w:tabs>
+        <w:ind w:left="4320" w:hanging="360"/>
+      </w:pPr>
+      <w:rPr>
+        <w:rFonts w:ascii="Wingdings" w:hAnsi="Wingdings" w:hint="default"/>
+        <w:sz w:val="20"/>
+      </w:rPr>
+    </w:lvl>
+    <w:lvl w:ilvl="6" w:tentative="1">
+      <w:start w:val="1"/>
+      <w:numFmt w:val="bullet"/>
+      <w:lvlText w:val=""/>
+      <w:lvlJc w:val="left"/>
+      <w:pPr>
+        <w:tabs>
+          <w:tab w:val="num" w:pos="5040"/>
+        </w:tabs>
+        <w:ind w:left="5040" w:hanging="360"/>
+      </w:pPr>
+      <w:rPr>
+        <w:rFonts w:ascii="Wingdings" w:hAnsi="Wingdings" w:hint="default"/>
+        <w:sz w:val="20"/>
+      </w:rPr>
+    </w:lvl>
+    <w:lvl w:ilvl="7" w:tentative="1">
+      <w:start w:val="1"/>
+      <w:numFmt w:val="bullet"/>
+      <w:lvlText w:val=""/>
+      <w:lvlJc w:val="left"/>
+      <w:pPr>
+        <w:tabs>
+          <w:tab w:val="num" w:pos="5760"/>
+        </w:tabs>
+        <w:ind w:left="5760" w:hanging="360"/>
+      </w:pPr>
+      <w:rPr>
+        <w:rFonts w:ascii="Wingdings" w:hAnsi="Wingdings" w:hint="default"/>
+        <w:sz w:val="20"/>
+      </w:rPr>
+    </w:lvl>
+    <w:lvl w:ilvl="8" w:tentative="1">
+      <w:start w:val="1"/>
+      <w:numFmt w:val="bullet"/>
+      <w:lvlText w:val=""/>
+      <w:lvlJc w:val="left"/>
+      <w:pPr>
+        <w:tabs>
+          <w:tab w:val="num" w:pos="6480"/>
+        </w:tabs>
+        <w:ind w:left="6480" w:hanging="360"/>
+      </w:pPr>
+      <w:rPr>
+        <w:rFonts w:ascii="Wingdings" w:hAnsi="Wingdings" w:hint="default"/>
+        <w:sz w:val="20"/>
+      </w:rPr>
+    </w:lvl>
+  </w:abstractNum>
+  <w:abstractNum w:abstractNumId="18" w15:restartNumberingAfterBreak="0">
     <w:nsid w:val="71DD7274"/>
     <w:multiLevelType w:val="multilevel"/>
     <w:tmpl w:val="2C645D04"/>
@@ -6063,6 +7369,155 @@
         </w:tabs>
         <w:ind w:left="6480" w:hanging="360"/>
       </w:pPr>
+    </w:lvl>
+  </w:abstractNum>
+  <w:abstractNum w:abstractNumId="19" w15:restartNumberingAfterBreak="0">
+    <w:nsid w:val="72380DDF"/>
+    <w:multiLevelType w:val="multilevel"/>
+    <w:tmpl w:val="B9CC6108"/>
+    <w:lvl w:ilvl="0">
+      <w:start w:val="1"/>
+      <w:numFmt w:val="bullet"/>
+      <w:lvlText w:val=""/>
+      <w:lvlJc w:val="left"/>
+      <w:pPr>
+        <w:tabs>
+          <w:tab w:val="num" w:pos="720"/>
+        </w:tabs>
+        <w:ind w:left="720" w:hanging="360"/>
+      </w:pPr>
+      <w:rPr>
+        <w:rFonts w:ascii="Symbol" w:hAnsi="Symbol" w:hint="default"/>
+        <w:sz w:val="20"/>
+      </w:rPr>
+    </w:lvl>
+    <w:lvl w:ilvl="1">
+      <w:start w:val="1"/>
+      <w:numFmt w:val="bullet"/>
+      <w:lvlText w:val="o"/>
+      <w:lvlJc w:val="left"/>
+      <w:pPr>
+        <w:tabs>
+          <w:tab w:val="num" w:pos="1440"/>
+        </w:tabs>
+        <w:ind w:left="1440" w:hanging="360"/>
+      </w:pPr>
+      <w:rPr>
+        <w:rFonts w:ascii="Courier New" w:hAnsi="Courier New" w:hint="default"/>
+        <w:sz w:val="20"/>
+      </w:rPr>
+    </w:lvl>
+    <w:lvl w:ilvl="2" w:tentative="1">
+      <w:start w:val="1"/>
+      <w:numFmt w:val="bullet"/>
+      <w:lvlText w:val=""/>
+      <w:lvlJc w:val="left"/>
+      <w:pPr>
+        <w:tabs>
+          <w:tab w:val="num" w:pos="2160"/>
+        </w:tabs>
+        <w:ind w:left="2160" w:hanging="360"/>
+      </w:pPr>
+      <w:rPr>
+        <w:rFonts w:ascii="Wingdings" w:hAnsi="Wingdings" w:hint="default"/>
+        <w:sz w:val="20"/>
+      </w:rPr>
+    </w:lvl>
+    <w:lvl w:ilvl="3" w:tentative="1">
+      <w:start w:val="1"/>
+      <w:numFmt w:val="bullet"/>
+      <w:lvlText w:val=""/>
+      <w:lvlJc w:val="left"/>
+      <w:pPr>
+        <w:tabs>
+          <w:tab w:val="num" w:pos="2880"/>
+        </w:tabs>
+        <w:ind w:left="2880" w:hanging="360"/>
+      </w:pPr>
+      <w:rPr>
+        <w:rFonts w:ascii="Wingdings" w:hAnsi="Wingdings" w:hint="default"/>
+        <w:sz w:val="20"/>
+      </w:rPr>
+    </w:lvl>
+    <w:lvl w:ilvl="4" w:tentative="1">
+      <w:start w:val="1"/>
+      <w:numFmt w:val="bullet"/>
+      <w:lvlText w:val=""/>
+      <w:lvlJc w:val="left"/>
+      <w:pPr>
+        <w:tabs>
+          <w:tab w:val="num" w:pos="3600"/>
+        </w:tabs>
+        <w:ind w:left="3600" w:hanging="360"/>
+      </w:pPr>
+      <w:rPr>
+        <w:rFonts w:ascii="Wingdings" w:hAnsi="Wingdings" w:hint="default"/>
+        <w:sz w:val="20"/>
+      </w:rPr>
+    </w:lvl>
+    <w:lvl w:ilvl="5" w:tentative="1">
+      <w:start w:val="1"/>
+      <w:numFmt w:val="bullet"/>
+      <w:lvlText w:val=""/>
+      <w:lvlJc w:val="left"/>
+      <w:pPr>
+        <w:tabs>
+          <w:tab w:val="num" w:pos="4320"/>
+        </w:tabs>
+        <w:ind w:left="4320" w:hanging="360"/>
+      </w:pPr>
+      <w:rPr>
+        <w:rFonts w:ascii="Wingdings" w:hAnsi="Wingdings" w:hint="default"/>
+        <w:sz w:val="20"/>
+      </w:rPr>
+    </w:lvl>
+    <w:lvl w:ilvl="6" w:tentative="1">
+      <w:start w:val="1"/>
+      <w:numFmt w:val="bullet"/>
+      <w:lvlText w:val=""/>
+      <w:lvlJc w:val="left"/>
+      <w:pPr>
+        <w:tabs>
+          <w:tab w:val="num" w:pos="5040"/>
+        </w:tabs>
+        <w:ind w:left="5040" w:hanging="360"/>
+      </w:pPr>
+      <w:rPr>
+        <w:rFonts w:ascii="Wingdings" w:hAnsi="Wingdings" w:hint="default"/>
+        <w:sz w:val="20"/>
+      </w:rPr>
+    </w:lvl>
+    <w:lvl w:ilvl="7" w:tentative="1">
+      <w:start w:val="1"/>
+      <w:numFmt w:val="bullet"/>
+      <w:lvlText w:val=""/>
+      <w:lvlJc w:val="left"/>
+      <w:pPr>
+        <w:tabs>
+          <w:tab w:val="num" w:pos="5760"/>
+        </w:tabs>
+        <w:ind w:left="5760" w:hanging="360"/>
+      </w:pPr>
+      <w:rPr>
+        <w:rFonts w:ascii="Wingdings" w:hAnsi="Wingdings" w:hint="default"/>
+        <w:sz w:val="20"/>
+      </w:rPr>
+    </w:lvl>
+    <w:lvl w:ilvl="8" w:tentative="1">
+      <w:start w:val="1"/>
+      <w:numFmt w:val="bullet"/>
+      <w:lvlText w:val=""/>
+      <w:lvlJc w:val="left"/>
+      <w:pPr>
+        <w:tabs>
+          <w:tab w:val="num" w:pos="6480"/>
+        </w:tabs>
+        <w:ind w:left="6480" w:hanging="360"/>
+      </w:pPr>
+      <w:rPr>
+        <w:rFonts w:ascii="Wingdings" w:hAnsi="Wingdings" w:hint="default"/>
+        <w:sz w:val="20"/>
+      </w:rPr>
     </w:lvl>
   </w:abstractNum>
   <w:num w:numId="1" w16cid:durableId="340132085">
@@ -6072,7 +7527,7 @@
     <w:abstractNumId w:val="4"/>
   </w:num>
   <w:num w:numId="3" w16cid:durableId="564411841">
-    <w:abstractNumId w:val="12"/>
+    <w:abstractNumId w:val="14"/>
   </w:num>
   <w:num w:numId="4" w16cid:durableId="495222279">
     <w:abstractNumId w:val="8"/>
@@ -6087,10 +7542,10 @@
     <w:abstractNumId w:val="6"/>
   </w:num>
   <w:num w:numId="8" w16cid:durableId="1905289728">
-    <w:abstractNumId w:val="13"/>
+    <w:abstractNumId w:val="15"/>
   </w:num>
   <w:num w:numId="9" w16cid:durableId="903224478">
-    <w:abstractNumId w:val="14"/>
+    <w:abstractNumId w:val="16"/>
   </w:num>
   <w:num w:numId="10" w16cid:durableId="1389456004">
     <w:abstractNumId w:val="1"/>
@@ -6105,13 +7560,25 @@
     <w:abstractNumId w:val="7"/>
   </w:num>
   <w:num w:numId="14" w16cid:durableId="1263025117">
-    <w:abstractNumId w:val="10"/>
+    <w:abstractNumId w:val="12"/>
   </w:num>
   <w:num w:numId="15" w16cid:durableId="1706708101">
-    <w:abstractNumId w:val="15"/>
+    <w:abstractNumId w:val="18"/>
   </w:num>
   <w:num w:numId="16" w16cid:durableId="1900166956">
+    <w:abstractNumId w:val="13"/>
+  </w:num>
+  <w:num w:numId="17" w16cid:durableId="1088618782">
     <w:abstractNumId w:val="11"/>
+  </w:num>
+  <w:num w:numId="18" w16cid:durableId="891696317">
+    <w:abstractNumId w:val="17"/>
+  </w:num>
+  <w:num w:numId="19" w16cid:durableId="1852720404">
+    <w:abstractNumId w:val="19"/>
+  </w:num>
+  <w:num w:numId="20" w16cid:durableId="2080328687">
+    <w:abstractNumId w:val="10"/>
   </w:num>
 </w:numbering>
 </file>

</xml_diff>

<commit_message>
feat: implementar modificación de Pokémon con reutilización de formulario (ABM) - Creación de Stored Procedure 'StoreModificarPokemon' en la base de datos para operaciones UPDATE seguras. - Desarrollo del método ModificarPokemonConSP() en la capa de negocio pasando el ID como parámetro clave. - Refactorización de PokemonForm.aspx.cs para funcionar como formulario de doble propósito (Alta y Modificación). - Implementación de lógica de precarga de datos en el Page_Load condicionada a !IsPostBack y a la existencia de Request.QueryString["id"]. - Búsqueda en memoria con método Find() utilizando expresiones lambda para precargar TextBox y DropDownLists. - Incorporación de condicional de enrutamiento en btnAceptar_Click para determinar la ejecución de Alta o Modificación según el contexto de la URL.
</commit_message>
<xml_diff>
--- a/Unidad 5 - Pokedex Web/Documentación de Pokedex.docx
+++ b/Unidad 5 - Pokedex Web/Documentación de Pokedex.docx
@@ -831,7 +831,6 @@
         <w:t xml:space="preserve">Importancia del </w:t>
       </w:r>
       <w:proofErr w:type="spellStart"/>
-      <w:proofErr w:type="gramStart"/>
       <w:r>
         <w:rPr>
           <w:b/>
@@ -845,15 +844,7 @@
           <w:b/>
           <w:bCs/>
         </w:rPr>
-        <w:t>(</w:t>
-      </w:r>
-      <w:proofErr w:type="gramEnd"/>
-      <w:r>
-        <w:rPr>
-          <w:b/>
-          <w:bCs/>
-        </w:rPr>
-        <w:t>):</w:t>
+        <w:t>():</w:t>
       </w:r>
       <w:r>
         <w:t xml:space="preserve"> Sin la ejecución de este método en el servidor, la grilla no procesará el origen de datos y no se renderizará ninguna fila en el HTML final del cliente.</w:t>
@@ -1012,12 +1003,10 @@
         <w:t>="false". Esto obliga al desarrollador a definir cada columna mediante &lt;</w:t>
       </w:r>
       <w:proofErr w:type="spellStart"/>
-      <w:proofErr w:type="gramStart"/>
       <w:r>
         <w:t>asp:BoundField</w:t>
       </w:r>
       <w:proofErr w:type="spellEnd"/>
-      <w:proofErr w:type="gramEnd"/>
       <w:r>
         <w:t>&gt;.</w:t>
       </w:r>
@@ -1182,13 +1171,8 @@
       </w:r>
       <w:proofErr w:type="spellEnd"/>
       <w:r>
-        <w:t xml:space="preserve">), suelen ser rígidos en cuanto a la estructura HTML que generan (tablas &lt;table&gt;). Para interfaces orientadas al usuario final (como catálogos o galerías), se requiere un control total sobre el HTML </w:t>
-      </w:r>
-      <w:proofErr w:type="gramStart"/>
-      <w:r>
-        <w:t>generado .</w:t>
-      </w:r>
-      <w:proofErr w:type="gramEnd"/>
+        <w:t>), suelen ser rígidos en cuanto a la estructura HTML que generan (tablas &lt;table&gt;). Para interfaces orientadas al usuario final (como catálogos o galerías), se requiere un control total sobre el HTML generado .</w:t>
+      </w:r>
     </w:p>
     <w:p>
       <w:pPr>
@@ -1221,13 +1205,8 @@
       </w:r>
       <w:proofErr w:type="spellEnd"/>
       <w:r>
-        <w:t xml:space="preserve">. El motor de renderizado ejecuta este código en el servidor antes de enviar el HTML al </w:t>
-      </w:r>
-      <w:proofErr w:type="gramStart"/>
-      <w:r>
-        <w:t>cliente .</w:t>
-      </w:r>
-      <w:proofErr w:type="gramEnd"/>
+        <w:t>. El motor de renderizado ejecuta este código en el servidor antes de enviar el HTML al cliente .</w:t>
+      </w:r>
     </w:p>
     <w:p>
       <w:pPr>
@@ -1300,15 +1279,7 @@
       </w:r>
       <w:proofErr w:type="spellEnd"/>
       <w:r>
-        <w:t xml:space="preserve">) </w:t>
-      </w:r>
-      <w:proofErr w:type="gramStart"/>
-      <w:r>
-        <w:t>{ %</w:t>
-      </w:r>
-      <w:proofErr w:type="gramEnd"/>
-      <w:r>
-        <w:t>&gt; ... HTML ... &lt;% } %&gt;), el servidor repite ese fragmento HTML por cada elemento de la colección.</w:t>
+        <w:t>) { %&gt; ... HTML ... &lt;% } %&gt;), el servidor repite ese fragmento HTML por cada elemento de la colección.</w:t>
       </w:r>
     </w:p>
     <w:p>
@@ -1418,13 +1389,8 @@
       </w:r>
       <w:proofErr w:type="spellEnd"/>
       <w:r>
-        <w:t xml:space="preserve">&gt; la única obligatoria para definir el contenido </w:t>
-      </w:r>
-      <w:proofErr w:type="gramStart"/>
-      <w:r>
-        <w:t>repetitivo .</w:t>
-      </w:r>
-      <w:proofErr w:type="gramEnd"/>
+        <w:t>&gt; la única obligatoria para definir el contenido repetitivo .</w:t>
+      </w:r>
     </w:p>
     <w:p>
       <w:pPr>
@@ -1484,17 +1450,12 @@
         <w:t xml:space="preserve"> procesa estas expresiones cuando se invoca el método </w:t>
       </w:r>
       <w:proofErr w:type="spellStart"/>
-      <w:proofErr w:type="gramStart"/>
       <w:r>
         <w:t>DataBind</w:t>
       </w:r>
       <w:proofErr w:type="spellEnd"/>
       <w:r>
-        <w:t>(</w:t>
-      </w:r>
-      <w:proofErr w:type="gramEnd"/>
-      <w:r>
-        <w:t>) en el servidor .</w:t>
+        <w:t>() en el servidor .</w:t>
       </w:r>
     </w:p>
     <w:p>
@@ -1512,7 +1473,6 @@
         <w:t xml:space="preserve">Método </w:t>
       </w:r>
       <w:proofErr w:type="spellStart"/>
-      <w:proofErr w:type="gramStart"/>
       <w:r>
         <w:rPr>
           <w:b/>
@@ -1526,15 +1486,7 @@
           <w:b/>
           <w:bCs/>
         </w:rPr>
-        <w:t>(</w:t>
-      </w:r>
-      <w:proofErr w:type="gramEnd"/>
-      <w:r>
-        <w:rPr>
-          <w:b/>
-          <w:bCs/>
-        </w:rPr>
-        <w:t>):</w:t>
+        <w:t>():</w:t>
       </w:r>
       <w:r>
         <w:t xml:space="preserve"> Es una función optimizada que utiliza reflexión (</w:t>
@@ -1585,13 +1537,8 @@
       </w:r>
       <w:proofErr w:type="spellEnd"/>
       <w:r>
-        <w:t>") %&gt;</w:t>
-      </w:r>
-      <w:proofErr w:type="gramStart"/>
-      <w:r>
-        <w:t>) .</w:t>
-      </w:r>
-      <w:proofErr w:type="gramEnd"/>
+        <w:t>") %&gt;) .</w:t>
+      </w:r>
     </w:p>
     <w:p/>
     <w:p/>
@@ -1751,13 +1698,8 @@
       </w:r>
       <w:proofErr w:type="spellEnd"/>
       <w:r>
-        <w:t xml:space="preserve">)) para que el compilador trate ese objeto como un botón y permita acceder a sus </w:t>
-      </w:r>
-      <w:proofErr w:type="gramStart"/>
-      <w:r>
-        <w:t>atributos .</w:t>
-      </w:r>
-      <w:proofErr w:type="gramEnd"/>
+        <w:t>)) para que el compilador trate ese objeto como un botón y permita acceder a sus atributos .</w:t>
+      </w:r>
     </w:p>
     <w:p>
       <w:pPr>
@@ -1806,15 +1748,7 @@
       </w:r>
       <w:proofErr w:type="spellEnd"/>
       <w:r>
-        <w:t xml:space="preserve"> de ASP.NET. Permite almacenar un valor dinámico (como la Clave Primaria o ID de un registro) directamente en el HTML del </w:t>
-      </w:r>
-      <w:proofErr w:type="gramStart"/>
-      <w:r>
-        <w:t>botón .</w:t>
-      </w:r>
-      <w:proofErr w:type="gramEnd"/>
-      <w:r>
-        <w:t xml:space="preserve"> Cuando el usuario hace clic, ese valor viaja automáticamente al servidor y puede ser recuperado en el evento </w:t>
+        <w:t xml:space="preserve"> de ASP.NET. Permite almacenar un valor dinámico (como la Clave Primaria o ID de un registro) directamente en el HTML del botón . Cuando el usuario hace clic, ese valor viaja automáticamente al servidor y puede ser recuperado en el evento </w:t>
       </w:r>
       <w:proofErr w:type="spellStart"/>
       <w:r>
@@ -1825,7 +1759,6 @@
         <w:t xml:space="preserve"> o </w:t>
       </w:r>
       <w:proofErr w:type="spellStart"/>
-      <w:proofErr w:type="gramStart"/>
       <w:r>
         <w:t>OnCommand</w:t>
       </w:r>
@@ -1833,7 +1766,6 @@
       <w:r>
         <w:t xml:space="preserve"> .</w:t>
       </w:r>
-      <w:proofErr w:type="gramEnd"/>
     </w:p>
     <w:p>
       <w:pPr>
@@ -1914,26 +1846,16 @@
       </w:r>
       <w:proofErr w:type="spellEnd"/>
       <w:r>
-        <w:t xml:space="preserve"> </w:t>
-      </w:r>
-      <w:proofErr w:type="gramStart"/>
-      <w:r>
-        <w:t>(!</w:t>
+        <w:t xml:space="preserve"> (!</w:t>
       </w:r>
       <w:proofErr w:type="spellStart"/>
       <w:r>
         <w:t>IsPostBack</w:t>
       </w:r>
       <w:proofErr w:type="spellEnd"/>
-      <w:proofErr w:type="gramEnd"/>
-      <w:r>
-        <w:t xml:space="preserve">)), el ciclo de vida de la página destruirá y recreará todos los botones dinámicos antes de procesar el evento de clic, lo que anulará la acción del usuario. La carga de datos debe restringirse a la primera carga de la </w:t>
-      </w:r>
-      <w:proofErr w:type="gramStart"/>
-      <w:r>
-        <w:t>página .</w:t>
-      </w:r>
-      <w:proofErr w:type="gramEnd"/>
+      <w:r>
+        <w:t>)), el ciclo de vida de la página destruirá y recreará todos los botones dinámicos antes de procesar el evento de clic, lo que anulará la acción del usuario. La carga de datos debe restringirse a la primera carga de la página .</w:t>
+      </w:r>
     </w:p>
     <w:p>
       <w:pPr>
@@ -2011,11 +1933,9 @@
         <w:t>PostBack</w:t>
       </w:r>
       <w:proofErr w:type="spellEnd"/>
-      <w:proofErr w:type="gramStart"/>
       <w:r>
         <w:t>) .</w:t>
       </w:r>
-      <w:proofErr w:type="gramEnd"/>
     </w:p>
     <w:p>
       <w:pPr>
@@ -2127,15 +2047,7 @@
           <w:b/>
           <w:bCs/>
         </w:rPr>
-        <w:t xml:space="preserve"> </w:t>
-      </w:r>
-      <w:proofErr w:type="gramStart"/>
-      <w:r>
-        <w:rPr>
-          <w:b/>
-          <w:bCs/>
-        </w:rPr>
-        <w:t>(!</w:t>
+        <w:t xml:space="preserve"> (!</w:t>
       </w:r>
       <w:proofErr w:type="spellStart"/>
       <w:r>
@@ -2146,7 +2058,6 @@
         <w:t>IsPostBack</w:t>
       </w:r>
       <w:proofErr w:type="spellEnd"/>
-      <w:proofErr w:type="gramEnd"/>
       <w:r>
         <w:rPr>
           <w:b/>
@@ -2271,18 +2182,13 @@
       </w:r>
       <w:proofErr w:type="spellEnd"/>
       <w:r>
-        <w:t xml:space="preserve"> </w:t>
-      </w:r>
-      <w:proofErr w:type="gramStart"/>
-      <w:r>
-        <w:t>(!</w:t>
+        <w:t xml:space="preserve"> (!</w:t>
       </w:r>
       <w:proofErr w:type="spellStart"/>
       <w:r>
         <w:t>IsPostBack</w:t>
       </w:r>
       <w:proofErr w:type="spellEnd"/>
-      <w:proofErr w:type="gramEnd"/>
       <w:r>
         <w:t xml:space="preserve">), vuelve a ir a la base de datos y ejecuta </w:t>
       </w:r>
@@ -2306,17 +2212,12 @@
         <w:t xml:space="preserve">Al hacer </w:t>
       </w:r>
       <w:proofErr w:type="spellStart"/>
-      <w:proofErr w:type="gramStart"/>
       <w:r>
         <w:t>DataBind</w:t>
       </w:r>
       <w:proofErr w:type="spellEnd"/>
       <w:r>
-        <w:t>(</w:t>
-      </w:r>
-      <w:proofErr w:type="gramEnd"/>
-      <w:r>
-        <w:t xml:space="preserve">), el servidor </w:t>
+        <w:t xml:space="preserve">(), el servidor </w:t>
       </w:r>
       <w:r>
         <w:rPr>
@@ -2358,21 +2259,8 @@
         <w:t>"Momento, este timbre ya no existe, lo acabo de destruir y reemplazar por uno nuevo en el paso 1"</w:t>
       </w:r>
       <w:r>
-        <w:t xml:space="preserve">. Como el botón original desapareció de la memoria, el clic se ignora por completo y no hace </w:t>
-      </w:r>
-      <w:proofErr w:type="gramStart"/>
-      <w:r>
-        <w:t>nada .</w:t>
-      </w:r>
-      <w:proofErr w:type="gramEnd"/>
-      <w:r>
-        <w:t xml:space="preserve"> ¡De hecho, este fue exactamente el error que le pasó al profe en la clase antes de </w:t>
-      </w:r>
-      <w:proofErr w:type="gramStart"/>
-      <w:r>
-        <w:t>corregirlo !</w:t>
-      </w:r>
-      <w:proofErr w:type="gramEnd"/>
+        <w:t>. Como el botón original desapareció de la memoria, el clic se ignora por completo y no hace nada . ¡De hecho, este fue exactamente el error que le pasó al profe en la clase antes de corregirlo !</w:t>
+      </w:r>
     </w:p>
     <w:p>
       <w:pPr>
@@ -2386,15 +2274,7 @@
           <w:b/>
           <w:bCs/>
         </w:rPr>
-        <w:t xml:space="preserve">La Solución: El escudo del </w:t>
-      </w:r>
-      <w:proofErr w:type="gramStart"/>
-      <w:r>
-        <w:rPr>
-          <w:b/>
-          <w:bCs/>
-        </w:rPr>
-        <w:t>(!</w:t>
+        <w:t>La Solución: El escudo del (!</w:t>
       </w:r>
       <w:proofErr w:type="spellStart"/>
       <w:r>
@@ -2405,7 +2285,6 @@
         <w:t>IsPostBack</w:t>
       </w:r>
       <w:proofErr w:type="spellEnd"/>
-      <w:proofErr w:type="gramEnd"/>
       <w:r>
         <w:rPr>
           <w:b/>
@@ -2484,13 +2363,8 @@
         <w:t>Paso 2</w:t>
       </w:r>
       <w:r>
-        <w:t xml:space="preserve">, el botón original sigue existiendo y el evento se dispara a la </w:t>
-      </w:r>
-      <w:proofErr w:type="gramStart"/>
-      <w:r>
-        <w:t>perfección .</w:t>
-      </w:r>
-      <w:proofErr w:type="gramEnd"/>
+        <w:t>, el botón original sigue existiendo y el evento se dispara a la perfección .</w:t>
+      </w:r>
     </w:p>
     <w:p>
       <w:pPr>
@@ -2525,13 +2399,8 @@
         <w:ind w:left="720"/>
       </w:pPr>
       <w:r>
-        <w:t xml:space="preserve">La elección del control de presentación de datos no obedece a una regla estricta, sino que depende del diseño visual requerido y de la funcionalidad de la </w:t>
-      </w:r>
-      <w:proofErr w:type="gramStart"/>
-      <w:r>
-        <w:t>pantalla .</w:t>
-      </w:r>
-      <w:proofErr w:type="gramEnd"/>
+        <w:t>La elección del control de presentación de datos no obedece a una regla estricta, sino que depende del diseño visual requerido y de la funcionalidad de la pantalla .</w:t>
+      </w:r>
     </w:p>
     <w:p>
       <w:pPr>
@@ -2576,13 +2445,8 @@
         <w:t>Uso ideal:</w:t>
       </w:r>
       <w:r>
-        <w:t xml:space="preserve"> Paneles de administración, sistemas de gestión (ABM / CRUD), reportes </w:t>
-      </w:r>
-      <w:proofErr w:type="gramStart"/>
-      <w:r>
-        <w:t>financieros .</w:t>
-      </w:r>
-      <w:proofErr w:type="gramEnd"/>
+        <w:t xml:space="preserve"> Paneles de administración, sistemas de gestión (ABM / CRUD), reportes financieros .</w:t>
+      </w:r>
     </w:p>
     <w:p>
       <w:pPr>
@@ -2599,13 +2463,8 @@
         <w:t>Ventajas:</w:t>
       </w:r>
       <w:r>
-        <w:t xml:space="preserve"> Genera una estructura tabular (&lt;table&gt;) estructurada. Posee muchísima funcionalidad incorporada (paginación, ordenamiento, botones de comando en la misma fila) que ahorra tiempo de desarrollo para interfaces </w:t>
-      </w:r>
-      <w:proofErr w:type="gramStart"/>
-      <w:r>
-        <w:t>internas .</w:t>
-      </w:r>
-      <w:proofErr w:type="gramEnd"/>
+        <w:t xml:space="preserve"> Genera una estructura tabular (&lt;table&gt;) estructurada. Posee muchísima funcionalidad incorporada (paginación, ordenamiento, botones de comando en la misma fila) que ahorra tiempo de desarrollo para interfaces internas .</w:t>
+      </w:r>
     </w:p>
     <w:p>
       <w:pPr>
@@ -2622,13 +2481,8 @@
         <w:t>Desventajas:</w:t>
       </w:r>
       <w:r>
-        <w:t xml:space="preserve"> Es muy rígido visualmente. No sirve para diseños modernos orientados al cliente final (como catálogos de tarjetas, carruseles o banners</w:t>
-      </w:r>
-      <w:proofErr w:type="gramStart"/>
-      <w:r>
-        <w:t>) .</w:t>
-      </w:r>
-      <w:proofErr w:type="gramEnd"/>
+        <w:t xml:space="preserve"> Es muy rígido visualmente. No sirve para diseños modernos orientados al cliente final (como catálogos de tarjetas, carruseles o banners) .</w:t>
+      </w:r>
     </w:p>
     <w:p>
       <w:pPr>
@@ -2673,13 +2527,8 @@
         <w:t>Uso ideal:</w:t>
       </w:r>
       <w:r>
-        <w:t xml:space="preserve"> Catálogos visuales y estructuras de datos jerárquicas o </w:t>
-      </w:r>
-      <w:proofErr w:type="gramStart"/>
-      <w:r>
-        <w:t>anidadas .</w:t>
-      </w:r>
-      <w:proofErr w:type="gramEnd"/>
+        <w:t xml:space="preserve"> Catálogos visuales y estructuras de datos jerárquicas o anidadas .</w:t>
+      </w:r>
     </w:p>
     <w:p>
       <w:pPr>
@@ -2722,13 +2571,8 @@
       </w:r>
       <w:proofErr w:type="spellEnd"/>
       <w:r>
-        <w:t xml:space="preserve"> dentro de otro para dibujar elementos HTML </w:t>
-      </w:r>
-      <w:proofErr w:type="gramStart"/>
-      <w:r>
-        <w:t>complejos .</w:t>
-      </w:r>
-      <w:proofErr w:type="gramEnd"/>
+        <w:t xml:space="preserve"> dentro de otro para dibujar elementos HTML complejos .</w:t>
+      </w:r>
     </w:p>
     <w:p>
       <w:pPr>
@@ -2745,13 +2589,8 @@
         <w:t>Desventajas:</w:t>
       </w:r>
       <w:r>
-        <w:t xml:space="preserve"> La sintaxis HTML queda un poco sucia ("código espagueti") y no permite manejar eventos de servidor en la misma página de forma nativa; requiere el envío de parámetros por URL a través de etiquetas &lt;a</w:t>
-      </w:r>
-      <w:proofErr w:type="gramStart"/>
-      <w:r>
-        <w:t>&gt; .</w:t>
-      </w:r>
-      <w:proofErr w:type="gramEnd"/>
+        <w:t xml:space="preserve"> La sintaxis HTML queda un poco sucia ("código espagueti") y no permite manejar eventos de servidor en la misma página de forma nativa; requiere el envío de parámetros por URL a través de etiquetas &lt;a&gt; .</w:t>
+      </w:r>
     </w:p>
     <w:p>
       <w:pPr>
@@ -2765,7 +2604,6 @@
         <w:t>3. Control &lt;</w:t>
       </w:r>
       <w:proofErr w:type="spellStart"/>
-      <w:proofErr w:type="gramStart"/>
       <w:r>
         <w:rPr>
           <w:b/>
@@ -2774,7 +2612,6 @@
         <w:t>asp:Repeater</w:t>
       </w:r>
       <w:proofErr w:type="spellEnd"/>
-      <w:proofErr w:type="gramEnd"/>
       <w:r>
         <w:rPr>
           <w:b/>
@@ -2798,13 +2635,8 @@
         <w:t>Uso ideal:</w:t>
       </w:r>
       <w:r>
-        <w:t xml:space="preserve"> Catálogos interactivos, listas de productos con botones de acción rápida ("Agregar al carrito", "Marcar favorito"</w:t>
-      </w:r>
-      <w:proofErr w:type="gramStart"/>
-      <w:r>
-        <w:t>) .</w:t>
-      </w:r>
-      <w:proofErr w:type="gramEnd"/>
+        <w:t xml:space="preserve"> Catálogos interactivos, listas de productos con botones de acción rápida ("Agregar al carrito", "Marcar favorito") .</w:t>
+      </w:r>
     </w:p>
     <w:p>
       <w:pPr>
@@ -2824,25 +2656,18 @@
         <w:t xml:space="preserve"> HTML mucho más limpio en la capa de presentación mediante la función &lt;%# </w:t>
       </w:r>
       <w:proofErr w:type="spellStart"/>
-      <w:proofErr w:type="gramStart"/>
       <w:r>
         <w:t>Eval</w:t>
       </w:r>
       <w:proofErr w:type="spellEnd"/>
       <w:r>
-        <w:t>(</w:t>
-      </w:r>
-      <w:proofErr w:type="gramEnd"/>
-      <w:r>
-        <w:t>) %&gt; . Su característica principal es la integración de controles de servidor (como &lt;</w:t>
-      </w:r>
-      <w:proofErr w:type="spellStart"/>
-      <w:proofErr w:type="gramStart"/>
+        <w:t>() %&gt; . Su característica principal es la integración de controles de servidor (como &lt;</w:t>
+      </w:r>
+      <w:proofErr w:type="spellStart"/>
       <w:r>
         <w:t>asp:Button</w:t>
       </w:r>
       <w:proofErr w:type="spellEnd"/>
-      <w:proofErr w:type="gramEnd"/>
       <w:r>
         <w:t>&gt;) que permiten capturar eventos (</w:t>
       </w:r>
@@ -3034,17 +2859,12 @@
         <w:t xml:space="preserve"> de la grilla y volver a invocar el método </w:t>
       </w:r>
       <w:proofErr w:type="spellStart"/>
-      <w:proofErr w:type="gramStart"/>
       <w:r>
         <w:t>DataBind</w:t>
       </w:r>
       <w:proofErr w:type="spellEnd"/>
       <w:r>
-        <w:t>(</w:t>
-      </w:r>
-      <w:proofErr w:type="gramEnd"/>
-      <w:r>
-        <w:t>) .</w:t>
+        <w:t>() .</w:t>
       </w:r>
     </w:p>
     <w:p>
@@ -3070,13 +2890,8 @@
       </w:r>
       <w:proofErr w:type="spellEnd"/>
       <w:r>
-        <w:t xml:space="preserve"> para modificar datos directamente sobre las celdas de la grilla. Sin embargo, a nivel arquitectónico y de UX, esta práctica se desaconseja para tablas con muchas columnas, ya que genera una interfaz similar a una hoja de cálculo de Excel, resultando tediosa y poco </w:t>
-      </w:r>
-      <w:proofErr w:type="gramStart"/>
-      <w:r>
-        <w:t>práctica .</w:t>
-      </w:r>
-      <w:proofErr w:type="gramEnd"/>
+        <w:t xml:space="preserve"> para modificar datos directamente sobre las celdas de la grilla. Sin embargo, a nivel arquitectónico y de UX, esta práctica se desaconseja para tablas con muchas columnas, ya que genera una interfaz similar a una hoja de cálculo de Excel, resultando tediosa y poco práctica .</w:t>
+      </w:r>
     </w:p>
     <w:p>
       <w:pPr>
@@ -3335,41 +3150,33 @@
     </w:p>
     <w:p>
       <w:r>
-        <w:t xml:space="preserve">La letra </w:t>
-      </w:r>
-      <w:proofErr w:type="gramStart"/>
+        <w:t>La letra e es simplemente una convención mundial en C# para abreviar "</w:t>
+      </w:r>
+      <w:proofErr w:type="spellStart"/>
+      <w:r>
+        <w:t>Event</w:t>
+      </w:r>
+      <w:proofErr w:type="spellEnd"/>
+      <w:r>
+        <w:t xml:space="preserve">", pero podrías llamarla </w:t>
+      </w:r>
+      <w:proofErr w:type="spellStart"/>
+      <w:r>
+        <w:t>datosDelEvento</w:t>
+      </w:r>
+      <w:proofErr w:type="spellEnd"/>
+      <w:r>
+        <w:t xml:space="preserve"> si quisieras.</w:t>
+      </w:r>
+    </w:p>
+    <w:p>
+      <w:r>
+        <w:t xml:space="preserve">Como este es un evento específico de paginación, la "cajita" </w:t>
+      </w:r>
+      <w:proofErr w:type="spellStart"/>
       <w:r>
         <w:t>e</w:t>
       </w:r>
-      <w:proofErr w:type="gramEnd"/>
-      <w:r>
-        <w:t xml:space="preserve"> es simplemente una convención mundial en C# para abreviar "</w:t>
-      </w:r>
-      <w:proofErr w:type="spellStart"/>
-      <w:r>
-        <w:t>Event</w:t>
-      </w:r>
-      <w:proofErr w:type="spellEnd"/>
-      <w:r>
-        <w:t xml:space="preserve">", pero podrías llamarla </w:t>
-      </w:r>
-      <w:proofErr w:type="spellStart"/>
-      <w:r>
-        <w:t>datosDelEvento</w:t>
-      </w:r>
-      <w:proofErr w:type="spellEnd"/>
-      <w:r>
-        <w:t xml:space="preserve"> si quisieras.</w:t>
-      </w:r>
-    </w:p>
-    <w:p>
-      <w:r>
-        <w:t xml:space="preserve">Como este es un evento específico de paginación, la "cajita" </w:t>
-      </w:r>
-      <w:proofErr w:type="spellStart"/>
-      <w:r>
-        <w:t>e</w:t>
-      </w:r>
       <w:proofErr w:type="spellEnd"/>
       <w:r>
         <w:t xml:space="preserve"> es del tipo </w:t>
@@ -3383,7 +3190,6 @@
         <w:t xml:space="preserve">. Adentro de esa cajita viene guardado exactamente el número de la página que el usuario tocó. Ese número se guarda en la propiedad </w:t>
       </w:r>
       <w:proofErr w:type="spellStart"/>
-      <w:proofErr w:type="gramStart"/>
       <w:r>
         <w:t>NewPageIndex</w:t>
       </w:r>
@@ -3391,7 +3197,6 @@
       <w:r>
         <w:t xml:space="preserve"> .</w:t>
       </w:r>
-      <w:proofErr w:type="gramEnd"/>
     </w:p>
     <w:p>
       <w:r>
@@ -3418,7 +3223,6 @@
         <w:t xml:space="preserve"> = </w:t>
       </w:r>
       <w:proofErr w:type="spellStart"/>
-      <w:proofErr w:type="gramStart"/>
       <w:r>
         <w:rPr>
           <w:b/>
@@ -3427,7 +3231,6 @@
         <w:t>e.NewPageIndex</w:t>
       </w:r>
       <w:proofErr w:type="spellEnd"/>
-      <w:proofErr w:type="gramEnd"/>
       <w:r>
         <w:rPr>
           <w:b/>
@@ -3720,15 +3523,7 @@
       </w:r>
       <w:proofErr w:type="spellEnd"/>
       <w:r>
-        <w:t xml:space="preserve">, el parámetro </w:t>
-      </w:r>
-      <w:proofErr w:type="gramStart"/>
-      <w:r>
-        <w:t>e</w:t>
-      </w:r>
-      <w:proofErr w:type="gramEnd"/>
-      <w:r>
-        <w:t xml:space="preserve"> es del tipo específico </w:t>
+        <w:t xml:space="preserve">, el parámetro e es del tipo específico </w:t>
       </w:r>
       <w:proofErr w:type="spellStart"/>
       <w:r>
@@ -3747,6 +3542,238 @@
         <w:t>, la cual almacena el índice base-cero de la nueva página que el usuario solicitó visualizar.</w:t>
       </w:r>
     </w:p>
+    <w:p>
+      <w:r>
+        <w:rPr>
+          <w:b/>
+          <w:bCs/>
+        </w:rPr>
+        <w:t>TEMA: Procedimientos Almacenados (</w:t>
+      </w:r>
+      <w:proofErr w:type="spellStart"/>
+      <w:r>
+        <w:rPr>
+          <w:b/>
+          <w:bCs/>
+        </w:rPr>
+        <w:t>Stored</w:t>
+      </w:r>
+      <w:proofErr w:type="spellEnd"/>
+      <w:r>
+        <w:rPr>
+          <w:b/>
+          <w:bCs/>
+        </w:rPr>
+        <w:t xml:space="preserve"> </w:t>
+      </w:r>
+      <w:proofErr w:type="spellStart"/>
+      <w:r>
+        <w:rPr>
+          <w:b/>
+          <w:bCs/>
+        </w:rPr>
+        <w:t>Procedures</w:t>
+      </w:r>
+      <w:proofErr w:type="spellEnd"/>
+      <w:r>
+        <w:rPr>
+          <w:b/>
+          <w:bCs/>
+        </w:rPr>
+        <w:t>)</w:t>
+      </w:r>
+    </w:p>
+    <w:p>
+      <w:pPr>
+        <w:numPr>
+          <w:ilvl w:val="0"/>
+          <w:numId w:val="21"/>
+        </w:numPr>
+      </w:pPr>
+      <w:r>
+        <w:rPr>
+          <w:b/>
+          <w:bCs/>
+        </w:rPr>
+        <w:t>¿Qué es?</w:t>
+      </w:r>
+      <w:r>
+        <w:t xml:space="preserve"> Un Procedimiento Almacenado (SP) es un conjunto de instrucciones de código SQL (como SELECT, INSERT, UPDATE, DELETE) que se agrupan, se compilan y se guardan directamente en el motor de la base de datos (ej. SQL Server) bajo un nombre específico. Funciona de manera muy similar a un "método" o "función" en C#, pero vive dentro de la base de datos.</w:t>
+      </w:r>
+    </w:p>
+    <w:p>
+      <w:pPr>
+        <w:numPr>
+          <w:ilvl w:val="0"/>
+          <w:numId w:val="21"/>
+        </w:numPr>
+      </w:pPr>
+      <w:r>
+        <w:rPr>
+          <w:b/>
+          <w:bCs/>
+        </w:rPr>
+        <w:t>¿Cómo funciona?</w:t>
+      </w:r>
+      <w:r>
+        <w:t xml:space="preserve"> En lugar de que la aplicación cliente (tu código C#) arme la consulta SQL concatenando textos (consultas embebidas) y la envíe cruda por la red, la aplicación simplemente invoca el nombre del Procedimiento Almacenado (ej. </w:t>
+      </w:r>
+      <w:proofErr w:type="spellStart"/>
+      <w:r>
+        <w:t>StoreAltaPokemon</w:t>
+      </w:r>
+      <w:proofErr w:type="spellEnd"/>
+      <w:r>
+        <w:t xml:space="preserve">) y le pasa los valores necesarios a través de </w:t>
+      </w:r>
+      <w:r>
+        <w:rPr>
+          <w:b/>
+          <w:bCs/>
+        </w:rPr>
+        <w:t>parámetros</w:t>
+      </w:r>
+      <w:r>
+        <w:t xml:space="preserve"> (las variables que empiezan con @).</w:t>
+      </w:r>
+    </w:p>
+    <w:p>
+      <w:pPr>
+        <w:numPr>
+          <w:ilvl w:val="0"/>
+          <w:numId w:val="21"/>
+        </w:numPr>
+      </w:pPr>
+      <w:r>
+        <w:rPr>
+          <w:b/>
+          <w:bCs/>
+        </w:rPr>
+        <w:t>Ventajas principales (Por qué se usan a nivel profesional):</w:t>
+      </w:r>
+    </w:p>
+    <w:p>
+      <w:pPr>
+        <w:numPr>
+          <w:ilvl w:val="1"/>
+          <w:numId w:val="21"/>
+        </w:numPr>
+      </w:pPr>
+      <w:r>
+        <w:rPr>
+          <w:b/>
+          <w:bCs/>
+        </w:rPr>
+        <w:t>Seguridad (Prevención de Inyección SQL):</w:t>
+      </w:r>
+      <w:r>
+        <w:t xml:space="preserve"> Al usar parámetros fuertemente tipados en lugar de concatenar cadenas de texto, el motor de la base de datos sabe distinguir entre el comando SQL y los datos del usuario, evitando que un atacante inyecte código malicioso.</w:t>
+      </w:r>
+    </w:p>
+    <w:p>
+      <w:pPr>
+        <w:numPr>
+          <w:ilvl w:val="1"/>
+          <w:numId w:val="21"/>
+        </w:numPr>
+      </w:pPr>
+      <w:r>
+        <w:rPr>
+          <w:b/>
+          <w:bCs/>
+        </w:rPr>
+        <w:t>Rendimiento (Performance):</w:t>
+      </w:r>
+      <w:r>
+        <w:t xml:space="preserve"> Cuando </w:t>
+      </w:r>
+      <w:proofErr w:type="spellStart"/>
+      <w:r>
+        <w:t>guardás</w:t>
+      </w:r>
+      <w:proofErr w:type="spellEnd"/>
+      <w:r>
+        <w:t xml:space="preserve"> un SP en SQL Server, el motor lo analiza y crea un "plan de ejecución" optimizado y </w:t>
+      </w:r>
+      <w:proofErr w:type="spellStart"/>
+      <w:r>
+        <w:t>pre-compilado</w:t>
+      </w:r>
+      <w:proofErr w:type="spellEnd"/>
+      <w:r>
+        <w:t>. Es mucho más rápido ejecutar un SP que mandarle una consulta de texto plano cada vez.</w:t>
+      </w:r>
+    </w:p>
+    <w:p>
+      <w:pPr>
+        <w:numPr>
+          <w:ilvl w:val="1"/>
+          <w:numId w:val="21"/>
+        </w:numPr>
+      </w:pPr>
+      <w:r>
+        <w:rPr>
+          <w:b/>
+          <w:bCs/>
+        </w:rPr>
+        <w:t>Mantenibilidad y Desacoplamiento:</w:t>
+      </w:r>
+      <w:r>
+        <w:t xml:space="preserve"> Si el día de mañana </w:t>
+      </w:r>
+      <w:proofErr w:type="spellStart"/>
+      <w:r>
+        <w:t>agregás</w:t>
+      </w:r>
+      <w:proofErr w:type="spellEnd"/>
+      <w:r>
+        <w:t xml:space="preserve"> una columna a la tabla, solo </w:t>
+      </w:r>
+      <w:proofErr w:type="spellStart"/>
+      <w:r>
+        <w:t>modificás</w:t>
+      </w:r>
+      <w:proofErr w:type="spellEnd"/>
+      <w:r>
+        <w:t xml:space="preserve"> el código SQL dentro del motor de base de datos. No hace falta tocar el </w:t>
+      </w:r>
+      <w:proofErr w:type="spellStart"/>
+      <w:r>
+        <w:t>string</w:t>
+      </w:r>
+      <w:proofErr w:type="spellEnd"/>
+      <w:r>
+        <w:t xml:space="preserve"> de C#, ni volver a compilar, ni volver a publicar toda la aplicación web.</w:t>
+      </w:r>
+    </w:p>
+    <w:p>
+      <w:pPr>
+        <w:numPr>
+          <w:ilvl w:val="1"/>
+          <w:numId w:val="21"/>
+        </w:numPr>
+      </w:pPr>
+      <w:r>
+        <w:rPr>
+          <w:b/>
+          <w:bCs/>
+        </w:rPr>
+        <w:lastRenderedPageBreak/>
+        <w:t>Tráfico de red:</w:t>
+      </w:r>
+      <w:r>
+        <w:t xml:space="preserve"> Se envía menos información por la red. En vez de mandar un INSERT gigante de 500 caracteres, solo </w:t>
+      </w:r>
+      <w:proofErr w:type="spellStart"/>
+      <w:r>
+        <w:t>mandás</w:t>
+      </w:r>
+      <w:proofErr w:type="spellEnd"/>
+      <w:r>
+        <w:t xml:space="preserve"> la instrucción "Ejecutar Alta" y los datos.</w:t>
+      </w:r>
+    </w:p>
+    <w:p/>
     <w:p>
       <w:r>
         <w:rPr>
@@ -3829,15 +3856,7 @@
       </w:r>
       <w:proofErr w:type="spellEnd"/>
       <w:r>
-        <w:t xml:space="preserve"> qué acción ejecutar evaluando la existencia de un parámetro identificador (</w:t>
-      </w:r>
-      <w:proofErr w:type="gramStart"/>
-      <w:r>
-        <w:t>ej. ?id</w:t>
-      </w:r>
-      <w:proofErr w:type="gramEnd"/>
-      <w:r>
-        <w:t xml:space="preserve">=X) en el </w:t>
+        <w:t xml:space="preserve"> qué acción ejecutar evaluando la existencia de un parámetro identificador (ej. ?id=X) en el </w:t>
       </w:r>
       <w:proofErr w:type="spellStart"/>
       <w:r>
@@ -4004,7 +4023,6 @@
           <w:b/>
           <w:bCs/>
         </w:rPr>
-        <w:lastRenderedPageBreak/>
         <w:t>AutoPostBack</w:t>
       </w:r>
       <w:proofErr w:type="spellEnd"/>
@@ -4214,6 +4232,7 @@
           <w:b/>
           <w:bCs/>
         </w:rPr>
+        <w:lastRenderedPageBreak/>
         <w:t>El Principio del Procesamiento en Lote (</w:t>
       </w:r>
       <w:proofErr w:type="spellStart"/>
@@ -4236,12 +4255,10 @@
         <w:t xml:space="preserve"> La mejor práctica de rendimiento web dicta que los datos de un formulario (como cadenas de texto o números) deben recolectarse localmente en el cliente y enviarse en una única petición al servidor mediante un control de envío (ej. &lt;</w:t>
       </w:r>
       <w:proofErr w:type="spellStart"/>
-      <w:proofErr w:type="gramStart"/>
       <w:r>
         <w:t>asp:Button</w:t>
       </w:r>
       <w:proofErr w:type="spellEnd"/>
-      <w:proofErr w:type="gramEnd"/>
       <w:r>
         <w:t xml:space="preserve"> ID="</w:t>
       </w:r>
@@ -4391,17 +4408,12 @@
         <w:t xml:space="preserve">). Es responsabilidad del desarrollador instanciar el objeto de dominio correspondiente (ej. new </w:t>
       </w:r>
       <w:proofErr w:type="spellStart"/>
-      <w:proofErr w:type="gramStart"/>
       <w:r>
         <w:t>Pokemon</w:t>
       </w:r>
       <w:proofErr w:type="spellEnd"/>
       <w:r>
-        <w:t>(</w:t>
-      </w:r>
-      <w:proofErr w:type="gramEnd"/>
-      <w:r>
-        <w:t xml:space="preserve">)) y realizar el mapeo manual, aplicando las conversiones de tipo necesarias (como </w:t>
+        <w:t xml:space="preserve">()) y realizar el mapeo manual, aplicando las conversiones de tipo necesarias (como </w:t>
       </w:r>
       <w:proofErr w:type="spellStart"/>
       <w:r>
@@ -4459,19 +4471,13 @@
       </w:r>
       <w:proofErr w:type="spellEnd"/>
       <w:r>
-        <w:t xml:space="preserve">). Para reconstruir las relaciones, </w:t>
-      </w:r>
-      <w:r>
-        <w:lastRenderedPageBreak/>
-        <w:t xml:space="preserve">se debe instanciar manualmente el objeto anidado e inyectarle dicho ID (ej. </w:t>
-      </w:r>
-      <w:proofErr w:type="spellStart"/>
-      <w:proofErr w:type="gramStart"/>
+        <w:t xml:space="preserve">). Para reconstruir las relaciones, se debe instanciar manualmente el objeto anidado e inyectarle dicho ID (ej. </w:t>
+      </w:r>
+      <w:proofErr w:type="spellStart"/>
       <w:r>
         <w:t>nuevo.Tipo</w:t>
       </w:r>
       <w:proofErr w:type="spellEnd"/>
-      <w:proofErr w:type="gramEnd"/>
       <w:r>
         <w:t xml:space="preserve"> = new Elemento(); </w:t>
       </w:r>
@@ -6852,6 +6858,151 @@
     </w:lvl>
   </w:abstractNum>
   <w:abstractNum w:abstractNumId="15" w15:restartNumberingAfterBreak="0">
+    <w:nsid w:val="63FC054C"/>
+    <w:multiLevelType w:val="multilevel"/>
+    <w:tmpl w:val="D00A9D0A"/>
+    <w:lvl w:ilvl="0">
+      <w:start w:val="1"/>
+      <w:numFmt w:val="bullet"/>
+      <w:lvlText w:val=""/>
+      <w:lvlJc w:val="left"/>
+      <w:pPr>
+        <w:tabs>
+          <w:tab w:val="num" w:pos="720"/>
+        </w:tabs>
+        <w:ind w:left="720" w:hanging="360"/>
+      </w:pPr>
+      <w:rPr>
+        <w:rFonts w:ascii="Symbol" w:hAnsi="Symbol" w:hint="default"/>
+        <w:sz w:val="20"/>
+      </w:rPr>
+    </w:lvl>
+    <w:lvl w:ilvl="1">
+      <w:start w:val="1"/>
+      <w:numFmt w:val="decimal"/>
+      <w:lvlText w:val="%2."/>
+      <w:lvlJc w:val="left"/>
+      <w:pPr>
+        <w:tabs>
+          <w:tab w:val="num" w:pos="1440"/>
+        </w:tabs>
+        <w:ind w:left="1440" w:hanging="360"/>
+      </w:pPr>
+    </w:lvl>
+    <w:lvl w:ilvl="2" w:tentative="1">
+      <w:start w:val="1"/>
+      <w:numFmt w:val="bullet"/>
+      <w:lvlText w:val=""/>
+      <w:lvlJc w:val="left"/>
+      <w:pPr>
+        <w:tabs>
+          <w:tab w:val="num" w:pos="2160"/>
+        </w:tabs>
+        <w:ind w:left="2160" w:hanging="360"/>
+      </w:pPr>
+      <w:rPr>
+        <w:rFonts w:ascii="Wingdings" w:hAnsi="Wingdings" w:hint="default"/>
+        <w:sz w:val="20"/>
+      </w:rPr>
+    </w:lvl>
+    <w:lvl w:ilvl="3" w:tentative="1">
+      <w:start w:val="1"/>
+      <w:numFmt w:val="bullet"/>
+      <w:lvlText w:val=""/>
+      <w:lvlJc w:val="left"/>
+      <w:pPr>
+        <w:tabs>
+          <w:tab w:val="num" w:pos="2880"/>
+        </w:tabs>
+        <w:ind w:left="2880" w:hanging="360"/>
+      </w:pPr>
+      <w:rPr>
+        <w:rFonts w:ascii="Wingdings" w:hAnsi="Wingdings" w:hint="default"/>
+        <w:sz w:val="20"/>
+      </w:rPr>
+    </w:lvl>
+    <w:lvl w:ilvl="4" w:tentative="1">
+      <w:start w:val="1"/>
+      <w:numFmt w:val="bullet"/>
+      <w:lvlText w:val=""/>
+      <w:lvlJc w:val="left"/>
+      <w:pPr>
+        <w:tabs>
+          <w:tab w:val="num" w:pos="3600"/>
+        </w:tabs>
+        <w:ind w:left="3600" w:hanging="360"/>
+      </w:pPr>
+      <w:rPr>
+        <w:rFonts w:ascii="Wingdings" w:hAnsi="Wingdings" w:hint="default"/>
+        <w:sz w:val="20"/>
+      </w:rPr>
+    </w:lvl>
+    <w:lvl w:ilvl="5" w:tentative="1">
+      <w:start w:val="1"/>
+      <w:numFmt w:val="bullet"/>
+      <w:lvlText w:val=""/>
+      <w:lvlJc w:val="left"/>
+      <w:pPr>
+        <w:tabs>
+          <w:tab w:val="num" w:pos="4320"/>
+        </w:tabs>
+        <w:ind w:left="4320" w:hanging="360"/>
+      </w:pPr>
+      <w:rPr>
+        <w:rFonts w:ascii="Wingdings" w:hAnsi="Wingdings" w:hint="default"/>
+        <w:sz w:val="20"/>
+      </w:rPr>
+    </w:lvl>
+    <w:lvl w:ilvl="6" w:tentative="1">
+      <w:start w:val="1"/>
+      <w:numFmt w:val="bullet"/>
+      <w:lvlText w:val=""/>
+      <w:lvlJc w:val="left"/>
+      <w:pPr>
+        <w:tabs>
+          <w:tab w:val="num" w:pos="5040"/>
+        </w:tabs>
+        <w:ind w:left="5040" w:hanging="360"/>
+      </w:pPr>
+      <w:rPr>
+        <w:rFonts w:ascii="Wingdings" w:hAnsi="Wingdings" w:hint="default"/>
+        <w:sz w:val="20"/>
+      </w:rPr>
+    </w:lvl>
+    <w:lvl w:ilvl="7" w:tentative="1">
+      <w:start w:val="1"/>
+      <w:numFmt w:val="bullet"/>
+      <w:lvlText w:val=""/>
+      <w:lvlJc w:val="left"/>
+      <w:pPr>
+        <w:tabs>
+          <w:tab w:val="num" w:pos="5760"/>
+        </w:tabs>
+        <w:ind w:left="5760" w:hanging="360"/>
+      </w:pPr>
+      <w:rPr>
+        <w:rFonts w:ascii="Wingdings" w:hAnsi="Wingdings" w:hint="default"/>
+        <w:sz w:val="20"/>
+      </w:rPr>
+    </w:lvl>
+    <w:lvl w:ilvl="8" w:tentative="1">
+      <w:start w:val="1"/>
+      <w:numFmt w:val="bullet"/>
+      <w:lvlText w:val=""/>
+      <w:lvlJc w:val="left"/>
+      <w:pPr>
+        <w:tabs>
+          <w:tab w:val="num" w:pos="6480"/>
+        </w:tabs>
+        <w:ind w:left="6480" w:hanging="360"/>
+      </w:pPr>
+      <w:rPr>
+        <w:rFonts w:ascii="Wingdings" w:hAnsi="Wingdings" w:hint="default"/>
+        <w:sz w:val="20"/>
+      </w:rPr>
+    </w:lvl>
+  </w:abstractNum>
+  <w:abstractNum w:abstractNumId="16" w15:restartNumberingAfterBreak="0">
     <w:nsid w:val="6DBF7670"/>
     <w:multiLevelType w:val="multilevel"/>
     <w:tmpl w:val="CC963EBA"/>
@@ -7000,7 +7151,7 @@
       </w:rPr>
     </w:lvl>
   </w:abstractNum>
-  <w:abstractNum w:abstractNumId="16" w15:restartNumberingAfterBreak="0">
+  <w:abstractNum w:abstractNumId="17" w15:restartNumberingAfterBreak="0">
     <w:nsid w:val="6F4C7C29"/>
     <w:multiLevelType w:val="multilevel"/>
     <w:tmpl w:val="0CC08082"/>
@@ -7113,7 +7264,7 @@
       </w:pPr>
     </w:lvl>
   </w:abstractNum>
-  <w:abstractNum w:abstractNumId="17" w15:restartNumberingAfterBreak="0">
+  <w:abstractNum w:abstractNumId="18" w15:restartNumberingAfterBreak="0">
     <w:nsid w:val="71B169B8"/>
     <w:multiLevelType w:val="multilevel"/>
     <w:tmpl w:val="124416DC"/>
@@ -7258,7 +7409,7 @@
       </w:rPr>
     </w:lvl>
   </w:abstractNum>
-  <w:abstractNum w:abstractNumId="18" w15:restartNumberingAfterBreak="0">
+  <w:abstractNum w:abstractNumId="19" w15:restartNumberingAfterBreak="0">
     <w:nsid w:val="71DD7274"/>
     <w:multiLevelType w:val="multilevel"/>
     <w:tmpl w:val="2C645D04"/>
@@ -7371,7 +7522,7 @@
       </w:pPr>
     </w:lvl>
   </w:abstractNum>
-  <w:abstractNum w:abstractNumId="19" w15:restartNumberingAfterBreak="0">
+  <w:abstractNum w:abstractNumId="20" w15:restartNumberingAfterBreak="0">
     <w:nsid w:val="72380DDF"/>
     <w:multiLevelType w:val="multilevel"/>
     <w:tmpl w:val="B9CC6108"/>
@@ -7542,10 +7693,10 @@
     <w:abstractNumId w:val="6"/>
   </w:num>
   <w:num w:numId="8" w16cid:durableId="1905289728">
-    <w:abstractNumId w:val="15"/>
+    <w:abstractNumId w:val="16"/>
   </w:num>
   <w:num w:numId="9" w16cid:durableId="903224478">
-    <w:abstractNumId w:val="16"/>
+    <w:abstractNumId w:val="17"/>
   </w:num>
   <w:num w:numId="10" w16cid:durableId="1389456004">
     <w:abstractNumId w:val="1"/>
@@ -7563,7 +7714,7 @@
     <w:abstractNumId w:val="12"/>
   </w:num>
   <w:num w:numId="15" w16cid:durableId="1706708101">
-    <w:abstractNumId w:val="18"/>
+    <w:abstractNumId w:val="19"/>
   </w:num>
   <w:num w:numId="16" w16cid:durableId="1900166956">
     <w:abstractNumId w:val="13"/>
@@ -7572,13 +7723,16 @@
     <w:abstractNumId w:val="11"/>
   </w:num>
   <w:num w:numId="18" w16cid:durableId="891696317">
-    <w:abstractNumId w:val="17"/>
+    <w:abstractNumId w:val="18"/>
   </w:num>
   <w:num w:numId="19" w16cid:durableId="1852720404">
-    <w:abstractNumId w:val="19"/>
+    <w:abstractNumId w:val="20"/>
   </w:num>
   <w:num w:numId="20" w16cid:durableId="2080328687">
     <w:abstractNumId w:val="10"/>
+  </w:num>
+  <w:num w:numId="21" w16cid:durableId="2061400506">
+    <w:abstractNumId w:val="15"/>
   </w:num>
 </w:numbering>
 </file>

</xml_diff>

<commit_message>
feat: implementar eliminación lógica y control de estados (Activo/Inactivo) - Modificación del modelo de dominio (Pokemon.cs) agregando la propiedad booleana 'Activo'. - Alteración del Stored Procedure 'SP_ListarPokemons' para incluir la lectura de la columna 'Activo' sin filtrar registros inactivos, manteniendo los LEFT JOIN. - Actualización del mapeo de datos en PokemonNegocio para leer el valor booleano desde el SqlDataReader. - Incorporación de <asp:CheckBoxField> en la grilla de PokemonLista.aspx para visualización rápida del estado de los registros. - Integración del botón 'Inactivar' (btn-warning) en el formulario PokemonForm.aspx, enlazado al método de negocio EliminarLogico() para realizar el 'Soft Delete'. -mejorar visibilidad de la columna estado en la grilla de Pokémon
</commit_message>
<xml_diff>
--- a/Unidad 5 - Pokedex Web/Documentación de Pokedex.docx
+++ b/Unidad 5 - Pokedex Web/Documentación de Pokedex.docx
@@ -831,6 +831,7 @@
         <w:t xml:space="preserve">Importancia del </w:t>
       </w:r>
       <w:proofErr w:type="spellStart"/>
+      <w:proofErr w:type="gramStart"/>
       <w:r>
         <w:rPr>
           <w:b/>
@@ -844,7 +845,15 @@
           <w:b/>
           <w:bCs/>
         </w:rPr>
-        <w:t>():</w:t>
+        <w:t>(</w:t>
+      </w:r>
+      <w:proofErr w:type="gramEnd"/>
+      <w:r>
+        <w:rPr>
+          <w:b/>
+          <w:bCs/>
+        </w:rPr>
+        <w:t>):</w:t>
       </w:r>
       <w:r>
         <w:t xml:space="preserve"> Sin la ejecución de este método en el servidor, la grilla no procesará el origen de datos y no se renderizará ninguna fila en el HTML final del cliente.</w:t>
@@ -1003,10 +1012,12 @@
         <w:t>="false". Esto obliga al desarrollador a definir cada columna mediante &lt;</w:t>
       </w:r>
       <w:proofErr w:type="spellStart"/>
+      <w:proofErr w:type="gramStart"/>
       <w:r>
         <w:t>asp:BoundField</w:t>
       </w:r>
       <w:proofErr w:type="spellEnd"/>
+      <w:proofErr w:type="gramEnd"/>
       <w:r>
         <w:t>&gt;.</w:t>
       </w:r>
@@ -1171,8 +1182,13 @@
       </w:r>
       <w:proofErr w:type="spellEnd"/>
       <w:r>
-        <w:t>), suelen ser rígidos en cuanto a la estructura HTML que generan (tablas &lt;table&gt;). Para interfaces orientadas al usuario final (como catálogos o galerías), se requiere un control total sobre el HTML generado .</w:t>
-      </w:r>
+        <w:t xml:space="preserve">), suelen ser rígidos en cuanto a la estructura HTML que generan (tablas &lt;table&gt;). Para interfaces orientadas al usuario final (como catálogos o galerías), se requiere un control total sobre el HTML </w:t>
+      </w:r>
+      <w:proofErr w:type="gramStart"/>
+      <w:r>
+        <w:t>generado .</w:t>
+      </w:r>
+      <w:proofErr w:type="gramEnd"/>
     </w:p>
     <w:p>
       <w:pPr>
@@ -1205,8 +1221,13 @@
       </w:r>
       <w:proofErr w:type="spellEnd"/>
       <w:r>
-        <w:t>. El motor de renderizado ejecuta este código en el servidor antes de enviar el HTML al cliente .</w:t>
-      </w:r>
+        <w:t xml:space="preserve">. El motor de renderizado ejecuta este código en el servidor antes de enviar el HTML al </w:t>
+      </w:r>
+      <w:proofErr w:type="gramStart"/>
+      <w:r>
+        <w:t>cliente .</w:t>
+      </w:r>
+      <w:proofErr w:type="gramEnd"/>
     </w:p>
     <w:p>
       <w:pPr>
@@ -1279,7 +1300,15 @@
       </w:r>
       <w:proofErr w:type="spellEnd"/>
       <w:r>
-        <w:t>) { %&gt; ... HTML ... &lt;% } %&gt;), el servidor repite ese fragmento HTML por cada elemento de la colección.</w:t>
+        <w:t xml:space="preserve">) </w:t>
+      </w:r>
+      <w:proofErr w:type="gramStart"/>
+      <w:r>
+        <w:t>{ %</w:t>
+      </w:r>
+      <w:proofErr w:type="gramEnd"/>
+      <w:r>
+        <w:t>&gt; ... HTML ... &lt;% } %&gt;), el servidor repite ese fragmento HTML por cada elemento de la colección.</w:t>
       </w:r>
     </w:p>
     <w:p>
@@ -1389,8 +1418,13 @@
       </w:r>
       <w:proofErr w:type="spellEnd"/>
       <w:r>
-        <w:t>&gt; la única obligatoria para definir el contenido repetitivo .</w:t>
-      </w:r>
+        <w:t xml:space="preserve">&gt; la única obligatoria para definir el contenido </w:t>
+      </w:r>
+      <w:proofErr w:type="gramStart"/>
+      <w:r>
+        <w:t>repetitivo .</w:t>
+      </w:r>
+      <w:proofErr w:type="gramEnd"/>
     </w:p>
     <w:p>
       <w:pPr>
@@ -1450,12 +1484,17 @@
         <w:t xml:space="preserve"> procesa estas expresiones cuando se invoca el método </w:t>
       </w:r>
       <w:proofErr w:type="spellStart"/>
+      <w:proofErr w:type="gramStart"/>
       <w:r>
         <w:t>DataBind</w:t>
       </w:r>
       <w:proofErr w:type="spellEnd"/>
       <w:r>
-        <w:t>() en el servidor .</w:t>
+        <w:t>(</w:t>
+      </w:r>
+      <w:proofErr w:type="gramEnd"/>
+      <w:r>
+        <w:t>) en el servidor .</w:t>
       </w:r>
     </w:p>
     <w:p>
@@ -1473,6 +1512,7 @@
         <w:t xml:space="preserve">Método </w:t>
       </w:r>
       <w:proofErr w:type="spellStart"/>
+      <w:proofErr w:type="gramStart"/>
       <w:r>
         <w:rPr>
           <w:b/>
@@ -1486,7 +1526,15 @@
           <w:b/>
           <w:bCs/>
         </w:rPr>
-        <w:t>():</w:t>
+        <w:t>(</w:t>
+      </w:r>
+      <w:proofErr w:type="gramEnd"/>
+      <w:r>
+        <w:rPr>
+          <w:b/>
+          <w:bCs/>
+        </w:rPr>
+        <w:t>):</w:t>
       </w:r>
       <w:r>
         <w:t xml:space="preserve"> Es una función optimizada que utiliza reflexión (</w:t>
@@ -1537,8 +1585,13 @@
       </w:r>
       <w:proofErr w:type="spellEnd"/>
       <w:r>
-        <w:t>") %&gt;) .</w:t>
-      </w:r>
+        <w:t>") %&gt;</w:t>
+      </w:r>
+      <w:proofErr w:type="gramStart"/>
+      <w:r>
+        <w:t>) .</w:t>
+      </w:r>
+      <w:proofErr w:type="gramEnd"/>
     </w:p>
     <w:p/>
     <w:p/>
@@ -1698,8 +1751,13 @@
       </w:r>
       <w:proofErr w:type="spellEnd"/>
       <w:r>
-        <w:t>)) para que el compilador trate ese objeto como un botón y permita acceder a sus atributos .</w:t>
-      </w:r>
+        <w:t xml:space="preserve">)) para que el compilador trate ese objeto como un botón y permita acceder a sus </w:t>
+      </w:r>
+      <w:proofErr w:type="gramStart"/>
+      <w:r>
+        <w:t>atributos .</w:t>
+      </w:r>
+      <w:proofErr w:type="gramEnd"/>
     </w:p>
     <w:p>
       <w:pPr>
@@ -1748,7 +1806,15 @@
       </w:r>
       <w:proofErr w:type="spellEnd"/>
       <w:r>
-        <w:t xml:space="preserve"> de ASP.NET. Permite almacenar un valor dinámico (como la Clave Primaria o ID de un registro) directamente en el HTML del botón . Cuando el usuario hace clic, ese valor viaja automáticamente al servidor y puede ser recuperado en el evento </w:t>
+        <w:t xml:space="preserve"> de ASP.NET. Permite almacenar un valor dinámico (como la Clave Primaria o ID de un registro) directamente en el HTML del </w:t>
+      </w:r>
+      <w:proofErr w:type="gramStart"/>
+      <w:r>
+        <w:t>botón .</w:t>
+      </w:r>
+      <w:proofErr w:type="gramEnd"/>
+      <w:r>
+        <w:t xml:space="preserve"> Cuando el usuario hace clic, ese valor viaja automáticamente al servidor y puede ser recuperado en el evento </w:t>
       </w:r>
       <w:proofErr w:type="spellStart"/>
       <w:r>
@@ -1759,6 +1825,7 @@
         <w:t xml:space="preserve"> o </w:t>
       </w:r>
       <w:proofErr w:type="spellStart"/>
+      <w:proofErr w:type="gramStart"/>
       <w:r>
         <w:t>OnCommand</w:t>
       </w:r>
@@ -1766,6 +1833,7 @@
       <w:r>
         <w:t xml:space="preserve"> .</w:t>
       </w:r>
+      <w:proofErr w:type="gramEnd"/>
     </w:p>
     <w:p>
       <w:pPr>
@@ -1846,16 +1914,26 @@
       </w:r>
       <w:proofErr w:type="spellEnd"/>
       <w:r>
-        <w:t xml:space="preserve"> (!</w:t>
+        <w:t xml:space="preserve"> </w:t>
+      </w:r>
+      <w:proofErr w:type="gramStart"/>
+      <w:r>
+        <w:t>(!</w:t>
       </w:r>
       <w:proofErr w:type="spellStart"/>
       <w:r>
         <w:t>IsPostBack</w:t>
       </w:r>
       <w:proofErr w:type="spellEnd"/>
-      <w:r>
-        <w:t>)), el ciclo de vida de la página destruirá y recreará todos los botones dinámicos antes de procesar el evento de clic, lo que anulará la acción del usuario. La carga de datos debe restringirse a la primera carga de la página .</w:t>
-      </w:r>
+      <w:proofErr w:type="gramEnd"/>
+      <w:r>
+        <w:t xml:space="preserve">)), el ciclo de vida de la página destruirá y recreará todos los botones dinámicos antes de procesar el evento de clic, lo que anulará la acción del usuario. La carga de datos debe restringirse a la primera carga de la </w:t>
+      </w:r>
+      <w:proofErr w:type="gramStart"/>
+      <w:r>
+        <w:t>página .</w:t>
+      </w:r>
+      <w:proofErr w:type="gramEnd"/>
     </w:p>
     <w:p>
       <w:pPr>
@@ -1933,9 +2011,11 @@
         <w:t>PostBack</w:t>
       </w:r>
       <w:proofErr w:type="spellEnd"/>
+      <w:proofErr w:type="gramStart"/>
       <w:r>
         <w:t>) .</w:t>
       </w:r>
+      <w:proofErr w:type="gramEnd"/>
     </w:p>
     <w:p>
       <w:pPr>
@@ -2047,7 +2127,15 @@
           <w:b/>
           <w:bCs/>
         </w:rPr>
-        <w:t xml:space="preserve"> (!</w:t>
+        <w:t xml:space="preserve"> </w:t>
+      </w:r>
+      <w:proofErr w:type="gramStart"/>
+      <w:r>
+        <w:rPr>
+          <w:b/>
+          <w:bCs/>
+        </w:rPr>
+        <w:t>(!</w:t>
       </w:r>
       <w:proofErr w:type="spellStart"/>
       <w:r>
@@ -2058,6 +2146,7 @@
         <w:t>IsPostBack</w:t>
       </w:r>
       <w:proofErr w:type="spellEnd"/>
+      <w:proofErr w:type="gramEnd"/>
       <w:r>
         <w:rPr>
           <w:b/>
@@ -2182,13 +2271,18 @@
       </w:r>
       <w:proofErr w:type="spellEnd"/>
       <w:r>
-        <w:t xml:space="preserve"> (!</w:t>
+        <w:t xml:space="preserve"> </w:t>
+      </w:r>
+      <w:proofErr w:type="gramStart"/>
+      <w:r>
+        <w:t>(!</w:t>
       </w:r>
       <w:proofErr w:type="spellStart"/>
       <w:r>
         <w:t>IsPostBack</w:t>
       </w:r>
       <w:proofErr w:type="spellEnd"/>
+      <w:proofErr w:type="gramEnd"/>
       <w:r>
         <w:t xml:space="preserve">), vuelve a ir a la base de datos y ejecuta </w:t>
       </w:r>
@@ -2212,12 +2306,17 @@
         <w:t xml:space="preserve">Al hacer </w:t>
       </w:r>
       <w:proofErr w:type="spellStart"/>
+      <w:proofErr w:type="gramStart"/>
       <w:r>
         <w:t>DataBind</w:t>
       </w:r>
       <w:proofErr w:type="spellEnd"/>
       <w:r>
-        <w:t xml:space="preserve">(), el servidor </w:t>
+        <w:t>(</w:t>
+      </w:r>
+      <w:proofErr w:type="gramEnd"/>
+      <w:r>
+        <w:t xml:space="preserve">), el servidor </w:t>
       </w:r>
       <w:r>
         <w:rPr>
@@ -2259,8 +2358,21 @@
         <w:t>"Momento, este timbre ya no existe, lo acabo de destruir y reemplazar por uno nuevo en el paso 1"</w:t>
       </w:r>
       <w:r>
-        <w:t>. Como el botón original desapareció de la memoria, el clic se ignora por completo y no hace nada . ¡De hecho, este fue exactamente el error que le pasó al profe en la clase antes de corregirlo !</w:t>
-      </w:r>
+        <w:t xml:space="preserve">. Como el botón original desapareció de la memoria, el clic se ignora por completo y no hace </w:t>
+      </w:r>
+      <w:proofErr w:type="gramStart"/>
+      <w:r>
+        <w:t>nada .</w:t>
+      </w:r>
+      <w:proofErr w:type="gramEnd"/>
+      <w:r>
+        <w:t xml:space="preserve"> ¡De hecho, este fue exactamente el error que le pasó al profe en la clase antes de </w:t>
+      </w:r>
+      <w:proofErr w:type="gramStart"/>
+      <w:r>
+        <w:t>corregirlo !</w:t>
+      </w:r>
+      <w:proofErr w:type="gramEnd"/>
     </w:p>
     <w:p>
       <w:pPr>
@@ -2274,7 +2386,15 @@
           <w:b/>
           <w:bCs/>
         </w:rPr>
-        <w:t>La Solución: El escudo del (!</w:t>
+        <w:t xml:space="preserve">La Solución: El escudo del </w:t>
+      </w:r>
+      <w:proofErr w:type="gramStart"/>
+      <w:r>
+        <w:rPr>
+          <w:b/>
+          <w:bCs/>
+        </w:rPr>
+        <w:t>(!</w:t>
       </w:r>
       <w:proofErr w:type="spellStart"/>
       <w:r>
@@ -2285,6 +2405,7 @@
         <w:t>IsPostBack</w:t>
       </w:r>
       <w:proofErr w:type="spellEnd"/>
+      <w:proofErr w:type="gramEnd"/>
       <w:r>
         <w:rPr>
           <w:b/>
@@ -2363,8 +2484,13 @@
         <w:t>Paso 2</w:t>
       </w:r>
       <w:r>
-        <w:t>, el botón original sigue existiendo y el evento se dispara a la perfección .</w:t>
-      </w:r>
+        <w:t xml:space="preserve">, el botón original sigue existiendo y el evento se dispara a la </w:t>
+      </w:r>
+      <w:proofErr w:type="gramStart"/>
+      <w:r>
+        <w:t>perfección .</w:t>
+      </w:r>
+      <w:proofErr w:type="gramEnd"/>
     </w:p>
     <w:p>
       <w:pPr>
@@ -2399,8 +2525,13 @@
         <w:ind w:left="720"/>
       </w:pPr>
       <w:r>
-        <w:t>La elección del control de presentación de datos no obedece a una regla estricta, sino que depende del diseño visual requerido y de la funcionalidad de la pantalla .</w:t>
-      </w:r>
+        <w:t xml:space="preserve">La elección del control de presentación de datos no obedece a una regla estricta, sino que depende del diseño visual requerido y de la funcionalidad de la </w:t>
+      </w:r>
+      <w:proofErr w:type="gramStart"/>
+      <w:r>
+        <w:t>pantalla .</w:t>
+      </w:r>
+      <w:proofErr w:type="gramEnd"/>
     </w:p>
     <w:p>
       <w:pPr>
@@ -2445,8 +2576,13 @@
         <w:t>Uso ideal:</w:t>
       </w:r>
       <w:r>
-        <w:t xml:space="preserve"> Paneles de administración, sistemas de gestión (ABM / CRUD), reportes financieros .</w:t>
-      </w:r>
+        <w:t xml:space="preserve"> Paneles de administración, sistemas de gestión (ABM / CRUD), reportes </w:t>
+      </w:r>
+      <w:proofErr w:type="gramStart"/>
+      <w:r>
+        <w:t>financieros .</w:t>
+      </w:r>
+      <w:proofErr w:type="gramEnd"/>
     </w:p>
     <w:p>
       <w:pPr>
@@ -2463,8 +2599,13 @@
         <w:t>Ventajas:</w:t>
       </w:r>
       <w:r>
-        <w:t xml:space="preserve"> Genera una estructura tabular (&lt;table&gt;) estructurada. Posee muchísima funcionalidad incorporada (paginación, ordenamiento, botones de comando en la misma fila) que ahorra tiempo de desarrollo para interfaces internas .</w:t>
-      </w:r>
+        <w:t xml:space="preserve"> Genera una estructura tabular (&lt;table&gt;) estructurada. Posee muchísima funcionalidad incorporada (paginación, ordenamiento, botones de comando en la misma fila) que ahorra tiempo de desarrollo para interfaces </w:t>
+      </w:r>
+      <w:proofErr w:type="gramStart"/>
+      <w:r>
+        <w:t>internas .</w:t>
+      </w:r>
+      <w:proofErr w:type="gramEnd"/>
     </w:p>
     <w:p>
       <w:pPr>
@@ -2481,8 +2622,13 @@
         <w:t>Desventajas:</w:t>
       </w:r>
       <w:r>
-        <w:t xml:space="preserve"> Es muy rígido visualmente. No sirve para diseños modernos orientados al cliente final (como catálogos de tarjetas, carruseles o banners) .</w:t>
-      </w:r>
+        <w:t xml:space="preserve"> Es muy rígido visualmente. No sirve para diseños modernos orientados al cliente final (como catálogos de tarjetas, carruseles o banners</w:t>
+      </w:r>
+      <w:proofErr w:type="gramStart"/>
+      <w:r>
+        <w:t>) .</w:t>
+      </w:r>
+      <w:proofErr w:type="gramEnd"/>
     </w:p>
     <w:p>
       <w:pPr>
@@ -2527,8 +2673,13 @@
         <w:t>Uso ideal:</w:t>
       </w:r>
       <w:r>
-        <w:t xml:space="preserve"> Catálogos visuales y estructuras de datos jerárquicas o anidadas .</w:t>
-      </w:r>
+        <w:t xml:space="preserve"> Catálogos visuales y estructuras de datos jerárquicas o </w:t>
+      </w:r>
+      <w:proofErr w:type="gramStart"/>
+      <w:r>
+        <w:t>anidadas .</w:t>
+      </w:r>
+      <w:proofErr w:type="gramEnd"/>
     </w:p>
     <w:p>
       <w:pPr>
@@ -2571,8 +2722,13 @@
       </w:r>
       <w:proofErr w:type="spellEnd"/>
       <w:r>
-        <w:t xml:space="preserve"> dentro de otro para dibujar elementos HTML complejos .</w:t>
-      </w:r>
+        <w:t xml:space="preserve"> dentro de otro para dibujar elementos HTML </w:t>
+      </w:r>
+      <w:proofErr w:type="gramStart"/>
+      <w:r>
+        <w:t>complejos .</w:t>
+      </w:r>
+      <w:proofErr w:type="gramEnd"/>
     </w:p>
     <w:p>
       <w:pPr>
@@ -2589,8 +2745,13 @@
         <w:t>Desventajas:</w:t>
       </w:r>
       <w:r>
-        <w:t xml:space="preserve"> La sintaxis HTML queda un poco sucia ("código espagueti") y no permite manejar eventos de servidor en la misma página de forma nativa; requiere el envío de parámetros por URL a través de etiquetas &lt;a&gt; .</w:t>
-      </w:r>
+        <w:t xml:space="preserve"> La sintaxis HTML queda un poco sucia ("código espagueti") y no permite manejar eventos de servidor en la misma página de forma nativa; requiere el envío de parámetros por URL a través de etiquetas &lt;a</w:t>
+      </w:r>
+      <w:proofErr w:type="gramStart"/>
+      <w:r>
+        <w:t>&gt; .</w:t>
+      </w:r>
+      <w:proofErr w:type="gramEnd"/>
     </w:p>
     <w:p>
       <w:pPr>
@@ -2604,6 +2765,7 @@
         <w:t>3. Control &lt;</w:t>
       </w:r>
       <w:proofErr w:type="spellStart"/>
+      <w:proofErr w:type="gramStart"/>
       <w:r>
         <w:rPr>
           <w:b/>
@@ -2612,6 +2774,7 @@
         <w:t>asp:Repeater</w:t>
       </w:r>
       <w:proofErr w:type="spellEnd"/>
+      <w:proofErr w:type="gramEnd"/>
       <w:r>
         <w:rPr>
           <w:b/>
@@ -2635,8 +2798,13 @@
         <w:t>Uso ideal:</w:t>
       </w:r>
       <w:r>
-        <w:t xml:space="preserve"> Catálogos interactivos, listas de productos con botones de acción rápida ("Agregar al carrito", "Marcar favorito") .</w:t>
-      </w:r>
+        <w:t xml:space="preserve"> Catálogos interactivos, listas de productos con botones de acción rápida ("Agregar al carrito", "Marcar favorito"</w:t>
+      </w:r>
+      <w:proofErr w:type="gramStart"/>
+      <w:r>
+        <w:t>) .</w:t>
+      </w:r>
+      <w:proofErr w:type="gramEnd"/>
     </w:p>
     <w:p>
       <w:pPr>
@@ -2656,18 +2824,25 @@
         <w:t xml:space="preserve"> HTML mucho más limpio en la capa de presentación mediante la función &lt;%# </w:t>
       </w:r>
       <w:proofErr w:type="spellStart"/>
+      <w:proofErr w:type="gramStart"/>
       <w:r>
         <w:t>Eval</w:t>
       </w:r>
       <w:proofErr w:type="spellEnd"/>
       <w:r>
-        <w:t>() %&gt; . Su característica principal es la integración de controles de servidor (como &lt;</w:t>
-      </w:r>
-      <w:proofErr w:type="spellStart"/>
+        <w:t>(</w:t>
+      </w:r>
+      <w:proofErr w:type="gramEnd"/>
+      <w:r>
+        <w:t>) %&gt; . Su característica principal es la integración de controles de servidor (como &lt;</w:t>
+      </w:r>
+      <w:proofErr w:type="spellStart"/>
+      <w:proofErr w:type="gramStart"/>
       <w:r>
         <w:t>asp:Button</w:t>
       </w:r>
       <w:proofErr w:type="spellEnd"/>
+      <w:proofErr w:type="gramEnd"/>
       <w:r>
         <w:t>&gt;) que permiten capturar eventos (</w:t>
       </w:r>
@@ -2859,12 +3034,17 @@
         <w:t xml:space="preserve"> de la grilla y volver a invocar el método </w:t>
       </w:r>
       <w:proofErr w:type="spellStart"/>
+      <w:proofErr w:type="gramStart"/>
       <w:r>
         <w:t>DataBind</w:t>
       </w:r>
       <w:proofErr w:type="spellEnd"/>
       <w:r>
-        <w:t>() .</w:t>
+        <w:t>(</w:t>
+      </w:r>
+      <w:proofErr w:type="gramEnd"/>
+      <w:r>
+        <w:t>) .</w:t>
       </w:r>
     </w:p>
     <w:p>
@@ -2890,8 +3070,13 @@
       </w:r>
       <w:proofErr w:type="spellEnd"/>
       <w:r>
-        <w:t xml:space="preserve"> para modificar datos directamente sobre las celdas de la grilla. Sin embargo, a nivel arquitectónico y de UX, esta práctica se desaconseja para tablas con muchas columnas, ya que genera una interfaz similar a una hoja de cálculo de Excel, resultando tediosa y poco práctica .</w:t>
-      </w:r>
+        <w:t xml:space="preserve"> para modificar datos directamente sobre las celdas de la grilla. Sin embargo, a nivel arquitectónico y de UX, esta práctica se desaconseja para tablas con muchas columnas, ya que genera una interfaz similar a una hoja de cálculo de Excel, resultando tediosa y poco </w:t>
+      </w:r>
+      <w:proofErr w:type="gramStart"/>
+      <w:r>
+        <w:t>práctica .</w:t>
+      </w:r>
+      <w:proofErr w:type="gramEnd"/>
     </w:p>
     <w:p>
       <w:pPr>
@@ -3150,7 +3335,15 @@
     </w:p>
     <w:p>
       <w:r>
-        <w:t>La letra e es simplemente una convención mundial en C# para abreviar "</w:t>
+        <w:t xml:space="preserve">La letra </w:t>
+      </w:r>
+      <w:proofErr w:type="gramStart"/>
+      <w:r>
+        <w:t>e</w:t>
+      </w:r>
+      <w:proofErr w:type="gramEnd"/>
+      <w:r>
+        <w:t xml:space="preserve"> es simplemente una convención mundial en C# para abreviar "</w:t>
       </w:r>
       <w:proofErr w:type="spellStart"/>
       <w:r>
@@ -3190,6 +3383,7 @@
         <w:t xml:space="preserve">. Adentro de esa cajita viene guardado exactamente el número de la página que el usuario tocó. Ese número se guarda en la propiedad </w:t>
       </w:r>
       <w:proofErr w:type="spellStart"/>
+      <w:proofErr w:type="gramStart"/>
       <w:r>
         <w:t>NewPageIndex</w:t>
       </w:r>
@@ -3197,6 +3391,7 @@
       <w:r>
         <w:t xml:space="preserve"> .</w:t>
       </w:r>
+      <w:proofErr w:type="gramEnd"/>
     </w:p>
     <w:p>
       <w:r>
@@ -3223,6 +3418,7 @@
         <w:t xml:space="preserve"> = </w:t>
       </w:r>
       <w:proofErr w:type="spellStart"/>
+      <w:proofErr w:type="gramStart"/>
       <w:r>
         <w:rPr>
           <w:b/>
@@ -3231,6 +3427,7 @@
         <w:t>e.NewPageIndex</w:t>
       </w:r>
       <w:proofErr w:type="spellEnd"/>
+      <w:proofErr w:type="gramEnd"/>
       <w:r>
         <w:rPr>
           <w:b/>
@@ -3523,7 +3720,15 @@
       </w:r>
       <w:proofErr w:type="spellEnd"/>
       <w:r>
-        <w:t xml:space="preserve">, el parámetro e es del tipo específico </w:t>
+        <w:t xml:space="preserve">, el parámetro </w:t>
+      </w:r>
+      <w:proofErr w:type="gramStart"/>
+      <w:r>
+        <w:t>e</w:t>
+      </w:r>
+      <w:proofErr w:type="gramEnd"/>
+      <w:r>
+        <w:t xml:space="preserve"> es del tipo específico </w:t>
       </w:r>
       <w:proofErr w:type="spellStart"/>
       <w:r>
@@ -3856,7 +4061,15 @@
       </w:r>
       <w:proofErr w:type="spellEnd"/>
       <w:r>
-        <w:t xml:space="preserve"> qué acción ejecutar evaluando la existencia de un parámetro identificador (ej. ?id=X) en el </w:t>
+        <w:t xml:space="preserve"> qué acción ejecutar evaluando la existencia de un parámetro identificador (</w:t>
+      </w:r>
+      <w:proofErr w:type="gramStart"/>
+      <w:r>
+        <w:t>ej. ?id</w:t>
+      </w:r>
+      <w:proofErr w:type="gramEnd"/>
+      <w:r>
+        <w:t xml:space="preserve">=X) en el </w:t>
       </w:r>
       <w:proofErr w:type="spellStart"/>
       <w:r>
@@ -4255,10 +4468,12 @@
         <w:t xml:space="preserve"> La mejor práctica de rendimiento web dicta que los datos de un formulario (como cadenas de texto o números) deben recolectarse localmente en el cliente y enviarse en una única petición al servidor mediante un control de envío (ej. &lt;</w:t>
       </w:r>
       <w:proofErr w:type="spellStart"/>
+      <w:proofErr w:type="gramStart"/>
       <w:r>
         <w:t>asp:Button</w:t>
       </w:r>
       <w:proofErr w:type="spellEnd"/>
+      <w:proofErr w:type="gramEnd"/>
       <w:r>
         <w:t xml:space="preserve"> ID="</w:t>
       </w:r>
@@ -4408,12 +4623,17 @@
         <w:t xml:space="preserve">). Es responsabilidad del desarrollador instanciar el objeto de dominio correspondiente (ej. new </w:t>
       </w:r>
       <w:proofErr w:type="spellStart"/>
+      <w:proofErr w:type="gramStart"/>
       <w:r>
         <w:t>Pokemon</w:t>
       </w:r>
       <w:proofErr w:type="spellEnd"/>
       <w:r>
-        <w:t xml:space="preserve">()) y realizar el mapeo manual, aplicando las conversiones de tipo necesarias (como </w:t>
+        <w:t>(</w:t>
+      </w:r>
+      <w:proofErr w:type="gramEnd"/>
+      <w:r>
+        <w:t xml:space="preserve">)) y realizar el mapeo manual, aplicando las conversiones de tipo necesarias (como </w:t>
       </w:r>
       <w:proofErr w:type="spellStart"/>
       <w:r>
@@ -4474,10 +4694,12 @@
         <w:t xml:space="preserve">). Para reconstruir las relaciones, se debe instanciar manualmente el objeto anidado e inyectarle dicho ID (ej. </w:t>
       </w:r>
       <w:proofErr w:type="spellStart"/>
+      <w:proofErr w:type="gramStart"/>
       <w:r>
         <w:t>nuevo.Tipo</w:t>
       </w:r>
       <w:proofErr w:type="spellEnd"/>
+      <w:proofErr w:type="gramEnd"/>
       <w:r>
         <w:t xml:space="preserve"> = new Elemento(); </w:t>
       </w:r>
@@ -4623,6 +4845,666 @@
       </w:r>
       <w:r>
         <w:t>mantenimiento.</w:t>
+      </w:r>
+    </w:p>
+    <w:p/>
+    <w:p/>
+    <w:p>
+      <w:r>
+        <w:rPr>
+          <w:b/>
+          <w:bCs/>
+        </w:rPr>
+        <w:lastRenderedPageBreak/>
+        <w:t>TEMA: Procedimientos Almacenados (</w:t>
+      </w:r>
+      <w:proofErr w:type="spellStart"/>
+      <w:r>
+        <w:rPr>
+          <w:b/>
+          <w:bCs/>
+        </w:rPr>
+        <w:t>Stored</w:t>
+      </w:r>
+      <w:proofErr w:type="spellEnd"/>
+      <w:r>
+        <w:rPr>
+          <w:b/>
+          <w:bCs/>
+        </w:rPr>
+        <w:t xml:space="preserve"> </w:t>
+      </w:r>
+      <w:proofErr w:type="spellStart"/>
+      <w:r>
+        <w:rPr>
+          <w:b/>
+          <w:bCs/>
+        </w:rPr>
+        <w:t>Procedures</w:t>
+      </w:r>
+      <w:proofErr w:type="spellEnd"/>
+      <w:r>
+        <w:rPr>
+          <w:b/>
+          <w:bCs/>
+        </w:rPr>
+        <w:t>)</w:t>
+      </w:r>
+    </w:p>
+    <w:p>
+      <w:pPr>
+        <w:numPr>
+          <w:ilvl w:val="0"/>
+          <w:numId w:val="22"/>
+        </w:numPr>
+      </w:pPr>
+      <w:r>
+        <w:rPr>
+          <w:b/>
+          <w:bCs/>
+        </w:rPr>
+        <w:t>¿Qué es?</w:t>
+      </w:r>
+      <w:r>
+        <w:t xml:space="preserve"> Un Procedimiento Almacenado (SP) es un conjunto de instrucciones de código SQL (como SELECT, INSERT, UPDATE, DELETE) que se agrupan, se compilan y se guardan directamente en el motor de la base de datos (ej. SQL Server) bajo un nombre específico. Funciona de manera muy similar a un "método" o "función" en C#, pero vive dentro de la base de datos.</w:t>
+      </w:r>
+    </w:p>
+    <w:p>
+      <w:pPr>
+        <w:numPr>
+          <w:ilvl w:val="0"/>
+          <w:numId w:val="22"/>
+        </w:numPr>
+      </w:pPr>
+      <w:r>
+        <w:rPr>
+          <w:b/>
+          <w:bCs/>
+        </w:rPr>
+        <w:t>¿Cómo funciona?</w:t>
+      </w:r>
+      <w:r>
+        <w:t xml:space="preserve"> En lugar de que la aplicación cliente (tu código C#) arme la consulta SQL concatenando textos (consultas embebidas) y la envíe cruda por la red, la aplicación simplemente invoca el nombre del Procedimiento Almacenado (ej. </w:t>
+      </w:r>
+      <w:proofErr w:type="spellStart"/>
+      <w:r>
+        <w:t>StoreAltaPokemon</w:t>
+      </w:r>
+      <w:proofErr w:type="spellEnd"/>
+      <w:r>
+        <w:t xml:space="preserve">) y le pasa los valores necesarios a través de </w:t>
+      </w:r>
+      <w:r>
+        <w:rPr>
+          <w:b/>
+          <w:bCs/>
+        </w:rPr>
+        <w:t>parámetros</w:t>
+      </w:r>
+      <w:r>
+        <w:t xml:space="preserve"> (las variables que empiezan con @).</w:t>
+      </w:r>
+    </w:p>
+    <w:p>
+      <w:pPr>
+        <w:numPr>
+          <w:ilvl w:val="0"/>
+          <w:numId w:val="22"/>
+        </w:numPr>
+      </w:pPr>
+      <w:r>
+        <w:rPr>
+          <w:b/>
+          <w:bCs/>
+        </w:rPr>
+        <w:t>Ventajas principales (Por qué se usan a nivel profesional):</w:t>
+      </w:r>
+    </w:p>
+    <w:p>
+      <w:pPr>
+        <w:numPr>
+          <w:ilvl w:val="1"/>
+          <w:numId w:val="22"/>
+        </w:numPr>
+      </w:pPr>
+      <w:r>
+        <w:rPr>
+          <w:b/>
+          <w:bCs/>
+        </w:rPr>
+        <w:t>Seguridad (Prevención de Inyección SQL):</w:t>
+      </w:r>
+      <w:r>
+        <w:t xml:space="preserve"> Al usar parámetros fuertemente tipados en lugar de concatenar cadenas de texto, el motor de la base de datos sabe distinguir entre el comando SQL y los datos del usuario, evitando que un atacante inyecte código malicioso.</w:t>
+      </w:r>
+    </w:p>
+    <w:p>
+      <w:pPr>
+        <w:numPr>
+          <w:ilvl w:val="1"/>
+          <w:numId w:val="22"/>
+        </w:numPr>
+      </w:pPr>
+      <w:r>
+        <w:rPr>
+          <w:b/>
+          <w:bCs/>
+        </w:rPr>
+        <w:t>Rendimiento (Performance):</w:t>
+      </w:r>
+      <w:r>
+        <w:t xml:space="preserve"> Cuando </w:t>
+      </w:r>
+      <w:proofErr w:type="spellStart"/>
+      <w:r>
+        <w:t>guardás</w:t>
+      </w:r>
+      <w:proofErr w:type="spellEnd"/>
+      <w:r>
+        <w:t xml:space="preserve"> un SP en SQL Server, el motor lo analiza y crea un "plan de ejecución" optimizado y </w:t>
+      </w:r>
+      <w:proofErr w:type="spellStart"/>
+      <w:r>
+        <w:t>pre-compilado</w:t>
+      </w:r>
+      <w:proofErr w:type="spellEnd"/>
+      <w:r>
+        <w:t>. Es mucho más rápido ejecutar un SP que mandarle una consulta de texto plano cada vez.</w:t>
+      </w:r>
+    </w:p>
+    <w:p>
+      <w:pPr>
+        <w:numPr>
+          <w:ilvl w:val="1"/>
+          <w:numId w:val="22"/>
+        </w:numPr>
+      </w:pPr>
+      <w:r>
+        <w:rPr>
+          <w:b/>
+          <w:bCs/>
+        </w:rPr>
+        <w:t>Mantenibilidad y Desacoplamiento:</w:t>
+      </w:r>
+      <w:r>
+        <w:t xml:space="preserve"> Si el día de mañana </w:t>
+      </w:r>
+      <w:proofErr w:type="spellStart"/>
+      <w:r>
+        <w:t>agregás</w:t>
+      </w:r>
+      <w:proofErr w:type="spellEnd"/>
+      <w:r>
+        <w:t xml:space="preserve"> una columna a la tabla, solo </w:t>
+      </w:r>
+      <w:proofErr w:type="spellStart"/>
+      <w:r>
+        <w:t>modificás</w:t>
+      </w:r>
+      <w:proofErr w:type="spellEnd"/>
+      <w:r>
+        <w:t xml:space="preserve"> el código SQL dentro del motor de base de datos. No hace falta tocar el </w:t>
+      </w:r>
+      <w:proofErr w:type="spellStart"/>
+      <w:r>
+        <w:t>string</w:t>
+      </w:r>
+      <w:proofErr w:type="spellEnd"/>
+      <w:r>
+        <w:t xml:space="preserve"> de C#, ni volver a compilar, ni volver a publicar toda la aplicación web.</w:t>
+      </w:r>
+    </w:p>
+    <w:p>
+      <w:pPr>
+        <w:numPr>
+          <w:ilvl w:val="1"/>
+          <w:numId w:val="22"/>
+        </w:numPr>
+      </w:pPr>
+      <w:r>
+        <w:rPr>
+          <w:b/>
+          <w:bCs/>
+        </w:rPr>
+        <w:t>Tráfico de red:</w:t>
+      </w:r>
+      <w:r>
+        <w:t xml:space="preserve"> Se envía menos información por la red. En vez de mandar un INSERT gigante de 500 caracteres, solo </w:t>
+      </w:r>
+      <w:proofErr w:type="spellStart"/>
+      <w:r>
+        <w:t>mandás</w:t>
+      </w:r>
+      <w:proofErr w:type="spellEnd"/>
+      <w:r>
+        <w:t xml:space="preserve"> la instrucción "Ejecutar Alta" y los datos.</w:t>
+      </w:r>
+    </w:p>
+    <w:p/>
+    <w:p>
+      <w:r>
+        <w:rPr>
+          <w:b/>
+          <w:bCs/>
+        </w:rPr>
+        <w:t xml:space="preserve">TEMA: Reutilización de Formularios, </w:t>
+      </w:r>
+      <w:proofErr w:type="spellStart"/>
+      <w:r>
+        <w:rPr>
+          <w:b/>
+          <w:bCs/>
+        </w:rPr>
+        <w:t>QueryStrings</w:t>
+      </w:r>
+      <w:proofErr w:type="spellEnd"/>
+      <w:r>
+        <w:rPr>
+          <w:b/>
+          <w:bCs/>
+        </w:rPr>
+        <w:t xml:space="preserve"> y el Ciclo de Vida (</w:t>
+      </w:r>
+      <w:proofErr w:type="spellStart"/>
+      <w:r>
+        <w:rPr>
+          <w:b/>
+          <w:bCs/>
+        </w:rPr>
+        <w:t>IsPostBack</w:t>
+      </w:r>
+      <w:proofErr w:type="spellEnd"/>
+      <w:r>
+        <w:rPr>
+          <w:b/>
+          <w:bCs/>
+        </w:rPr>
+        <w:t>)</w:t>
+      </w:r>
+    </w:p>
+    <w:p>
+      <w:pPr>
+        <w:numPr>
+          <w:ilvl w:val="0"/>
+          <w:numId w:val="23"/>
+        </w:numPr>
+      </w:pPr>
+      <w:r>
+        <w:rPr>
+          <w:b/>
+          <w:bCs/>
+        </w:rPr>
+        <w:t>Patrón de Formulario Único (ABM/CRUD):</w:t>
+      </w:r>
+      <w:r>
+        <w:t xml:space="preserve"> Es una excelente práctica de diseño reutilizar la misma interfaz (.</w:t>
+      </w:r>
+      <w:proofErr w:type="spellStart"/>
+      <w:r>
+        <w:t>aspx</w:t>
+      </w:r>
+      <w:proofErr w:type="spellEnd"/>
+      <w:r>
+        <w:t xml:space="preserve">) para las operaciones de Alta y Modificación. La aplicación determina qué flujo ejecutar evaluando si existe un parámetro identificador en la URL mediante </w:t>
+      </w:r>
+      <w:proofErr w:type="spellStart"/>
+      <w:r>
+        <w:t>Request.QueryString</w:t>
+      </w:r>
+      <w:proofErr w:type="spellEnd"/>
+      <w:r>
+        <w:t>["id"</w:t>
+      </w:r>
+      <w:proofErr w:type="gramStart"/>
+      <w:r>
+        <w:t>] .</w:t>
+      </w:r>
+      <w:proofErr w:type="gramEnd"/>
+      <w:r>
+        <w:t xml:space="preserve"> Si es nulo, es un Alta; si contiene un valor, es una </w:t>
+      </w:r>
+      <w:proofErr w:type="gramStart"/>
+      <w:r>
+        <w:t>Modificación .</w:t>
+      </w:r>
+      <w:proofErr w:type="gramEnd"/>
+    </w:p>
+    <w:p>
+      <w:pPr>
+        <w:numPr>
+          <w:ilvl w:val="0"/>
+          <w:numId w:val="23"/>
+        </w:numPr>
+      </w:pPr>
+      <w:r>
+        <w:rPr>
+          <w:b/>
+          <w:bCs/>
+        </w:rPr>
+        <w:t xml:space="preserve">Precarga de Datos y la Trampa del </w:t>
+      </w:r>
+      <w:proofErr w:type="spellStart"/>
+      <w:r>
+        <w:rPr>
+          <w:b/>
+          <w:bCs/>
+        </w:rPr>
+        <w:t>IsPostBack</w:t>
+      </w:r>
+      <w:proofErr w:type="spellEnd"/>
+      <w:r>
+        <w:rPr>
+          <w:b/>
+          <w:bCs/>
+        </w:rPr>
+        <w:t>:</w:t>
+      </w:r>
+      <w:r>
+        <w:t xml:space="preserve"> Al modificar un registro, se deben precargar los campos de texto y listas desplegables con los datos actuales del objeto para una buena experiencia de </w:t>
+      </w:r>
+      <w:r>
+        <w:t>usuario.</w:t>
+      </w:r>
+      <w:r>
+        <w:t xml:space="preserve"> Sin embargo, </w:t>
+      </w:r>
+      <w:r>
+        <w:rPr>
+          <w:b/>
+          <w:bCs/>
+        </w:rPr>
+        <w:t>es crítico</w:t>
+      </w:r>
+      <w:r>
+        <w:t xml:space="preserve"> que esta precarga ocurra exclusivamente </w:t>
+      </w:r>
+      <w:proofErr w:type="gramStart"/>
+      <w:r>
+        <w:t>cuando !</w:t>
+      </w:r>
+      <w:proofErr w:type="spellStart"/>
+      <w:r>
+        <w:t>IsPostBack</w:t>
+      </w:r>
+      <w:proofErr w:type="spellEnd"/>
+      <w:proofErr w:type="gramEnd"/>
+      <w:r>
+        <w:t xml:space="preserve"> es verdadero. Si se omite esta validación, al hacer clic en el botón "Aceptar", el ciclo de vida de la página ejecutará primero el </w:t>
+      </w:r>
+      <w:proofErr w:type="spellStart"/>
+      <w:r>
+        <w:t>Page_Load</w:t>
+      </w:r>
+      <w:proofErr w:type="spellEnd"/>
+      <w:r>
+        <w:t xml:space="preserve">, recargando los datos originales de la base de datos y sobrescribiendo (borrando) las modificaciones que el usuario acaba de tipear en la pantalla antes de que el evento </w:t>
+      </w:r>
+      <w:proofErr w:type="spellStart"/>
+      <w:r>
+        <w:t>OnClick</w:t>
+      </w:r>
+      <w:proofErr w:type="spellEnd"/>
+      <w:r>
+        <w:t xml:space="preserve"> se </w:t>
+      </w:r>
+      <w:r>
+        <w:t>ejecute.</w:t>
+      </w:r>
+    </w:p>
+    <w:p>
+      <w:pPr>
+        <w:numPr>
+          <w:ilvl w:val="0"/>
+          <w:numId w:val="23"/>
+        </w:numPr>
+      </w:pPr>
+      <w:r>
+        <w:rPr>
+          <w:b/>
+          <w:bCs/>
+        </w:rPr>
+        <w:t>El Peligro del "</w:t>
+      </w:r>
+      <w:proofErr w:type="spellStart"/>
+      <w:r>
+        <w:rPr>
+          <w:b/>
+          <w:bCs/>
+        </w:rPr>
+        <w:t>Copy</w:t>
+      </w:r>
+      <w:proofErr w:type="spellEnd"/>
+      <w:r>
+        <w:rPr>
+          <w:b/>
+          <w:bCs/>
+        </w:rPr>
+        <w:t>-Paste" (Código Espagueti):</w:t>
+      </w:r>
+      <w:r>
+        <w:t xml:space="preserve"> Al reutilizar métodos (como copiar un método de Insertar para crear el de Modificar), es común olvidar actualizar llamadas internas críticas (ej. dejar </w:t>
+      </w:r>
+      <w:proofErr w:type="spellStart"/>
+      <w:r>
+        <w:t>setearConsulta</w:t>
+      </w:r>
+      <w:proofErr w:type="spellEnd"/>
+      <w:r>
+        <w:t xml:space="preserve"> en lugar de cambiarlo a </w:t>
+      </w:r>
+      <w:proofErr w:type="spellStart"/>
+      <w:r>
+        <w:t>setearProcedimiento</w:t>
+      </w:r>
+      <w:proofErr w:type="spellEnd"/>
+      <w:r>
+        <w:t xml:space="preserve">). Esto genera </w:t>
+      </w:r>
+      <w:r>
+        <w:lastRenderedPageBreak/>
+        <w:t xml:space="preserve">excepciones difíciles de rastrear, como parámetros no reconocidos por el motor de base de </w:t>
+      </w:r>
+      <w:r>
+        <w:t>datos.</w:t>
+      </w:r>
+    </w:p>
+    <w:p>
+      <w:pPr>
+        <w:numPr>
+          <w:ilvl w:val="0"/>
+          <w:numId w:val="23"/>
+        </w:numPr>
+      </w:pPr>
+      <w:r>
+        <w:rPr>
+          <w:b/>
+          <w:bCs/>
+        </w:rPr>
+        <w:t>Actualización Total vs. Parcial:</w:t>
+      </w:r>
+      <w:r>
+        <w:t xml:space="preserve"> En arquitecturas estándar, la operación de Modificación (</w:t>
+      </w:r>
+      <w:proofErr w:type="spellStart"/>
+      <w:r>
+        <w:t>Update</w:t>
+      </w:r>
+      <w:proofErr w:type="spellEnd"/>
+      <w:r>
+        <w:t xml:space="preserve">) suele sobrescribir todos los campos del registro en la base de datos con los valores actuales del formulario, independientemente de si el usuario modificó solo uno o todos. Desarrollar un algoritmo que detecte y actualice únicamente los campos alterados añade una complejidad que rara vez se justifica, salvo en tablas con un volumen extremo de </w:t>
+      </w:r>
+      <w:r>
+        <w:t>columnas.</w:t>
+      </w:r>
+    </w:p>
+    <w:p>
+      <w:r>
+        <w:rPr>
+          <w:b/>
+          <w:bCs/>
+        </w:rPr>
+        <w:t>TEMA: Patrones de Eliminación de Registros e Integridad Relacional</w:t>
+      </w:r>
+    </w:p>
+    <w:p>
+      <w:pPr>
+        <w:numPr>
+          <w:ilvl w:val="0"/>
+          <w:numId w:val="24"/>
+        </w:numPr>
+      </w:pPr>
+      <w:r>
+        <w:rPr>
+          <w:b/>
+          <w:bCs/>
+        </w:rPr>
+        <w:t>Eliminación Física vs. Lógica:</w:t>
+      </w:r>
+      <w:r>
+        <w:t xml:space="preserve"> La eliminación física implica la ejecución de la instrucción SQL DELETE, la cual remueve el registro de la tabla de forma definitiva e irreversible. Por el contrario, la eliminación lógica solo altera el estado de una columna (ej. Activo = 0) para ocultar el registro en las consultas SELECT.</w:t>
+      </w:r>
+    </w:p>
+    <w:p>
+      <w:pPr>
+        <w:numPr>
+          <w:ilvl w:val="0"/>
+          <w:numId w:val="24"/>
+        </w:numPr>
+      </w:pPr>
+      <w:r>
+        <w:rPr>
+          <w:b/>
+          <w:bCs/>
+        </w:rPr>
+        <w:t>Integridad Referencial y Restricciones:</w:t>
+      </w:r>
+      <w:r>
+        <w:t xml:space="preserve"> En bases de datos relacionales bien estructuradas, intentar eliminar físicamente un registro que actúa como Clave Primaria referenciada por otras tablas (</w:t>
+      </w:r>
+      <w:proofErr w:type="spellStart"/>
+      <w:r>
+        <w:t>Foreign</w:t>
+      </w:r>
+      <w:proofErr w:type="spellEnd"/>
+      <w:r>
+        <w:t xml:space="preserve"> </w:t>
+      </w:r>
+      <w:proofErr w:type="spellStart"/>
+      <w:r>
+        <w:t>Keys</w:t>
+      </w:r>
+      <w:proofErr w:type="spellEnd"/>
+      <w:r>
+        <w:t>) producirá un error de restricción.</w:t>
+      </w:r>
+    </w:p>
+    <w:p>
+      <w:pPr>
+        <w:numPr>
+          <w:ilvl w:val="0"/>
+          <w:numId w:val="24"/>
+        </w:numPr>
+      </w:pPr>
+      <w:r>
+        <w:rPr>
+          <w:b/>
+          <w:bCs/>
+        </w:rPr>
+        <w:t xml:space="preserve">El </w:t>
+      </w:r>
+      <w:proofErr w:type="spellStart"/>
+      <w:r>
+        <w:rPr>
+          <w:b/>
+          <w:bCs/>
+        </w:rPr>
+        <w:t>Antipatrón</w:t>
+      </w:r>
+      <w:proofErr w:type="spellEnd"/>
+      <w:r>
+        <w:rPr>
+          <w:b/>
+          <w:bCs/>
+        </w:rPr>
+        <w:t xml:space="preserve"> de la Eliminación en Cascada:</w:t>
+      </w:r>
+      <w:r>
+        <w:t xml:space="preserve"> Para sortear el error de integridad referencial, los motores SQL permiten configurar borrados "en cascada". Sin embargo, a nivel de arquitectura de software, esto se considera una muy mala práctica, ya que un borrado accidental destruiría árboles completos de información interconectada.</w:t>
+      </w:r>
+    </w:p>
+    <w:p>
+      <w:pPr>
+        <w:numPr>
+          <w:ilvl w:val="0"/>
+          <w:numId w:val="24"/>
+        </w:numPr>
+      </w:pPr>
+      <w:r>
+        <w:rPr>
+          <w:b/>
+          <w:bCs/>
+        </w:rPr>
+        <w:t>Manejo de Datos Sensibles:</w:t>
+      </w:r>
+      <w:r>
+        <w:t xml:space="preserve"> Para información crítica (como historiales de facturación, legajos o liquidaciones de sueldos), la eliminación física está completamente desaconsejada. La pérdida de trazabilidad en datos sensibles es inaceptable a nivel </w:t>
+      </w:r>
+      <w:proofErr w:type="gramStart"/>
+      <w:r>
+        <w:t>auditoría .</w:t>
+      </w:r>
+      <w:proofErr w:type="gramEnd"/>
+    </w:p>
+    <w:p>
+      <w:pPr>
+        <w:numPr>
+          <w:ilvl w:val="0"/>
+          <w:numId w:val="24"/>
+        </w:numPr>
+      </w:pPr>
+      <w:r>
+        <w:rPr>
+          <w:b/>
+          <w:bCs/>
+        </w:rPr>
+        <w:t>Control de Estado UI (Doble Confirmación):</w:t>
+      </w:r>
+      <w:r>
+        <w:t xml:space="preserve"> Para operaciones destructivas en interfaces web, se recomienda implementar mecanismos de confirmación. Utilizando variables booleanas de estado en el </w:t>
+      </w:r>
+      <w:proofErr w:type="spellStart"/>
+      <w:r>
+        <w:t>Code-Behind</w:t>
+      </w:r>
+      <w:proofErr w:type="spellEnd"/>
+      <w:r>
+        <w:t xml:space="preserve"> combinadas con un &lt;</w:t>
+      </w:r>
+      <w:proofErr w:type="spellStart"/>
+      <w:proofErr w:type="gramStart"/>
+      <w:r>
+        <w:t>asp:UpdatePanel</w:t>
+      </w:r>
+      <w:proofErr w:type="spellEnd"/>
+      <w:proofErr w:type="gramEnd"/>
+      <w:r>
+        <w:t xml:space="preserve">&gt;, es posible desplegar controles de confirmación dinámicos (como un </w:t>
+      </w:r>
+      <w:proofErr w:type="spellStart"/>
+      <w:r>
+        <w:t>CheckBox</w:t>
+      </w:r>
+      <w:proofErr w:type="spellEnd"/>
+      <w:r>
+        <w:t>) sin forzar la recarga completa de la página (</w:t>
+      </w:r>
+      <w:proofErr w:type="spellStart"/>
+      <w:r>
+        <w:t>PostBack</w:t>
+      </w:r>
+      <w:proofErr w:type="spellEnd"/>
+      <w:r>
+        <w:t xml:space="preserve"> total) .</w:t>
       </w:r>
     </w:p>
     <w:p/>
@@ -5517,6 +6399,155 @@
     </w:lvl>
   </w:abstractNum>
   <w:abstractNum w:abstractNumId="6" w15:restartNumberingAfterBreak="0">
+    <w:nsid w:val="280324FF"/>
+    <w:multiLevelType w:val="multilevel"/>
+    <w:tmpl w:val="E4EE3730"/>
+    <w:lvl w:ilvl="0">
+      <w:start w:val="1"/>
+      <w:numFmt w:val="bullet"/>
+      <w:lvlText w:val=""/>
+      <w:lvlJc w:val="left"/>
+      <w:pPr>
+        <w:tabs>
+          <w:tab w:val="num" w:pos="720"/>
+        </w:tabs>
+        <w:ind w:left="720" w:hanging="360"/>
+      </w:pPr>
+      <w:rPr>
+        <w:rFonts w:ascii="Symbol" w:hAnsi="Symbol" w:hint="default"/>
+        <w:sz w:val="20"/>
+      </w:rPr>
+    </w:lvl>
+    <w:lvl w:ilvl="1" w:tentative="1">
+      <w:start w:val="1"/>
+      <w:numFmt w:val="bullet"/>
+      <w:lvlText w:val="o"/>
+      <w:lvlJc w:val="left"/>
+      <w:pPr>
+        <w:tabs>
+          <w:tab w:val="num" w:pos="1440"/>
+        </w:tabs>
+        <w:ind w:left="1440" w:hanging="360"/>
+      </w:pPr>
+      <w:rPr>
+        <w:rFonts w:ascii="Courier New" w:hAnsi="Courier New" w:hint="default"/>
+        <w:sz w:val="20"/>
+      </w:rPr>
+    </w:lvl>
+    <w:lvl w:ilvl="2" w:tentative="1">
+      <w:start w:val="1"/>
+      <w:numFmt w:val="bullet"/>
+      <w:lvlText w:val=""/>
+      <w:lvlJc w:val="left"/>
+      <w:pPr>
+        <w:tabs>
+          <w:tab w:val="num" w:pos="2160"/>
+        </w:tabs>
+        <w:ind w:left="2160" w:hanging="360"/>
+      </w:pPr>
+      <w:rPr>
+        <w:rFonts w:ascii="Wingdings" w:hAnsi="Wingdings" w:hint="default"/>
+        <w:sz w:val="20"/>
+      </w:rPr>
+    </w:lvl>
+    <w:lvl w:ilvl="3" w:tentative="1">
+      <w:start w:val="1"/>
+      <w:numFmt w:val="bullet"/>
+      <w:lvlText w:val=""/>
+      <w:lvlJc w:val="left"/>
+      <w:pPr>
+        <w:tabs>
+          <w:tab w:val="num" w:pos="2880"/>
+        </w:tabs>
+        <w:ind w:left="2880" w:hanging="360"/>
+      </w:pPr>
+      <w:rPr>
+        <w:rFonts w:ascii="Wingdings" w:hAnsi="Wingdings" w:hint="default"/>
+        <w:sz w:val="20"/>
+      </w:rPr>
+    </w:lvl>
+    <w:lvl w:ilvl="4" w:tentative="1">
+      <w:start w:val="1"/>
+      <w:numFmt w:val="bullet"/>
+      <w:lvlText w:val=""/>
+      <w:lvlJc w:val="left"/>
+      <w:pPr>
+        <w:tabs>
+          <w:tab w:val="num" w:pos="3600"/>
+        </w:tabs>
+        <w:ind w:left="3600" w:hanging="360"/>
+      </w:pPr>
+      <w:rPr>
+        <w:rFonts w:ascii="Wingdings" w:hAnsi="Wingdings" w:hint="default"/>
+        <w:sz w:val="20"/>
+      </w:rPr>
+    </w:lvl>
+    <w:lvl w:ilvl="5" w:tentative="1">
+      <w:start w:val="1"/>
+      <w:numFmt w:val="bullet"/>
+      <w:lvlText w:val=""/>
+      <w:lvlJc w:val="left"/>
+      <w:pPr>
+        <w:tabs>
+          <w:tab w:val="num" w:pos="4320"/>
+        </w:tabs>
+        <w:ind w:left="4320" w:hanging="360"/>
+      </w:pPr>
+      <w:rPr>
+        <w:rFonts w:ascii="Wingdings" w:hAnsi="Wingdings" w:hint="default"/>
+        <w:sz w:val="20"/>
+      </w:rPr>
+    </w:lvl>
+    <w:lvl w:ilvl="6" w:tentative="1">
+      <w:start w:val="1"/>
+      <w:numFmt w:val="bullet"/>
+      <w:lvlText w:val=""/>
+      <w:lvlJc w:val="left"/>
+      <w:pPr>
+        <w:tabs>
+          <w:tab w:val="num" w:pos="5040"/>
+        </w:tabs>
+        <w:ind w:left="5040" w:hanging="360"/>
+      </w:pPr>
+      <w:rPr>
+        <w:rFonts w:ascii="Wingdings" w:hAnsi="Wingdings" w:hint="default"/>
+        <w:sz w:val="20"/>
+      </w:rPr>
+    </w:lvl>
+    <w:lvl w:ilvl="7" w:tentative="1">
+      <w:start w:val="1"/>
+      <w:numFmt w:val="bullet"/>
+      <w:lvlText w:val=""/>
+      <w:lvlJc w:val="left"/>
+      <w:pPr>
+        <w:tabs>
+          <w:tab w:val="num" w:pos="5760"/>
+        </w:tabs>
+        <w:ind w:left="5760" w:hanging="360"/>
+      </w:pPr>
+      <w:rPr>
+        <w:rFonts w:ascii="Wingdings" w:hAnsi="Wingdings" w:hint="default"/>
+        <w:sz w:val="20"/>
+      </w:rPr>
+    </w:lvl>
+    <w:lvl w:ilvl="8" w:tentative="1">
+      <w:start w:val="1"/>
+      <w:numFmt w:val="bullet"/>
+      <w:lvlText w:val=""/>
+      <w:lvlJc w:val="left"/>
+      <w:pPr>
+        <w:tabs>
+          <w:tab w:val="num" w:pos="6480"/>
+        </w:tabs>
+        <w:ind w:left="6480" w:hanging="360"/>
+      </w:pPr>
+      <w:rPr>
+        <w:rFonts w:ascii="Wingdings" w:hAnsi="Wingdings" w:hint="default"/>
+        <w:sz w:val="20"/>
+      </w:rPr>
+    </w:lvl>
+  </w:abstractNum>
+  <w:abstractNum w:abstractNumId="7" w15:restartNumberingAfterBreak="0">
     <w:nsid w:val="365F1960"/>
     <w:multiLevelType w:val="multilevel"/>
     <w:tmpl w:val="4CA4C0FA"/>
@@ -5665,7 +6696,7 @@
       </w:rPr>
     </w:lvl>
   </w:abstractNum>
-  <w:abstractNum w:abstractNumId="7" w15:restartNumberingAfterBreak="0">
+  <w:abstractNum w:abstractNumId="8" w15:restartNumberingAfterBreak="0">
     <w:nsid w:val="376B325C"/>
     <w:multiLevelType w:val="multilevel"/>
     <w:tmpl w:val="85C0A918"/>
@@ -5814,7 +6845,152 @@
       </w:rPr>
     </w:lvl>
   </w:abstractNum>
-  <w:abstractNum w:abstractNumId="8" w15:restartNumberingAfterBreak="0">
+  <w:abstractNum w:abstractNumId="9" w15:restartNumberingAfterBreak="0">
+    <w:nsid w:val="3C320E2E"/>
+    <w:multiLevelType w:val="multilevel"/>
+    <w:tmpl w:val="6396FB1C"/>
+    <w:lvl w:ilvl="0">
+      <w:start w:val="1"/>
+      <w:numFmt w:val="bullet"/>
+      <w:lvlText w:val=""/>
+      <w:lvlJc w:val="left"/>
+      <w:pPr>
+        <w:tabs>
+          <w:tab w:val="num" w:pos="720"/>
+        </w:tabs>
+        <w:ind w:left="720" w:hanging="360"/>
+      </w:pPr>
+      <w:rPr>
+        <w:rFonts w:ascii="Symbol" w:hAnsi="Symbol" w:hint="default"/>
+        <w:sz w:val="20"/>
+      </w:rPr>
+    </w:lvl>
+    <w:lvl w:ilvl="1">
+      <w:start w:val="1"/>
+      <w:numFmt w:val="decimal"/>
+      <w:lvlText w:val="%2."/>
+      <w:lvlJc w:val="left"/>
+      <w:pPr>
+        <w:tabs>
+          <w:tab w:val="num" w:pos="1440"/>
+        </w:tabs>
+        <w:ind w:left="1440" w:hanging="360"/>
+      </w:pPr>
+    </w:lvl>
+    <w:lvl w:ilvl="2" w:tentative="1">
+      <w:start w:val="1"/>
+      <w:numFmt w:val="bullet"/>
+      <w:lvlText w:val=""/>
+      <w:lvlJc w:val="left"/>
+      <w:pPr>
+        <w:tabs>
+          <w:tab w:val="num" w:pos="2160"/>
+        </w:tabs>
+        <w:ind w:left="2160" w:hanging="360"/>
+      </w:pPr>
+      <w:rPr>
+        <w:rFonts w:ascii="Wingdings" w:hAnsi="Wingdings" w:hint="default"/>
+        <w:sz w:val="20"/>
+      </w:rPr>
+    </w:lvl>
+    <w:lvl w:ilvl="3" w:tentative="1">
+      <w:start w:val="1"/>
+      <w:numFmt w:val="bullet"/>
+      <w:lvlText w:val=""/>
+      <w:lvlJc w:val="left"/>
+      <w:pPr>
+        <w:tabs>
+          <w:tab w:val="num" w:pos="2880"/>
+        </w:tabs>
+        <w:ind w:left="2880" w:hanging="360"/>
+      </w:pPr>
+      <w:rPr>
+        <w:rFonts w:ascii="Wingdings" w:hAnsi="Wingdings" w:hint="default"/>
+        <w:sz w:val="20"/>
+      </w:rPr>
+    </w:lvl>
+    <w:lvl w:ilvl="4" w:tentative="1">
+      <w:start w:val="1"/>
+      <w:numFmt w:val="bullet"/>
+      <w:lvlText w:val=""/>
+      <w:lvlJc w:val="left"/>
+      <w:pPr>
+        <w:tabs>
+          <w:tab w:val="num" w:pos="3600"/>
+        </w:tabs>
+        <w:ind w:left="3600" w:hanging="360"/>
+      </w:pPr>
+      <w:rPr>
+        <w:rFonts w:ascii="Wingdings" w:hAnsi="Wingdings" w:hint="default"/>
+        <w:sz w:val="20"/>
+      </w:rPr>
+    </w:lvl>
+    <w:lvl w:ilvl="5" w:tentative="1">
+      <w:start w:val="1"/>
+      <w:numFmt w:val="bullet"/>
+      <w:lvlText w:val=""/>
+      <w:lvlJc w:val="left"/>
+      <w:pPr>
+        <w:tabs>
+          <w:tab w:val="num" w:pos="4320"/>
+        </w:tabs>
+        <w:ind w:left="4320" w:hanging="360"/>
+      </w:pPr>
+      <w:rPr>
+        <w:rFonts w:ascii="Wingdings" w:hAnsi="Wingdings" w:hint="default"/>
+        <w:sz w:val="20"/>
+      </w:rPr>
+    </w:lvl>
+    <w:lvl w:ilvl="6" w:tentative="1">
+      <w:start w:val="1"/>
+      <w:numFmt w:val="bullet"/>
+      <w:lvlText w:val=""/>
+      <w:lvlJc w:val="left"/>
+      <w:pPr>
+        <w:tabs>
+          <w:tab w:val="num" w:pos="5040"/>
+        </w:tabs>
+        <w:ind w:left="5040" w:hanging="360"/>
+      </w:pPr>
+      <w:rPr>
+        <w:rFonts w:ascii="Wingdings" w:hAnsi="Wingdings" w:hint="default"/>
+        <w:sz w:val="20"/>
+      </w:rPr>
+    </w:lvl>
+    <w:lvl w:ilvl="7" w:tentative="1">
+      <w:start w:val="1"/>
+      <w:numFmt w:val="bullet"/>
+      <w:lvlText w:val=""/>
+      <w:lvlJc w:val="left"/>
+      <w:pPr>
+        <w:tabs>
+          <w:tab w:val="num" w:pos="5760"/>
+        </w:tabs>
+        <w:ind w:left="5760" w:hanging="360"/>
+      </w:pPr>
+      <w:rPr>
+        <w:rFonts w:ascii="Wingdings" w:hAnsi="Wingdings" w:hint="default"/>
+        <w:sz w:val="20"/>
+      </w:rPr>
+    </w:lvl>
+    <w:lvl w:ilvl="8" w:tentative="1">
+      <w:start w:val="1"/>
+      <w:numFmt w:val="bullet"/>
+      <w:lvlText w:val=""/>
+      <w:lvlJc w:val="left"/>
+      <w:pPr>
+        <w:tabs>
+          <w:tab w:val="num" w:pos="6480"/>
+        </w:tabs>
+        <w:ind w:left="6480" w:hanging="360"/>
+      </w:pPr>
+      <w:rPr>
+        <w:rFonts w:ascii="Wingdings" w:hAnsi="Wingdings" w:hint="default"/>
+        <w:sz w:val="20"/>
+      </w:rPr>
+    </w:lvl>
+  </w:abstractNum>
+  <w:abstractNum w:abstractNumId="10" w15:restartNumberingAfterBreak="0">
     <w:nsid w:val="3DDF61CA"/>
     <w:multiLevelType w:val="multilevel"/>
     <w:tmpl w:val="ABFC856E"/>
@@ -5963,7 +7139,7 @@
       </w:rPr>
     </w:lvl>
   </w:abstractNum>
-  <w:abstractNum w:abstractNumId="9" w15:restartNumberingAfterBreak="0">
+  <w:abstractNum w:abstractNumId="11" w15:restartNumberingAfterBreak="0">
     <w:nsid w:val="3EC2497A"/>
     <w:multiLevelType w:val="multilevel"/>
     <w:tmpl w:val="038669AA"/>
@@ -6112,7 +7288,7 @@
       </w:rPr>
     </w:lvl>
   </w:abstractNum>
-  <w:abstractNum w:abstractNumId="10" w15:restartNumberingAfterBreak="0">
+  <w:abstractNum w:abstractNumId="12" w15:restartNumberingAfterBreak="0">
     <w:nsid w:val="43D6285F"/>
     <w:multiLevelType w:val="multilevel"/>
     <w:tmpl w:val="0CF470C0"/>
@@ -6261,7 +7437,7 @@
       </w:rPr>
     </w:lvl>
   </w:abstractNum>
-  <w:abstractNum w:abstractNumId="11" w15:restartNumberingAfterBreak="0">
+  <w:abstractNum w:abstractNumId="13" w15:restartNumberingAfterBreak="0">
     <w:nsid w:val="47A256AC"/>
     <w:multiLevelType w:val="multilevel"/>
     <w:tmpl w:val="94784BE8"/>
@@ -6410,7 +7586,7 @@
       </w:rPr>
     </w:lvl>
   </w:abstractNum>
-  <w:abstractNum w:abstractNumId="12" w15:restartNumberingAfterBreak="0">
+  <w:abstractNum w:abstractNumId="14" w15:restartNumberingAfterBreak="0">
     <w:nsid w:val="496B4294"/>
     <w:multiLevelType w:val="multilevel"/>
     <w:tmpl w:val="EEAAA56C"/>
@@ -6559,7 +7735,7 @@
       </w:rPr>
     </w:lvl>
   </w:abstractNum>
-  <w:abstractNum w:abstractNumId="13" w15:restartNumberingAfterBreak="0">
+  <w:abstractNum w:abstractNumId="15" w15:restartNumberingAfterBreak="0">
     <w:nsid w:val="5AFF2E8D"/>
     <w:multiLevelType w:val="multilevel"/>
     <w:tmpl w:val="00E82A94"/>
@@ -6708,7 +7884,156 @@
       </w:rPr>
     </w:lvl>
   </w:abstractNum>
-  <w:abstractNum w:abstractNumId="14" w15:restartNumberingAfterBreak="0">
+  <w:abstractNum w:abstractNumId="16" w15:restartNumberingAfterBreak="0">
+    <w:nsid w:val="5C491D25"/>
+    <w:multiLevelType w:val="multilevel"/>
+    <w:tmpl w:val="83B68182"/>
+    <w:lvl w:ilvl="0">
+      <w:start w:val="1"/>
+      <w:numFmt w:val="bullet"/>
+      <w:lvlText w:val=""/>
+      <w:lvlJc w:val="left"/>
+      <w:pPr>
+        <w:tabs>
+          <w:tab w:val="num" w:pos="720"/>
+        </w:tabs>
+        <w:ind w:left="720" w:hanging="360"/>
+      </w:pPr>
+      <w:rPr>
+        <w:rFonts w:ascii="Symbol" w:hAnsi="Symbol" w:hint="default"/>
+        <w:sz w:val="20"/>
+      </w:rPr>
+    </w:lvl>
+    <w:lvl w:ilvl="1" w:tentative="1">
+      <w:start w:val="1"/>
+      <w:numFmt w:val="bullet"/>
+      <w:lvlText w:val="o"/>
+      <w:lvlJc w:val="left"/>
+      <w:pPr>
+        <w:tabs>
+          <w:tab w:val="num" w:pos="1440"/>
+        </w:tabs>
+        <w:ind w:left="1440" w:hanging="360"/>
+      </w:pPr>
+      <w:rPr>
+        <w:rFonts w:ascii="Courier New" w:hAnsi="Courier New" w:hint="default"/>
+        <w:sz w:val="20"/>
+      </w:rPr>
+    </w:lvl>
+    <w:lvl w:ilvl="2" w:tentative="1">
+      <w:start w:val="1"/>
+      <w:numFmt w:val="bullet"/>
+      <w:lvlText w:val=""/>
+      <w:lvlJc w:val="left"/>
+      <w:pPr>
+        <w:tabs>
+          <w:tab w:val="num" w:pos="2160"/>
+        </w:tabs>
+        <w:ind w:left="2160" w:hanging="360"/>
+      </w:pPr>
+      <w:rPr>
+        <w:rFonts w:ascii="Wingdings" w:hAnsi="Wingdings" w:hint="default"/>
+        <w:sz w:val="20"/>
+      </w:rPr>
+    </w:lvl>
+    <w:lvl w:ilvl="3" w:tentative="1">
+      <w:start w:val="1"/>
+      <w:numFmt w:val="bullet"/>
+      <w:lvlText w:val=""/>
+      <w:lvlJc w:val="left"/>
+      <w:pPr>
+        <w:tabs>
+          <w:tab w:val="num" w:pos="2880"/>
+        </w:tabs>
+        <w:ind w:left="2880" w:hanging="360"/>
+      </w:pPr>
+      <w:rPr>
+        <w:rFonts w:ascii="Wingdings" w:hAnsi="Wingdings" w:hint="default"/>
+        <w:sz w:val="20"/>
+      </w:rPr>
+    </w:lvl>
+    <w:lvl w:ilvl="4" w:tentative="1">
+      <w:start w:val="1"/>
+      <w:numFmt w:val="bullet"/>
+      <w:lvlText w:val=""/>
+      <w:lvlJc w:val="left"/>
+      <w:pPr>
+        <w:tabs>
+          <w:tab w:val="num" w:pos="3600"/>
+        </w:tabs>
+        <w:ind w:left="3600" w:hanging="360"/>
+      </w:pPr>
+      <w:rPr>
+        <w:rFonts w:ascii="Wingdings" w:hAnsi="Wingdings" w:hint="default"/>
+        <w:sz w:val="20"/>
+      </w:rPr>
+    </w:lvl>
+    <w:lvl w:ilvl="5" w:tentative="1">
+      <w:start w:val="1"/>
+      <w:numFmt w:val="bullet"/>
+      <w:lvlText w:val=""/>
+      <w:lvlJc w:val="left"/>
+      <w:pPr>
+        <w:tabs>
+          <w:tab w:val="num" w:pos="4320"/>
+        </w:tabs>
+        <w:ind w:left="4320" w:hanging="360"/>
+      </w:pPr>
+      <w:rPr>
+        <w:rFonts w:ascii="Wingdings" w:hAnsi="Wingdings" w:hint="default"/>
+        <w:sz w:val="20"/>
+      </w:rPr>
+    </w:lvl>
+    <w:lvl w:ilvl="6" w:tentative="1">
+      <w:start w:val="1"/>
+      <w:numFmt w:val="bullet"/>
+      <w:lvlText w:val=""/>
+      <w:lvlJc w:val="left"/>
+      <w:pPr>
+        <w:tabs>
+          <w:tab w:val="num" w:pos="5040"/>
+        </w:tabs>
+        <w:ind w:left="5040" w:hanging="360"/>
+      </w:pPr>
+      <w:rPr>
+        <w:rFonts w:ascii="Wingdings" w:hAnsi="Wingdings" w:hint="default"/>
+        <w:sz w:val="20"/>
+      </w:rPr>
+    </w:lvl>
+    <w:lvl w:ilvl="7" w:tentative="1">
+      <w:start w:val="1"/>
+      <w:numFmt w:val="bullet"/>
+      <w:lvlText w:val=""/>
+      <w:lvlJc w:val="left"/>
+      <w:pPr>
+        <w:tabs>
+          <w:tab w:val="num" w:pos="5760"/>
+        </w:tabs>
+        <w:ind w:left="5760" w:hanging="360"/>
+      </w:pPr>
+      <w:rPr>
+        <w:rFonts w:ascii="Wingdings" w:hAnsi="Wingdings" w:hint="default"/>
+        <w:sz w:val="20"/>
+      </w:rPr>
+    </w:lvl>
+    <w:lvl w:ilvl="8" w:tentative="1">
+      <w:start w:val="1"/>
+      <w:numFmt w:val="bullet"/>
+      <w:lvlText w:val=""/>
+      <w:lvlJc w:val="left"/>
+      <w:pPr>
+        <w:tabs>
+          <w:tab w:val="num" w:pos="6480"/>
+        </w:tabs>
+        <w:ind w:left="6480" w:hanging="360"/>
+      </w:pPr>
+      <w:rPr>
+        <w:rFonts w:ascii="Wingdings" w:hAnsi="Wingdings" w:hint="default"/>
+        <w:sz w:val="20"/>
+      </w:rPr>
+    </w:lvl>
+  </w:abstractNum>
+  <w:abstractNum w:abstractNumId="17" w15:restartNumberingAfterBreak="0">
     <w:nsid w:val="5D612526"/>
     <w:multiLevelType w:val="multilevel"/>
     <w:tmpl w:val="DB62DC76"/>
@@ -6857,7 +8182,7 @@
       </w:rPr>
     </w:lvl>
   </w:abstractNum>
-  <w:abstractNum w:abstractNumId="15" w15:restartNumberingAfterBreak="0">
+  <w:abstractNum w:abstractNumId="18" w15:restartNumberingAfterBreak="0">
     <w:nsid w:val="63FC054C"/>
     <w:multiLevelType w:val="multilevel"/>
     <w:tmpl w:val="D00A9D0A"/>
@@ -7002,7 +8327,7 @@
       </w:rPr>
     </w:lvl>
   </w:abstractNum>
-  <w:abstractNum w:abstractNumId="16" w15:restartNumberingAfterBreak="0">
+  <w:abstractNum w:abstractNumId="19" w15:restartNumberingAfterBreak="0">
     <w:nsid w:val="6DBF7670"/>
     <w:multiLevelType w:val="multilevel"/>
     <w:tmpl w:val="CC963EBA"/>
@@ -7151,7 +8476,7 @@
       </w:rPr>
     </w:lvl>
   </w:abstractNum>
-  <w:abstractNum w:abstractNumId="17" w15:restartNumberingAfterBreak="0">
+  <w:abstractNum w:abstractNumId="20" w15:restartNumberingAfterBreak="0">
     <w:nsid w:val="6F4C7C29"/>
     <w:multiLevelType w:val="multilevel"/>
     <w:tmpl w:val="0CC08082"/>
@@ -7264,7 +8589,7 @@
       </w:pPr>
     </w:lvl>
   </w:abstractNum>
-  <w:abstractNum w:abstractNumId="18" w15:restartNumberingAfterBreak="0">
+  <w:abstractNum w:abstractNumId="21" w15:restartNumberingAfterBreak="0">
     <w:nsid w:val="71B169B8"/>
     <w:multiLevelType w:val="multilevel"/>
     <w:tmpl w:val="124416DC"/>
@@ -7409,7 +8734,7 @@
       </w:rPr>
     </w:lvl>
   </w:abstractNum>
-  <w:abstractNum w:abstractNumId="19" w15:restartNumberingAfterBreak="0">
+  <w:abstractNum w:abstractNumId="22" w15:restartNumberingAfterBreak="0">
     <w:nsid w:val="71DD7274"/>
     <w:multiLevelType w:val="multilevel"/>
     <w:tmpl w:val="2C645D04"/>
@@ -7522,7 +8847,7 @@
       </w:pPr>
     </w:lvl>
   </w:abstractNum>
-  <w:abstractNum w:abstractNumId="20" w15:restartNumberingAfterBreak="0">
+  <w:abstractNum w:abstractNumId="23" w15:restartNumberingAfterBreak="0">
     <w:nsid w:val="72380DDF"/>
     <w:multiLevelType w:val="multilevel"/>
     <w:tmpl w:val="B9CC6108"/>
@@ -7672,16 +8997,16 @@
     </w:lvl>
   </w:abstractNum>
   <w:num w:numId="1" w16cid:durableId="340132085">
-    <w:abstractNumId w:val="9"/>
+    <w:abstractNumId w:val="11"/>
   </w:num>
   <w:num w:numId="2" w16cid:durableId="1890527785">
     <w:abstractNumId w:val="4"/>
   </w:num>
   <w:num w:numId="3" w16cid:durableId="564411841">
-    <w:abstractNumId w:val="14"/>
+    <w:abstractNumId w:val="17"/>
   </w:num>
   <w:num w:numId="4" w16cid:durableId="495222279">
-    <w:abstractNumId w:val="8"/>
+    <w:abstractNumId w:val="10"/>
   </w:num>
   <w:num w:numId="5" w16cid:durableId="1905722608">
     <w:abstractNumId w:val="3"/>
@@ -7690,13 +9015,13 @@
     <w:abstractNumId w:val="5"/>
   </w:num>
   <w:num w:numId="7" w16cid:durableId="1874030179">
-    <w:abstractNumId w:val="6"/>
+    <w:abstractNumId w:val="7"/>
   </w:num>
   <w:num w:numId="8" w16cid:durableId="1905289728">
-    <w:abstractNumId w:val="16"/>
+    <w:abstractNumId w:val="19"/>
   </w:num>
   <w:num w:numId="9" w16cid:durableId="903224478">
-    <w:abstractNumId w:val="17"/>
+    <w:abstractNumId w:val="20"/>
   </w:num>
   <w:num w:numId="10" w16cid:durableId="1389456004">
     <w:abstractNumId w:val="1"/>
@@ -7708,31 +9033,40 @@
     <w:abstractNumId w:val="0"/>
   </w:num>
   <w:num w:numId="13" w16cid:durableId="1358509900">
-    <w:abstractNumId w:val="7"/>
+    <w:abstractNumId w:val="8"/>
   </w:num>
   <w:num w:numId="14" w16cid:durableId="1263025117">
+    <w:abstractNumId w:val="14"/>
+  </w:num>
+  <w:num w:numId="15" w16cid:durableId="1706708101">
+    <w:abstractNumId w:val="22"/>
+  </w:num>
+  <w:num w:numId="16" w16cid:durableId="1900166956">
+    <w:abstractNumId w:val="15"/>
+  </w:num>
+  <w:num w:numId="17" w16cid:durableId="1088618782">
+    <w:abstractNumId w:val="13"/>
+  </w:num>
+  <w:num w:numId="18" w16cid:durableId="891696317">
+    <w:abstractNumId w:val="21"/>
+  </w:num>
+  <w:num w:numId="19" w16cid:durableId="1852720404">
+    <w:abstractNumId w:val="23"/>
+  </w:num>
+  <w:num w:numId="20" w16cid:durableId="2080328687">
     <w:abstractNumId w:val="12"/>
   </w:num>
-  <w:num w:numId="15" w16cid:durableId="1706708101">
-    <w:abstractNumId w:val="19"/>
-  </w:num>
-  <w:num w:numId="16" w16cid:durableId="1900166956">
-    <w:abstractNumId w:val="13"/>
-  </w:num>
-  <w:num w:numId="17" w16cid:durableId="1088618782">
-    <w:abstractNumId w:val="11"/>
-  </w:num>
-  <w:num w:numId="18" w16cid:durableId="891696317">
+  <w:num w:numId="21" w16cid:durableId="2061400506">
     <w:abstractNumId w:val="18"/>
   </w:num>
-  <w:num w:numId="19" w16cid:durableId="1852720404">
-    <w:abstractNumId w:val="20"/>
+  <w:num w:numId="22" w16cid:durableId="322779506">
+    <w:abstractNumId w:val="9"/>
   </w:num>
-  <w:num w:numId="20" w16cid:durableId="2080328687">
-    <w:abstractNumId w:val="10"/>
+  <w:num w:numId="23" w16cid:durableId="1742749278">
+    <w:abstractNumId w:val="16"/>
   </w:num>
-  <w:num w:numId="21" w16cid:durableId="2061400506">
-    <w:abstractNumId w:val="15"/>
+  <w:num w:numId="24" w16cid:durableId="1272977281">
+    <w:abstractNumId w:val="6"/>
   </w:num>
 </w:numbering>
 </file>

</xml_diff>

<commit_message>
feat: implementar autenticación de usuarios, perfiles y control de acceso (RBAC). - Creación de tabla USUARIOS y capa de Dominio (clase Usuario) integrando un enum TipoUsuario para evitar magic strings [cite: 157-159]. - Desarrollo del método Loguear en UsuarioNegocio con consultas SQL dinámicas mapeando credenciales y perfiles [cite: 167-169]. - Construcción de Login.aspx para captura de credenciales y gestión de estado mediante el objeto Session. - Implementación de control de acceso en Page_Load de PokemonLista.aspx y PokemonForm.aspx, restringiendo el ingreso a usuarios no autenticados o sin perfil Admin. - Configuración de UI dinámica (btnAgregar.Visible = false) para usuarios estándar, mejorando la seguridad y UX.
</commit_message>
<xml_diff>
--- a/Unidad 5 - Pokedex Web/Documentación de Pokedex.docx
+++ b/Unidad 5 - Pokedex Web/Documentación de Pokedex.docx
@@ -5200,13 +5200,7 @@
         <w:t>:</w:t>
       </w:r>
       <w:r>
-        <w:t xml:space="preserve"> Al modificar un registro, se deben precargar los campos de texto y listas desplegables con los datos actuales del objeto para una buena experiencia de </w:t>
-      </w:r>
-      <w:r>
-        <w:t>usuario.</w:t>
-      </w:r>
-      <w:r>
-        <w:t xml:space="preserve"> Sin embargo, </w:t>
+        <w:t xml:space="preserve"> Al modificar un registro, se deben precargar los campos de texto y listas desplegables con los datos actuales del objeto para una buena experiencia de usuario. Sin embargo, </w:t>
       </w:r>
       <w:r>
         <w:rPr>
@@ -5245,10 +5239,7 @@
       </w:r>
       <w:proofErr w:type="spellEnd"/>
       <w:r>
-        <w:t xml:space="preserve"> se </w:t>
-      </w:r>
-      <w:r>
-        <w:t>ejecute.</w:t>
+        <w:t xml:space="preserve"> se ejecute.</w:t>
       </w:r>
     </w:p>
     <w:p>
@@ -5302,10 +5293,7 @@
       </w:r>
       <w:r>
         <w:lastRenderedPageBreak/>
-        <w:t xml:space="preserve">excepciones difíciles de rastrear, como parámetros no reconocidos por el motor de base de </w:t>
-      </w:r>
-      <w:r>
-        <w:t>datos.</w:t>
+        <w:t>excepciones difíciles de rastrear, como parámetros no reconocidos por el motor de base de datos.</w:t>
       </w:r>
     </w:p>
     <w:p>
@@ -5331,10 +5319,7 @@
       </w:r>
       <w:proofErr w:type="spellEnd"/>
       <w:r>
-        <w:t xml:space="preserve">) suele sobrescribir todos los campos del registro en la base de datos con los valores actuales del formulario, independientemente de si el usuario modificó solo uno o todos. Desarrollar un algoritmo que detecte y actualice únicamente los campos alterados añade una complejidad que rara vez se justifica, salvo en tablas con un volumen extremo de </w:t>
-      </w:r>
-      <w:r>
-        <w:t>columnas.</w:t>
+        <w:t>) suele sobrescribir todos los campos del registro en la base de datos con los valores actuales del formulario, independientemente de si el usuario modificó solo uno o todos. Desarrollar un algoritmo que detecte y actualice únicamente los campos alterados añade una complejidad que rara vez se justifica, salvo en tablas con un volumen extremo de columnas.</w:t>
       </w:r>
     </w:p>
     <w:p>
@@ -5507,6 +5492,1188 @@
         <w:t xml:space="preserve"> total) .</w:t>
       </w:r>
     </w:p>
+    <w:p>
+      <w:r>
+        <w:rPr>
+          <w:b/>
+          <w:bCs/>
+        </w:rPr>
+        <w:t>TEMA: Manejo de Estados (</w:t>
+      </w:r>
+      <w:proofErr w:type="spellStart"/>
+      <w:r>
+        <w:rPr>
+          <w:b/>
+          <w:bCs/>
+        </w:rPr>
+        <w:t>State</w:t>
+      </w:r>
+      <w:proofErr w:type="spellEnd"/>
+      <w:r>
+        <w:rPr>
+          <w:b/>
+          <w:bCs/>
+        </w:rPr>
+        <w:t xml:space="preserve"> Machine) y Persistencia con </w:t>
+      </w:r>
+      <w:proofErr w:type="spellStart"/>
+      <w:r>
+        <w:rPr>
+          <w:b/>
+          <w:bCs/>
+        </w:rPr>
+        <w:t>Session</w:t>
+      </w:r>
+      <w:proofErr w:type="spellEnd"/>
+      <w:r>
+        <w:rPr>
+          <w:b/>
+          <w:bCs/>
+        </w:rPr>
+        <w:t xml:space="preserve"> en ASP.NET</w:t>
+      </w:r>
+    </w:p>
+    <w:p>
+      <w:pPr>
+        <w:numPr>
+          <w:ilvl w:val="0"/>
+          <w:numId w:val="25"/>
+        </w:numPr>
+      </w:pPr>
+      <w:r>
+        <w:rPr>
+          <w:b/>
+          <w:bCs/>
+        </w:rPr>
+        <w:t>Modelo de Estados:</w:t>
+      </w:r>
+      <w:r>
+        <w:t xml:space="preserve"> En el desarrollo de software corporativo, los registros suelen atravesar distintos estados (ej. </w:t>
+      </w:r>
+      <w:r>
+        <w:rPr>
+          <w:i/>
+          <w:iCs/>
+        </w:rPr>
+        <w:t>En preparación</w:t>
+      </w:r>
+      <w:r>
+        <w:t xml:space="preserve">, </w:t>
+      </w:r>
+      <w:r>
+        <w:rPr>
+          <w:i/>
+          <w:iCs/>
+        </w:rPr>
+        <w:t>Activo</w:t>
+      </w:r>
+      <w:r>
+        <w:t xml:space="preserve">, </w:t>
+      </w:r>
+      <w:r>
+        <w:rPr>
+          <w:i/>
+          <w:iCs/>
+        </w:rPr>
+        <w:t>Cancelado</w:t>
+      </w:r>
+      <w:r>
+        <w:t xml:space="preserve">, </w:t>
+      </w:r>
+      <w:r>
+        <w:rPr>
+          <w:i/>
+          <w:iCs/>
+        </w:rPr>
+        <w:t>Finalizado</w:t>
+      </w:r>
+      <w:proofErr w:type="gramStart"/>
+      <w:r>
+        <w:t>) .</w:t>
+      </w:r>
+      <w:proofErr w:type="gramEnd"/>
+      <w:r>
+        <w:t xml:space="preserve"> Dependiendo de las reglas de negocio, un estado puede ser reversible (como activar/inactivar un producto) o irreversible (como cancelar un remito facturado</w:t>
+      </w:r>
+      <w:proofErr w:type="gramStart"/>
+      <w:r>
+        <w:t>) .</w:t>
+      </w:r>
+      <w:proofErr w:type="gramEnd"/>
+    </w:p>
+    <w:p>
+      <w:pPr>
+        <w:numPr>
+          <w:ilvl w:val="0"/>
+          <w:numId w:val="25"/>
+        </w:numPr>
+      </w:pPr>
+      <w:r>
+        <w:rPr>
+          <w:b/>
+          <w:bCs/>
+        </w:rPr>
+        <w:t xml:space="preserve">Persistencia entre </w:t>
+      </w:r>
+      <w:proofErr w:type="spellStart"/>
+      <w:r>
+        <w:rPr>
+          <w:b/>
+          <w:bCs/>
+        </w:rPr>
+        <w:t>PostBacks</w:t>
+      </w:r>
+      <w:proofErr w:type="spellEnd"/>
+      <w:r>
+        <w:rPr>
+          <w:b/>
+          <w:bCs/>
+        </w:rPr>
+        <w:t xml:space="preserve"> (El Objeto </w:t>
+      </w:r>
+      <w:proofErr w:type="spellStart"/>
+      <w:r>
+        <w:rPr>
+          <w:b/>
+          <w:bCs/>
+        </w:rPr>
+        <w:t>Session</w:t>
+      </w:r>
+      <w:proofErr w:type="spellEnd"/>
+      <w:r>
+        <w:rPr>
+          <w:b/>
+          <w:bCs/>
+        </w:rPr>
+        <w:t>):</w:t>
+      </w:r>
+      <w:r>
+        <w:t xml:space="preserve"> Debido a que el protocolo HTTP es "</w:t>
+      </w:r>
+      <w:proofErr w:type="spellStart"/>
+      <w:r>
+        <w:t>stateless</w:t>
+      </w:r>
+      <w:proofErr w:type="spellEnd"/>
+      <w:r>
+        <w:t xml:space="preserve">" (sin estado), cada vez que el usuario hace clic en un botón, la página web viaja al servidor y el servidor "olvida" los datos que había cargado en el </w:t>
+      </w:r>
+      <w:proofErr w:type="spellStart"/>
+      <w:r>
+        <w:t>Page_Load</w:t>
+      </w:r>
+      <w:proofErr w:type="spellEnd"/>
+      <w:r>
+        <w:t xml:space="preserve">. Para evitar tener que ir a buscar a la base de datos el mismo objeto una y otra vez, ASP.NET provee la colección </w:t>
+      </w:r>
+      <w:proofErr w:type="spellStart"/>
+      <w:r>
+        <w:t>Session</w:t>
+      </w:r>
+      <w:proofErr w:type="spellEnd"/>
+      <w:r>
+        <w:t xml:space="preserve">. Permite guardar objetos completos en la memoria del servidor (ej. </w:t>
+      </w:r>
+      <w:proofErr w:type="spellStart"/>
+      <w:r>
+        <w:t>Session.Add</w:t>
+      </w:r>
+      <w:proofErr w:type="spellEnd"/>
+      <w:r>
+        <w:t>("clave", objeto)) durante el tiempo que dure la visita del usuario, pudiendo recuperarlos en eventos posteriores mediante un casteo (ej. (</w:t>
+      </w:r>
+      <w:proofErr w:type="spellStart"/>
+      <w:r>
+        <w:t>TipoObjeto</w:t>
+      </w:r>
+      <w:proofErr w:type="spellEnd"/>
+      <w:r>
+        <w:t>)</w:t>
+      </w:r>
+      <w:proofErr w:type="spellStart"/>
+      <w:r>
+        <w:t>Session</w:t>
+      </w:r>
+      <w:proofErr w:type="spellEnd"/>
+      <w:r>
+        <w:t>["clave"]</w:t>
+      </w:r>
+      <w:proofErr w:type="gramStart"/>
+      <w:r>
+        <w:t>) .</w:t>
+      </w:r>
+      <w:proofErr w:type="gramEnd"/>
+    </w:p>
+    <w:p>
+      <w:pPr>
+        <w:numPr>
+          <w:ilvl w:val="0"/>
+          <w:numId w:val="25"/>
+        </w:numPr>
+      </w:pPr>
+      <w:r>
+        <w:rPr>
+          <w:b/>
+          <w:bCs/>
+        </w:rPr>
+        <w:lastRenderedPageBreak/>
+        <w:t>Operadores de Negación (</w:t>
+      </w:r>
+      <w:proofErr w:type="spellStart"/>
+      <w:r>
+        <w:rPr>
+          <w:b/>
+          <w:bCs/>
+        </w:rPr>
+        <w:t>Toggle</w:t>
+      </w:r>
+      <w:proofErr w:type="spellEnd"/>
+      <w:r>
+        <w:rPr>
+          <w:b/>
+          <w:bCs/>
+        </w:rPr>
+        <w:t>):</w:t>
+      </w:r>
+      <w:r>
+        <w:t xml:space="preserve"> Para alternar entre dos estados booleanos (Activo/Inactivo), una práctica profesional es no </w:t>
+      </w:r>
+      <w:proofErr w:type="spellStart"/>
+      <w:r>
+        <w:t>hardcodear</w:t>
+      </w:r>
+      <w:proofErr w:type="spellEnd"/>
+      <w:r>
+        <w:t xml:space="preserve"> el valor, sino enviar al método actualizador el valor </w:t>
+      </w:r>
+      <w:r>
+        <w:rPr>
+          <w:i/>
+          <w:iCs/>
+        </w:rPr>
+        <w:t>negado</w:t>
+      </w:r>
+      <w:r>
+        <w:t xml:space="preserve"> del estado actual utilizando el </w:t>
+      </w:r>
+      <w:proofErr w:type="gramStart"/>
+      <w:r>
+        <w:t>operador !</w:t>
+      </w:r>
+      <w:proofErr w:type="gramEnd"/>
+      <w:r>
+        <w:t xml:space="preserve"> (NOT). Es decir: </w:t>
+      </w:r>
+      <w:proofErr w:type="spellStart"/>
+      <w:r>
+        <w:t>nuevoEstado</w:t>
+      </w:r>
+      <w:proofErr w:type="spellEnd"/>
+      <w:r>
+        <w:t xml:space="preserve"> </w:t>
+      </w:r>
+      <w:proofErr w:type="gramStart"/>
+      <w:r>
+        <w:t>= !</w:t>
+      </w:r>
+      <w:proofErr w:type="spellStart"/>
+      <w:r>
+        <w:t>estadoActual</w:t>
+      </w:r>
+      <w:proofErr w:type="spellEnd"/>
+      <w:proofErr w:type="gramEnd"/>
+      <w:r>
+        <w:t xml:space="preserve"> .</w:t>
+      </w:r>
+    </w:p>
+    <w:p>
+      <w:pPr>
+        <w:numPr>
+          <w:ilvl w:val="0"/>
+          <w:numId w:val="25"/>
+        </w:numPr>
+      </w:pPr>
+      <w:r>
+        <w:rPr>
+          <w:b/>
+          <w:bCs/>
+        </w:rPr>
+        <w:t>Parámetros Opcionales en C#:</w:t>
+      </w:r>
+      <w:r>
+        <w:t xml:space="preserve"> Se puede modificar la firma de un método existente para recibir parámetros con valores por defecto (ej. </w:t>
+      </w:r>
+      <w:proofErr w:type="spellStart"/>
+      <w:r>
+        <w:t>bool</w:t>
+      </w:r>
+      <w:proofErr w:type="spellEnd"/>
+      <w:r>
+        <w:t xml:space="preserve"> activo = false). Esto permite extender la funcionalidad del método (ej. sirviendo tanto para eliminar como para reactivar) sin romper el código en las partes de la aplicación donde el método ya estaba siendo invocado sin ese </w:t>
+      </w:r>
+      <w:r>
+        <w:t>parámetro.</w:t>
+      </w:r>
+    </w:p>
+    <w:p/>
+    <w:p>
+      <w:r>
+        <w:rPr>
+          <w:b/>
+          <w:bCs/>
+        </w:rPr>
+        <w:t>TEMA: Búsqueda Reactiva (Filtro Rápido) y Manipulación de Colecciones en Memoria</w:t>
+      </w:r>
+    </w:p>
+    <w:p>
+      <w:pPr>
+        <w:numPr>
+          <w:ilvl w:val="0"/>
+          <w:numId w:val="26"/>
+        </w:numPr>
+      </w:pPr>
+      <w:r>
+        <w:rPr>
+          <w:b/>
+          <w:bCs/>
+        </w:rPr>
+        <w:t>Estrategias de Filtrado (Memoria vs. Base de Datos):</w:t>
+      </w:r>
+      <w:r>
+        <w:t xml:space="preserve"> Para volúmenes de datos pequeños a moderados, es una práctica altamente eficiente realizar el filtrado </w:t>
+      </w:r>
+      <w:r>
+        <w:rPr>
+          <w:i/>
+          <w:iCs/>
+        </w:rPr>
+        <w:t>en memoria</w:t>
+      </w:r>
+      <w:r>
+        <w:t xml:space="preserve"> (lado del servidor web) en lugar de consultar repetidamente a la base de </w:t>
+      </w:r>
+      <w:proofErr w:type="gramStart"/>
+      <w:r>
+        <w:t>datos .</w:t>
+      </w:r>
+      <w:proofErr w:type="gramEnd"/>
+      <w:r>
+        <w:t xml:space="preserve"> Esto se logra persistiendo la colección original en el estado de sesión (</w:t>
+      </w:r>
+      <w:proofErr w:type="spellStart"/>
+      <w:r>
+        <w:t>Session</w:t>
+      </w:r>
+      <w:proofErr w:type="spellEnd"/>
+      <w:r>
+        <w:t>) durante la carga inicial (</w:t>
+      </w:r>
+      <w:proofErr w:type="spellStart"/>
+      <w:r>
+        <w:t>Page_Load</w:t>
+      </w:r>
+      <w:proofErr w:type="spellEnd"/>
+      <w:r>
+        <w:t>) y aplicando filtros sobre esa variable local.</w:t>
+      </w:r>
+    </w:p>
+    <w:p>
+      <w:pPr>
+        <w:numPr>
+          <w:ilvl w:val="0"/>
+          <w:numId w:val="26"/>
+        </w:numPr>
+      </w:pPr>
+      <w:r>
+        <w:rPr>
+          <w:b/>
+          <w:bCs/>
+        </w:rPr>
+        <w:t xml:space="preserve">El evento </w:t>
+      </w:r>
+      <w:proofErr w:type="spellStart"/>
+      <w:r>
+        <w:rPr>
+          <w:b/>
+          <w:bCs/>
+        </w:rPr>
+        <w:t>OnTextChanged</w:t>
+      </w:r>
+      <w:proofErr w:type="spellEnd"/>
+      <w:r>
+        <w:rPr>
+          <w:b/>
+          <w:bCs/>
+        </w:rPr>
+        <w:t xml:space="preserve"> y </w:t>
+      </w:r>
+      <w:proofErr w:type="spellStart"/>
+      <w:r>
+        <w:rPr>
+          <w:b/>
+          <w:bCs/>
+        </w:rPr>
+        <w:t>AutoPostBack</w:t>
+      </w:r>
+      <w:proofErr w:type="spellEnd"/>
+      <w:r>
+        <w:rPr>
+          <w:b/>
+          <w:bCs/>
+        </w:rPr>
+        <w:t>:</w:t>
+      </w:r>
+      <w:r>
+        <w:t xml:space="preserve"> En </w:t>
+      </w:r>
+      <w:proofErr w:type="spellStart"/>
+      <w:r>
+        <w:t>WebForms</w:t>
+      </w:r>
+      <w:proofErr w:type="spellEnd"/>
+      <w:r>
+        <w:t>, para que una caja de texto dispare un evento en el servidor (</w:t>
+      </w:r>
+      <w:proofErr w:type="spellStart"/>
+      <w:r>
+        <w:t>Code-Behind</w:t>
+      </w:r>
+      <w:proofErr w:type="spellEnd"/>
+      <w:r>
+        <w:t xml:space="preserve">) inmediatamente después de que el usuario termina de escribir (al presionar </w:t>
+      </w:r>
+      <w:proofErr w:type="spellStart"/>
+      <w:r>
+        <w:rPr>
+          <w:i/>
+          <w:iCs/>
+        </w:rPr>
+        <w:t>Tab</w:t>
+      </w:r>
+      <w:proofErr w:type="spellEnd"/>
+      <w:r>
+        <w:t xml:space="preserve"> o hacer clic fuera de la caja), se debe configurar la propiedad </w:t>
+      </w:r>
+      <w:proofErr w:type="spellStart"/>
+      <w:r>
+        <w:t>AutoPostBack</w:t>
+      </w:r>
+      <w:proofErr w:type="spellEnd"/>
+      <w:r>
+        <w:t>="true". Esto genera un envío de formulario automático.</w:t>
+      </w:r>
+    </w:p>
+    <w:p>
+      <w:pPr>
+        <w:numPr>
+          <w:ilvl w:val="0"/>
+          <w:numId w:val="26"/>
+        </w:numPr>
+      </w:pPr>
+      <w:r>
+        <w:rPr>
+          <w:b/>
+          <w:bCs/>
+        </w:rPr>
+        <w:t>Expresiones Lambda (</w:t>
+      </w:r>
+      <w:proofErr w:type="spellStart"/>
+      <w:r>
+        <w:rPr>
+          <w:b/>
+          <w:bCs/>
+        </w:rPr>
+        <w:t>FindAll</w:t>
+      </w:r>
+      <w:proofErr w:type="spellEnd"/>
+      <w:r>
+        <w:rPr>
+          <w:b/>
+          <w:bCs/>
+        </w:rPr>
+        <w:t>):</w:t>
+      </w:r>
+      <w:r>
+        <w:t xml:space="preserve"> Para filtrar listas en C# de forma declarativa, se utiliza el método </w:t>
+      </w:r>
+      <w:proofErr w:type="spellStart"/>
+      <w:r>
+        <w:t>List</w:t>
+      </w:r>
+      <w:proofErr w:type="spellEnd"/>
+      <w:r>
+        <w:t>&lt;T&gt;.</w:t>
+      </w:r>
+      <w:proofErr w:type="spellStart"/>
+      <w:r>
+        <w:t>FindAll</w:t>
+      </w:r>
+      <w:proofErr w:type="spellEnd"/>
+      <w:r>
+        <w:t>(</w:t>
+      </w:r>
+      <w:proofErr w:type="spellStart"/>
+      <w:r>
+        <w:t>Predicate</w:t>
+      </w:r>
+      <w:proofErr w:type="spellEnd"/>
+      <w:r>
+        <w:t xml:space="preserve">&lt;T&gt;). El predicado suele ser una expresión Lambda (ej. x =&gt; </w:t>
+      </w:r>
+      <w:proofErr w:type="spellStart"/>
+      <w:proofErr w:type="gramStart"/>
+      <w:r>
+        <w:t>x.Propiedad</w:t>
+      </w:r>
+      <w:proofErr w:type="spellEnd"/>
+      <w:proofErr w:type="gramEnd"/>
+      <w:r>
+        <w:t xml:space="preserve"> == valor), la cual itera internamente sobre la colección y retorna una nueva lista únicamente con los elementos que cumplen la condición.</w:t>
+      </w:r>
+    </w:p>
+    <w:p>
+      <w:pPr>
+        <w:numPr>
+          <w:ilvl w:val="0"/>
+          <w:numId w:val="26"/>
+        </w:numPr>
+      </w:pPr>
+      <w:r>
+        <w:rPr>
+          <w:b/>
+          <w:bCs/>
+        </w:rPr>
+        <w:t>Normalización de Cadenas para Búsqueda:</w:t>
+      </w:r>
+      <w:r>
+        <w:t xml:space="preserve"> Para evitar errores de </w:t>
+      </w:r>
+      <w:r>
+        <w:rPr>
+          <w:i/>
+          <w:iCs/>
+        </w:rPr>
+        <w:t xml:space="preserve">case </w:t>
+      </w:r>
+      <w:proofErr w:type="spellStart"/>
+      <w:r>
+        <w:rPr>
+          <w:i/>
+          <w:iCs/>
+        </w:rPr>
+        <w:t>sensitivity</w:t>
+      </w:r>
+      <w:proofErr w:type="spellEnd"/>
+      <w:r>
+        <w:t xml:space="preserve"> (diferencias entre mayúsculas y minúsculas), es imperativo normalizar tanto el valor de búsqueda como el dato del objeto antes de compararlos. La técnica estándar es convertir ambos valores a mayúsculas </w:t>
+      </w:r>
+      <w:proofErr w:type="gramStart"/>
+      <w:r>
+        <w:t>usando .</w:t>
+      </w:r>
+      <w:proofErr w:type="spellStart"/>
+      <w:r>
+        <w:t>ToUpper</w:t>
+      </w:r>
+      <w:proofErr w:type="spellEnd"/>
+      <w:proofErr w:type="gramEnd"/>
+      <w:r>
+        <w:t xml:space="preserve">() (ej. </w:t>
+      </w:r>
+      <w:proofErr w:type="spellStart"/>
+      <w:r>
+        <w:t>x.Nombre.ToUpper</w:t>
+      </w:r>
+      <w:proofErr w:type="spellEnd"/>
+      <w:r>
+        <w:t>().</w:t>
+      </w:r>
+      <w:proofErr w:type="spellStart"/>
+      <w:r>
+        <w:t>Contains</w:t>
+      </w:r>
+      <w:proofErr w:type="spellEnd"/>
+      <w:r>
+        <w:t>(</w:t>
+      </w:r>
+      <w:proofErr w:type="spellStart"/>
+      <w:r>
+        <w:t>filtro.ToUpper</w:t>
+      </w:r>
+      <w:proofErr w:type="spellEnd"/>
+      <w:r>
+        <w:t>())).</w:t>
+      </w:r>
+    </w:p>
+    <w:p>
+      <w:r>
+        <w:rPr>
+          <w:b/>
+          <w:bCs/>
+        </w:rPr>
+        <w:t xml:space="preserve">TEMA: Interfaz Dinámica, </w:t>
+      </w:r>
+      <w:proofErr w:type="spellStart"/>
+      <w:r>
+        <w:rPr>
+          <w:b/>
+          <w:bCs/>
+        </w:rPr>
+        <w:t>Cascading</w:t>
+      </w:r>
+      <w:proofErr w:type="spellEnd"/>
+      <w:r>
+        <w:rPr>
+          <w:b/>
+          <w:bCs/>
+        </w:rPr>
+        <w:t xml:space="preserve"> </w:t>
+      </w:r>
+      <w:proofErr w:type="spellStart"/>
+      <w:r>
+        <w:rPr>
+          <w:b/>
+          <w:bCs/>
+        </w:rPr>
+        <w:t>DropDownLists</w:t>
+      </w:r>
+      <w:proofErr w:type="spellEnd"/>
+      <w:r>
+        <w:rPr>
+          <w:b/>
+          <w:bCs/>
+        </w:rPr>
+        <w:t xml:space="preserve"> y SQL Dinámico</w:t>
+      </w:r>
+    </w:p>
+    <w:p>
+      <w:pPr>
+        <w:numPr>
+          <w:ilvl w:val="0"/>
+          <w:numId w:val="27"/>
+        </w:numPr>
+      </w:pPr>
+      <w:r>
+        <w:rPr>
+          <w:b/>
+          <w:bCs/>
+        </w:rPr>
+        <w:t>Gestión de Estado de Controles Dinámicos:</w:t>
+      </w:r>
+      <w:r>
+        <w:t xml:space="preserve"> Cuando se construyen interfaces que muestran u ocultan paneles enteros basándose en la interacción del usuario (como un </w:t>
+      </w:r>
+      <w:proofErr w:type="spellStart"/>
+      <w:r>
+        <w:t>CheckBox</w:t>
+      </w:r>
+      <w:proofErr w:type="spellEnd"/>
+      <w:r>
+        <w:t xml:space="preserve"> de "Filtro Avanzado"), es vital comprender el ciclo de vida de la página. Dado que el protocolo HTTP no mantiene el estado, las variables de la clase (</w:t>
+      </w:r>
+      <w:proofErr w:type="spellStart"/>
+      <w:r>
+        <w:t>properties</w:t>
+      </w:r>
+      <w:proofErr w:type="spellEnd"/>
+      <w:r>
+        <w:t xml:space="preserve"> en C#) se reinician en cada recarga (</w:t>
+      </w:r>
+      <w:proofErr w:type="spellStart"/>
+      <w:r>
+        <w:t>PostBack</w:t>
+      </w:r>
+      <w:proofErr w:type="spellEnd"/>
+      <w:r>
+        <w:t xml:space="preserve">). Para mantener la interfaz coherente, se debe leer el valor directamente del control (ej. </w:t>
+      </w:r>
+      <w:proofErr w:type="spellStart"/>
+      <w:r>
+        <w:t>chkAvanzado.Checked</w:t>
+      </w:r>
+      <w:proofErr w:type="spellEnd"/>
+      <w:r>
+        <w:t xml:space="preserve">) en el </w:t>
+      </w:r>
+      <w:proofErr w:type="spellStart"/>
+      <w:r>
+        <w:t>Page_Load</w:t>
+      </w:r>
+      <w:proofErr w:type="spellEnd"/>
+      <w:r>
+        <w:t xml:space="preserve"> o persistir el estado utilizando </w:t>
+      </w:r>
+      <w:proofErr w:type="spellStart"/>
+      <w:r>
+        <w:t>ViewState</w:t>
+      </w:r>
+      <w:proofErr w:type="spellEnd"/>
+      <w:r>
+        <w:t xml:space="preserve"> o </w:t>
+      </w:r>
+      <w:proofErr w:type="spellStart"/>
+      <w:r>
+        <w:t>Session</w:t>
+      </w:r>
+      <w:proofErr w:type="spellEnd"/>
+      <w:r>
+        <w:t>.</w:t>
+      </w:r>
+    </w:p>
+    <w:p>
+      <w:pPr>
+        <w:numPr>
+          <w:ilvl w:val="0"/>
+          <w:numId w:val="27"/>
+        </w:numPr>
+      </w:pPr>
+      <w:r>
+        <w:rPr>
+          <w:b/>
+          <w:bCs/>
+        </w:rPr>
+        <w:t>Listas en Cascada (</w:t>
+      </w:r>
+      <w:proofErr w:type="spellStart"/>
+      <w:r>
+        <w:rPr>
+          <w:b/>
+          <w:bCs/>
+        </w:rPr>
+        <w:t>Cascading</w:t>
+      </w:r>
+      <w:proofErr w:type="spellEnd"/>
+      <w:r>
+        <w:rPr>
+          <w:b/>
+          <w:bCs/>
+        </w:rPr>
+        <w:t xml:space="preserve"> </w:t>
+      </w:r>
+      <w:proofErr w:type="spellStart"/>
+      <w:r>
+        <w:rPr>
+          <w:b/>
+          <w:bCs/>
+        </w:rPr>
+        <w:t>DropDownLists</w:t>
+      </w:r>
+      <w:proofErr w:type="spellEnd"/>
+      <w:r>
+        <w:rPr>
+          <w:b/>
+          <w:bCs/>
+        </w:rPr>
+        <w:t>):</w:t>
+      </w:r>
+      <w:r>
+        <w:t xml:space="preserve"> Es un patrón de diseño de interfaz donde las opciones de un control desplegable dependen del valor seleccionado en un control desplegable "padre". En ASP.NET </w:t>
+      </w:r>
+      <w:proofErr w:type="spellStart"/>
+      <w:r>
+        <w:t>WebForms</w:t>
+      </w:r>
+      <w:proofErr w:type="spellEnd"/>
+      <w:r>
+        <w:t xml:space="preserve">, esto se implementa activando la propiedad </w:t>
+      </w:r>
+      <w:proofErr w:type="spellStart"/>
+      <w:r>
+        <w:lastRenderedPageBreak/>
+        <w:t>AutoPostBack</w:t>
+      </w:r>
+      <w:proofErr w:type="spellEnd"/>
+      <w:r>
+        <w:t xml:space="preserve">="true" en el control padre y suscribiéndose al evento </w:t>
+      </w:r>
+      <w:proofErr w:type="spellStart"/>
+      <w:r>
+        <w:t>OnSelectedIndexChanged</w:t>
+      </w:r>
+      <w:proofErr w:type="spellEnd"/>
+      <w:r>
+        <w:t>. En dicho evento, se limpia la lista hija (</w:t>
+      </w:r>
+      <w:proofErr w:type="spellStart"/>
+      <w:r>
+        <w:t>Items.Clear</w:t>
+      </w:r>
+      <w:proofErr w:type="spellEnd"/>
+      <w:r>
+        <w:t>()) y se repuebla según la regla de negocio correspondiente.</w:t>
+      </w:r>
+    </w:p>
+    <w:p>
+      <w:pPr>
+        <w:numPr>
+          <w:ilvl w:val="0"/>
+          <w:numId w:val="27"/>
+        </w:numPr>
+      </w:pPr>
+      <w:r>
+        <w:rPr>
+          <w:b/>
+          <w:bCs/>
+        </w:rPr>
+        <w:t>SQL Dinámico (Construcción de Consultas en C#):</w:t>
+      </w:r>
+      <w:r>
+        <w:t xml:space="preserve"> Cuando los criterios de búsqueda son muy variables y opcionales (filtro avanzado), resulta ineficiente crear un </w:t>
+      </w:r>
+      <w:proofErr w:type="spellStart"/>
+      <w:r>
+        <w:t>Stored</w:t>
+      </w:r>
+      <w:proofErr w:type="spellEnd"/>
+      <w:r>
+        <w:t xml:space="preserve"> </w:t>
+      </w:r>
+      <w:proofErr w:type="spellStart"/>
+      <w:r>
+        <w:t>Procedure</w:t>
+      </w:r>
+      <w:proofErr w:type="spellEnd"/>
+      <w:r>
+        <w:t xml:space="preserve"> para cada combinación posible. En estos escenarios, la capa de acceso a datos construye la consulta SQL de forma dinámica. Se parte de una instrucción SELECT base y se van concatenando cláusulas WHERE y AND basándose en estructuras de control (</w:t>
+      </w:r>
+      <w:proofErr w:type="spellStart"/>
+      <w:r>
+        <w:t>if</w:t>
+      </w:r>
+      <w:proofErr w:type="spellEnd"/>
+      <w:r>
+        <w:t>, switch) evaluadas en tiempo de ejecución.</w:t>
+      </w:r>
+    </w:p>
+    <w:p>
+      <w:r>
+        <w:rPr>
+          <w:b/>
+          <w:bCs/>
+        </w:rPr>
+        <w:t>TEMA: Seguridad Web: Autenticación, Autorización y Manejo de Sesiones</w:t>
+      </w:r>
+    </w:p>
+    <w:p>
+      <w:pPr>
+        <w:numPr>
+          <w:ilvl w:val="0"/>
+          <w:numId w:val="28"/>
+        </w:numPr>
+      </w:pPr>
+      <w:r>
+        <w:rPr>
+          <w:b/>
+          <w:bCs/>
+        </w:rPr>
+        <w:t>Autenticación vs. Autorización:</w:t>
+      </w:r>
+      <w:r>
+        <w:t xml:space="preserve"> Son los dos pilares de la seguridad en software.</w:t>
+      </w:r>
+    </w:p>
+    <w:p>
+      <w:pPr>
+        <w:numPr>
+          <w:ilvl w:val="1"/>
+          <w:numId w:val="28"/>
+        </w:numPr>
+      </w:pPr>
+      <w:r>
+        <w:t xml:space="preserve">La </w:t>
+      </w:r>
+      <w:r>
+        <w:rPr>
+          <w:b/>
+          <w:bCs/>
+        </w:rPr>
+        <w:t>Autenticación</w:t>
+      </w:r>
+      <w:r>
+        <w:t xml:space="preserve"> (</w:t>
+      </w:r>
+      <w:proofErr w:type="spellStart"/>
+      <w:r>
+        <w:t>Login</w:t>
+      </w:r>
+      <w:proofErr w:type="spellEnd"/>
+      <w:r>
+        <w:t xml:space="preserve">) responde a la pregunta </w:t>
+      </w:r>
+      <w:r>
+        <w:rPr>
+          <w:i/>
+          <w:iCs/>
+        </w:rPr>
+        <w:t>"¿Quién sos?"</w:t>
+      </w:r>
+      <w:r>
+        <w:t xml:space="preserve">. Es el proceso de validar las credenciales (usuario y contraseña) contra la base de datos para confirmar la identidad del </w:t>
+      </w:r>
+      <w:r>
+        <w:t>usuario.</w:t>
+      </w:r>
+    </w:p>
+    <w:p>
+      <w:pPr>
+        <w:numPr>
+          <w:ilvl w:val="1"/>
+          <w:numId w:val="28"/>
+        </w:numPr>
+      </w:pPr>
+      <w:r>
+        <w:t xml:space="preserve">La </w:t>
+      </w:r>
+      <w:r>
+        <w:rPr>
+          <w:b/>
+          <w:bCs/>
+        </w:rPr>
+        <w:t>Autorización</w:t>
+      </w:r>
+      <w:r>
+        <w:t xml:space="preserve"> (Permisos/Perfiles) responde a la pregunta </w:t>
+      </w:r>
+      <w:r>
+        <w:rPr>
+          <w:i/>
+          <w:iCs/>
+        </w:rPr>
+        <w:t xml:space="preserve">"¿Qué </w:t>
+      </w:r>
+      <w:proofErr w:type="spellStart"/>
+      <w:r>
+        <w:rPr>
+          <w:i/>
+          <w:iCs/>
+        </w:rPr>
+        <w:t>podés</w:t>
+      </w:r>
+      <w:proofErr w:type="spellEnd"/>
+      <w:r>
+        <w:rPr>
+          <w:i/>
+          <w:iCs/>
+        </w:rPr>
+        <w:t xml:space="preserve"> hacer?"</w:t>
+      </w:r>
+      <w:r>
+        <w:t xml:space="preserve">. Una vez autenticado, el sistema verifica el rol del usuario (ej. </w:t>
+      </w:r>
+      <w:proofErr w:type="spellStart"/>
+      <w:r>
+        <w:t>Admin</w:t>
+      </w:r>
+      <w:proofErr w:type="spellEnd"/>
+      <w:r>
+        <w:t xml:space="preserve"> o Normal) para permitir o denegar el acceso a ciertas pantallas o </w:t>
+      </w:r>
+      <w:r>
+        <w:t>funcionalidades.</w:t>
+      </w:r>
+    </w:p>
+    <w:p>
+      <w:pPr>
+        <w:numPr>
+          <w:ilvl w:val="0"/>
+          <w:numId w:val="28"/>
+        </w:numPr>
+      </w:pPr>
+      <w:r>
+        <w:rPr>
+          <w:b/>
+          <w:bCs/>
+        </w:rPr>
+        <w:t>Manejo de Sesiones para Seguridad (</w:t>
+      </w:r>
+      <w:proofErr w:type="spellStart"/>
+      <w:r>
+        <w:rPr>
+          <w:b/>
+          <w:bCs/>
+        </w:rPr>
+        <w:t>Session</w:t>
+      </w:r>
+      <w:proofErr w:type="spellEnd"/>
+      <w:r>
+        <w:rPr>
+          <w:b/>
+          <w:bCs/>
+        </w:rPr>
+        <w:t>):</w:t>
+      </w:r>
+      <w:r>
+        <w:t xml:space="preserve"> Como HTTP no tiene estado, si no guardamos quién se </w:t>
+      </w:r>
+      <w:proofErr w:type="spellStart"/>
+      <w:r>
+        <w:t>logueó</w:t>
+      </w:r>
+      <w:proofErr w:type="spellEnd"/>
+      <w:r>
+        <w:t xml:space="preserve">, el servidor lo olvida al cambiar de página. Al guardar el objeto Usuario en la variable </w:t>
+      </w:r>
+      <w:proofErr w:type="spellStart"/>
+      <w:r>
+        <w:t>Session</w:t>
+      </w:r>
+      <w:proofErr w:type="spellEnd"/>
+      <w:r>
+        <w:t xml:space="preserve"> tras un </w:t>
+      </w:r>
+      <w:proofErr w:type="spellStart"/>
+      <w:r>
+        <w:t>login</w:t>
+      </w:r>
+      <w:proofErr w:type="spellEnd"/>
+      <w:r>
+        <w:t xml:space="preserve"> exitoso, podemos verificar en el </w:t>
+      </w:r>
+      <w:proofErr w:type="spellStart"/>
+      <w:r>
+        <w:t>Page_Load</w:t>
+      </w:r>
+      <w:proofErr w:type="spellEnd"/>
+      <w:r>
+        <w:t xml:space="preserve"> de cualquier otra página si ese objeto existe (</w:t>
+      </w:r>
+      <w:proofErr w:type="spellStart"/>
+      <w:r>
+        <w:t>Session</w:t>
+      </w:r>
+      <w:proofErr w:type="spellEnd"/>
+      <w:r>
+        <w:t>["usuario"</w:t>
+      </w:r>
+      <w:proofErr w:type="gramStart"/>
+      <w:r>
+        <w:t>] !</w:t>
+      </w:r>
+      <w:proofErr w:type="gramEnd"/>
+      <w:r>
+        <w:t xml:space="preserve">= </w:t>
+      </w:r>
+      <w:proofErr w:type="spellStart"/>
+      <w:r>
+        <w:t>null</w:t>
+      </w:r>
+      <w:proofErr w:type="spellEnd"/>
+      <w:r>
+        <w:t xml:space="preserve">). Si es nulo, significa que el usuario intentó acceder escribiendo la URL directamente sin </w:t>
+      </w:r>
+      <w:proofErr w:type="spellStart"/>
+      <w:r>
+        <w:t>loguearse</w:t>
+      </w:r>
+      <w:proofErr w:type="spellEnd"/>
+      <w:r>
+        <w:t xml:space="preserve">, por lo que debe ser redirigido a una página de error o de </w:t>
+      </w:r>
+      <w:proofErr w:type="spellStart"/>
+      <w:r>
+        <w:t>login</w:t>
+      </w:r>
+      <w:proofErr w:type="spellEnd"/>
+      <w:r>
+        <w:t>.</w:t>
+      </w:r>
+    </w:p>
+    <w:p>
+      <w:pPr>
+        <w:numPr>
+          <w:ilvl w:val="0"/>
+          <w:numId w:val="28"/>
+        </w:numPr>
+      </w:pPr>
+      <w:r>
+        <w:rPr>
+          <w:b/>
+          <w:bCs/>
+        </w:rPr>
+        <w:t>Enumeraciones (</w:t>
+      </w:r>
+      <w:proofErr w:type="spellStart"/>
+      <w:r>
+        <w:rPr>
+          <w:b/>
+          <w:bCs/>
+        </w:rPr>
+        <w:t>enum</w:t>
+      </w:r>
+      <w:proofErr w:type="spellEnd"/>
+      <w:r>
+        <w:rPr>
+          <w:b/>
+          <w:bCs/>
+        </w:rPr>
+        <w:t>):</w:t>
+      </w:r>
+      <w:r>
+        <w:t xml:space="preserve"> En C#, un </w:t>
+      </w:r>
+      <w:proofErr w:type="spellStart"/>
+      <w:r>
+        <w:t>enum</w:t>
+      </w:r>
+      <w:proofErr w:type="spellEnd"/>
+      <w:r>
+        <w:t xml:space="preserve"> es un tipo de dato especial que permite definir un conjunto de constantes con </w:t>
+      </w:r>
+      <w:r>
+        <w:t>nombre.</w:t>
+      </w:r>
+      <w:r>
+        <w:t xml:space="preserve"> Es ideal para manejar perfiles de usuario (ej. Normal = 1, </w:t>
+      </w:r>
+      <w:proofErr w:type="spellStart"/>
+      <w:r>
+        <w:t>Admin</w:t>
+      </w:r>
+      <w:proofErr w:type="spellEnd"/>
+      <w:r>
+        <w:t xml:space="preserve"> = 2), ya que evita el uso de "Magic </w:t>
+      </w:r>
+      <w:proofErr w:type="spellStart"/>
+      <w:r>
+        <w:t>Strings</w:t>
+      </w:r>
+      <w:proofErr w:type="spellEnd"/>
+      <w:r>
+        <w:t xml:space="preserve">" (cadenas de texto sueltas propensas a errores de tipeo) y mejora la legibilidad del código al evaluar permisos (ej. </w:t>
+      </w:r>
+      <w:proofErr w:type="spellStart"/>
+      <w:r>
+        <w:t>if</w:t>
+      </w:r>
+      <w:proofErr w:type="spellEnd"/>
+      <w:r>
+        <w:t xml:space="preserve"> (</w:t>
+      </w:r>
+      <w:proofErr w:type="spellStart"/>
+      <w:proofErr w:type="gramStart"/>
+      <w:r>
+        <w:t>usuario.TipoUsuario</w:t>
+      </w:r>
+      <w:proofErr w:type="spellEnd"/>
+      <w:proofErr w:type="gramEnd"/>
+      <w:r>
+        <w:t xml:space="preserve"> == </w:t>
+      </w:r>
+      <w:proofErr w:type="spellStart"/>
+      <w:r>
+        <w:t>TipoUsuario.Admin</w:t>
+      </w:r>
+      <w:proofErr w:type="spellEnd"/>
+      <w:r>
+        <w:t>)) .</w:t>
+      </w:r>
+    </w:p>
+    <w:p/>
+    <w:p/>
+    <w:p/>
+    <w:p/>
+    <w:p/>
+    <w:p/>
     <w:p/>
     <w:p/>
     <w:p/>
@@ -6250,6 +7417,155 @@
     </w:lvl>
   </w:abstractNum>
   <w:abstractNum w:abstractNumId="5" w15:restartNumberingAfterBreak="0">
+    <w:nsid w:val="1A9C0DB3"/>
+    <w:multiLevelType w:val="multilevel"/>
+    <w:tmpl w:val="99E0C8C8"/>
+    <w:lvl w:ilvl="0">
+      <w:start w:val="1"/>
+      <w:numFmt w:val="bullet"/>
+      <w:lvlText w:val=""/>
+      <w:lvlJc w:val="left"/>
+      <w:pPr>
+        <w:tabs>
+          <w:tab w:val="num" w:pos="720"/>
+        </w:tabs>
+        <w:ind w:left="720" w:hanging="360"/>
+      </w:pPr>
+      <w:rPr>
+        <w:rFonts w:ascii="Symbol" w:hAnsi="Symbol" w:hint="default"/>
+        <w:sz w:val="20"/>
+      </w:rPr>
+    </w:lvl>
+    <w:lvl w:ilvl="1" w:tentative="1">
+      <w:start w:val="1"/>
+      <w:numFmt w:val="bullet"/>
+      <w:lvlText w:val="o"/>
+      <w:lvlJc w:val="left"/>
+      <w:pPr>
+        <w:tabs>
+          <w:tab w:val="num" w:pos="1440"/>
+        </w:tabs>
+        <w:ind w:left="1440" w:hanging="360"/>
+      </w:pPr>
+      <w:rPr>
+        <w:rFonts w:ascii="Courier New" w:hAnsi="Courier New" w:hint="default"/>
+        <w:sz w:val="20"/>
+      </w:rPr>
+    </w:lvl>
+    <w:lvl w:ilvl="2" w:tentative="1">
+      <w:start w:val="1"/>
+      <w:numFmt w:val="bullet"/>
+      <w:lvlText w:val=""/>
+      <w:lvlJc w:val="left"/>
+      <w:pPr>
+        <w:tabs>
+          <w:tab w:val="num" w:pos="2160"/>
+        </w:tabs>
+        <w:ind w:left="2160" w:hanging="360"/>
+      </w:pPr>
+      <w:rPr>
+        <w:rFonts w:ascii="Wingdings" w:hAnsi="Wingdings" w:hint="default"/>
+        <w:sz w:val="20"/>
+      </w:rPr>
+    </w:lvl>
+    <w:lvl w:ilvl="3" w:tentative="1">
+      <w:start w:val="1"/>
+      <w:numFmt w:val="bullet"/>
+      <w:lvlText w:val=""/>
+      <w:lvlJc w:val="left"/>
+      <w:pPr>
+        <w:tabs>
+          <w:tab w:val="num" w:pos="2880"/>
+        </w:tabs>
+        <w:ind w:left="2880" w:hanging="360"/>
+      </w:pPr>
+      <w:rPr>
+        <w:rFonts w:ascii="Wingdings" w:hAnsi="Wingdings" w:hint="default"/>
+        <w:sz w:val="20"/>
+      </w:rPr>
+    </w:lvl>
+    <w:lvl w:ilvl="4" w:tentative="1">
+      <w:start w:val="1"/>
+      <w:numFmt w:val="bullet"/>
+      <w:lvlText w:val=""/>
+      <w:lvlJc w:val="left"/>
+      <w:pPr>
+        <w:tabs>
+          <w:tab w:val="num" w:pos="3600"/>
+        </w:tabs>
+        <w:ind w:left="3600" w:hanging="360"/>
+      </w:pPr>
+      <w:rPr>
+        <w:rFonts w:ascii="Wingdings" w:hAnsi="Wingdings" w:hint="default"/>
+        <w:sz w:val="20"/>
+      </w:rPr>
+    </w:lvl>
+    <w:lvl w:ilvl="5" w:tentative="1">
+      <w:start w:val="1"/>
+      <w:numFmt w:val="bullet"/>
+      <w:lvlText w:val=""/>
+      <w:lvlJc w:val="left"/>
+      <w:pPr>
+        <w:tabs>
+          <w:tab w:val="num" w:pos="4320"/>
+        </w:tabs>
+        <w:ind w:left="4320" w:hanging="360"/>
+      </w:pPr>
+      <w:rPr>
+        <w:rFonts w:ascii="Wingdings" w:hAnsi="Wingdings" w:hint="default"/>
+        <w:sz w:val="20"/>
+      </w:rPr>
+    </w:lvl>
+    <w:lvl w:ilvl="6" w:tentative="1">
+      <w:start w:val="1"/>
+      <w:numFmt w:val="bullet"/>
+      <w:lvlText w:val=""/>
+      <w:lvlJc w:val="left"/>
+      <w:pPr>
+        <w:tabs>
+          <w:tab w:val="num" w:pos="5040"/>
+        </w:tabs>
+        <w:ind w:left="5040" w:hanging="360"/>
+      </w:pPr>
+      <w:rPr>
+        <w:rFonts w:ascii="Wingdings" w:hAnsi="Wingdings" w:hint="default"/>
+        <w:sz w:val="20"/>
+      </w:rPr>
+    </w:lvl>
+    <w:lvl w:ilvl="7" w:tentative="1">
+      <w:start w:val="1"/>
+      <w:numFmt w:val="bullet"/>
+      <w:lvlText w:val=""/>
+      <w:lvlJc w:val="left"/>
+      <w:pPr>
+        <w:tabs>
+          <w:tab w:val="num" w:pos="5760"/>
+        </w:tabs>
+        <w:ind w:left="5760" w:hanging="360"/>
+      </w:pPr>
+      <w:rPr>
+        <w:rFonts w:ascii="Wingdings" w:hAnsi="Wingdings" w:hint="default"/>
+        <w:sz w:val="20"/>
+      </w:rPr>
+    </w:lvl>
+    <w:lvl w:ilvl="8" w:tentative="1">
+      <w:start w:val="1"/>
+      <w:numFmt w:val="bullet"/>
+      <w:lvlText w:val=""/>
+      <w:lvlJc w:val="left"/>
+      <w:pPr>
+        <w:tabs>
+          <w:tab w:val="num" w:pos="6480"/>
+        </w:tabs>
+        <w:ind w:left="6480" w:hanging="360"/>
+      </w:pPr>
+      <w:rPr>
+        <w:rFonts w:ascii="Wingdings" w:hAnsi="Wingdings" w:hint="default"/>
+        <w:sz w:val="20"/>
+      </w:rPr>
+    </w:lvl>
+  </w:abstractNum>
+  <w:abstractNum w:abstractNumId="6" w15:restartNumberingAfterBreak="0">
     <w:nsid w:val="1E2F16BF"/>
     <w:multiLevelType w:val="multilevel"/>
     <w:tmpl w:val="B8DEC6BE"/>
@@ -6398,7 +7714,7 @@
       </w:rPr>
     </w:lvl>
   </w:abstractNum>
-  <w:abstractNum w:abstractNumId="6" w15:restartNumberingAfterBreak="0">
+  <w:abstractNum w:abstractNumId="7" w15:restartNumberingAfterBreak="0">
     <w:nsid w:val="280324FF"/>
     <w:multiLevelType w:val="multilevel"/>
     <w:tmpl w:val="E4EE3730"/>
@@ -6547,7 +7863,156 @@
       </w:rPr>
     </w:lvl>
   </w:abstractNum>
-  <w:abstractNum w:abstractNumId="7" w15:restartNumberingAfterBreak="0">
+  <w:abstractNum w:abstractNumId="8" w15:restartNumberingAfterBreak="0">
+    <w:nsid w:val="30C06DE2"/>
+    <w:multiLevelType w:val="multilevel"/>
+    <w:tmpl w:val="865873C0"/>
+    <w:lvl w:ilvl="0">
+      <w:start w:val="1"/>
+      <w:numFmt w:val="bullet"/>
+      <w:lvlText w:val=""/>
+      <w:lvlJc w:val="left"/>
+      <w:pPr>
+        <w:tabs>
+          <w:tab w:val="num" w:pos="720"/>
+        </w:tabs>
+        <w:ind w:left="720" w:hanging="360"/>
+      </w:pPr>
+      <w:rPr>
+        <w:rFonts w:ascii="Symbol" w:hAnsi="Symbol" w:hint="default"/>
+        <w:sz w:val="20"/>
+      </w:rPr>
+    </w:lvl>
+    <w:lvl w:ilvl="1">
+      <w:start w:val="1"/>
+      <w:numFmt w:val="bullet"/>
+      <w:lvlText w:val="o"/>
+      <w:lvlJc w:val="left"/>
+      <w:pPr>
+        <w:tabs>
+          <w:tab w:val="num" w:pos="1440"/>
+        </w:tabs>
+        <w:ind w:left="1440" w:hanging="360"/>
+      </w:pPr>
+      <w:rPr>
+        <w:rFonts w:ascii="Courier New" w:hAnsi="Courier New" w:hint="default"/>
+        <w:sz w:val="20"/>
+      </w:rPr>
+    </w:lvl>
+    <w:lvl w:ilvl="2" w:tentative="1">
+      <w:start w:val="1"/>
+      <w:numFmt w:val="bullet"/>
+      <w:lvlText w:val=""/>
+      <w:lvlJc w:val="left"/>
+      <w:pPr>
+        <w:tabs>
+          <w:tab w:val="num" w:pos="2160"/>
+        </w:tabs>
+        <w:ind w:left="2160" w:hanging="360"/>
+      </w:pPr>
+      <w:rPr>
+        <w:rFonts w:ascii="Wingdings" w:hAnsi="Wingdings" w:hint="default"/>
+        <w:sz w:val="20"/>
+      </w:rPr>
+    </w:lvl>
+    <w:lvl w:ilvl="3" w:tentative="1">
+      <w:start w:val="1"/>
+      <w:numFmt w:val="bullet"/>
+      <w:lvlText w:val=""/>
+      <w:lvlJc w:val="left"/>
+      <w:pPr>
+        <w:tabs>
+          <w:tab w:val="num" w:pos="2880"/>
+        </w:tabs>
+        <w:ind w:left="2880" w:hanging="360"/>
+      </w:pPr>
+      <w:rPr>
+        <w:rFonts w:ascii="Wingdings" w:hAnsi="Wingdings" w:hint="default"/>
+        <w:sz w:val="20"/>
+      </w:rPr>
+    </w:lvl>
+    <w:lvl w:ilvl="4" w:tentative="1">
+      <w:start w:val="1"/>
+      <w:numFmt w:val="bullet"/>
+      <w:lvlText w:val=""/>
+      <w:lvlJc w:val="left"/>
+      <w:pPr>
+        <w:tabs>
+          <w:tab w:val="num" w:pos="3600"/>
+        </w:tabs>
+        <w:ind w:left="3600" w:hanging="360"/>
+      </w:pPr>
+      <w:rPr>
+        <w:rFonts w:ascii="Wingdings" w:hAnsi="Wingdings" w:hint="default"/>
+        <w:sz w:val="20"/>
+      </w:rPr>
+    </w:lvl>
+    <w:lvl w:ilvl="5" w:tentative="1">
+      <w:start w:val="1"/>
+      <w:numFmt w:val="bullet"/>
+      <w:lvlText w:val=""/>
+      <w:lvlJc w:val="left"/>
+      <w:pPr>
+        <w:tabs>
+          <w:tab w:val="num" w:pos="4320"/>
+        </w:tabs>
+        <w:ind w:left="4320" w:hanging="360"/>
+      </w:pPr>
+      <w:rPr>
+        <w:rFonts w:ascii="Wingdings" w:hAnsi="Wingdings" w:hint="default"/>
+        <w:sz w:val="20"/>
+      </w:rPr>
+    </w:lvl>
+    <w:lvl w:ilvl="6" w:tentative="1">
+      <w:start w:val="1"/>
+      <w:numFmt w:val="bullet"/>
+      <w:lvlText w:val=""/>
+      <w:lvlJc w:val="left"/>
+      <w:pPr>
+        <w:tabs>
+          <w:tab w:val="num" w:pos="5040"/>
+        </w:tabs>
+        <w:ind w:left="5040" w:hanging="360"/>
+      </w:pPr>
+      <w:rPr>
+        <w:rFonts w:ascii="Wingdings" w:hAnsi="Wingdings" w:hint="default"/>
+        <w:sz w:val="20"/>
+      </w:rPr>
+    </w:lvl>
+    <w:lvl w:ilvl="7" w:tentative="1">
+      <w:start w:val="1"/>
+      <w:numFmt w:val="bullet"/>
+      <w:lvlText w:val=""/>
+      <w:lvlJc w:val="left"/>
+      <w:pPr>
+        <w:tabs>
+          <w:tab w:val="num" w:pos="5760"/>
+        </w:tabs>
+        <w:ind w:left="5760" w:hanging="360"/>
+      </w:pPr>
+      <w:rPr>
+        <w:rFonts w:ascii="Wingdings" w:hAnsi="Wingdings" w:hint="default"/>
+        <w:sz w:val="20"/>
+      </w:rPr>
+    </w:lvl>
+    <w:lvl w:ilvl="8" w:tentative="1">
+      <w:start w:val="1"/>
+      <w:numFmt w:val="bullet"/>
+      <w:lvlText w:val=""/>
+      <w:lvlJc w:val="left"/>
+      <w:pPr>
+        <w:tabs>
+          <w:tab w:val="num" w:pos="6480"/>
+        </w:tabs>
+        <w:ind w:left="6480" w:hanging="360"/>
+      </w:pPr>
+      <w:rPr>
+        <w:rFonts w:ascii="Wingdings" w:hAnsi="Wingdings" w:hint="default"/>
+        <w:sz w:val="20"/>
+      </w:rPr>
+    </w:lvl>
+  </w:abstractNum>
+  <w:abstractNum w:abstractNumId="9" w15:restartNumberingAfterBreak="0">
     <w:nsid w:val="365F1960"/>
     <w:multiLevelType w:val="multilevel"/>
     <w:tmpl w:val="4CA4C0FA"/>
@@ -6696,7 +8161,7 @@
       </w:rPr>
     </w:lvl>
   </w:abstractNum>
-  <w:abstractNum w:abstractNumId="8" w15:restartNumberingAfterBreak="0">
+  <w:abstractNum w:abstractNumId="10" w15:restartNumberingAfterBreak="0">
     <w:nsid w:val="376B325C"/>
     <w:multiLevelType w:val="multilevel"/>
     <w:tmpl w:val="85C0A918"/>
@@ -6845,7 +8310,7 @@
       </w:rPr>
     </w:lvl>
   </w:abstractNum>
-  <w:abstractNum w:abstractNumId="9" w15:restartNumberingAfterBreak="0">
+  <w:abstractNum w:abstractNumId="11" w15:restartNumberingAfterBreak="0">
     <w:nsid w:val="3C320E2E"/>
     <w:multiLevelType w:val="multilevel"/>
     <w:tmpl w:val="6396FB1C"/>
@@ -6990,7 +8455,7 @@
       </w:rPr>
     </w:lvl>
   </w:abstractNum>
-  <w:abstractNum w:abstractNumId="10" w15:restartNumberingAfterBreak="0">
+  <w:abstractNum w:abstractNumId="12" w15:restartNumberingAfterBreak="0">
     <w:nsid w:val="3DDF61CA"/>
     <w:multiLevelType w:val="multilevel"/>
     <w:tmpl w:val="ABFC856E"/>
@@ -7139,7 +8604,7 @@
       </w:rPr>
     </w:lvl>
   </w:abstractNum>
-  <w:abstractNum w:abstractNumId="11" w15:restartNumberingAfterBreak="0">
+  <w:abstractNum w:abstractNumId="13" w15:restartNumberingAfterBreak="0">
     <w:nsid w:val="3EC2497A"/>
     <w:multiLevelType w:val="multilevel"/>
     <w:tmpl w:val="038669AA"/>
@@ -7288,7 +8753,7 @@
       </w:rPr>
     </w:lvl>
   </w:abstractNum>
-  <w:abstractNum w:abstractNumId="12" w15:restartNumberingAfterBreak="0">
+  <w:abstractNum w:abstractNumId="14" w15:restartNumberingAfterBreak="0">
     <w:nsid w:val="43D6285F"/>
     <w:multiLevelType w:val="multilevel"/>
     <w:tmpl w:val="0CF470C0"/>
@@ -7437,7 +8902,156 @@
       </w:rPr>
     </w:lvl>
   </w:abstractNum>
-  <w:abstractNum w:abstractNumId="13" w15:restartNumberingAfterBreak="0">
+  <w:abstractNum w:abstractNumId="15" w15:restartNumberingAfterBreak="0">
+    <w:nsid w:val="45FE6ABD"/>
+    <w:multiLevelType w:val="multilevel"/>
+    <w:tmpl w:val="1F9611C0"/>
+    <w:lvl w:ilvl="0">
+      <w:start w:val="1"/>
+      <w:numFmt w:val="bullet"/>
+      <w:lvlText w:val=""/>
+      <w:lvlJc w:val="left"/>
+      <w:pPr>
+        <w:tabs>
+          <w:tab w:val="num" w:pos="720"/>
+        </w:tabs>
+        <w:ind w:left="720" w:hanging="360"/>
+      </w:pPr>
+      <w:rPr>
+        <w:rFonts w:ascii="Symbol" w:hAnsi="Symbol" w:hint="default"/>
+        <w:sz w:val="20"/>
+      </w:rPr>
+    </w:lvl>
+    <w:lvl w:ilvl="1" w:tentative="1">
+      <w:start w:val="1"/>
+      <w:numFmt w:val="bullet"/>
+      <w:lvlText w:val="o"/>
+      <w:lvlJc w:val="left"/>
+      <w:pPr>
+        <w:tabs>
+          <w:tab w:val="num" w:pos="1440"/>
+        </w:tabs>
+        <w:ind w:left="1440" w:hanging="360"/>
+      </w:pPr>
+      <w:rPr>
+        <w:rFonts w:ascii="Courier New" w:hAnsi="Courier New" w:hint="default"/>
+        <w:sz w:val="20"/>
+      </w:rPr>
+    </w:lvl>
+    <w:lvl w:ilvl="2" w:tentative="1">
+      <w:start w:val="1"/>
+      <w:numFmt w:val="bullet"/>
+      <w:lvlText w:val=""/>
+      <w:lvlJc w:val="left"/>
+      <w:pPr>
+        <w:tabs>
+          <w:tab w:val="num" w:pos="2160"/>
+        </w:tabs>
+        <w:ind w:left="2160" w:hanging="360"/>
+      </w:pPr>
+      <w:rPr>
+        <w:rFonts w:ascii="Wingdings" w:hAnsi="Wingdings" w:hint="default"/>
+        <w:sz w:val="20"/>
+      </w:rPr>
+    </w:lvl>
+    <w:lvl w:ilvl="3" w:tentative="1">
+      <w:start w:val="1"/>
+      <w:numFmt w:val="bullet"/>
+      <w:lvlText w:val=""/>
+      <w:lvlJc w:val="left"/>
+      <w:pPr>
+        <w:tabs>
+          <w:tab w:val="num" w:pos="2880"/>
+        </w:tabs>
+        <w:ind w:left="2880" w:hanging="360"/>
+      </w:pPr>
+      <w:rPr>
+        <w:rFonts w:ascii="Wingdings" w:hAnsi="Wingdings" w:hint="default"/>
+        <w:sz w:val="20"/>
+      </w:rPr>
+    </w:lvl>
+    <w:lvl w:ilvl="4" w:tentative="1">
+      <w:start w:val="1"/>
+      <w:numFmt w:val="bullet"/>
+      <w:lvlText w:val=""/>
+      <w:lvlJc w:val="left"/>
+      <w:pPr>
+        <w:tabs>
+          <w:tab w:val="num" w:pos="3600"/>
+        </w:tabs>
+        <w:ind w:left="3600" w:hanging="360"/>
+      </w:pPr>
+      <w:rPr>
+        <w:rFonts w:ascii="Wingdings" w:hAnsi="Wingdings" w:hint="default"/>
+        <w:sz w:val="20"/>
+      </w:rPr>
+    </w:lvl>
+    <w:lvl w:ilvl="5" w:tentative="1">
+      <w:start w:val="1"/>
+      <w:numFmt w:val="bullet"/>
+      <w:lvlText w:val=""/>
+      <w:lvlJc w:val="left"/>
+      <w:pPr>
+        <w:tabs>
+          <w:tab w:val="num" w:pos="4320"/>
+        </w:tabs>
+        <w:ind w:left="4320" w:hanging="360"/>
+      </w:pPr>
+      <w:rPr>
+        <w:rFonts w:ascii="Wingdings" w:hAnsi="Wingdings" w:hint="default"/>
+        <w:sz w:val="20"/>
+      </w:rPr>
+    </w:lvl>
+    <w:lvl w:ilvl="6" w:tentative="1">
+      <w:start w:val="1"/>
+      <w:numFmt w:val="bullet"/>
+      <w:lvlText w:val=""/>
+      <w:lvlJc w:val="left"/>
+      <w:pPr>
+        <w:tabs>
+          <w:tab w:val="num" w:pos="5040"/>
+        </w:tabs>
+        <w:ind w:left="5040" w:hanging="360"/>
+      </w:pPr>
+      <w:rPr>
+        <w:rFonts w:ascii="Wingdings" w:hAnsi="Wingdings" w:hint="default"/>
+        <w:sz w:val="20"/>
+      </w:rPr>
+    </w:lvl>
+    <w:lvl w:ilvl="7" w:tentative="1">
+      <w:start w:val="1"/>
+      <w:numFmt w:val="bullet"/>
+      <w:lvlText w:val=""/>
+      <w:lvlJc w:val="left"/>
+      <w:pPr>
+        <w:tabs>
+          <w:tab w:val="num" w:pos="5760"/>
+        </w:tabs>
+        <w:ind w:left="5760" w:hanging="360"/>
+      </w:pPr>
+      <w:rPr>
+        <w:rFonts w:ascii="Wingdings" w:hAnsi="Wingdings" w:hint="default"/>
+        <w:sz w:val="20"/>
+      </w:rPr>
+    </w:lvl>
+    <w:lvl w:ilvl="8" w:tentative="1">
+      <w:start w:val="1"/>
+      <w:numFmt w:val="bullet"/>
+      <w:lvlText w:val=""/>
+      <w:lvlJc w:val="left"/>
+      <w:pPr>
+        <w:tabs>
+          <w:tab w:val="num" w:pos="6480"/>
+        </w:tabs>
+        <w:ind w:left="6480" w:hanging="360"/>
+      </w:pPr>
+      <w:rPr>
+        <w:rFonts w:ascii="Wingdings" w:hAnsi="Wingdings" w:hint="default"/>
+        <w:sz w:val="20"/>
+      </w:rPr>
+    </w:lvl>
+  </w:abstractNum>
+  <w:abstractNum w:abstractNumId="16" w15:restartNumberingAfterBreak="0">
     <w:nsid w:val="47A256AC"/>
     <w:multiLevelType w:val="multilevel"/>
     <w:tmpl w:val="94784BE8"/>
@@ -7586,7 +9200,7 @@
       </w:rPr>
     </w:lvl>
   </w:abstractNum>
-  <w:abstractNum w:abstractNumId="14" w15:restartNumberingAfterBreak="0">
+  <w:abstractNum w:abstractNumId="17" w15:restartNumberingAfterBreak="0">
     <w:nsid w:val="496B4294"/>
     <w:multiLevelType w:val="multilevel"/>
     <w:tmpl w:val="EEAAA56C"/>
@@ -7735,7 +9349,156 @@
       </w:rPr>
     </w:lvl>
   </w:abstractNum>
-  <w:abstractNum w:abstractNumId="15" w15:restartNumberingAfterBreak="0">
+  <w:abstractNum w:abstractNumId="18" w15:restartNumberingAfterBreak="0">
+    <w:nsid w:val="4C5B7A63"/>
+    <w:multiLevelType w:val="multilevel"/>
+    <w:tmpl w:val="0E2AA2F4"/>
+    <w:lvl w:ilvl="0">
+      <w:start w:val="1"/>
+      <w:numFmt w:val="bullet"/>
+      <w:lvlText w:val=""/>
+      <w:lvlJc w:val="left"/>
+      <w:pPr>
+        <w:tabs>
+          <w:tab w:val="num" w:pos="720"/>
+        </w:tabs>
+        <w:ind w:left="720" w:hanging="360"/>
+      </w:pPr>
+      <w:rPr>
+        <w:rFonts w:ascii="Symbol" w:hAnsi="Symbol" w:hint="default"/>
+        <w:sz w:val="20"/>
+      </w:rPr>
+    </w:lvl>
+    <w:lvl w:ilvl="1" w:tentative="1">
+      <w:start w:val="1"/>
+      <w:numFmt w:val="bullet"/>
+      <w:lvlText w:val="o"/>
+      <w:lvlJc w:val="left"/>
+      <w:pPr>
+        <w:tabs>
+          <w:tab w:val="num" w:pos="1440"/>
+        </w:tabs>
+        <w:ind w:left="1440" w:hanging="360"/>
+      </w:pPr>
+      <w:rPr>
+        <w:rFonts w:ascii="Courier New" w:hAnsi="Courier New" w:hint="default"/>
+        <w:sz w:val="20"/>
+      </w:rPr>
+    </w:lvl>
+    <w:lvl w:ilvl="2" w:tentative="1">
+      <w:start w:val="1"/>
+      <w:numFmt w:val="bullet"/>
+      <w:lvlText w:val=""/>
+      <w:lvlJc w:val="left"/>
+      <w:pPr>
+        <w:tabs>
+          <w:tab w:val="num" w:pos="2160"/>
+        </w:tabs>
+        <w:ind w:left="2160" w:hanging="360"/>
+      </w:pPr>
+      <w:rPr>
+        <w:rFonts w:ascii="Wingdings" w:hAnsi="Wingdings" w:hint="default"/>
+        <w:sz w:val="20"/>
+      </w:rPr>
+    </w:lvl>
+    <w:lvl w:ilvl="3" w:tentative="1">
+      <w:start w:val="1"/>
+      <w:numFmt w:val="bullet"/>
+      <w:lvlText w:val=""/>
+      <w:lvlJc w:val="left"/>
+      <w:pPr>
+        <w:tabs>
+          <w:tab w:val="num" w:pos="2880"/>
+        </w:tabs>
+        <w:ind w:left="2880" w:hanging="360"/>
+      </w:pPr>
+      <w:rPr>
+        <w:rFonts w:ascii="Wingdings" w:hAnsi="Wingdings" w:hint="default"/>
+        <w:sz w:val="20"/>
+      </w:rPr>
+    </w:lvl>
+    <w:lvl w:ilvl="4" w:tentative="1">
+      <w:start w:val="1"/>
+      <w:numFmt w:val="bullet"/>
+      <w:lvlText w:val=""/>
+      <w:lvlJc w:val="left"/>
+      <w:pPr>
+        <w:tabs>
+          <w:tab w:val="num" w:pos="3600"/>
+        </w:tabs>
+        <w:ind w:left="3600" w:hanging="360"/>
+      </w:pPr>
+      <w:rPr>
+        <w:rFonts w:ascii="Wingdings" w:hAnsi="Wingdings" w:hint="default"/>
+        <w:sz w:val="20"/>
+      </w:rPr>
+    </w:lvl>
+    <w:lvl w:ilvl="5" w:tentative="1">
+      <w:start w:val="1"/>
+      <w:numFmt w:val="bullet"/>
+      <w:lvlText w:val=""/>
+      <w:lvlJc w:val="left"/>
+      <w:pPr>
+        <w:tabs>
+          <w:tab w:val="num" w:pos="4320"/>
+        </w:tabs>
+        <w:ind w:left="4320" w:hanging="360"/>
+      </w:pPr>
+      <w:rPr>
+        <w:rFonts w:ascii="Wingdings" w:hAnsi="Wingdings" w:hint="default"/>
+        <w:sz w:val="20"/>
+      </w:rPr>
+    </w:lvl>
+    <w:lvl w:ilvl="6" w:tentative="1">
+      <w:start w:val="1"/>
+      <w:numFmt w:val="bullet"/>
+      <w:lvlText w:val=""/>
+      <w:lvlJc w:val="left"/>
+      <w:pPr>
+        <w:tabs>
+          <w:tab w:val="num" w:pos="5040"/>
+        </w:tabs>
+        <w:ind w:left="5040" w:hanging="360"/>
+      </w:pPr>
+      <w:rPr>
+        <w:rFonts w:ascii="Wingdings" w:hAnsi="Wingdings" w:hint="default"/>
+        <w:sz w:val="20"/>
+      </w:rPr>
+    </w:lvl>
+    <w:lvl w:ilvl="7" w:tentative="1">
+      <w:start w:val="1"/>
+      <w:numFmt w:val="bullet"/>
+      <w:lvlText w:val=""/>
+      <w:lvlJc w:val="left"/>
+      <w:pPr>
+        <w:tabs>
+          <w:tab w:val="num" w:pos="5760"/>
+        </w:tabs>
+        <w:ind w:left="5760" w:hanging="360"/>
+      </w:pPr>
+      <w:rPr>
+        <w:rFonts w:ascii="Wingdings" w:hAnsi="Wingdings" w:hint="default"/>
+        <w:sz w:val="20"/>
+      </w:rPr>
+    </w:lvl>
+    <w:lvl w:ilvl="8" w:tentative="1">
+      <w:start w:val="1"/>
+      <w:numFmt w:val="bullet"/>
+      <w:lvlText w:val=""/>
+      <w:lvlJc w:val="left"/>
+      <w:pPr>
+        <w:tabs>
+          <w:tab w:val="num" w:pos="6480"/>
+        </w:tabs>
+        <w:ind w:left="6480" w:hanging="360"/>
+      </w:pPr>
+      <w:rPr>
+        <w:rFonts w:ascii="Wingdings" w:hAnsi="Wingdings" w:hint="default"/>
+        <w:sz w:val="20"/>
+      </w:rPr>
+    </w:lvl>
+  </w:abstractNum>
+  <w:abstractNum w:abstractNumId="19" w15:restartNumberingAfterBreak="0">
     <w:nsid w:val="5AFF2E8D"/>
     <w:multiLevelType w:val="multilevel"/>
     <w:tmpl w:val="00E82A94"/>
@@ -7884,7 +9647,7 @@
       </w:rPr>
     </w:lvl>
   </w:abstractNum>
-  <w:abstractNum w:abstractNumId="16" w15:restartNumberingAfterBreak="0">
+  <w:abstractNum w:abstractNumId="20" w15:restartNumberingAfterBreak="0">
     <w:nsid w:val="5C491D25"/>
     <w:multiLevelType w:val="multilevel"/>
     <w:tmpl w:val="83B68182"/>
@@ -8033,7 +9796,7 @@
       </w:rPr>
     </w:lvl>
   </w:abstractNum>
-  <w:abstractNum w:abstractNumId="17" w15:restartNumberingAfterBreak="0">
+  <w:abstractNum w:abstractNumId="21" w15:restartNumberingAfterBreak="0">
     <w:nsid w:val="5D612526"/>
     <w:multiLevelType w:val="multilevel"/>
     <w:tmpl w:val="DB62DC76"/>
@@ -8182,7 +9945,7 @@
       </w:rPr>
     </w:lvl>
   </w:abstractNum>
-  <w:abstractNum w:abstractNumId="18" w15:restartNumberingAfterBreak="0">
+  <w:abstractNum w:abstractNumId="22" w15:restartNumberingAfterBreak="0">
     <w:nsid w:val="63FC054C"/>
     <w:multiLevelType w:val="multilevel"/>
     <w:tmpl w:val="D00A9D0A"/>
@@ -8327,7 +10090,7 @@
       </w:rPr>
     </w:lvl>
   </w:abstractNum>
-  <w:abstractNum w:abstractNumId="19" w15:restartNumberingAfterBreak="0">
+  <w:abstractNum w:abstractNumId="23" w15:restartNumberingAfterBreak="0">
     <w:nsid w:val="6DBF7670"/>
     <w:multiLevelType w:val="multilevel"/>
     <w:tmpl w:val="CC963EBA"/>
@@ -8476,7 +10239,7 @@
       </w:rPr>
     </w:lvl>
   </w:abstractNum>
-  <w:abstractNum w:abstractNumId="20" w15:restartNumberingAfterBreak="0">
+  <w:abstractNum w:abstractNumId="24" w15:restartNumberingAfterBreak="0">
     <w:nsid w:val="6F4C7C29"/>
     <w:multiLevelType w:val="multilevel"/>
     <w:tmpl w:val="0CC08082"/>
@@ -8589,7 +10352,7 @@
       </w:pPr>
     </w:lvl>
   </w:abstractNum>
-  <w:abstractNum w:abstractNumId="21" w15:restartNumberingAfterBreak="0">
+  <w:abstractNum w:abstractNumId="25" w15:restartNumberingAfterBreak="0">
     <w:nsid w:val="71B169B8"/>
     <w:multiLevelType w:val="multilevel"/>
     <w:tmpl w:val="124416DC"/>
@@ -8734,7 +10497,7 @@
       </w:rPr>
     </w:lvl>
   </w:abstractNum>
-  <w:abstractNum w:abstractNumId="22" w15:restartNumberingAfterBreak="0">
+  <w:abstractNum w:abstractNumId="26" w15:restartNumberingAfterBreak="0">
     <w:nsid w:val="71DD7274"/>
     <w:multiLevelType w:val="multilevel"/>
     <w:tmpl w:val="2C645D04"/>
@@ -8847,7 +10610,7 @@
       </w:pPr>
     </w:lvl>
   </w:abstractNum>
-  <w:abstractNum w:abstractNumId="23" w15:restartNumberingAfterBreak="0">
+  <w:abstractNum w:abstractNumId="27" w15:restartNumberingAfterBreak="0">
     <w:nsid w:val="72380DDF"/>
     <w:multiLevelType w:val="multilevel"/>
     <w:tmpl w:val="B9CC6108"/>
@@ -8997,31 +10760,31 @@
     </w:lvl>
   </w:abstractNum>
   <w:num w:numId="1" w16cid:durableId="340132085">
-    <w:abstractNumId w:val="11"/>
+    <w:abstractNumId w:val="13"/>
   </w:num>
   <w:num w:numId="2" w16cid:durableId="1890527785">
     <w:abstractNumId w:val="4"/>
   </w:num>
   <w:num w:numId="3" w16cid:durableId="564411841">
-    <w:abstractNumId w:val="17"/>
+    <w:abstractNumId w:val="21"/>
   </w:num>
   <w:num w:numId="4" w16cid:durableId="495222279">
-    <w:abstractNumId w:val="10"/>
+    <w:abstractNumId w:val="12"/>
   </w:num>
   <w:num w:numId="5" w16cid:durableId="1905722608">
     <w:abstractNumId w:val="3"/>
   </w:num>
   <w:num w:numId="6" w16cid:durableId="2014138789">
-    <w:abstractNumId w:val="5"/>
+    <w:abstractNumId w:val="6"/>
   </w:num>
   <w:num w:numId="7" w16cid:durableId="1874030179">
-    <w:abstractNumId w:val="7"/>
+    <w:abstractNumId w:val="9"/>
   </w:num>
   <w:num w:numId="8" w16cid:durableId="1905289728">
-    <w:abstractNumId w:val="19"/>
+    <w:abstractNumId w:val="23"/>
   </w:num>
   <w:num w:numId="9" w16cid:durableId="903224478">
-    <w:abstractNumId w:val="20"/>
+    <w:abstractNumId w:val="24"/>
   </w:num>
   <w:num w:numId="10" w16cid:durableId="1389456004">
     <w:abstractNumId w:val="1"/>
@@ -9033,40 +10796,52 @@
     <w:abstractNumId w:val="0"/>
   </w:num>
   <w:num w:numId="13" w16cid:durableId="1358509900">
-    <w:abstractNumId w:val="8"/>
+    <w:abstractNumId w:val="10"/>
   </w:num>
   <w:num w:numId="14" w16cid:durableId="1263025117">
+    <w:abstractNumId w:val="17"/>
+  </w:num>
+  <w:num w:numId="15" w16cid:durableId="1706708101">
+    <w:abstractNumId w:val="26"/>
+  </w:num>
+  <w:num w:numId="16" w16cid:durableId="1900166956">
+    <w:abstractNumId w:val="19"/>
+  </w:num>
+  <w:num w:numId="17" w16cid:durableId="1088618782">
+    <w:abstractNumId w:val="16"/>
+  </w:num>
+  <w:num w:numId="18" w16cid:durableId="891696317">
+    <w:abstractNumId w:val="25"/>
+  </w:num>
+  <w:num w:numId="19" w16cid:durableId="1852720404">
+    <w:abstractNumId w:val="27"/>
+  </w:num>
+  <w:num w:numId="20" w16cid:durableId="2080328687">
     <w:abstractNumId w:val="14"/>
   </w:num>
-  <w:num w:numId="15" w16cid:durableId="1706708101">
+  <w:num w:numId="21" w16cid:durableId="2061400506">
     <w:abstractNumId w:val="22"/>
   </w:num>
-  <w:num w:numId="16" w16cid:durableId="1900166956">
+  <w:num w:numId="22" w16cid:durableId="322779506">
+    <w:abstractNumId w:val="11"/>
+  </w:num>
+  <w:num w:numId="23" w16cid:durableId="1742749278">
+    <w:abstractNumId w:val="20"/>
+  </w:num>
+  <w:num w:numId="24" w16cid:durableId="1272977281">
+    <w:abstractNumId w:val="7"/>
+  </w:num>
+  <w:num w:numId="25" w16cid:durableId="1997803170">
+    <w:abstractNumId w:val="18"/>
+  </w:num>
+  <w:num w:numId="26" w16cid:durableId="268512735">
+    <w:abstractNumId w:val="5"/>
+  </w:num>
+  <w:num w:numId="27" w16cid:durableId="638652703">
     <w:abstractNumId w:val="15"/>
   </w:num>
-  <w:num w:numId="17" w16cid:durableId="1088618782">
-    <w:abstractNumId w:val="13"/>
-  </w:num>
-  <w:num w:numId="18" w16cid:durableId="891696317">
-    <w:abstractNumId w:val="21"/>
-  </w:num>
-  <w:num w:numId="19" w16cid:durableId="1852720404">
-    <w:abstractNumId w:val="23"/>
-  </w:num>
-  <w:num w:numId="20" w16cid:durableId="2080328687">
-    <w:abstractNumId w:val="12"/>
-  </w:num>
-  <w:num w:numId="21" w16cid:durableId="2061400506">
-    <w:abstractNumId w:val="18"/>
-  </w:num>
-  <w:num w:numId="22" w16cid:durableId="322779506">
-    <w:abstractNumId w:val="9"/>
-  </w:num>
-  <w:num w:numId="23" w16cid:durableId="1742749278">
-    <w:abstractNumId w:val="16"/>
-  </w:num>
-  <w:num w:numId="24" w16cid:durableId="1272977281">
-    <w:abstractNumId w:val="6"/>
+  <w:num w:numId="28" w16cid:durableId="95559940">
+    <w:abstractNumId w:val="8"/>
   </w:num>
 </w:numbering>
 </file>

</xml_diff>

<commit_message>
feat: implementar registro de Trainees con SQL OUTPUT y email automático. - Creación de tabla USERS y Procedimiento Almacenado 'insertarNuevo' utilizando la cláusula OUTPUT para recuperar el ID autoincremental. - Implementación del método EjecutarAccionEscalar en la capa de Datos mediante ExecuteScalar() para atrapar valores únicos. - Desarrollo de la clase TraineeNegocio para orquestar la creación de nuevos usuarios en la base de datos. - Creación de la interfaz Registro.aspx para la captura de credenciales. - Integración exitosa de EmailService para despachar el correo de bienvenida inmediatamente después de confirmar el alta. - Actualización de la barra de navegación en MiMaster.Master agregando perfil, favoritos y botones alineados a la derecha con Bootstrap.
</commit_message>
<xml_diff>
--- a/Unidad 5 - Pokedex Web/Documentación de Pokedex.docx
+++ b/Unidad 5 - Pokedex Web/Documentación de Pokedex.docx
@@ -6666,6 +6666,339 @@
       <w:proofErr w:type="spellEnd"/>
       <w:r>
         <w:t>)) .</w:t>
+      </w:r>
+    </w:p>
+    <w:p/>
+    <w:p>
+      <w:r>
+        <w:rPr>
+          <w:b/>
+          <w:bCs/>
+        </w:rPr>
+        <w:t xml:space="preserve">TEMA: Inserción de Datos y Recuperación de </w:t>
+      </w:r>
+      <w:proofErr w:type="spellStart"/>
+      <w:r>
+        <w:rPr>
+          <w:b/>
+          <w:bCs/>
+        </w:rPr>
+        <w:t>Identity</w:t>
+      </w:r>
+      <w:proofErr w:type="spellEnd"/>
+      <w:r>
+        <w:rPr>
+          <w:b/>
+          <w:bCs/>
+        </w:rPr>
+        <w:t xml:space="preserve"> (SQL OUTPUT) / </w:t>
+      </w:r>
+      <w:proofErr w:type="spellStart"/>
+      <w:r>
+        <w:rPr>
+          <w:b/>
+          <w:bCs/>
+        </w:rPr>
+        <w:t>ExecuteScalar</w:t>
+      </w:r>
+      <w:proofErr w:type="spellEnd"/>
+    </w:p>
+    <w:p>
+      <w:pPr>
+        <w:numPr>
+          <w:ilvl w:val="0"/>
+          <w:numId w:val="29"/>
+        </w:numPr>
+      </w:pPr>
+      <w:r>
+        <w:rPr>
+          <w:b/>
+          <w:bCs/>
+        </w:rPr>
+        <w:t xml:space="preserve">El problema de los </w:t>
+      </w:r>
+      <w:proofErr w:type="spellStart"/>
+      <w:r>
+        <w:rPr>
+          <w:b/>
+          <w:bCs/>
+        </w:rPr>
+        <w:t>IDs</w:t>
+      </w:r>
+      <w:proofErr w:type="spellEnd"/>
+      <w:r>
+        <w:rPr>
+          <w:b/>
+          <w:bCs/>
+        </w:rPr>
+        <w:t xml:space="preserve"> </w:t>
+      </w:r>
+      <w:proofErr w:type="spellStart"/>
+      <w:r>
+        <w:rPr>
+          <w:b/>
+          <w:bCs/>
+        </w:rPr>
+        <w:t>Autoincrementales</w:t>
+      </w:r>
+      <w:proofErr w:type="spellEnd"/>
+      <w:r>
+        <w:rPr>
+          <w:b/>
+          <w:bCs/>
+        </w:rPr>
+        <w:t>:</w:t>
+      </w:r>
+      <w:r>
+        <w:t xml:space="preserve"> Cuando insertamos un registro en una tabla que tiene una clave primaria tipo IDENTITY (</w:t>
+      </w:r>
+      <w:proofErr w:type="spellStart"/>
+      <w:r>
+        <w:t>autoincremental</w:t>
+      </w:r>
+      <w:proofErr w:type="spellEnd"/>
+      <w:r>
+        <w:t xml:space="preserve">), la base de datos es quien asigna el número. Por defecto, un simple INSERT no nos devuelve ese número generado, lo cual es un problema si necesitamos ese ID inmediatamente en nuestra aplicación C# (por ejemplo, para </w:t>
+      </w:r>
+      <w:proofErr w:type="spellStart"/>
+      <w:r>
+        <w:t>loguear</w:t>
+      </w:r>
+      <w:proofErr w:type="spellEnd"/>
+      <w:r>
+        <w:t xml:space="preserve"> automáticamente al usuario o guardar datos relacionados).</w:t>
+      </w:r>
+    </w:p>
+    <w:p>
+      <w:pPr>
+        <w:numPr>
+          <w:ilvl w:val="0"/>
+          <w:numId w:val="29"/>
+        </w:numPr>
+      </w:pPr>
+      <w:r>
+        <w:rPr>
+          <w:b/>
+          <w:bCs/>
+        </w:rPr>
+        <w:t>La Cláusula OUTPUT en SQL Server:</w:t>
+      </w:r>
+      <w:r>
+        <w:t xml:space="preserve"> Es una herramienta avanzada que nos permite interceptar los datos que están siendo afectados por una instrucción INSERT, UPDATE o DELETE. Para recuperar el ID recién creado, modificamos nuestro comando agregando OUTPUT </w:t>
+      </w:r>
+      <w:proofErr w:type="spellStart"/>
+      <w:proofErr w:type="gramStart"/>
+      <w:r>
+        <w:t>inserted.Id</w:t>
+      </w:r>
+      <w:proofErr w:type="spellEnd"/>
+      <w:proofErr w:type="gramEnd"/>
+      <w:r>
+        <w:t xml:space="preserve"> justo después del INSERT INTO y antes del VALUES.</w:t>
+      </w:r>
+    </w:p>
+    <w:p>
+      <w:pPr>
+        <w:numPr>
+          <w:ilvl w:val="0"/>
+          <w:numId w:val="29"/>
+        </w:numPr>
+      </w:pPr>
+      <w:r>
+        <w:rPr>
+          <w:b/>
+          <w:bCs/>
+        </w:rPr>
+        <w:lastRenderedPageBreak/>
+        <w:t xml:space="preserve">El Método </w:t>
+      </w:r>
+      <w:proofErr w:type="spellStart"/>
+      <w:proofErr w:type="gramStart"/>
+      <w:r>
+        <w:rPr>
+          <w:b/>
+          <w:bCs/>
+        </w:rPr>
+        <w:t>ExecuteScalar</w:t>
+      </w:r>
+      <w:proofErr w:type="spellEnd"/>
+      <w:r>
+        <w:rPr>
+          <w:b/>
+          <w:bCs/>
+        </w:rPr>
+        <w:t>(</w:t>
+      </w:r>
+      <w:proofErr w:type="gramEnd"/>
+      <w:r>
+        <w:rPr>
+          <w:b/>
+          <w:bCs/>
+        </w:rPr>
+        <w:t>) en ADO.NET:</w:t>
+      </w:r>
+      <w:r>
+        <w:t xml:space="preserve"> Hasta ahora, para operaciones de escritura (ABM), usábamos </w:t>
+      </w:r>
+      <w:proofErr w:type="spellStart"/>
+      <w:r>
+        <w:t>ExecuteNonQuery</w:t>
+      </w:r>
+      <w:proofErr w:type="spellEnd"/>
+      <w:r>
+        <w:t xml:space="preserve">() (que solo devuelve la cantidad de filas afectadas). Para capturar el dato único que nos devuelve la cláusula OUTPUT, debemos utilizar el método </w:t>
+      </w:r>
+      <w:proofErr w:type="spellStart"/>
+      <w:proofErr w:type="gramStart"/>
+      <w:r>
+        <w:t>ExecuteScalar</w:t>
+      </w:r>
+      <w:proofErr w:type="spellEnd"/>
+      <w:r>
+        <w:t>(</w:t>
+      </w:r>
+      <w:proofErr w:type="gramEnd"/>
+      <w:r>
+        <w:t xml:space="preserve">) del objeto </w:t>
+      </w:r>
+      <w:proofErr w:type="spellStart"/>
+      <w:r>
+        <w:t>SqlCommand</w:t>
+      </w:r>
+      <w:proofErr w:type="spellEnd"/>
+      <w:r>
+        <w:t xml:space="preserve">. Este método ejecuta la consulta y retorna </w:t>
+      </w:r>
+      <w:r>
+        <w:rPr>
+          <w:b/>
+          <w:bCs/>
+        </w:rPr>
+        <w:t>únicamente la primera columna de la primera fila</w:t>
+      </w:r>
+      <w:r>
+        <w:t xml:space="preserve"> del </w:t>
+      </w:r>
+      <w:proofErr w:type="gramStart"/>
+      <w:r>
+        <w:t>resultado .</w:t>
+      </w:r>
+      <w:proofErr w:type="gramEnd"/>
+      <w:r>
+        <w:t xml:space="preserve"> Como devuelve un tipo genérico </w:t>
+      </w:r>
+      <w:proofErr w:type="spellStart"/>
+      <w:r>
+        <w:t>object</w:t>
+      </w:r>
+      <w:proofErr w:type="spellEnd"/>
+      <w:r>
+        <w:t xml:space="preserve">, en C# debemos castearlo o </w:t>
+      </w:r>
+      <w:proofErr w:type="spellStart"/>
+      <w:r>
+        <w:t>parsearlo</w:t>
+      </w:r>
+      <w:proofErr w:type="spellEnd"/>
+      <w:r>
+        <w:t xml:space="preserve"> al tipo de dato esperado (ej. </w:t>
+      </w:r>
+      <w:proofErr w:type="spellStart"/>
+      <w:r>
+        <w:t>int</w:t>
+      </w:r>
+      <w:proofErr w:type="spellEnd"/>
+      <w:r>
+        <w:t>).</w:t>
+      </w:r>
+    </w:p>
+    <w:p>
+      <w:pPr>
+        <w:numPr>
+          <w:ilvl w:val="0"/>
+          <w:numId w:val="29"/>
+        </w:numPr>
+      </w:pPr>
+      <w:r>
+        <w:rPr>
+          <w:b/>
+          <w:bCs/>
+        </w:rPr>
+        <w:t>Flujo de Registro Básico:</w:t>
+      </w:r>
+      <w:r>
+        <w:t xml:space="preserve"> Un flujo de registro (</w:t>
+      </w:r>
+      <w:proofErr w:type="spellStart"/>
+      <w:r>
+        <w:t>Sign</w:t>
+      </w:r>
+      <w:proofErr w:type="spellEnd"/>
+      <w:r>
+        <w:t xml:space="preserve"> Up) seguro y profesional consta de:</w:t>
+      </w:r>
+    </w:p>
+    <w:p>
+      <w:pPr>
+        <w:numPr>
+          <w:ilvl w:val="1"/>
+          <w:numId w:val="29"/>
+        </w:numPr>
+      </w:pPr>
+      <w:r>
+        <w:t xml:space="preserve">Captura de credenciales iniciales (Email y </w:t>
+      </w:r>
+      <w:proofErr w:type="spellStart"/>
+      <w:r>
+        <w:t>Password</w:t>
+      </w:r>
+      <w:proofErr w:type="spellEnd"/>
+      <w:r>
+        <w:t>).</w:t>
+      </w:r>
+    </w:p>
+    <w:p>
+      <w:pPr>
+        <w:numPr>
+          <w:ilvl w:val="1"/>
+          <w:numId w:val="29"/>
+        </w:numPr>
+      </w:pPr>
+      <w:r>
+        <w:t xml:space="preserve">Asignación de roles por defecto (ej. </w:t>
+      </w:r>
+      <w:proofErr w:type="spellStart"/>
+      <w:r>
+        <w:t>Admin</w:t>
+      </w:r>
+      <w:proofErr w:type="spellEnd"/>
+      <w:r>
+        <w:t xml:space="preserve"> = false</w:t>
+      </w:r>
+      <w:r>
+        <w:t>).</w:t>
+      </w:r>
+    </w:p>
+    <w:p>
+      <w:pPr>
+        <w:numPr>
+          <w:ilvl w:val="1"/>
+          <w:numId w:val="29"/>
+        </w:numPr>
+      </w:pPr>
+      <w:r>
+        <w:t>Inserción en DB recuperando el ID.</w:t>
+      </w:r>
+    </w:p>
+    <w:p>
+      <w:pPr>
+        <w:numPr>
+          <w:ilvl w:val="1"/>
+          <w:numId w:val="29"/>
+        </w:numPr>
+      </w:pPr>
+      <w:r>
+        <w:t>Disparo de eventos asíncronos o notificaciones (ej. Envío de Email de bienvenida).</w:t>
       </w:r>
     </w:p>
     <w:p/>
@@ -10645,6 +10978,151 @@
         <w:rFonts w:ascii="Courier New" w:hAnsi="Courier New" w:hint="default"/>
         <w:sz w:val="20"/>
       </w:rPr>
+    </w:lvl>
+    <w:lvl w:ilvl="2" w:tentative="1">
+      <w:start w:val="1"/>
+      <w:numFmt w:val="bullet"/>
+      <w:lvlText w:val=""/>
+      <w:lvlJc w:val="left"/>
+      <w:pPr>
+        <w:tabs>
+          <w:tab w:val="num" w:pos="2160"/>
+        </w:tabs>
+        <w:ind w:left="2160" w:hanging="360"/>
+      </w:pPr>
+      <w:rPr>
+        <w:rFonts w:ascii="Wingdings" w:hAnsi="Wingdings" w:hint="default"/>
+        <w:sz w:val="20"/>
+      </w:rPr>
+    </w:lvl>
+    <w:lvl w:ilvl="3" w:tentative="1">
+      <w:start w:val="1"/>
+      <w:numFmt w:val="bullet"/>
+      <w:lvlText w:val=""/>
+      <w:lvlJc w:val="left"/>
+      <w:pPr>
+        <w:tabs>
+          <w:tab w:val="num" w:pos="2880"/>
+        </w:tabs>
+        <w:ind w:left="2880" w:hanging="360"/>
+      </w:pPr>
+      <w:rPr>
+        <w:rFonts w:ascii="Wingdings" w:hAnsi="Wingdings" w:hint="default"/>
+        <w:sz w:val="20"/>
+      </w:rPr>
+    </w:lvl>
+    <w:lvl w:ilvl="4" w:tentative="1">
+      <w:start w:val="1"/>
+      <w:numFmt w:val="bullet"/>
+      <w:lvlText w:val=""/>
+      <w:lvlJc w:val="left"/>
+      <w:pPr>
+        <w:tabs>
+          <w:tab w:val="num" w:pos="3600"/>
+        </w:tabs>
+        <w:ind w:left="3600" w:hanging="360"/>
+      </w:pPr>
+      <w:rPr>
+        <w:rFonts w:ascii="Wingdings" w:hAnsi="Wingdings" w:hint="default"/>
+        <w:sz w:val="20"/>
+      </w:rPr>
+    </w:lvl>
+    <w:lvl w:ilvl="5" w:tentative="1">
+      <w:start w:val="1"/>
+      <w:numFmt w:val="bullet"/>
+      <w:lvlText w:val=""/>
+      <w:lvlJc w:val="left"/>
+      <w:pPr>
+        <w:tabs>
+          <w:tab w:val="num" w:pos="4320"/>
+        </w:tabs>
+        <w:ind w:left="4320" w:hanging="360"/>
+      </w:pPr>
+      <w:rPr>
+        <w:rFonts w:ascii="Wingdings" w:hAnsi="Wingdings" w:hint="default"/>
+        <w:sz w:val="20"/>
+      </w:rPr>
+    </w:lvl>
+    <w:lvl w:ilvl="6" w:tentative="1">
+      <w:start w:val="1"/>
+      <w:numFmt w:val="bullet"/>
+      <w:lvlText w:val=""/>
+      <w:lvlJc w:val="left"/>
+      <w:pPr>
+        <w:tabs>
+          <w:tab w:val="num" w:pos="5040"/>
+        </w:tabs>
+        <w:ind w:left="5040" w:hanging="360"/>
+      </w:pPr>
+      <w:rPr>
+        <w:rFonts w:ascii="Wingdings" w:hAnsi="Wingdings" w:hint="default"/>
+        <w:sz w:val="20"/>
+      </w:rPr>
+    </w:lvl>
+    <w:lvl w:ilvl="7" w:tentative="1">
+      <w:start w:val="1"/>
+      <w:numFmt w:val="bullet"/>
+      <w:lvlText w:val=""/>
+      <w:lvlJc w:val="left"/>
+      <w:pPr>
+        <w:tabs>
+          <w:tab w:val="num" w:pos="5760"/>
+        </w:tabs>
+        <w:ind w:left="5760" w:hanging="360"/>
+      </w:pPr>
+      <w:rPr>
+        <w:rFonts w:ascii="Wingdings" w:hAnsi="Wingdings" w:hint="default"/>
+        <w:sz w:val="20"/>
+      </w:rPr>
+    </w:lvl>
+    <w:lvl w:ilvl="8" w:tentative="1">
+      <w:start w:val="1"/>
+      <w:numFmt w:val="bullet"/>
+      <w:lvlText w:val=""/>
+      <w:lvlJc w:val="left"/>
+      <w:pPr>
+        <w:tabs>
+          <w:tab w:val="num" w:pos="6480"/>
+        </w:tabs>
+        <w:ind w:left="6480" w:hanging="360"/>
+      </w:pPr>
+      <w:rPr>
+        <w:rFonts w:ascii="Wingdings" w:hAnsi="Wingdings" w:hint="default"/>
+        <w:sz w:val="20"/>
+      </w:rPr>
+    </w:lvl>
+  </w:abstractNum>
+  <w:abstractNum w:abstractNumId="28" w15:restartNumberingAfterBreak="0">
+    <w:nsid w:val="73E15FBD"/>
+    <w:multiLevelType w:val="multilevel"/>
+    <w:tmpl w:val="481E18CC"/>
+    <w:lvl w:ilvl="0">
+      <w:start w:val="1"/>
+      <w:numFmt w:val="bullet"/>
+      <w:lvlText w:val=""/>
+      <w:lvlJc w:val="left"/>
+      <w:pPr>
+        <w:tabs>
+          <w:tab w:val="num" w:pos="720"/>
+        </w:tabs>
+        <w:ind w:left="720" w:hanging="360"/>
+      </w:pPr>
+      <w:rPr>
+        <w:rFonts w:ascii="Symbol" w:hAnsi="Symbol" w:hint="default"/>
+        <w:sz w:val="20"/>
+      </w:rPr>
+    </w:lvl>
+    <w:lvl w:ilvl="1">
+      <w:start w:val="1"/>
+      <w:numFmt w:val="decimal"/>
+      <w:lvlText w:val="%2."/>
+      <w:lvlJc w:val="left"/>
+      <w:pPr>
+        <w:tabs>
+          <w:tab w:val="num" w:pos="1440"/>
+        </w:tabs>
+        <w:ind w:left="1440" w:hanging="360"/>
+      </w:pPr>
     </w:lvl>
     <w:lvl w:ilvl="2" w:tentative="1">
       <w:start w:val="1"/>
@@ -10842,6 +11320,9 @@
   </w:num>
   <w:num w:numId="28" w16cid:durableId="95559940">
     <w:abstractNumId w:val="8"/>
+  </w:num>
+  <w:num w:numId="29" w16cid:durableId="1757095926">
+    <w:abstractNumId w:val="28"/>
   </w:num>
 </w:numbering>
 </file>

</xml_diff>

<commit_message>
feat: implementar sistema de autenticación y seguridad centralizada basada en roles. - Creación del método Login en TraineeNegocio para validar credenciales contra la base de datos y recuperar el ID/Rol del usuario. - Actualización de Login.aspx para utilizar el modelo Trainee y almacenar la sesión autenticada (Session["trainee"]). - Implementación de la clase estática 'Seguridad' (Helper) para centralizar las validaciones lógicas de sesionActiva y esAdmin. - Configuración de un interceptor de seguridad global en el Page_Load de MiMaster.Master, protegiendo rutas privadas y exceptuando las públicas mediante comprobación de tipos (is). - Refactorización de PokemonLista.aspx eliminando lógica heredada (Usuario) y aplicando el control de acceso exclusivo para administradores (Seguridad.esAdmin).
</commit_message>
<xml_diff>
--- a/Unidad 5 - Pokedex Web/Documentación de Pokedex.docx
+++ b/Unidad 5 - Pokedex Web/Documentación de Pokedex.docx
@@ -1182,13 +1182,8 @@
       </w:r>
       <w:proofErr w:type="spellEnd"/>
       <w:r>
-        <w:t xml:space="preserve">), suelen ser rígidos en cuanto a la estructura HTML que generan (tablas &lt;table&gt;). Para interfaces orientadas al usuario final (como catálogos o galerías), se requiere un control total sobre el HTML </w:t>
-      </w:r>
-      <w:proofErr w:type="gramStart"/>
-      <w:r>
-        <w:t>generado .</w:t>
-      </w:r>
-      <w:proofErr w:type="gramEnd"/>
+        <w:t>), suelen ser rígidos en cuanto a la estructura HTML que generan (tablas &lt;table&gt;). Para interfaces orientadas al usuario final (como catálogos o galerías), se requiere un control total sobre el HTML generado .</w:t>
+      </w:r>
     </w:p>
     <w:p>
       <w:pPr>
@@ -1221,13 +1216,8 @@
       </w:r>
       <w:proofErr w:type="spellEnd"/>
       <w:r>
-        <w:t xml:space="preserve">. El motor de renderizado ejecuta este código en el servidor antes de enviar el HTML al </w:t>
-      </w:r>
-      <w:proofErr w:type="gramStart"/>
-      <w:r>
-        <w:t>cliente .</w:t>
-      </w:r>
-      <w:proofErr w:type="gramEnd"/>
+        <w:t>. El motor de renderizado ejecuta este código en el servidor antes de enviar el HTML al cliente .</w:t>
+      </w:r>
     </w:p>
     <w:p>
       <w:pPr>
@@ -1300,15 +1290,7 @@
       </w:r>
       <w:proofErr w:type="spellEnd"/>
       <w:r>
-        <w:t xml:space="preserve">) </w:t>
-      </w:r>
-      <w:proofErr w:type="gramStart"/>
-      <w:r>
-        <w:t>{ %</w:t>
-      </w:r>
-      <w:proofErr w:type="gramEnd"/>
-      <w:r>
-        <w:t>&gt; ... HTML ... &lt;% } %&gt;), el servidor repite ese fragmento HTML por cada elemento de la colección.</w:t>
+        <w:t>) { %&gt; ... HTML ... &lt;% } %&gt;), el servidor repite ese fragmento HTML por cada elemento de la colección.</w:t>
       </w:r>
     </w:p>
     <w:p>
@@ -1418,13 +1400,8 @@
       </w:r>
       <w:proofErr w:type="spellEnd"/>
       <w:r>
-        <w:t xml:space="preserve">&gt; la única obligatoria para definir el contenido </w:t>
-      </w:r>
-      <w:proofErr w:type="gramStart"/>
-      <w:r>
-        <w:t>repetitivo .</w:t>
-      </w:r>
-      <w:proofErr w:type="gramEnd"/>
+        <w:t>&gt; la única obligatoria para definir el contenido repetitivo .</w:t>
+      </w:r>
     </w:p>
     <w:p>
       <w:pPr>
@@ -1484,17 +1461,12 @@
         <w:t xml:space="preserve"> procesa estas expresiones cuando se invoca el método </w:t>
       </w:r>
       <w:proofErr w:type="spellStart"/>
-      <w:proofErr w:type="gramStart"/>
       <w:r>
         <w:t>DataBind</w:t>
       </w:r>
       <w:proofErr w:type="spellEnd"/>
       <w:r>
-        <w:t>(</w:t>
-      </w:r>
-      <w:proofErr w:type="gramEnd"/>
-      <w:r>
-        <w:t>) en el servidor .</w:t>
+        <w:t>() en el servidor .</w:t>
       </w:r>
     </w:p>
     <w:p>
@@ -1512,7 +1484,6 @@
         <w:t xml:space="preserve">Método </w:t>
       </w:r>
       <w:proofErr w:type="spellStart"/>
-      <w:proofErr w:type="gramStart"/>
       <w:r>
         <w:rPr>
           <w:b/>
@@ -1526,15 +1497,7 @@
           <w:b/>
           <w:bCs/>
         </w:rPr>
-        <w:t>(</w:t>
-      </w:r>
-      <w:proofErr w:type="gramEnd"/>
-      <w:r>
-        <w:rPr>
-          <w:b/>
-          <w:bCs/>
-        </w:rPr>
-        <w:t>):</w:t>
+        <w:t>():</w:t>
       </w:r>
       <w:r>
         <w:t xml:space="preserve"> Es una función optimizada que utiliza reflexión (</w:t>
@@ -1585,13 +1548,8 @@
       </w:r>
       <w:proofErr w:type="spellEnd"/>
       <w:r>
-        <w:t>") %&gt;</w:t>
-      </w:r>
-      <w:proofErr w:type="gramStart"/>
-      <w:r>
-        <w:t>) .</w:t>
-      </w:r>
-      <w:proofErr w:type="gramEnd"/>
+        <w:t>") %&gt;) .</w:t>
+      </w:r>
     </w:p>
     <w:p/>
     <w:p/>
@@ -1751,13 +1709,8 @@
       </w:r>
       <w:proofErr w:type="spellEnd"/>
       <w:r>
-        <w:t xml:space="preserve">)) para que el compilador trate ese objeto como un botón y permita acceder a sus </w:t>
-      </w:r>
-      <w:proofErr w:type="gramStart"/>
-      <w:r>
-        <w:t>atributos .</w:t>
-      </w:r>
-      <w:proofErr w:type="gramEnd"/>
+        <w:t>)) para que el compilador trate ese objeto como un botón y permita acceder a sus atributos .</w:t>
+      </w:r>
     </w:p>
     <w:p>
       <w:pPr>
@@ -1806,15 +1759,7 @@
       </w:r>
       <w:proofErr w:type="spellEnd"/>
       <w:r>
-        <w:t xml:space="preserve"> de ASP.NET. Permite almacenar un valor dinámico (como la Clave Primaria o ID de un registro) directamente en el HTML del </w:t>
-      </w:r>
-      <w:proofErr w:type="gramStart"/>
-      <w:r>
-        <w:t>botón .</w:t>
-      </w:r>
-      <w:proofErr w:type="gramEnd"/>
-      <w:r>
-        <w:t xml:space="preserve"> Cuando el usuario hace clic, ese valor viaja automáticamente al servidor y puede ser recuperado en el evento </w:t>
+        <w:t xml:space="preserve"> de ASP.NET. Permite almacenar un valor dinámico (como la Clave Primaria o ID de un registro) directamente en el HTML del botón . Cuando el usuario hace clic, ese valor viaja automáticamente al servidor y puede ser recuperado en el evento </w:t>
       </w:r>
       <w:proofErr w:type="spellStart"/>
       <w:r>
@@ -1825,7 +1770,6 @@
         <w:t xml:space="preserve"> o </w:t>
       </w:r>
       <w:proofErr w:type="spellStart"/>
-      <w:proofErr w:type="gramStart"/>
       <w:r>
         <w:t>OnCommand</w:t>
       </w:r>
@@ -1833,7 +1777,6 @@
       <w:r>
         <w:t xml:space="preserve"> .</w:t>
       </w:r>
-      <w:proofErr w:type="gramEnd"/>
     </w:p>
     <w:p>
       <w:pPr>
@@ -1914,26 +1857,16 @@
       </w:r>
       <w:proofErr w:type="spellEnd"/>
       <w:r>
-        <w:t xml:space="preserve"> </w:t>
-      </w:r>
-      <w:proofErr w:type="gramStart"/>
-      <w:r>
-        <w:t>(!</w:t>
+        <w:t xml:space="preserve"> (!</w:t>
       </w:r>
       <w:proofErr w:type="spellStart"/>
       <w:r>
         <w:t>IsPostBack</w:t>
       </w:r>
       <w:proofErr w:type="spellEnd"/>
-      <w:proofErr w:type="gramEnd"/>
-      <w:r>
-        <w:t xml:space="preserve">)), el ciclo de vida de la página destruirá y recreará todos los botones dinámicos antes de procesar el evento de clic, lo que anulará la acción del usuario. La carga de datos debe restringirse a la primera carga de la </w:t>
-      </w:r>
-      <w:proofErr w:type="gramStart"/>
-      <w:r>
-        <w:t>página .</w:t>
-      </w:r>
-      <w:proofErr w:type="gramEnd"/>
+      <w:r>
+        <w:t>)), el ciclo de vida de la página destruirá y recreará todos los botones dinámicos antes de procesar el evento de clic, lo que anulará la acción del usuario. La carga de datos debe restringirse a la primera carga de la página .</w:t>
+      </w:r>
     </w:p>
     <w:p>
       <w:pPr>
@@ -2011,11 +1944,9 @@
         <w:t>PostBack</w:t>
       </w:r>
       <w:proofErr w:type="spellEnd"/>
-      <w:proofErr w:type="gramStart"/>
       <w:r>
         <w:t>) .</w:t>
       </w:r>
-      <w:proofErr w:type="gramEnd"/>
     </w:p>
     <w:p>
       <w:pPr>
@@ -2127,15 +2058,7 @@
           <w:b/>
           <w:bCs/>
         </w:rPr>
-        <w:t xml:space="preserve"> </w:t>
-      </w:r>
-      <w:proofErr w:type="gramStart"/>
-      <w:r>
-        <w:rPr>
-          <w:b/>
-          <w:bCs/>
-        </w:rPr>
-        <w:t>(!</w:t>
+        <w:t xml:space="preserve"> (!</w:t>
       </w:r>
       <w:proofErr w:type="spellStart"/>
       <w:r>
@@ -2146,7 +2069,6 @@
         <w:t>IsPostBack</w:t>
       </w:r>
       <w:proofErr w:type="spellEnd"/>
-      <w:proofErr w:type="gramEnd"/>
       <w:r>
         <w:rPr>
           <w:b/>
@@ -2271,18 +2193,13 @@
       </w:r>
       <w:proofErr w:type="spellEnd"/>
       <w:r>
-        <w:t xml:space="preserve"> </w:t>
-      </w:r>
-      <w:proofErr w:type="gramStart"/>
-      <w:r>
-        <w:t>(!</w:t>
+        <w:t xml:space="preserve"> (!</w:t>
       </w:r>
       <w:proofErr w:type="spellStart"/>
       <w:r>
         <w:t>IsPostBack</w:t>
       </w:r>
       <w:proofErr w:type="spellEnd"/>
-      <w:proofErr w:type="gramEnd"/>
       <w:r>
         <w:t xml:space="preserve">), vuelve a ir a la base de datos y ejecuta </w:t>
       </w:r>
@@ -2306,17 +2223,12 @@
         <w:t xml:space="preserve">Al hacer </w:t>
       </w:r>
       <w:proofErr w:type="spellStart"/>
-      <w:proofErr w:type="gramStart"/>
       <w:r>
         <w:t>DataBind</w:t>
       </w:r>
       <w:proofErr w:type="spellEnd"/>
       <w:r>
-        <w:t>(</w:t>
-      </w:r>
-      <w:proofErr w:type="gramEnd"/>
-      <w:r>
-        <w:t xml:space="preserve">), el servidor </w:t>
+        <w:t xml:space="preserve">(), el servidor </w:t>
       </w:r>
       <w:r>
         <w:rPr>
@@ -2358,21 +2270,8 @@
         <w:t>"Momento, este timbre ya no existe, lo acabo de destruir y reemplazar por uno nuevo en el paso 1"</w:t>
       </w:r>
       <w:r>
-        <w:t xml:space="preserve">. Como el botón original desapareció de la memoria, el clic se ignora por completo y no hace </w:t>
-      </w:r>
-      <w:proofErr w:type="gramStart"/>
-      <w:r>
-        <w:t>nada .</w:t>
-      </w:r>
-      <w:proofErr w:type="gramEnd"/>
-      <w:r>
-        <w:t xml:space="preserve"> ¡De hecho, este fue exactamente el error que le pasó al profe en la clase antes de </w:t>
-      </w:r>
-      <w:proofErr w:type="gramStart"/>
-      <w:r>
-        <w:t>corregirlo !</w:t>
-      </w:r>
-      <w:proofErr w:type="gramEnd"/>
+        <w:t>. Como el botón original desapareció de la memoria, el clic se ignora por completo y no hace nada . ¡De hecho, este fue exactamente el error que le pasó al profe en la clase antes de corregirlo !</w:t>
+      </w:r>
     </w:p>
     <w:p>
       <w:pPr>
@@ -2386,15 +2285,7 @@
           <w:b/>
           <w:bCs/>
         </w:rPr>
-        <w:t xml:space="preserve">La Solución: El escudo del </w:t>
-      </w:r>
-      <w:proofErr w:type="gramStart"/>
-      <w:r>
-        <w:rPr>
-          <w:b/>
-          <w:bCs/>
-        </w:rPr>
-        <w:t>(!</w:t>
+        <w:t>La Solución: El escudo del (!</w:t>
       </w:r>
       <w:proofErr w:type="spellStart"/>
       <w:r>
@@ -2405,7 +2296,6 @@
         <w:t>IsPostBack</w:t>
       </w:r>
       <w:proofErr w:type="spellEnd"/>
-      <w:proofErr w:type="gramEnd"/>
       <w:r>
         <w:rPr>
           <w:b/>
@@ -2484,13 +2374,8 @@
         <w:t>Paso 2</w:t>
       </w:r>
       <w:r>
-        <w:t xml:space="preserve">, el botón original sigue existiendo y el evento se dispara a la </w:t>
-      </w:r>
-      <w:proofErr w:type="gramStart"/>
-      <w:r>
-        <w:t>perfección .</w:t>
-      </w:r>
-      <w:proofErr w:type="gramEnd"/>
+        <w:t>, el botón original sigue existiendo y el evento se dispara a la perfección .</w:t>
+      </w:r>
     </w:p>
     <w:p>
       <w:pPr>
@@ -2525,13 +2410,8 @@
         <w:ind w:left="720"/>
       </w:pPr>
       <w:r>
-        <w:t xml:space="preserve">La elección del control de presentación de datos no obedece a una regla estricta, sino que depende del diseño visual requerido y de la funcionalidad de la </w:t>
-      </w:r>
-      <w:proofErr w:type="gramStart"/>
-      <w:r>
-        <w:t>pantalla .</w:t>
-      </w:r>
-      <w:proofErr w:type="gramEnd"/>
+        <w:t>La elección del control de presentación de datos no obedece a una regla estricta, sino que depende del diseño visual requerido y de la funcionalidad de la pantalla .</w:t>
+      </w:r>
     </w:p>
     <w:p>
       <w:pPr>
@@ -2576,13 +2456,8 @@
         <w:t>Uso ideal:</w:t>
       </w:r>
       <w:r>
-        <w:t xml:space="preserve"> Paneles de administración, sistemas de gestión (ABM / CRUD), reportes </w:t>
-      </w:r>
-      <w:proofErr w:type="gramStart"/>
-      <w:r>
-        <w:t>financieros .</w:t>
-      </w:r>
-      <w:proofErr w:type="gramEnd"/>
+        <w:t xml:space="preserve"> Paneles de administración, sistemas de gestión (ABM / CRUD), reportes financieros .</w:t>
+      </w:r>
     </w:p>
     <w:p>
       <w:pPr>
@@ -2599,13 +2474,8 @@
         <w:t>Ventajas:</w:t>
       </w:r>
       <w:r>
-        <w:t xml:space="preserve"> Genera una estructura tabular (&lt;table&gt;) estructurada. Posee muchísima funcionalidad incorporada (paginación, ordenamiento, botones de comando en la misma fila) que ahorra tiempo de desarrollo para interfaces </w:t>
-      </w:r>
-      <w:proofErr w:type="gramStart"/>
-      <w:r>
-        <w:t>internas .</w:t>
-      </w:r>
-      <w:proofErr w:type="gramEnd"/>
+        <w:t xml:space="preserve"> Genera una estructura tabular (&lt;table&gt;) estructurada. Posee muchísima funcionalidad incorporada (paginación, ordenamiento, botones de comando en la misma fila) que ahorra tiempo de desarrollo para interfaces internas .</w:t>
+      </w:r>
     </w:p>
     <w:p>
       <w:pPr>
@@ -2622,13 +2492,8 @@
         <w:t>Desventajas:</w:t>
       </w:r>
       <w:r>
-        <w:t xml:space="preserve"> Es muy rígido visualmente. No sirve para diseños modernos orientados al cliente final (como catálogos de tarjetas, carruseles o banners</w:t>
-      </w:r>
-      <w:proofErr w:type="gramStart"/>
-      <w:r>
-        <w:t>) .</w:t>
-      </w:r>
-      <w:proofErr w:type="gramEnd"/>
+        <w:t xml:space="preserve"> Es muy rígido visualmente. No sirve para diseños modernos orientados al cliente final (como catálogos de tarjetas, carruseles o banners) .</w:t>
+      </w:r>
     </w:p>
     <w:p>
       <w:pPr>
@@ -2673,13 +2538,8 @@
         <w:t>Uso ideal:</w:t>
       </w:r>
       <w:r>
-        <w:t xml:space="preserve"> Catálogos visuales y estructuras de datos jerárquicas o </w:t>
-      </w:r>
-      <w:proofErr w:type="gramStart"/>
-      <w:r>
-        <w:t>anidadas .</w:t>
-      </w:r>
-      <w:proofErr w:type="gramEnd"/>
+        <w:t xml:space="preserve"> Catálogos visuales y estructuras de datos jerárquicas o anidadas .</w:t>
+      </w:r>
     </w:p>
     <w:p>
       <w:pPr>
@@ -2722,13 +2582,8 @@
       </w:r>
       <w:proofErr w:type="spellEnd"/>
       <w:r>
-        <w:t xml:space="preserve"> dentro de otro para dibujar elementos HTML </w:t>
-      </w:r>
-      <w:proofErr w:type="gramStart"/>
-      <w:r>
-        <w:t>complejos .</w:t>
-      </w:r>
-      <w:proofErr w:type="gramEnd"/>
+        <w:t xml:space="preserve"> dentro de otro para dibujar elementos HTML complejos .</w:t>
+      </w:r>
     </w:p>
     <w:p>
       <w:pPr>
@@ -2745,13 +2600,8 @@
         <w:t>Desventajas:</w:t>
       </w:r>
       <w:r>
-        <w:t xml:space="preserve"> La sintaxis HTML queda un poco sucia ("código espagueti") y no permite manejar eventos de servidor en la misma página de forma nativa; requiere el envío de parámetros por URL a través de etiquetas &lt;a</w:t>
-      </w:r>
-      <w:proofErr w:type="gramStart"/>
-      <w:r>
-        <w:t>&gt; .</w:t>
-      </w:r>
-      <w:proofErr w:type="gramEnd"/>
+        <w:t xml:space="preserve"> La sintaxis HTML queda un poco sucia ("código espagueti") y no permite manejar eventos de servidor en la misma página de forma nativa; requiere el envío de parámetros por URL a través de etiquetas &lt;a&gt; .</w:t>
+      </w:r>
     </w:p>
     <w:p>
       <w:pPr>
@@ -2765,7 +2615,6 @@
         <w:t>3. Control &lt;</w:t>
       </w:r>
       <w:proofErr w:type="spellStart"/>
-      <w:proofErr w:type="gramStart"/>
       <w:r>
         <w:rPr>
           <w:b/>
@@ -2774,7 +2623,6 @@
         <w:t>asp:Repeater</w:t>
       </w:r>
       <w:proofErr w:type="spellEnd"/>
-      <w:proofErr w:type="gramEnd"/>
       <w:r>
         <w:rPr>
           <w:b/>
@@ -2798,13 +2646,8 @@
         <w:t>Uso ideal:</w:t>
       </w:r>
       <w:r>
-        <w:t xml:space="preserve"> Catálogos interactivos, listas de productos con botones de acción rápida ("Agregar al carrito", "Marcar favorito"</w:t>
-      </w:r>
-      <w:proofErr w:type="gramStart"/>
-      <w:r>
-        <w:t>) .</w:t>
-      </w:r>
-      <w:proofErr w:type="gramEnd"/>
+        <w:t xml:space="preserve"> Catálogos interactivos, listas de productos con botones de acción rápida ("Agregar al carrito", "Marcar favorito") .</w:t>
+      </w:r>
     </w:p>
     <w:p>
       <w:pPr>
@@ -2824,25 +2667,18 @@
         <w:t xml:space="preserve"> HTML mucho más limpio en la capa de presentación mediante la función &lt;%# </w:t>
       </w:r>
       <w:proofErr w:type="spellStart"/>
-      <w:proofErr w:type="gramStart"/>
       <w:r>
         <w:t>Eval</w:t>
       </w:r>
       <w:proofErr w:type="spellEnd"/>
       <w:r>
-        <w:t>(</w:t>
-      </w:r>
-      <w:proofErr w:type="gramEnd"/>
-      <w:r>
-        <w:t>) %&gt; . Su característica principal es la integración de controles de servidor (como &lt;</w:t>
-      </w:r>
-      <w:proofErr w:type="spellStart"/>
-      <w:proofErr w:type="gramStart"/>
+        <w:t>() %&gt; . Su característica principal es la integración de controles de servidor (como &lt;</w:t>
+      </w:r>
+      <w:proofErr w:type="spellStart"/>
       <w:r>
         <w:t>asp:Button</w:t>
       </w:r>
       <w:proofErr w:type="spellEnd"/>
-      <w:proofErr w:type="gramEnd"/>
       <w:r>
         <w:t>&gt;) que permiten capturar eventos (</w:t>
       </w:r>
@@ -3034,17 +2870,12 @@
         <w:t xml:space="preserve"> de la grilla y volver a invocar el método </w:t>
       </w:r>
       <w:proofErr w:type="spellStart"/>
-      <w:proofErr w:type="gramStart"/>
       <w:r>
         <w:t>DataBind</w:t>
       </w:r>
       <w:proofErr w:type="spellEnd"/>
       <w:r>
-        <w:t>(</w:t>
-      </w:r>
-      <w:proofErr w:type="gramEnd"/>
-      <w:r>
-        <w:t>) .</w:t>
+        <w:t>() .</w:t>
       </w:r>
     </w:p>
     <w:p>
@@ -3070,13 +2901,8 @@
       </w:r>
       <w:proofErr w:type="spellEnd"/>
       <w:r>
-        <w:t xml:space="preserve"> para modificar datos directamente sobre las celdas de la grilla. Sin embargo, a nivel arquitectónico y de UX, esta práctica se desaconseja para tablas con muchas columnas, ya que genera una interfaz similar a una hoja de cálculo de Excel, resultando tediosa y poco </w:t>
-      </w:r>
-      <w:proofErr w:type="gramStart"/>
-      <w:r>
-        <w:t>práctica .</w:t>
-      </w:r>
-      <w:proofErr w:type="gramEnd"/>
+        <w:t xml:space="preserve"> para modificar datos directamente sobre las celdas de la grilla. Sin embargo, a nivel arquitectónico y de UX, esta práctica se desaconseja para tablas con muchas columnas, ya que genera una interfaz similar a una hoja de cálculo de Excel, resultando tediosa y poco práctica .</w:t>
+      </w:r>
     </w:p>
     <w:p>
       <w:pPr>
@@ -3335,41 +3161,33 @@
     </w:p>
     <w:p>
       <w:r>
-        <w:t xml:space="preserve">La letra </w:t>
-      </w:r>
-      <w:proofErr w:type="gramStart"/>
+        <w:t>La letra e es simplemente una convención mundial en C# para abreviar "</w:t>
+      </w:r>
+      <w:proofErr w:type="spellStart"/>
+      <w:r>
+        <w:t>Event</w:t>
+      </w:r>
+      <w:proofErr w:type="spellEnd"/>
+      <w:r>
+        <w:t xml:space="preserve">", pero podrías llamarla </w:t>
+      </w:r>
+      <w:proofErr w:type="spellStart"/>
+      <w:r>
+        <w:t>datosDelEvento</w:t>
+      </w:r>
+      <w:proofErr w:type="spellEnd"/>
+      <w:r>
+        <w:t xml:space="preserve"> si quisieras.</w:t>
+      </w:r>
+    </w:p>
+    <w:p>
+      <w:r>
+        <w:t xml:space="preserve">Como este es un evento específico de paginación, la "cajita" </w:t>
+      </w:r>
+      <w:proofErr w:type="spellStart"/>
       <w:r>
         <w:t>e</w:t>
       </w:r>
-      <w:proofErr w:type="gramEnd"/>
-      <w:r>
-        <w:t xml:space="preserve"> es simplemente una convención mundial en C# para abreviar "</w:t>
-      </w:r>
-      <w:proofErr w:type="spellStart"/>
-      <w:r>
-        <w:t>Event</w:t>
-      </w:r>
-      <w:proofErr w:type="spellEnd"/>
-      <w:r>
-        <w:t xml:space="preserve">", pero podrías llamarla </w:t>
-      </w:r>
-      <w:proofErr w:type="spellStart"/>
-      <w:r>
-        <w:t>datosDelEvento</w:t>
-      </w:r>
-      <w:proofErr w:type="spellEnd"/>
-      <w:r>
-        <w:t xml:space="preserve"> si quisieras.</w:t>
-      </w:r>
-    </w:p>
-    <w:p>
-      <w:r>
-        <w:t xml:space="preserve">Como este es un evento específico de paginación, la "cajita" </w:t>
-      </w:r>
-      <w:proofErr w:type="spellStart"/>
-      <w:r>
-        <w:t>e</w:t>
-      </w:r>
       <w:proofErr w:type="spellEnd"/>
       <w:r>
         <w:t xml:space="preserve"> es del tipo </w:t>
@@ -3383,7 +3201,6 @@
         <w:t xml:space="preserve">. Adentro de esa cajita viene guardado exactamente el número de la página que el usuario tocó. Ese número se guarda en la propiedad </w:t>
       </w:r>
       <w:proofErr w:type="spellStart"/>
-      <w:proofErr w:type="gramStart"/>
       <w:r>
         <w:t>NewPageIndex</w:t>
       </w:r>
@@ -3391,7 +3208,6 @@
       <w:r>
         <w:t xml:space="preserve"> .</w:t>
       </w:r>
-      <w:proofErr w:type="gramEnd"/>
     </w:p>
     <w:p>
       <w:r>
@@ -3418,7 +3234,6 @@
         <w:t xml:space="preserve"> = </w:t>
       </w:r>
       <w:proofErr w:type="spellStart"/>
-      <w:proofErr w:type="gramStart"/>
       <w:r>
         <w:rPr>
           <w:b/>
@@ -3427,7 +3242,6 @@
         <w:t>e.NewPageIndex</w:t>
       </w:r>
       <w:proofErr w:type="spellEnd"/>
-      <w:proofErr w:type="gramEnd"/>
       <w:r>
         <w:rPr>
           <w:b/>
@@ -3720,15 +3534,7 @@
       </w:r>
       <w:proofErr w:type="spellEnd"/>
       <w:r>
-        <w:t xml:space="preserve">, el parámetro </w:t>
-      </w:r>
-      <w:proofErr w:type="gramStart"/>
-      <w:r>
-        <w:t>e</w:t>
-      </w:r>
-      <w:proofErr w:type="gramEnd"/>
-      <w:r>
-        <w:t xml:space="preserve"> es del tipo específico </w:t>
+        <w:t xml:space="preserve">, el parámetro e es del tipo específico </w:t>
       </w:r>
       <w:proofErr w:type="spellStart"/>
       <w:r>
@@ -4061,15 +3867,7 @@
       </w:r>
       <w:proofErr w:type="spellEnd"/>
       <w:r>
-        <w:t xml:space="preserve"> qué acción ejecutar evaluando la existencia de un parámetro identificador (</w:t>
-      </w:r>
-      <w:proofErr w:type="gramStart"/>
-      <w:r>
-        <w:t>ej. ?id</w:t>
-      </w:r>
-      <w:proofErr w:type="gramEnd"/>
-      <w:r>
-        <w:t xml:space="preserve">=X) en el </w:t>
+        <w:t xml:space="preserve"> qué acción ejecutar evaluando la existencia de un parámetro identificador (ej. ?id=X) en el </w:t>
       </w:r>
       <w:proofErr w:type="spellStart"/>
       <w:r>
@@ -4468,12 +4266,10 @@
         <w:t xml:space="preserve"> La mejor práctica de rendimiento web dicta que los datos de un formulario (como cadenas de texto o números) deben recolectarse localmente en el cliente y enviarse en una única petición al servidor mediante un control de envío (ej. &lt;</w:t>
       </w:r>
       <w:proofErr w:type="spellStart"/>
-      <w:proofErr w:type="gramStart"/>
       <w:r>
         <w:t>asp:Button</w:t>
       </w:r>
       <w:proofErr w:type="spellEnd"/>
-      <w:proofErr w:type="gramEnd"/>
       <w:r>
         <w:t xml:space="preserve"> ID="</w:t>
       </w:r>
@@ -4623,17 +4419,12 @@
         <w:t xml:space="preserve">). Es responsabilidad del desarrollador instanciar el objeto de dominio correspondiente (ej. new </w:t>
       </w:r>
       <w:proofErr w:type="spellStart"/>
-      <w:proofErr w:type="gramStart"/>
       <w:r>
         <w:t>Pokemon</w:t>
       </w:r>
       <w:proofErr w:type="spellEnd"/>
       <w:r>
-        <w:t>(</w:t>
-      </w:r>
-      <w:proofErr w:type="gramEnd"/>
-      <w:r>
-        <w:t xml:space="preserve">)) y realizar el mapeo manual, aplicando las conversiones de tipo necesarias (como </w:t>
+        <w:t xml:space="preserve">()) y realizar el mapeo manual, aplicando las conversiones de tipo necesarias (como </w:t>
       </w:r>
       <w:proofErr w:type="spellStart"/>
       <w:r>
@@ -4694,12 +4485,10 @@
         <w:t xml:space="preserve">). Para reconstruir las relaciones, se debe instanciar manualmente el objeto anidado e inyectarle dicho ID (ej. </w:t>
       </w:r>
       <w:proofErr w:type="spellStart"/>
-      <w:proofErr w:type="gramStart"/>
       <w:r>
         <w:t>nuevo.Tipo</w:t>
       </w:r>
       <w:proofErr w:type="spellEnd"/>
-      <w:proofErr w:type="gramEnd"/>
       <w:r>
         <w:t xml:space="preserve"> = new Elemento(); </w:t>
       </w:r>
@@ -5153,21 +4942,8 @@
       </w:r>
       <w:proofErr w:type="spellEnd"/>
       <w:r>
-        <w:t>["id"</w:t>
-      </w:r>
-      <w:proofErr w:type="gramStart"/>
-      <w:r>
-        <w:t>] .</w:t>
-      </w:r>
-      <w:proofErr w:type="gramEnd"/>
-      <w:r>
-        <w:t xml:space="preserve"> Si es nulo, es un Alta; si contiene un valor, es una </w:t>
-      </w:r>
-      <w:proofErr w:type="gramStart"/>
-      <w:r>
-        <w:t>Modificación .</w:t>
-      </w:r>
-      <w:proofErr w:type="gramEnd"/>
+        <w:t>["id"] . Si es nulo, es un Alta; si contiene un valor, es una Modificación .</w:t>
+      </w:r>
     </w:p>
     <w:p>
       <w:pPr>
@@ -5210,18 +4986,13 @@
         <w:t>es crítico</w:t>
       </w:r>
       <w:r>
-        <w:t xml:space="preserve"> que esta precarga ocurra exclusivamente </w:t>
-      </w:r>
-      <w:proofErr w:type="gramStart"/>
-      <w:r>
-        <w:t>cuando !</w:t>
+        <w:t xml:space="preserve"> que esta precarga ocurra exclusivamente cuando !</w:t>
       </w:r>
       <w:proofErr w:type="spellStart"/>
       <w:r>
         <w:t>IsPostBack</w:t>
       </w:r>
       <w:proofErr w:type="spellEnd"/>
-      <w:proofErr w:type="gramEnd"/>
       <w:r>
         <w:t xml:space="preserve"> es verdadero. Si se omite esta validación, al hacer clic en el botón "Aceptar", el ciclo de vida de la página ejecutará primero el </w:t>
       </w:r>
@@ -5432,13 +5203,8 @@
         <w:t>Manejo de Datos Sensibles:</w:t>
       </w:r>
       <w:r>
-        <w:t xml:space="preserve"> Para información crítica (como historiales de facturación, legajos o liquidaciones de sueldos), la eliminación física está completamente desaconsejada. La pérdida de trazabilidad en datos sensibles es inaceptable a nivel </w:t>
-      </w:r>
-      <w:proofErr w:type="gramStart"/>
-      <w:r>
-        <w:t>auditoría .</w:t>
-      </w:r>
-      <w:proofErr w:type="gramEnd"/>
+        <w:t xml:space="preserve"> Para información crítica (como historiales de facturación, legajos o liquidaciones de sueldos), la eliminación física está completamente desaconsejada. La pérdida de trazabilidad en datos sensibles es inaceptable a nivel auditoría .</w:t>
+      </w:r>
     </w:p>
     <w:p>
       <w:pPr>
@@ -5466,12 +5232,10 @@
         <w:t xml:space="preserve"> combinadas con un &lt;</w:t>
       </w:r>
       <w:proofErr w:type="spellStart"/>
-      <w:proofErr w:type="gramStart"/>
       <w:r>
         <w:t>asp:UpdatePanel</w:t>
       </w:r>
       <w:proofErr w:type="spellEnd"/>
-      <w:proofErr w:type="gramEnd"/>
       <w:r>
         <w:t xml:space="preserve">&gt;, es posible desplegar controles de confirmación dinámicos (como un </w:t>
       </w:r>
@@ -5587,19 +5351,9 @@
         </w:rPr>
         <w:t>Finalizado</w:t>
       </w:r>
-      <w:proofErr w:type="gramStart"/>
-      <w:r>
-        <w:t>) .</w:t>
-      </w:r>
-      <w:proofErr w:type="gramEnd"/>
-      <w:r>
-        <w:t xml:space="preserve"> Dependiendo de las reglas de negocio, un estado puede ser reversible (como activar/inactivar un producto) o irreversible (como cancelar un remito facturado</w:t>
-      </w:r>
-      <w:proofErr w:type="gramStart"/>
-      <w:r>
-        <w:t>) .</w:t>
-      </w:r>
-      <w:proofErr w:type="gramEnd"/>
+      <w:r>
+        <w:t>) . Dependiendo de las reglas de negocio, un estado puede ser reversible (como activar/inactivar un producto) o irreversible (como cancelar un remito facturado) .</w:t>
+      </w:r>
     </w:p>
     <w:p>
       <w:pPr>
@@ -5696,13 +5450,8 @@
       </w:r>
       <w:proofErr w:type="spellEnd"/>
       <w:r>
-        <w:t>["clave"]</w:t>
-      </w:r>
-      <w:proofErr w:type="gramStart"/>
-      <w:r>
-        <w:t>) .</w:t>
-      </w:r>
-      <w:proofErr w:type="gramEnd"/>
+        <w:t>["clave"]) .</w:t>
+      </w:r>
     </w:p>
     <w:p>
       <w:pPr>
@@ -5754,15 +5503,7 @@
         <w:t>negado</w:t>
       </w:r>
       <w:r>
-        <w:t xml:space="preserve"> del estado actual utilizando el </w:t>
-      </w:r>
-      <w:proofErr w:type="gramStart"/>
-      <w:r>
-        <w:t>operador !</w:t>
-      </w:r>
-      <w:proofErr w:type="gramEnd"/>
-      <w:r>
-        <w:t xml:space="preserve"> (NOT). Es decir: </w:t>
+        <w:t xml:space="preserve"> del estado actual utilizando el operador ! (NOT). Es decir: </w:t>
       </w:r>
       <w:proofErr w:type="spellStart"/>
       <w:r>
@@ -5770,18 +5511,13 @@
       </w:r>
       <w:proofErr w:type="spellEnd"/>
       <w:r>
-        <w:t xml:space="preserve"> </w:t>
-      </w:r>
-      <w:proofErr w:type="gramStart"/>
-      <w:r>
-        <w:t>= !</w:t>
+        <w:t xml:space="preserve"> = !</w:t>
       </w:r>
       <w:proofErr w:type="spellStart"/>
       <w:r>
         <w:t>estadoActual</w:t>
       </w:r>
       <w:proofErr w:type="spellEnd"/>
-      <w:proofErr w:type="gramEnd"/>
       <w:r>
         <w:t xml:space="preserve"> .</w:t>
       </w:r>
@@ -5809,10 +5545,7 @@
       </w:r>
       <w:proofErr w:type="spellEnd"/>
       <w:r>
-        <w:t xml:space="preserve"> activo = false). Esto permite extender la funcionalidad del método (ej. sirviendo tanto para eliminar como para reactivar) sin romper el código en las partes de la aplicación donde el método ya estaba siendo invocado sin ese </w:t>
-      </w:r>
-      <w:r>
-        <w:t>parámetro.</w:t>
+        <w:t xml:space="preserve"> activo = false). Esto permite extender la funcionalidad del método (ej. sirviendo tanto para eliminar como para reactivar) sin romper el código en las partes de la aplicación donde el método ya estaba siendo invocado sin ese parámetro.</w:t>
       </w:r>
     </w:p>
     <w:p/>
@@ -5850,15 +5583,7 @@
         <w:t>en memoria</w:t>
       </w:r>
       <w:r>
-        <w:t xml:space="preserve"> (lado del servidor web) en lugar de consultar repetidamente a la base de </w:t>
-      </w:r>
-      <w:proofErr w:type="gramStart"/>
-      <w:r>
-        <w:t>datos .</w:t>
-      </w:r>
-      <w:proofErr w:type="gramEnd"/>
-      <w:r>
-        <w:t xml:space="preserve"> Esto se logra persistiendo la colección original en el estado de sesión (</w:t>
+        <w:t xml:space="preserve"> (lado del servidor web) en lugar de consultar repetidamente a la base de datos . Esto se logra persistiendo la colección original en el estado de sesión (</w:t>
       </w:r>
       <w:proofErr w:type="spellStart"/>
       <w:r>
@@ -6021,12 +5746,10 @@
         <w:t xml:space="preserve">&lt;T&gt;). El predicado suele ser una expresión Lambda (ej. x =&gt; </w:t>
       </w:r>
       <w:proofErr w:type="spellStart"/>
-      <w:proofErr w:type="gramStart"/>
       <w:r>
         <w:t>x.Propiedad</w:t>
       </w:r>
       <w:proofErr w:type="spellEnd"/>
-      <w:proofErr w:type="gramEnd"/>
       <w:r>
         <w:t xml:space="preserve"> == valor), la cual itera internamente sobre la colección y retorna una nueva lista únicamente con los elementos que cumplen la condición.</w:t>
       </w:r>
@@ -6065,18 +5788,13 @@
       </w:r>
       <w:proofErr w:type="spellEnd"/>
       <w:r>
-        <w:t xml:space="preserve"> (diferencias entre mayúsculas y minúsculas), es imperativo normalizar tanto el valor de búsqueda como el dato del objeto antes de compararlos. La técnica estándar es convertir ambos valores a mayúsculas </w:t>
-      </w:r>
-      <w:proofErr w:type="gramStart"/>
-      <w:r>
-        <w:t>usando .</w:t>
+        <w:t xml:space="preserve"> (diferencias entre mayúsculas y minúsculas), es imperativo normalizar tanto el valor de búsqueda como el dato del objeto antes de compararlos. La técnica estándar es convertir ambos valores a mayúsculas usando .</w:t>
       </w:r>
       <w:proofErr w:type="spellStart"/>
       <w:r>
         <w:t>ToUpper</w:t>
       </w:r>
       <w:proofErr w:type="spellEnd"/>
-      <w:proofErr w:type="gramEnd"/>
       <w:r>
         <w:t xml:space="preserve">() (ej. </w:t>
       </w:r>
@@ -6408,10 +6126,7 @@
         <w:t>"¿Quién sos?"</w:t>
       </w:r>
       <w:r>
-        <w:t xml:space="preserve">. Es el proceso de validar las credenciales (usuario y contraseña) contra la base de datos para confirmar la identidad del </w:t>
-      </w:r>
-      <w:r>
-        <w:t>usuario.</w:t>
+        <w:t>. Es el proceso de validar las credenciales (usuario y contraseña) contra la base de datos para confirmar la identidad del usuario.</w:t>
       </w:r>
     </w:p>
     <w:p>
@@ -6466,10 +6181,7 @@
       </w:r>
       <w:proofErr w:type="spellEnd"/>
       <w:r>
-        <w:t xml:space="preserve"> o Normal) para permitir o denegar el acceso a ciertas pantallas o </w:t>
-      </w:r>
-      <w:r>
-        <w:t>funcionalidades.</w:t>
+        <w:t xml:space="preserve"> o Normal) para permitir o denegar el acceso a ciertas pantallas o funcionalidades.</w:t>
       </w:r>
     </w:p>
     <w:p>
@@ -6543,15 +6255,7 @@
       </w:r>
       <w:proofErr w:type="spellEnd"/>
       <w:r>
-        <w:t>["usuario"</w:t>
-      </w:r>
-      <w:proofErr w:type="gramStart"/>
-      <w:r>
-        <w:t>] !</w:t>
-      </w:r>
-      <w:proofErr w:type="gramEnd"/>
-      <w:r>
-        <w:t xml:space="preserve">= </w:t>
+        <w:t xml:space="preserve">["usuario"] != </w:t>
       </w:r>
       <w:proofErr w:type="spellStart"/>
       <w:r>
@@ -6617,13 +6321,7 @@
       </w:r>
       <w:proofErr w:type="spellEnd"/>
       <w:r>
-        <w:t xml:space="preserve"> es un tipo de dato especial que permite definir un conjunto de constantes con </w:t>
-      </w:r>
-      <w:r>
-        <w:t>nombre.</w:t>
-      </w:r>
-      <w:r>
-        <w:t xml:space="preserve"> Es ideal para manejar perfiles de usuario (ej. Normal = 1, </w:t>
+        <w:t xml:space="preserve"> es un tipo de dato especial que permite definir un conjunto de constantes con nombre. Es ideal para manejar perfiles de usuario (ej. Normal = 1, </w:t>
       </w:r>
       <w:proofErr w:type="spellStart"/>
       <w:r>
@@ -6650,12 +6348,10 @@
         <w:t xml:space="preserve"> (</w:t>
       </w:r>
       <w:proofErr w:type="spellStart"/>
-      <w:proofErr w:type="gramStart"/>
       <w:r>
         <w:t>usuario.TipoUsuario</w:t>
       </w:r>
       <w:proofErr w:type="spellEnd"/>
-      <w:proofErr w:type="gramEnd"/>
       <w:r>
         <w:t xml:space="preserve"> == </w:t>
       </w:r>
@@ -6787,12 +6483,10 @@
         <w:t xml:space="preserve"> Es una herramienta avanzada que nos permite interceptar los datos que están siendo afectados por una instrucción INSERT, UPDATE o DELETE. Para recuperar el ID recién creado, modificamos nuestro comando agregando OUTPUT </w:t>
       </w:r>
       <w:proofErr w:type="spellStart"/>
-      <w:proofErr w:type="gramStart"/>
       <w:r>
         <w:t>inserted.Id</w:t>
       </w:r>
       <w:proofErr w:type="spellEnd"/>
-      <w:proofErr w:type="gramEnd"/>
       <w:r>
         <w:t xml:space="preserve"> justo después del INSERT INTO y antes del VALUES.</w:t>
       </w:r>
@@ -6813,7 +6507,6 @@
         <w:t xml:space="preserve">El Método </w:t>
       </w:r>
       <w:proofErr w:type="spellStart"/>
-      <w:proofErr w:type="gramStart"/>
       <w:r>
         <w:rPr>
           <w:b/>
@@ -6827,15 +6520,7 @@
           <w:b/>
           <w:bCs/>
         </w:rPr>
-        <w:t>(</w:t>
-      </w:r>
-      <w:proofErr w:type="gramEnd"/>
-      <w:r>
-        <w:rPr>
-          <w:b/>
-          <w:bCs/>
-        </w:rPr>
-        <w:t>) en ADO.NET:</w:t>
+        <w:t>() en ADO.NET:</w:t>
       </w:r>
       <w:r>
         <w:t xml:space="preserve"> Hasta ahora, para operaciones de escritura (ABM), usábamos </w:t>
@@ -6849,17 +6534,12 @@
         <w:t xml:space="preserve">() (que solo devuelve la cantidad de filas afectadas). Para capturar el dato único que nos devuelve la cláusula OUTPUT, debemos utilizar el método </w:t>
       </w:r>
       <w:proofErr w:type="spellStart"/>
-      <w:proofErr w:type="gramStart"/>
       <w:r>
         <w:t>ExecuteScalar</w:t>
       </w:r>
       <w:proofErr w:type="spellEnd"/>
       <w:r>
-        <w:t>(</w:t>
-      </w:r>
-      <w:proofErr w:type="gramEnd"/>
-      <w:r>
-        <w:t xml:space="preserve">) del objeto </w:t>
+        <w:t xml:space="preserve">() del objeto </w:t>
       </w:r>
       <w:proofErr w:type="spellStart"/>
       <w:r>
@@ -6877,15 +6557,7 @@
         <w:t>únicamente la primera columna de la primera fila</w:t>
       </w:r>
       <w:r>
-        <w:t xml:space="preserve"> del </w:t>
-      </w:r>
-      <w:proofErr w:type="gramStart"/>
-      <w:r>
-        <w:t>resultado .</w:t>
-      </w:r>
-      <w:proofErr w:type="gramEnd"/>
-      <w:r>
-        <w:t xml:space="preserve"> Como devuelve un tipo genérico </w:t>
+        <w:t xml:space="preserve"> del resultado . Como devuelve un tipo genérico </w:t>
       </w:r>
       <w:proofErr w:type="spellStart"/>
       <w:r>
@@ -6999,6 +6671,508 @@
       </w:pPr>
       <w:r>
         <w:t>Disparo de eventos asíncronos o notificaciones (ej. Envío de Email de bienvenida).</w:t>
+      </w:r>
+    </w:p>
+    <w:p>
+      <w:r>
+        <w:rPr>
+          <w:b/>
+          <w:bCs/>
+        </w:rPr>
+        <w:t>TEMA: Entornos de Prueba (Sandbox) vs. Producción en Servicios de Terceros (SaaS)</w:t>
+      </w:r>
+    </w:p>
+    <w:p>
+      <w:pPr>
+        <w:numPr>
+          <w:ilvl w:val="0"/>
+          <w:numId w:val="30"/>
+        </w:numPr>
+      </w:pPr>
+      <w:r>
+        <w:rPr>
+          <w:b/>
+          <w:bCs/>
+        </w:rPr>
+        <w:t>El concepto de Sandbox:</w:t>
+      </w:r>
+      <w:r>
+        <w:t xml:space="preserve"> En el desarrollo de software, un "Sandbox" (caja de arena) es un entorno aislado de pruebas que imita el comportamiento del sistema real, pero sin causar efectos en el mundo físico o en usuarios reales. En el contexto del envío de emails (como </w:t>
+      </w:r>
+      <w:proofErr w:type="spellStart"/>
+      <w:r>
+        <w:t>Mailtrap</w:t>
+      </w:r>
+      <w:proofErr w:type="spellEnd"/>
+      <w:r>
+        <w:t xml:space="preserve">), el Sandbox permite a los desarrolladores verificar que el código SMTP funciona, que las credenciales son válidas y que el HTML del correo se renderiza correctamente, </w:t>
+      </w:r>
+      <w:r>
+        <w:rPr>
+          <w:i/>
+          <w:iCs/>
+        </w:rPr>
+        <w:t>sin</w:t>
+      </w:r>
+      <w:r>
+        <w:t xml:space="preserve"> enviar realmente el correo a la bandeja de entrada del destinatario final.</w:t>
+      </w:r>
+    </w:p>
+    <w:p>
+      <w:pPr>
+        <w:numPr>
+          <w:ilvl w:val="0"/>
+          <w:numId w:val="30"/>
+        </w:numPr>
+      </w:pPr>
+      <w:r>
+        <w:rPr>
+          <w:b/>
+          <w:bCs/>
+        </w:rPr>
+        <w:t>Ventajas del Sandbox en Desarrollo:</w:t>
+      </w:r>
+      <w:r>
+        <w:t xml:space="preserve"> 1. Evita el envío accidental de correos de prueba ("spam de desarrollo") a clientes reales. 2. Permite usar correos electrónicos inventados o de prueba (ej. test@test.com) sabiendo que el correo será interceptado por la plataforma. 3. Valida la correcta construcción del objeto </w:t>
+      </w:r>
+      <w:proofErr w:type="spellStart"/>
+      <w:r>
+        <w:t>MailMessage</w:t>
+      </w:r>
+      <w:proofErr w:type="spellEnd"/>
+      <w:r>
+        <w:t xml:space="preserve"> y la ausencia de excepciones de red (</w:t>
+      </w:r>
+      <w:proofErr w:type="spellStart"/>
+      <w:r>
+        <w:t>SmtpException</w:t>
+      </w:r>
+      <w:proofErr w:type="spellEnd"/>
+      <w:r>
+        <w:t>).</w:t>
+      </w:r>
+    </w:p>
+    <w:p>
+      <w:pPr>
+        <w:numPr>
+          <w:ilvl w:val="0"/>
+          <w:numId w:val="30"/>
+        </w:numPr>
+      </w:pPr>
+      <w:r>
+        <w:rPr>
+          <w:b/>
+          <w:bCs/>
+        </w:rPr>
+        <w:t>Transición a Producción (Email API / SMTP Real):</w:t>
+      </w:r>
+      <w:r>
+        <w:t xml:space="preserve"> Cuando una aplicación está lista para ser publicada (</w:t>
+      </w:r>
+      <w:proofErr w:type="spellStart"/>
+      <w:r>
+        <w:t>deploy</w:t>
+      </w:r>
+      <w:proofErr w:type="spellEnd"/>
+      <w:r>
+        <w:t xml:space="preserve">), se debe abandonar el entorno Sandbox. Servicios como </w:t>
+      </w:r>
+      <w:proofErr w:type="spellStart"/>
+      <w:r>
+        <w:t>Mailtrap</w:t>
+      </w:r>
+      <w:proofErr w:type="spellEnd"/>
+      <w:r>
+        <w:t xml:space="preserve"> ofrecen opciones de "Producción" (Email API), las cuales requieren la configuración y verificación criptográfica de un dominio real (ej. midominio.com) modificando los registros DNS (</w:t>
+      </w:r>
+      <w:proofErr w:type="spellStart"/>
+      <w:r>
+        <w:t>Domain</w:t>
+      </w:r>
+      <w:proofErr w:type="spellEnd"/>
+      <w:r>
+        <w:t xml:space="preserve"> </w:t>
+      </w:r>
+      <w:proofErr w:type="spellStart"/>
+      <w:r>
+        <w:t>Name</w:t>
+      </w:r>
+      <w:proofErr w:type="spellEnd"/>
+      <w:r>
+        <w:t xml:space="preserve"> </w:t>
+      </w:r>
+      <w:proofErr w:type="spellStart"/>
+      <w:r>
+        <w:t>System</w:t>
+      </w:r>
+      <w:proofErr w:type="spellEnd"/>
+      <w:r>
+        <w:t>) del proveedor de hosting. Una vez verificado el dominio, el servicio provee nuevas credenciales SMTP definitivas para el envío real de correos.</w:t>
+      </w:r>
+    </w:p>
+    <w:p>
+      <w:pPr>
+        <w:numPr>
+          <w:ilvl w:val="0"/>
+          <w:numId w:val="30"/>
+        </w:numPr>
+      </w:pPr>
+      <w:r>
+        <w:rPr>
+          <w:b/>
+          <w:bCs/>
+        </w:rPr>
+        <w:t>Políticas de Seguridad Actuales:</w:t>
+      </w:r>
+      <w:r>
+        <w:t xml:space="preserve"> Es importante destacar que los proveedores de correo tradicionales (como Gmail) han endurecido sus políticas de seguridad (ej. a partir de mayo de 2022), restringiendo o bloqueando el uso de "aplicaciones menos seguras" mediante autenticación básica (usuario/contraseña pura), empujando a la industria a utilizar servicios transaccionales dedicados (SaaS) como </w:t>
+      </w:r>
+      <w:proofErr w:type="spellStart"/>
+      <w:r>
+        <w:t>Mailtrap</w:t>
+      </w:r>
+      <w:proofErr w:type="spellEnd"/>
+      <w:r>
+        <w:t xml:space="preserve">, </w:t>
+      </w:r>
+      <w:proofErr w:type="spellStart"/>
+      <w:r>
+        <w:t>SendGrid</w:t>
+      </w:r>
+      <w:proofErr w:type="spellEnd"/>
+      <w:r>
+        <w:t xml:space="preserve"> o configuraciones con contraseñas de aplicación / OAuth2.</w:t>
+      </w:r>
+    </w:p>
+    <w:p>
+      <w:r>
+        <w:rPr>
+          <w:b/>
+          <w:bCs/>
+        </w:rPr>
+        <w:t>TEMA: Autenticación, Autorización y Seguridad Centralizada en ASP.NET</w:t>
+      </w:r>
+    </w:p>
+    <w:p>
+      <w:pPr>
+        <w:numPr>
+          <w:ilvl w:val="0"/>
+          <w:numId w:val="31"/>
+        </w:numPr>
+      </w:pPr>
+      <w:r>
+        <w:rPr>
+          <w:b/>
+          <w:bCs/>
+        </w:rPr>
+        <w:t>Autenticación vs. Autorización:</w:t>
+      </w:r>
+      <w:r>
+        <w:t xml:space="preserve"> Son dos conceptos complementarios pero distintos en seguridad informática. La </w:t>
+      </w:r>
+      <w:r>
+        <w:rPr>
+          <w:b/>
+          <w:bCs/>
+        </w:rPr>
+        <w:t>Autenticación</w:t>
+      </w:r>
+      <w:r>
+        <w:t xml:space="preserve"> es verificar </w:t>
+      </w:r>
+      <w:r>
+        <w:rPr>
+          <w:i/>
+          <w:iCs/>
+        </w:rPr>
+        <w:t>quién es</w:t>
+      </w:r>
+      <w:r>
+        <w:t xml:space="preserve"> el usuario (ej. validar el Email y </w:t>
+      </w:r>
+      <w:proofErr w:type="spellStart"/>
+      <w:r>
+        <w:t>Password</w:t>
+      </w:r>
+      <w:proofErr w:type="spellEnd"/>
+      <w:r>
+        <w:t xml:space="preserve"> contra la base de datos mediante un SELECT) . La </w:t>
+      </w:r>
+      <w:r>
+        <w:rPr>
+          <w:b/>
+          <w:bCs/>
+        </w:rPr>
+        <w:t>Autorización</w:t>
+      </w:r>
+      <w:r>
+        <w:t xml:space="preserve"> es verificar </w:t>
+      </w:r>
+      <w:r>
+        <w:rPr>
+          <w:i/>
+          <w:iCs/>
+        </w:rPr>
+        <w:t xml:space="preserve">qué </w:t>
+      </w:r>
+      <w:r>
+        <w:rPr>
+          <w:i/>
+          <w:iCs/>
+        </w:rPr>
+        <w:lastRenderedPageBreak/>
+        <w:t>puede hacer</w:t>
+      </w:r>
+      <w:r>
+        <w:t xml:space="preserve"> ese usuario autenticado (ej. validar si la propiedad </w:t>
+      </w:r>
+      <w:proofErr w:type="spellStart"/>
+      <w:r>
+        <w:t>Admin</w:t>
+      </w:r>
+      <w:proofErr w:type="spellEnd"/>
+      <w:r>
+        <w:t xml:space="preserve"> es true para dejarlo entrar a la lista de administración) .</w:t>
+      </w:r>
+    </w:p>
+    <w:p>
+      <w:pPr>
+        <w:numPr>
+          <w:ilvl w:val="0"/>
+          <w:numId w:val="31"/>
+        </w:numPr>
+      </w:pPr>
+      <w:r>
+        <w:rPr>
+          <w:b/>
+          <w:bCs/>
+        </w:rPr>
+        <w:t>Manejo de Estado (</w:t>
+      </w:r>
+      <w:proofErr w:type="spellStart"/>
+      <w:r>
+        <w:rPr>
+          <w:b/>
+          <w:bCs/>
+        </w:rPr>
+        <w:t>Session</w:t>
+      </w:r>
+      <w:proofErr w:type="spellEnd"/>
+      <w:r>
+        <w:rPr>
+          <w:b/>
+          <w:bCs/>
+        </w:rPr>
+        <w:t>):</w:t>
+      </w:r>
+      <w:r>
+        <w:t xml:space="preserve"> HTTP es un protocolo "sin estado" (</w:t>
+      </w:r>
+      <w:proofErr w:type="spellStart"/>
+      <w:r>
+        <w:t>stateless</w:t>
+      </w:r>
+      <w:proofErr w:type="spellEnd"/>
+      <w:r>
+        <w:t xml:space="preserve">), lo que significa que olvida al usuario en cada clic. Para mantener la sesión iniciada, guardamos el objeto </w:t>
+      </w:r>
+      <w:proofErr w:type="spellStart"/>
+      <w:r>
+        <w:t>Trainee</w:t>
+      </w:r>
+      <w:proofErr w:type="spellEnd"/>
+      <w:r>
+        <w:t xml:space="preserve"> autenticado dentro de la variable global </w:t>
+      </w:r>
+      <w:proofErr w:type="spellStart"/>
+      <w:r>
+        <w:t>Session</w:t>
+      </w:r>
+      <w:proofErr w:type="spellEnd"/>
+      <w:r>
+        <w:t>["</w:t>
+      </w:r>
+      <w:proofErr w:type="spellStart"/>
+      <w:r>
+        <w:t>trainee</w:t>
+      </w:r>
+      <w:proofErr w:type="spellEnd"/>
+      <w:r>
+        <w:t>"]. Si este objeto existe y su ID es distinto de 0, el usuario está "</w:t>
+      </w:r>
+      <w:proofErr w:type="spellStart"/>
+      <w:r>
+        <w:t>logueado</w:t>
+      </w:r>
+      <w:proofErr w:type="spellEnd"/>
+      <w:r>
+        <w:t>" .</w:t>
+      </w:r>
+    </w:p>
+    <w:p>
+      <w:pPr>
+        <w:numPr>
+          <w:ilvl w:val="0"/>
+          <w:numId w:val="31"/>
+        </w:numPr>
+      </w:pPr>
+      <w:r>
+        <w:rPr>
+          <w:b/>
+          <w:bCs/>
+        </w:rPr>
+        <w:t xml:space="preserve">Clases </w:t>
+      </w:r>
+      <w:proofErr w:type="spellStart"/>
+      <w:r>
+        <w:rPr>
+          <w:b/>
+          <w:bCs/>
+        </w:rPr>
+        <w:t>Helper</w:t>
+      </w:r>
+      <w:proofErr w:type="spellEnd"/>
+      <w:r>
+        <w:rPr>
+          <w:b/>
+          <w:bCs/>
+        </w:rPr>
+        <w:t xml:space="preserve"> y Métodos Estáticos (</w:t>
+      </w:r>
+      <w:proofErr w:type="spellStart"/>
+      <w:r>
+        <w:rPr>
+          <w:b/>
+          <w:bCs/>
+        </w:rPr>
+        <w:t>static</w:t>
+      </w:r>
+      <w:proofErr w:type="spellEnd"/>
+      <w:r>
+        <w:rPr>
+          <w:b/>
+          <w:bCs/>
+        </w:rPr>
+        <w:t>):</w:t>
+      </w:r>
+      <w:r>
+        <w:t xml:space="preserve"> Para no repetir la misma lógica de validación de seguridad en cada una de las pantallas de la aplicación, se crea una clase auxiliar (</w:t>
+      </w:r>
+      <w:proofErr w:type="spellStart"/>
+      <w:r>
+        <w:t>Helper</w:t>
+      </w:r>
+      <w:proofErr w:type="spellEnd"/>
+      <w:r>
+        <w:t xml:space="preserve">) llamada Seguridad. Al declarar sus métodos como </w:t>
+      </w:r>
+      <w:proofErr w:type="spellStart"/>
+      <w:r>
+        <w:t>public</w:t>
+      </w:r>
+      <w:proofErr w:type="spellEnd"/>
+      <w:r>
+        <w:t xml:space="preserve"> </w:t>
+      </w:r>
+      <w:proofErr w:type="spellStart"/>
+      <w:r>
+        <w:t>static</w:t>
+      </w:r>
+      <w:proofErr w:type="spellEnd"/>
+      <w:r>
+        <w:t xml:space="preserve">, podemos invocarlos directamente escribiendo </w:t>
+      </w:r>
+      <w:proofErr w:type="spellStart"/>
+      <w:r>
+        <w:t>Seguridad.SesionActiva</w:t>
+      </w:r>
+      <w:proofErr w:type="spellEnd"/>
+      <w:r>
+        <w:t>() sin necesidad de instanciar la clase con la palabra reservada new .</w:t>
+      </w:r>
+    </w:p>
+    <w:p>
+      <w:pPr>
+        <w:numPr>
+          <w:ilvl w:val="0"/>
+          <w:numId w:val="31"/>
+        </w:numPr>
+      </w:pPr>
+      <w:r>
+        <w:rPr>
+          <w:b/>
+          <w:bCs/>
+        </w:rPr>
+        <w:t>Seguridad Centralizada (Master Page vs. Page Load):</w:t>
+      </w:r>
+      <w:r>
+        <w:t xml:space="preserve"> El ciclo de vida de ASP.NET ejecuta el evento </w:t>
+      </w:r>
+      <w:proofErr w:type="spellStart"/>
+      <w:r>
+        <w:t>Page_Load</w:t>
+      </w:r>
+      <w:proofErr w:type="spellEnd"/>
+      <w:r>
+        <w:t xml:space="preserve"> de la Master Page </w:t>
+      </w:r>
+      <w:r>
+        <w:rPr>
+          <w:i/>
+          <w:iCs/>
+        </w:rPr>
+        <w:t>antes</w:t>
+      </w:r>
+      <w:r>
+        <w:t xml:space="preserve"> que el evento </w:t>
+      </w:r>
+      <w:proofErr w:type="spellStart"/>
+      <w:r>
+        <w:t>Page_Load</w:t>
+      </w:r>
+      <w:proofErr w:type="spellEnd"/>
+      <w:r>
+        <w:t xml:space="preserve"> de la página individual (ej. MiPerfil.aspx). Por lo tanto, el mejor lugar para colocar el "patovica" general es la Master Page . Para evitar que la seguridad bloquee pantallas públicas (como el </w:t>
+      </w:r>
+      <w:proofErr w:type="spellStart"/>
+      <w:r>
+        <w:t>Login</w:t>
+      </w:r>
+      <w:proofErr w:type="spellEnd"/>
+      <w:r>
+        <w:t xml:space="preserve"> o el Registro), se evalúa dinámicamente qué página se está solicitando utilizando la palabra reservada </w:t>
+      </w:r>
+      <w:proofErr w:type="spellStart"/>
+      <w:r>
+        <w:t>is</w:t>
+      </w:r>
+      <w:proofErr w:type="spellEnd"/>
+      <w:r>
+        <w:t xml:space="preserve"> (ej. </w:t>
+      </w:r>
+      <w:proofErr w:type="spellStart"/>
+      <w:r>
+        <w:t>if</w:t>
+      </w:r>
+      <w:proofErr w:type="spellEnd"/>
+      <w:r>
+        <w:t xml:space="preserve"> (!(Page </w:t>
+      </w:r>
+      <w:proofErr w:type="spellStart"/>
+      <w:r>
+        <w:t>is</w:t>
+      </w:r>
+      <w:proofErr w:type="spellEnd"/>
+      <w:r>
+        <w:t xml:space="preserve"> </w:t>
+      </w:r>
+      <w:proofErr w:type="spellStart"/>
+      <w:r>
+        <w:t>Login</w:t>
+      </w:r>
+      <w:proofErr w:type="spellEnd"/>
+      <w:r>
+        <w:t>))) .</w:t>
       </w:r>
     </w:p>
     <w:p/>
@@ -9236,6 +9410,155 @@
     </w:lvl>
   </w:abstractNum>
   <w:abstractNum w:abstractNumId="15" w15:restartNumberingAfterBreak="0">
+    <w:nsid w:val="44F82DB6"/>
+    <w:multiLevelType w:val="multilevel"/>
+    <w:tmpl w:val="B590C8E6"/>
+    <w:lvl w:ilvl="0">
+      <w:start w:val="1"/>
+      <w:numFmt w:val="bullet"/>
+      <w:lvlText w:val=""/>
+      <w:lvlJc w:val="left"/>
+      <w:pPr>
+        <w:tabs>
+          <w:tab w:val="num" w:pos="720"/>
+        </w:tabs>
+        <w:ind w:left="720" w:hanging="360"/>
+      </w:pPr>
+      <w:rPr>
+        <w:rFonts w:ascii="Symbol" w:hAnsi="Symbol" w:hint="default"/>
+        <w:sz w:val="20"/>
+      </w:rPr>
+    </w:lvl>
+    <w:lvl w:ilvl="1" w:tentative="1">
+      <w:start w:val="1"/>
+      <w:numFmt w:val="bullet"/>
+      <w:lvlText w:val="o"/>
+      <w:lvlJc w:val="left"/>
+      <w:pPr>
+        <w:tabs>
+          <w:tab w:val="num" w:pos="1440"/>
+        </w:tabs>
+        <w:ind w:left="1440" w:hanging="360"/>
+      </w:pPr>
+      <w:rPr>
+        <w:rFonts w:ascii="Courier New" w:hAnsi="Courier New" w:hint="default"/>
+        <w:sz w:val="20"/>
+      </w:rPr>
+    </w:lvl>
+    <w:lvl w:ilvl="2" w:tentative="1">
+      <w:start w:val="1"/>
+      <w:numFmt w:val="bullet"/>
+      <w:lvlText w:val=""/>
+      <w:lvlJc w:val="left"/>
+      <w:pPr>
+        <w:tabs>
+          <w:tab w:val="num" w:pos="2160"/>
+        </w:tabs>
+        <w:ind w:left="2160" w:hanging="360"/>
+      </w:pPr>
+      <w:rPr>
+        <w:rFonts w:ascii="Wingdings" w:hAnsi="Wingdings" w:hint="default"/>
+        <w:sz w:val="20"/>
+      </w:rPr>
+    </w:lvl>
+    <w:lvl w:ilvl="3" w:tentative="1">
+      <w:start w:val="1"/>
+      <w:numFmt w:val="bullet"/>
+      <w:lvlText w:val=""/>
+      <w:lvlJc w:val="left"/>
+      <w:pPr>
+        <w:tabs>
+          <w:tab w:val="num" w:pos="2880"/>
+        </w:tabs>
+        <w:ind w:left="2880" w:hanging="360"/>
+      </w:pPr>
+      <w:rPr>
+        <w:rFonts w:ascii="Wingdings" w:hAnsi="Wingdings" w:hint="default"/>
+        <w:sz w:val="20"/>
+      </w:rPr>
+    </w:lvl>
+    <w:lvl w:ilvl="4" w:tentative="1">
+      <w:start w:val="1"/>
+      <w:numFmt w:val="bullet"/>
+      <w:lvlText w:val=""/>
+      <w:lvlJc w:val="left"/>
+      <w:pPr>
+        <w:tabs>
+          <w:tab w:val="num" w:pos="3600"/>
+        </w:tabs>
+        <w:ind w:left="3600" w:hanging="360"/>
+      </w:pPr>
+      <w:rPr>
+        <w:rFonts w:ascii="Wingdings" w:hAnsi="Wingdings" w:hint="default"/>
+        <w:sz w:val="20"/>
+      </w:rPr>
+    </w:lvl>
+    <w:lvl w:ilvl="5" w:tentative="1">
+      <w:start w:val="1"/>
+      <w:numFmt w:val="bullet"/>
+      <w:lvlText w:val=""/>
+      <w:lvlJc w:val="left"/>
+      <w:pPr>
+        <w:tabs>
+          <w:tab w:val="num" w:pos="4320"/>
+        </w:tabs>
+        <w:ind w:left="4320" w:hanging="360"/>
+      </w:pPr>
+      <w:rPr>
+        <w:rFonts w:ascii="Wingdings" w:hAnsi="Wingdings" w:hint="default"/>
+        <w:sz w:val="20"/>
+      </w:rPr>
+    </w:lvl>
+    <w:lvl w:ilvl="6" w:tentative="1">
+      <w:start w:val="1"/>
+      <w:numFmt w:val="bullet"/>
+      <w:lvlText w:val=""/>
+      <w:lvlJc w:val="left"/>
+      <w:pPr>
+        <w:tabs>
+          <w:tab w:val="num" w:pos="5040"/>
+        </w:tabs>
+        <w:ind w:left="5040" w:hanging="360"/>
+      </w:pPr>
+      <w:rPr>
+        <w:rFonts w:ascii="Wingdings" w:hAnsi="Wingdings" w:hint="default"/>
+        <w:sz w:val="20"/>
+      </w:rPr>
+    </w:lvl>
+    <w:lvl w:ilvl="7" w:tentative="1">
+      <w:start w:val="1"/>
+      <w:numFmt w:val="bullet"/>
+      <w:lvlText w:val=""/>
+      <w:lvlJc w:val="left"/>
+      <w:pPr>
+        <w:tabs>
+          <w:tab w:val="num" w:pos="5760"/>
+        </w:tabs>
+        <w:ind w:left="5760" w:hanging="360"/>
+      </w:pPr>
+      <w:rPr>
+        <w:rFonts w:ascii="Wingdings" w:hAnsi="Wingdings" w:hint="default"/>
+        <w:sz w:val="20"/>
+      </w:rPr>
+    </w:lvl>
+    <w:lvl w:ilvl="8" w:tentative="1">
+      <w:start w:val="1"/>
+      <w:numFmt w:val="bullet"/>
+      <w:lvlText w:val=""/>
+      <w:lvlJc w:val="left"/>
+      <w:pPr>
+        <w:tabs>
+          <w:tab w:val="num" w:pos="6480"/>
+        </w:tabs>
+        <w:ind w:left="6480" w:hanging="360"/>
+      </w:pPr>
+      <w:rPr>
+        <w:rFonts w:ascii="Wingdings" w:hAnsi="Wingdings" w:hint="default"/>
+        <w:sz w:val="20"/>
+      </w:rPr>
+    </w:lvl>
+  </w:abstractNum>
+  <w:abstractNum w:abstractNumId="16" w15:restartNumberingAfterBreak="0">
     <w:nsid w:val="45FE6ABD"/>
     <w:multiLevelType w:val="multilevel"/>
     <w:tmpl w:val="1F9611C0"/>
@@ -9384,7 +9707,7 @@
       </w:rPr>
     </w:lvl>
   </w:abstractNum>
-  <w:abstractNum w:abstractNumId="16" w15:restartNumberingAfterBreak="0">
+  <w:abstractNum w:abstractNumId="17" w15:restartNumberingAfterBreak="0">
     <w:nsid w:val="47A256AC"/>
     <w:multiLevelType w:val="multilevel"/>
     <w:tmpl w:val="94784BE8"/>
@@ -9533,7 +9856,7 @@
       </w:rPr>
     </w:lvl>
   </w:abstractNum>
-  <w:abstractNum w:abstractNumId="17" w15:restartNumberingAfterBreak="0">
+  <w:abstractNum w:abstractNumId="18" w15:restartNumberingAfterBreak="0">
     <w:nsid w:val="496B4294"/>
     <w:multiLevelType w:val="multilevel"/>
     <w:tmpl w:val="EEAAA56C"/>
@@ -9682,7 +10005,7 @@
       </w:rPr>
     </w:lvl>
   </w:abstractNum>
-  <w:abstractNum w:abstractNumId="18" w15:restartNumberingAfterBreak="0">
+  <w:abstractNum w:abstractNumId="19" w15:restartNumberingAfterBreak="0">
     <w:nsid w:val="4C5B7A63"/>
     <w:multiLevelType w:val="multilevel"/>
     <w:tmpl w:val="0E2AA2F4"/>
@@ -9831,7 +10154,156 @@
       </w:rPr>
     </w:lvl>
   </w:abstractNum>
-  <w:abstractNum w:abstractNumId="19" w15:restartNumberingAfterBreak="0">
+  <w:abstractNum w:abstractNumId="20" w15:restartNumberingAfterBreak="0">
+    <w:nsid w:val="54D116A9"/>
+    <w:multiLevelType w:val="multilevel"/>
+    <w:tmpl w:val="170CA37A"/>
+    <w:lvl w:ilvl="0">
+      <w:start w:val="1"/>
+      <w:numFmt w:val="bullet"/>
+      <w:lvlText w:val=""/>
+      <w:lvlJc w:val="left"/>
+      <w:pPr>
+        <w:tabs>
+          <w:tab w:val="num" w:pos="720"/>
+        </w:tabs>
+        <w:ind w:left="720" w:hanging="360"/>
+      </w:pPr>
+      <w:rPr>
+        <w:rFonts w:ascii="Symbol" w:hAnsi="Symbol" w:hint="default"/>
+        <w:sz w:val="20"/>
+      </w:rPr>
+    </w:lvl>
+    <w:lvl w:ilvl="1" w:tentative="1">
+      <w:start w:val="1"/>
+      <w:numFmt w:val="bullet"/>
+      <w:lvlText w:val="o"/>
+      <w:lvlJc w:val="left"/>
+      <w:pPr>
+        <w:tabs>
+          <w:tab w:val="num" w:pos="1440"/>
+        </w:tabs>
+        <w:ind w:left="1440" w:hanging="360"/>
+      </w:pPr>
+      <w:rPr>
+        <w:rFonts w:ascii="Courier New" w:hAnsi="Courier New" w:hint="default"/>
+        <w:sz w:val="20"/>
+      </w:rPr>
+    </w:lvl>
+    <w:lvl w:ilvl="2" w:tentative="1">
+      <w:start w:val="1"/>
+      <w:numFmt w:val="bullet"/>
+      <w:lvlText w:val=""/>
+      <w:lvlJc w:val="left"/>
+      <w:pPr>
+        <w:tabs>
+          <w:tab w:val="num" w:pos="2160"/>
+        </w:tabs>
+        <w:ind w:left="2160" w:hanging="360"/>
+      </w:pPr>
+      <w:rPr>
+        <w:rFonts w:ascii="Wingdings" w:hAnsi="Wingdings" w:hint="default"/>
+        <w:sz w:val="20"/>
+      </w:rPr>
+    </w:lvl>
+    <w:lvl w:ilvl="3" w:tentative="1">
+      <w:start w:val="1"/>
+      <w:numFmt w:val="bullet"/>
+      <w:lvlText w:val=""/>
+      <w:lvlJc w:val="left"/>
+      <w:pPr>
+        <w:tabs>
+          <w:tab w:val="num" w:pos="2880"/>
+        </w:tabs>
+        <w:ind w:left="2880" w:hanging="360"/>
+      </w:pPr>
+      <w:rPr>
+        <w:rFonts w:ascii="Wingdings" w:hAnsi="Wingdings" w:hint="default"/>
+        <w:sz w:val="20"/>
+      </w:rPr>
+    </w:lvl>
+    <w:lvl w:ilvl="4" w:tentative="1">
+      <w:start w:val="1"/>
+      <w:numFmt w:val="bullet"/>
+      <w:lvlText w:val=""/>
+      <w:lvlJc w:val="left"/>
+      <w:pPr>
+        <w:tabs>
+          <w:tab w:val="num" w:pos="3600"/>
+        </w:tabs>
+        <w:ind w:left="3600" w:hanging="360"/>
+      </w:pPr>
+      <w:rPr>
+        <w:rFonts w:ascii="Wingdings" w:hAnsi="Wingdings" w:hint="default"/>
+        <w:sz w:val="20"/>
+      </w:rPr>
+    </w:lvl>
+    <w:lvl w:ilvl="5" w:tentative="1">
+      <w:start w:val="1"/>
+      <w:numFmt w:val="bullet"/>
+      <w:lvlText w:val=""/>
+      <w:lvlJc w:val="left"/>
+      <w:pPr>
+        <w:tabs>
+          <w:tab w:val="num" w:pos="4320"/>
+        </w:tabs>
+        <w:ind w:left="4320" w:hanging="360"/>
+      </w:pPr>
+      <w:rPr>
+        <w:rFonts w:ascii="Wingdings" w:hAnsi="Wingdings" w:hint="default"/>
+        <w:sz w:val="20"/>
+      </w:rPr>
+    </w:lvl>
+    <w:lvl w:ilvl="6" w:tentative="1">
+      <w:start w:val="1"/>
+      <w:numFmt w:val="bullet"/>
+      <w:lvlText w:val=""/>
+      <w:lvlJc w:val="left"/>
+      <w:pPr>
+        <w:tabs>
+          <w:tab w:val="num" w:pos="5040"/>
+        </w:tabs>
+        <w:ind w:left="5040" w:hanging="360"/>
+      </w:pPr>
+      <w:rPr>
+        <w:rFonts w:ascii="Wingdings" w:hAnsi="Wingdings" w:hint="default"/>
+        <w:sz w:val="20"/>
+      </w:rPr>
+    </w:lvl>
+    <w:lvl w:ilvl="7" w:tentative="1">
+      <w:start w:val="1"/>
+      <w:numFmt w:val="bullet"/>
+      <w:lvlText w:val=""/>
+      <w:lvlJc w:val="left"/>
+      <w:pPr>
+        <w:tabs>
+          <w:tab w:val="num" w:pos="5760"/>
+        </w:tabs>
+        <w:ind w:left="5760" w:hanging="360"/>
+      </w:pPr>
+      <w:rPr>
+        <w:rFonts w:ascii="Wingdings" w:hAnsi="Wingdings" w:hint="default"/>
+        <w:sz w:val="20"/>
+      </w:rPr>
+    </w:lvl>
+    <w:lvl w:ilvl="8" w:tentative="1">
+      <w:start w:val="1"/>
+      <w:numFmt w:val="bullet"/>
+      <w:lvlText w:val=""/>
+      <w:lvlJc w:val="left"/>
+      <w:pPr>
+        <w:tabs>
+          <w:tab w:val="num" w:pos="6480"/>
+        </w:tabs>
+        <w:ind w:left="6480" w:hanging="360"/>
+      </w:pPr>
+      <w:rPr>
+        <w:rFonts w:ascii="Wingdings" w:hAnsi="Wingdings" w:hint="default"/>
+        <w:sz w:val="20"/>
+      </w:rPr>
+    </w:lvl>
+  </w:abstractNum>
+  <w:abstractNum w:abstractNumId="21" w15:restartNumberingAfterBreak="0">
     <w:nsid w:val="5AFF2E8D"/>
     <w:multiLevelType w:val="multilevel"/>
     <w:tmpl w:val="00E82A94"/>
@@ -9980,7 +10452,7 @@
       </w:rPr>
     </w:lvl>
   </w:abstractNum>
-  <w:abstractNum w:abstractNumId="20" w15:restartNumberingAfterBreak="0">
+  <w:abstractNum w:abstractNumId="22" w15:restartNumberingAfterBreak="0">
     <w:nsid w:val="5C491D25"/>
     <w:multiLevelType w:val="multilevel"/>
     <w:tmpl w:val="83B68182"/>
@@ -10129,7 +10601,7 @@
       </w:rPr>
     </w:lvl>
   </w:abstractNum>
-  <w:abstractNum w:abstractNumId="21" w15:restartNumberingAfterBreak="0">
+  <w:abstractNum w:abstractNumId="23" w15:restartNumberingAfterBreak="0">
     <w:nsid w:val="5D612526"/>
     <w:multiLevelType w:val="multilevel"/>
     <w:tmpl w:val="DB62DC76"/>
@@ -10278,7 +10750,7 @@
       </w:rPr>
     </w:lvl>
   </w:abstractNum>
-  <w:abstractNum w:abstractNumId="22" w15:restartNumberingAfterBreak="0">
+  <w:abstractNum w:abstractNumId="24" w15:restartNumberingAfterBreak="0">
     <w:nsid w:val="63FC054C"/>
     <w:multiLevelType w:val="multilevel"/>
     <w:tmpl w:val="D00A9D0A"/>
@@ -10423,7 +10895,7 @@
       </w:rPr>
     </w:lvl>
   </w:abstractNum>
-  <w:abstractNum w:abstractNumId="23" w15:restartNumberingAfterBreak="0">
+  <w:abstractNum w:abstractNumId="25" w15:restartNumberingAfterBreak="0">
     <w:nsid w:val="6DBF7670"/>
     <w:multiLevelType w:val="multilevel"/>
     <w:tmpl w:val="CC963EBA"/>
@@ -10572,7 +11044,7 @@
       </w:rPr>
     </w:lvl>
   </w:abstractNum>
-  <w:abstractNum w:abstractNumId="24" w15:restartNumberingAfterBreak="0">
+  <w:abstractNum w:abstractNumId="26" w15:restartNumberingAfterBreak="0">
     <w:nsid w:val="6F4C7C29"/>
     <w:multiLevelType w:val="multilevel"/>
     <w:tmpl w:val="0CC08082"/>
@@ -10685,7 +11157,7 @@
       </w:pPr>
     </w:lvl>
   </w:abstractNum>
-  <w:abstractNum w:abstractNumId="25" w15:restartNumberingAfterBreak="0">
+  <w:abstractNum w:abstractNumId="27" w15:restartNumberingAfterBreak="0">
     <w:nsid w:val="71B169B8"/>
     <w:multiLevelType w:val="multilevel"/>
     <w:tmpl w:val="124416DC"/>
@@ -10830,7 +11302,7 @@
       </w:rPr>
     </w:lvl>
   </w:abstractNum>
-  <w:abstractNum w:abstractNumId="26" w15:restartNumberingAfterBreak="0">
+  <w:abstractNum w:abstractNumId="28" w15:restartNumberingAfterBreak="0">
     <w:nsid w:val="71DD7274"/>
     <w:multiLevelType w:val="multilevel"/>
     <w:tmpl w:val="2C645D04"/>
@@ -10943,7 +11415,7 @@
       </w:pPr>
     </w:lvl>
   </w:abstractNum>
-  <w:abstractNum w:abstractNumId="27" w15:restartNumberingAfterBreak="0">
+  <w:abstractNum w:abstractNumId="29" w15:restartNumberingAfterBreak="0">
     <w:nsid w:val="72380DDF"/>
     <w:multiLevelType w:val="multilevel"/>
     <w:tmpl w:val="B9CC6108"/>
@@ -11092,7 +11564,7 @@
       </w:rPr>
     </w:lvl>
   </w:abstractNum>
-  <w:abstractNum w:abstractNumId="28" w15:restartNumberingAfterBreak="0">
+  <w:abstractNum w:abstractNumId="30" w15:restartNumberingAfterBreak="0">
     <w:nsid w:val="73E15FBD"/>
     <w:multiLevelType w:val="multilevel"/>
     <w:tmpl w:val="481E18CC"/>
@@ -11244,7 +11716,7 @@
     <w:abstractNumId w:val="4"/>
   </w:num>
   <w:num w:numId="3" w16cid:durableId="564411841">
-    <w:abstractNumId w:val="21"/>
+    <w:abstractNumId w:val="23"/>
   </w:num>
   <w:num w:numId="4" w16cid:durableId="495222279">
     <w:abstractNumId w:val="12"/>
@@ -11259,10 +11731,10 @@
     <w:abstractNumId w:val="9"/>
   </w:num>
   <w:num w:numId="8" w16cid:durableId="1905289728">
-    <w:abstractNumId w:val="23"/>
+    <w:abstractNumId w:val="25"/>
   </w:num>
   <w:num w:numId="9" w16cid:durableId="903224478">
-    <w:abstractNumId w:val="24"/>
+    <w:abstractNumId w:val="26"/>
   </w:num>
   <w:num w:numId="10" w16cid:durableId="1389456004">
     <w:abstractNumId w:val="1"/>
@@ -11277,52 +11749,58 @@
     <w:abstractNumId w:val="10"/>
   </w:num>
   <w:num w:numId="14" w16cid:durableId="1263025117">
+    <w:abstractNumId w:val="18"/>
+  </w:num>
+  <w:num w:numId="15" w16cid:durableId="1706708101">
+    <w:abstractNumId w:val="28"/>
+  </w:num>
+  <w:num w:numId="16" w16cid:durableId="1900166956">
+    <w:abstractNumId w:val="21"/>
+  </w:num>
+  <w:num w:numId="17" w16cid:durableId="1088618782">
     <w:abstractNumId w:val="17"/>
   </w:num>
-  <w:num w:numId="15" w16cid:durableId="1706708101">
-    <w:abstractNumId w:val="26"/>
-  </w:num>
-  <w:num w:numId="16" w16cid:durableId="1900166956">
-    <w:abstractNumId w:val="19"/>
-  </w:num>
-  <w:num w:numId="17" w16cid:durableId="1088618782">
-    <w:abstractNumId w:val="16"/>
-  </w:num>
   <w:num w:numId="18" w16cid:durableId="891696317">
-    <w:abstractNumId w:val="25"/>
+    <w:abstractNumId w:val="27"/>
   </w:num>
   <w:num w:numId="19" w16cid:durableId="1852720404">
-    <w:abstractNumId w:val="27"/>
+    <w:abstractNumId w:val="29"/>
   </w:num>
   <w:num w:numId="20" w16cid:durableId="2080328687">
     <w:abstractNumId w:val="14"/>
   </w:num>
   <w:num w:numId="21" w16cid:durableId="2061400506">
-    <w:abstractNumId w:val="22"/>
+    <w:abstractNumId w:val="24"/>
   </w:num>
   <w:num w:numId="22" w16cid:durableId="322779506">
     <w:abstractNumId w:val="11"/>
   </w:num>
   <w:num w:numId="23" w16cid:durableId="1742749278">
-    <w:abstractNumId w:val="20"/>
+    <w:abstractNumId w:val="22"/>
   </w:num>
   <w:num w:numId="24" w16cid:durableId="1272977281">
     <w:abstractNumId w:val="7"/>
   </w:num>
   <w:num w:numId="25" w16cid:durableId="1997803170">
-    <w:abstractNumId w:val="18"/>
+    <w:abstractNumId w:val="19"/>
   </w:num>
   <w:num w:numId="26" w16cid:durableId="268512735">
     <w:abstractNumId w:val="5"/>
   </w:num>
   <w:num w:numId="27" w16cid:durableId="638652703">
-    <w:abstractNumId w:val="15"/>
+    <w:abstractNumId w:val="16"/>
   </w:num>
   <w:num w:numId="28" w16cid:durableId="95559940">
     <w:abstractNumId w:val="8"/>
   </w:num>
   <w:num w:numId="29" w16cid:durableId="1757095926">
-    <w:abstractNumId w:val="28"/>
+    <w:abstractNumId w:val="30"/>
+  </w:num>
+  <w:num w:numId="30" w16cid:durableId="1616064062">
+    <w:abstractNumId w:val="15"/>
+  </w:num>
+  <w:num w:numId="31" w16cid:durableId="351957631">
+    <w:abstractNumId w:val="20"/>
   </w:num>
 </w:numbering>
 </file>

</xml_diff>

<commit_message>
feat: implementar AutoLogin post-registro y renderizado dinámico de navbar. - Refactorización del flujo de registro (Registro.aspx) para asignar el ID autogenerado al objeto Trainee e inyectarlo en Session["trainee"], logrando el AutoLogin inmediato. - Actualización de MiMaster.Master agregando lógica C# incrustada (<% if... %>) para renderizar condicionalmente los botones de Login/Registro o el panel de Usuario/Salir según el estado de la sesión (Seguridad.sesionActiva). - Implementación del evento de cierre de sesión (btnSalir_Click) utilizando Session.Clear() para destruir el estado de forma segura y redirigir al Login. - Modificación del interceptor global en el Page_Load de la Master Page (operadores lógicos OR) para exceptuar correctamente las rutas públicas (Default, Login, Registro).
</commit_message>
<xml_diff>
--- a/Unidad 5 - Pokedex Web/Documentación de Pokedex.docx
+++ b/Unidad 5 - Pokedex Web/Documentación de Pokedex.docx
@@ -7173,6 +7173,245 @@
       <w:proofErr w:type="spellEnd"/>
       <w:r>
         <w:t>))) .</w:t>
+      </w:r>
+    </w:p>
+    <w:p>
+      <w:r>
+        <w:t xml:space="preserve">Una clase </w:t>
+      </w:r>
+      <w:r>
+        <w:rPr>
+          <w:b/>
+          <w:bCs/>
+        </w:rPr>
+        <w:t>estática</w:t>
+      </w:r>
+      <w:r>
+        <w:t xml:space="preserve"> (</w:t>
+      </w:r>
+      <w:proofErr w:type="spellStart"/>
+      <w:r>
+        <w:t>static</w:t>
+      </w:r>
+      <w:proofErr w:type="spellEnd"/>
+      <w:r>
+        <w:t>) en C# es aquella que no puede ser instanciada (no se puede usar new). Se carga en memoria una sola vez por dominio de aplicación. Se utiliza idealmente para crear "Clases Utilitarias" (</w:t>
+      </w:r>
+      <w:proofErr w:type="spellStart"/>
+      <w:r>
+        <w:t>Helpers</w:t>
+      </w:r>
+      <w:proofErr w:type="spellEnd"/>
+      <w:r>
+        <w:t>), las cuales agrupan métodos que realizan cálculos o evaluaciones lógicas independientes sin necesidad de almacenar el estado interno de un objeto.</w:t>
+      </w:r>
+    </w:p>
+    <w:p>
+      <w:r>
+        <w:rPr>
+          <w:b/>
+          <w:bCs/>
+        </w:rPr>
+        <w:t xml:space="preserve">TEMA: Experiencia de Usuario (UX) - </w:t>
+      </w:r>
+      <w:proofErr w:type="spellStart"/>
+      <w:r>
+        <w:rPr>
+          <w:b/>
+          <w:bCs/>
+        </w:rPr>
+        <w:t>AutoLogin</w:t>
+      </w:r>
+      <w:proofErr w:type="spellEnd"/>
+      <w:r>
+        <w:rPr>
+          <w:b/>
+          <w:bCs/>
+        </w:rPr>
+        <w:t xml:space="preserve"> y Gestión Visual de Sesiones</w:t>
+      </w:r>
+    </w:p>
+    <w:p>
+      <w:pPr>
+        <w:numPr>
+          <w:ilvl w:val="0"/>
+          <w:numId w:val="32"/>
+        </w:numPr>
+      </w:pPr>
+      <w:proofErr w:type="spellStart"/>
+      <w:r>
+        <w:rPr>
+          <w:b/>
+          <w:bCs/>
+        </w:rPr>
+        <w:t>AutoLogin</w:t>
+      </w:r>
+      <w:proofErr w:type="spellEnd"/>
+      <w:r>
+        <w:rPr>
+          <w:b/>
+          <w:bCs/>
+        </w:rPr>
+        <w:t xml:space="preserve"> Post-Registro:</w:t>
+      </w:r>
+      <w:r>
+        <w:t xml:space="preserve"> En aplicaciones web modernas, obligar a un usuario a pasar por la pantalla de </w:t>
+      </w:r>
+      <w:proofErr w:type="spellStart"/>
+      <w:r>
+        <w:t>Login</w:t>
+      </w:r>
+      <w:proofErr w:type="spellEnd"/>
+      <w:r>
+        <w:t xml:space="preserve"> inmediatamente después de haber completado exitosamente el formulario de Registro es considerado una mala práctica de Experiencia de Usuario (UX). Para evitar esta fricción, se implementa el "</w:t>
+      </w:r>
+      <w:proofErr w:type="spellStart"/>
+      <w:r>
+        <w:t>AutoLogin</w:t>
+      </w:r>
+      <w:proofErr w:type="spellEnd"/>
+      <w:r>
+        <w:t>": una vez que el alta en la base de datos es exitosa, el sistema toma las credenciales recién creadas (junto con el ID generado mediante la cláusula OUTPUT) y construye manualmente la sesión (</w:t>
+      </w:r>
+      <w:proofErr w:type="spellStart"/>
+      <w:r>
+        <w:t>Session.Add</w:t>
+      </w:r>
+      <w:proofErr w:type="spellEnd"/>
+      <w:r>
+        <w:t>) antes de redirigir al usuario al inicio.</w:t>
+      </w:r>
+    </w:p>
+    <w:p>
+      <w:pPr>
+        <w:numPr>
+          <w:ilvl w:val="0"/>
+          <w:numId w:val="32"/>
+        </w:numPr>
+      </w:pPr>
+      <w:r>
+        <w:rPr>
+          <w:b/>
+          <w:bCs/>
+        </w:rPr>
+        <w:t>Destrucción de la Sesión (</w:t>
+      </w:r>
+      <w:proofErr w:type="spellStart"/>
+      <w:r>
+        <w:rPr>
+          <w:b/>
+          <w:bCs/>
+        </w:rPr>
+        <w:t>Logout</w:t>
+      </w:r>
+      <w:proofErr w:type="spellEnd"/>
+      <w:r>
+        <w:rPr>
+          <w:b/>
+          <w:bCs/>
+        </w:rPr>
+        <w:t>):</w:t>
+      </w:r>
+      <w:r>
+        <w:t xml:space="preserve"> Para implementar una funcionalidad segura de "Salir" o "Cerrar Sesión", no basta con eliminar un solo objeto de la memoria. Se debe utilizar el método </w:t>
+      </w:r>
+      <w:proofErr w:type="spellStart"/>
+      <w:r>
+        <w:t>Session.Clear</w:t>
+      </w:r>
+      <w:proofErr w:type="spellEnd"/>
+      <w:r>
+        <w:t xml:space="preserve">() del </w:t>
+      </w:r>
+      <w:proofErr w:type="spellStart"/>
+      <w:r>
+        <w:t>framework</w:t>
+      </w:r>
+      <w:proofErr w:type="spellEnd"/>
+      <w:r>
+        <w:t xml:space="preserve"> ASP.NET. Este método vacía completamente el diccionario de la sesión actual, eliminando no solo los datos de autenticación del usuario, sino cualquier otro dato temporal o lista almacenada en memoria, garantizando un cierre limpio y seguro.</w:t>
+      </w:r>
+    </w:p>
+    <w:p>
+      <w:pPr>
+        <w:numPr>
+          <w:ilvl w:val="0"/>
+          <w:numId w:val="32"/>
+        </w:numPr>
+      </w:pPr>
+      <w:r>
+        <w:rPr>
+          <w:b/>
+          <w:bCs/>
+        </w:rPr>
+        <w:t>Renderizado Condicional en ASP.NET (Front-</w:t>
+      </w:r>
+      <w:proofErr w:type="spellStart"/>
+      <w:r>
+        <w:rPr>
+          <w:b/>
+          <w:bCs/>
+        </w:rPr>
+        <w:t>end</w:t>
+      </w:r>
+      <w:proofErr w:type="spellEnd"/>
+      <w:r>
+        <w:rPr>
+          <w:b/>
+          <w:bCs/>
+        </w:rPr>
+        <w:t>):</w:t>
+      </w:r>
+      <w:r>
+        <w:t xml:space="preserve"> Para mejorar la interfaz gráfica según el estado de autenticación, se pueden utilizar bloques condicionales (&lt;% </w:t>
+      </w:r>
+      <w:proofErr w:type="spellStart"/>
+      <w:r>
+        <w:t>if</w:t>
+      </w:r>
+      <w:proofErr w:type="spellEnd"/>
+      <w:r>
+        <w:t xml:space="preserve">(...) { } </w:t>
+      </w:r>
+      <w:proofErr w:type="spellStart"/>
+      <w:r>
+        <w:t>else</w:t>
+      </w:r>
+      <w:proofErr w:type="spellEnd"/>
+      <w:r>
+        <w:t xml:space="preserve"> { } %&gt;) directamente en el código HTML (archivo .</w:t>
+      </w:r>
+      <w:proofErr w:type="spellStart"/>
+      <w:r>
+        <w:t>aspx</w:t>
+      </w:r>
+      <w:proofErr w:type="spellEnd"/>
+      <w:r>
+        <w:t xml:space="preserve"> o .Master). Al invocar métodos estáticos de seguridad (como </w:t>
+      </w:r>
+      <w:proofErr w:type="spellStart"/>
+      <w:r>
+        <w:t>Seguridad.sesionActiva</w:t>
+      </w:r>
+      <w:proofErr w:type="spellEnd"/>
+      <w:r>
+        <w:t>()), el servidor determina qué bloque de HTML (</w:t>
+      </w:r>
+      <w:proofErr w:type="spellStart"/>
+      <w:r>
+        <w:t>ej</w:t>
+      </w:r>
+      <w:proofErr w:type="spellEnd"/>
+      <w:r>
+        <w:t xml:space="preserve">: botones de </w:t>
+      </w:r>
+      <w:proofErr w:type="spellStart"/>
+      <w:r>
+        <w:t>Login</w:t>
+      </w:r>
+      <w:proofErr w:type="spellEnd"/>
+      <w:r>
+        <w:t>/Registro vs. botón de Salir) se enviará al navegador del cliente.</w:t>
       </w:r>
     </w:p>
     <w:p/>
@@ -10896,6 +11135,155 @@
     </w:lvl>
   </w:abstractNum>
   <w:abstractNum w:abstractNumId="25" w15:restartNumberingAfterBreak="0">
+    <w:nsid w:val="69221DCE"/>
+    <w:multiLevelType w:val="multilevel"/>
+    <w:tmpl w:val="3C58754E"/>
+    <w:lvl w:ilvl="0">
+      <w:start w:val="1"/>
+      <w:numFmt w:val="bullet"/>
+      <w:lvlText w:val=""/>
+      <w:lvlJc w:val="left"/>
+      <w:pPr>
+        <w:tabs>
+          <w:tab w:val="num" w:pos="720"/>
+        </w:tabs>
+        <w:ind w:left="720" w:hanging="360"/>
+      </w:pPr>
+      <w:rPr>
+        <w:rFonts w:ascii="Symbol" w:hAnsi="Symbol" w:hint="default"/>
+        <w:sz w:val="20"/>
+      </w:rPr>
+    </w:lvl>
+    <w:lvl w:ilvl="1" w:tentative="1">
+      <w:start w:val="1"/>
+      <w:numFmt w:val="bullet"/>
+      <w:lvlText w:val="o"/>
+      <w:lvlJc w:val="left"/>
+      <w:pPr>
+        <w:tabs>
+          <w:tab w:val="num" w:pos="1440"/>
+        </w:tabs>
+        <w:ind w:left="1440" w:hanging="360"/>
+      </w:pPr>
+      <w:rPr>
+        <w:rFonts w:ascii="Courier New" w:hAnsi="Courier New" w:hint="default"/>
+        <w:sz w:val="20"/>
+      </w:rPr>
+    </w:lvl>
+    <w:lvl w:ilvl="2" w:tentative="1">
+      <w:start w:val="1"/>
+      <w:numFmt w:val="bullet"/>
+      <w:lvlText w:val=""/>
+      <w:lvlJc w:val="left"/>
+      <w:pPr>
+        <w:tabs>
+          <w:tab w:val="num" w:pos="2160"/>
+        </w:tabs>
+        <w:ind w:left="2160" w:hanging="360"/>
+      </w:pPr>
+      <w:rPr>
+        <w:rFonts w:ascii="Wingdings" w:hAnsi="Wingdings" w:hint="default"/>
+        <w:sz w:val="20"/>
+      </w:rPr>
+    </w:lvl>
+    <w:lvl w:ilvl="3" w:tentative="1">
+      <w:start w:val="1"/>
+      <w:numFmt w:val="bullet"/>
+      <w:lvlText w:val=""/>
+      <w:lvlJc w:val="left"/>
+      <w:pPr>
+        <w:tabs>
+          <w:tab w:val="num" w:pos="2880"/>
+        </w:tabs>
+        <w:ind w:left="2880" w:hanging="360"/>
+      </w:pPr>
+      <w:rPr>
+        <w:rFonts w:ascii="Wingdings" w:hAnsi="Wingdings" w:hint="default"/>
+        <w:sz w:val="20"/>
+      </w:rPr>
+    </w:lvl>
+    <w:lvl w:ilvl="4" w:tentative="1">
+      <w:start w:val="1"/>
+      <w:numFmt w:val="bullet"/>
+      <w:lvlText w:val=""/>
+      <w:lvlJc w:val="left"/>
+      <w:pPr>
+        <w:tabs>
+          <w:tab w:val="num" w:pos="3600"/>
+        </w:tabs>
+        <w:ind w:left="3600" w:hanging="360"/>
+      </w:pPr>
+      <w:rPr>
+        <w:rFonts w:ascii="Wingdings" w:hAnsi="Wingdings" w:hint="default"/>
+        <w:sz w:val="20"/>
+      </w:rPr>
+    </w:lvl>
+    <w:lvl w:ilvl="5" w:tentative="1">
+      <w:start w:val="1"/>
+      <w:numFmt w:val="bullet"/>
+      <w:lvlText w:val=""/>
+      <w:lvlJc w:val="left"/>
+      <w:pPr>
+        <w:tabs>
+          <w:tab w:val="num" w:pos="4320"/>
+        </w:tabs>
+        <w:ind w:left="4320" w:hanging="360"/>
+      </w:pPr>
+      <w:rPr>
+        <w:rFonts w:ascii="Wingdings" w:hAnsi="Wingdings" w:hint="default"/>
+        <w:sz w:val="20"/>
+      </w:rPr>
+    </w:lvl>
+    <w:lvl w:ilvl="6" w:tentative="1">
+      <w:start w:val="1"/>
+      <w:numFmt w:val="bullet"/>
+      <w:lvlText w:val=""/>
+      <w:lvlJc w:val="left"/>
+      <w:pPr>
+        <w:tabs>
+          <w:tab w:val="num" w:pos="5040"/>
+        </w:tabs>
+        <w:ind w:left="5040" w:hanging="360"/>
+      </w:pPr>
+      <w:rPr>
+        <w:rFonts w:ascii="Wingdings" w:hAnsi="Wingdings" w:hint="default"/>
+        <w:sz w:val="20"/>
+      </w:rPr>
+    </w:lvl>
+    <w:lvl w:ilvl="7" w:tentative="1">
+      <w:start w:val="1"/>
+      <w:numFmt w:val="bullet"/>
+      <w:lvlText w:val=""/>
+      <w:lvlJc w:val="left"/>
+      <w:pPr>
+        <w:tabs>
+          <w:tab w:val="num" w:pos="5760"/>
+        </w:tabs>
+        <w:ind w:left="5760" w:hanging="360"/>
+      </w:pPr>
+      <w:rPr>
+        <w:rFonts w:ascii="Wingdings" w:hAnsi="Wingdings" w:hint="default"/>
+        <w:sz w:val="20"/>
+      </w:rPr>
+    </w:lvl>
+    <w:lvl w:ilvl="8" w:tentative="1">
+      <w:start w:val="1"/>
+      <w:numFmt w:val="bullet"/>
+      <w:lvlText w:val=""/>
+      <w:lvlJc w:val="left"/>
+      <w:pPr>
+        <w:tabs>
+          <w:tab w:val="num" w:pos="6480"/>
+        </w:tabs>
+        <w:ind w:left="6480" w:hanging="360"/>
+      </w:pPr>
+      <w:rPr>
+        <w:rFonts w:ascii="Wingdings" w:hAnsi="Wingdings" w:hint="default"/>
+        <w:sz w:val="20"/>
+      </w:rPr>
+    </w:lvl>
+  </w:abstractNum>
+  <w:abstractNum w:abstractNumId="26" w15:restartNumberingAfterBreak="0">
     <w:nsid w:val="6DBF7670"/>
     <w:multiLevelType w:val="multilevel"/>
     <w:tmpl w:val="CC963EBA"/>
@@ -11044,7 +11432,7 @@
       </w:rPr>
     </w:lvl>
   </w:abstractNum>
-  <w:abstractNum w:abstractNumId="26" w15:restartNumberingAfterBreak="0">
+  <w:abstractNum w:abstractNumId="27" w15:restartNumberingAfterBreak="0">
     <w:nsid w:val="6F4C7C29"/>
     <w:multiLevelType w:val="multilevel"/>
     <w:tmpl w:val="0CC08082"/>
@@ -11157,7 +11545,7 @@
       </w:pPr>
     </w:lvl>
   </w:abstractNum>
-  <w:abstractNum w:abstractNumId="27" w15:restartNumberingAfterBreak="0">
+  <w:abstractNum w:abstractNumId="28" w15:restartNumberingAfterBreak="0">
     <w:nsid w:val="71B169B8"/>
     <w:multiLevelType w:val="multilevel"/>
     <w:tmpl w:val="124416DC"/>
@@ -11302,7 +11690,7 @@
       </w:rPr>
     </w:lvl>
   </w:abstractNum>
-  <w:abstractNum w:abstractNumId="28" w15:restartNumberingAfterBreak="0">
+  <w:abstractNum w:abstractNumId="29" w15:restartNumberingAfterBreak="0">
     <w:nsid w:val="71DD7274"/>
     <w:multiLevelType w:val="multilevel"/>
     <w:tmpl w:val="2C645D04"/>
@@ -11415,7 +11803,7 @@
       </w:pPr>
     </w:lvl>
   </w:abstractNum>
-  <w:abstractNum w:abstractNumId="29" w15:restartNumberingAfterBreak="0">
+  <w:abstractNum w:abstractNumId="30" w15:restartNumberingAfterBreak="0">
     <w:nsid w:val="72380DDF"/>
     <w:multiLevelType w:val="multilevel"/>
     <w:tmpl w:val="B9CC6108"/>
@@ -11564,7 +11952,7 @@
       </w:rPr>
     </w:lvl>
   </w:abstractNum>
-  <w:abstractNum w:abstractNumId="30" w15:restartNumberingAfterBreak="0">
+  <w:abstractNum w:abstractNumId="31" w15:restartNumberingAfterBreak="0">
     <w:nsid w:val="73E15FBD"/>
     <w:multiLevelType w:val="multilevel"/>
     <w:tmpl w:val="481E18CC"/>
@@ -11731,10 +12119,10 @@
     <w:abstractNumId w:val="9"/>
   </w:num>
   <w:num w:numId="8" w16cid:durableId="1905289728">
-    <w:abstractNumId w:val="25"/>
+    <w:abstractNumId w:val="26"/>
   </w:num>
   <w:num w:numId="9" w16cid:durableId="903224478">
-    <w:abstractNumId w:val="26"/>
+    <w:abstractNumId w:val="27"/>
   </w:num>
   <w:num w:numId="10" w16cid:durableId="1389456004">
     <w:abstractNumId w:val="1"/>
@@ -11752,7 +12140,7 @@
     <w:abstractNumId w:val="18"/>
   </w:num>
   <w:num w:numId="15" w16cid:durableId="1706708101">
-    <w:abstractNumId w:val="28"/>
+    <w:abstractNumId w:val="29"/>
   </w:num>
   <w:num w:numId="16" w16cid:durableId="1900166956">
     <w:abstractNumId w:val="21"/>
@@ -11761,10 +12149,10 @@
     <w:abstractNumId w:val="17"/>
   </w:num>
   <w:num w:numId="18" w16cid:durableId="891696317">
-    <w:abstractNumId w:val="27"/>
+    <w:abstractNumId w:val="28"/>
   </w:num>
   <w:num w:numId="19" w16cid:durableId="1852720404">
-    <w:abstractNumId w:val="29"/>
+    <w:abstractNumId w:val="30"/>
   </w:num>
   <w:num w:numId="20" w16cid:durableId="2080328687">
     <w:abstractNumId w:val="14"/>
@@ -11794,13 +12182,16 @@
     <w:abstractNumId w:val="8"/>
   </w:num>
   <w:num w:numId="29" w16cid:durableId="1757095926">
-    <w:abstractNumId w:val="30"/>
+    <w:abstractNumId w:val="31"/>
   </w:num>
   <w:num w:numId="30" w16cid:durableId="1616064062">
     <w:abstractNumId w:val="15"/>
   </w:num>
   <w:num w:numId="31" w16cid:durableId="351957631">
     <w:abstractNumId w:val="20"/>
+  </w:num>
+  <w:num w:numId="32" w16cid:durableId="1445613649">
+    <w:abstractNumId w:val="25"/>
   </w:num>
 </w:numbering>
 </file>

</xml_diff>

<commit_message>
feat: implementar subida, almacenamiento físico y renderizado dinámico de imagen de perfil. - Creación del directorio físico 'Images' en el servidor para almacenar recursos estáticos. - Desarrollo de interfaz en MiPerfil.aspx utilizando un input de tipo file con runat="server" y JavaScript (FileReader) para previsualización instantánea en el cliente. - Implementación de lógica en MiPerfil.aspx.cs utilizando Server.MapPath para obtener la ruta absoluta, extracción de extensión con System.IO y persistencia con el método SaveAs(). - Creación del método ActualizarImgPerfil en TraineeNegocio para hacer el UPDATE del nombre del archivo en la base de datos. - Refactorización del método Login para incluir la columna ImagenPerfil, añadiendo validación de seguridad contra valores nulos (DBNull). - Modificación de MiMaster.Master y MiPerfil.aspx.cs para leer la sesión actual y renderizar dinámicamente la foto de perfil o el avatar por defecto.
</commit_message>
<xml_diff>
--- a/Unidad 5 - Pokedex Web/Documentación de Pokedex.docx
+++ b/Unidad 5 - Pokedex Web/Documentación de Pokedex.docx
@@ -7329,7 +7329,15 @@
       </w:r>
       <w:proofErr w:type="spellEnd"/>
       <w:r>
-        <w:t xml:space="preserve"> ASP.NET. Este método vacía completamente el diccionario de la sesión actual, eliminando no solo los datos de autenticación del usuario, sino cualquier otro dato temporal o lista almacenada en memoria, garantizando un cierre limpio y seguro.</w:t>
+        <w:t xml:space="preserve"> ASP.NET. Este </w:t>
+      </w:r>
+      <w:proofErr w:type="gramStart"/>
+      <w:r>
+        <w:t>método vacía completamente</w:t>
+      </w:r>
+      <w:proofErr w:type="gramEnd"/>
+      <w:r>
+        <w:t xml:space="preserve"> el diccionario de la sesión actual, eliminando no solo los datos de autenticación del usuario, sino cualquier otro dato temporal o lista almacenada en memoria, garantizando un cierre limpio y seguro.</w:t>
       </w:r>
     </w:p>
     <w:p>
@@ -7371,7 +7379,15 @@
       </w:r>
       <w:proofErr w:type="spellEnd"/>
       <w:r>
-        <w:t xml:space="preserve">(...) { } </w:t>
+        <w:t xml:space="preserve">(...) </w:t>
+      </w:r>
+      <w:proofErr w:type="gramStart"/>
+      <w:r>
+        <w:t>{ }</w:t>
+      </w:r>
+      <w:proofErr w:type="gramEnd"/>
+      <w:r>
+        <w:t xml:space="preserve"> </w:t>
       </w:r>
       <w:proofErr w:type="spellStart"/>
       <w:r>
@@ -7413,6 +7429,395 @@
       <w:r>
         <w:t>/Registro vs. botón de Salir) se enviará al navegador del cliente.</w:t>
       </w:r>
+    </w:p>
+    <w:p>
+      <w:pPr>
+        <w:rPr>
+          <w:b/>
+          <w:bCs/>
+        </w:rPr>
+      </w:pPr>
+    </w:p>
+    <w:p>
+      <w:r>
+        <w:rPr>
+          <w:b/>
+          <w:bCs/>
+        </w:rPr>
+        <w:lastRenderedPageBreak/>
+        <w:t xml:space="preserve">TEMA: Gestión de Archivos (File </w:t>
+      </w:r>
+      <w:proofErr w:type="spellStart"/>
+      <w:r>
+        <w:rPr>
+          <w:b/>
+          <w:bCs/>
+        </w:rPr>
+        <w:t>Uploading</w:t>
+      </w:r>
+      <w:proofErr w:type="spellEnd"/>
+      <w:r>
+        <w:rPr>
+          <w:b/>
+          <w:bCs/>
+        </w:rPr>
+        <w:t>) y Rutas en ASP.NET</w:t>
+      </w:r>
+    </w:p>
+    <w:p>
+      <w:pPr>
+        <w:numPr>
+          <w:ilvl w:val="0"/>
+          <w:numId w:val="33"/>
+        </w:numPr>
+      </w:pPr>
+      <w:r>
+        <w:rPr>
+          <w:b/>
+          <w:bCs/>
+        </w:rPr>
+        <w:t>Almacenamiento de Archivos:</w:t>
+      </w:r>
+      <w:r>
+        <w:t xml:space="preserve"> En aplicaciones web, es una mala práctica guardar archivos binarios pesados (como imágenes o </w:t>
+      </w:r>
+      <w:proofErr w:type="spellStart"/>
+      <w:r>
+        <w:t>PDFs</w:t>
+      </w:r>
+      <w:proofErr w:type="spellEnd"/>
+      <w:r>
+        <w:t>) directamente dentro de una columna de la base de datos. La convención estándar de la industria es guardar el archivo físico en un directorio (carpeta) del servidor web y guardar únicamente una referencia (el nombre del archivo o su ruta relativa) en la base de datos.</w:t>
+      </w:r>
+    </w:p>
+    <w:p>
+      <w:pPr>
+        <w:numPr>
+          <w:ilvl w:val="0"/>
+          <w:numId w:val="33"/>
+        </w:numPr>
+      </w:pPr>
+      <w:r>
+        <w:rPr>
+          <w:b/>
+          <w:bCs/>
+        </w:rPr>
+        <w:t>Rutas Físicas vs. Rutas Virtuales:</w:t>
+      </w:r>
+      <w:r>
+        <w:t xml:space="preserve"> * </w:t>
+      </w:r>
+      <w:r>
+        <w:rPr>
+          <w:b/>
+          <w:bCs/>
+        </w:rPr>
+        <w:t>Ruta Física (Escritura):</w:t>
+      </w:r>
+      <w:r>
+        <w:t xml:space="preserve"> Es la ubicación real en el disco duro del servidor (</w:t>
+      </w:r>
+      <w:proofErr w:type="spellStart"/>
+      <w:r>
+        <w:t>ej</w:t>
+      </w:r>
+      <w:proofErr w:type="spellEnd"/>
+      <w:r>
+        <w:t xml:space="preserve">: C:\inetpub\wwwroot\PokedexWeb\Images\perfil-1.jpg). Se utiliza exclusivamente para operaciones de escritura (guardar o borrar archivos). En ASP.NET, se obtiene dinámicamente utilizando el método </w:t>
+      </w:r>
+      <w:proofErr w:type="spellStart"/>
+      <w:r>
+        <w:t>Server.MapPath</w:t>
+      </w:r>
+      <w:proofErr w:type="spellEnd"/>
+      <w:r>
+        <w:t>(</w:t>
+      </w:r>
+      <w:proofErr w:type="gramStart"/>
+      <w:r>
+        <w:t>"./</w:t>
+      </w:r>
+      <w:proofErr w:type="gramEnd"/>
+      <w:r>
+        <w:t>Directorio/") .</w:t>
+      </w:r>
+    </w:p>
+    <w:p>
+      <w:pPr>
+        <w:numPr>
+          <w:ilvl w:val="1"/>
+          <w:numId w:val="33"/>
+        </w:numPr>
+      </w:pPr>
+      <w:r>
+        <w:rPr>
+          <w:b/>
+          <w:bCs/>
+        </w:rPr>
+        <w:t>Ruta Virtual (Lectura):</w:t>
+      </w:r>
+      <w:r>
+        <w:t xml:space="preserve"> Es la URL relativa que entiende el navegador del cliente para solicitar y mostrar la imagen (</w:t>
+      </w:r>
+      <w:proofErr w:type="spellStart"/>
+      <w:r>
+        <w:t>ej</w:t>
+      </w:r>
+      <w:proofErr w:type="spellEnd"/>
+      <w:r>
+        <w:t>: ~/</w:t>
+      </w:r>
+      <w:proofErr w:type="spellStart"/>
+      <w:r>
+        <w:t>Images</w:t>
+      </w:r>
+      <w:proofErr w:type="spellEnd"/>
+      <w:r>
+        <w:t xml:space="preserve">/perfil-1.jpg). Se utiliza para operaciones de lectura (asignar la propiedad </w:t>
+      </w:r>
+      <w:proofErr w:type="spellStart"/>
+      <w:r>
+        <w:t>ImageUrl</w:t>
+      </w:r>
+      <w:proofErr w:type="spellEnd"/>
+      <w:r>
+        <w:t xml:space="preserve"> a un control &lt;</w:t>
+      </w:r>
+      <w:proofErr w:type="spellStart"/>
+      <w:proofErr w:type="gramStart"/>
+      <w:r>
+        <w:t>asp:Image</w:t>
+      </w:r>
+      <w:proofErr w:type="spellEnd"/>
+      <w:proofErr w:type="gramEnd"/>
+      <w:r>
+        <w:t xml:space="preserve">&gt;). El símbolo de virgulilla (~) en ASP.NET representa la raíz de la aplicación </w:t>
+      </w:r>
+      <w:proofErr w:type="gramStart"/>
+      <w:r>
+        <w:t>web .</w:t>
+      </w:r>
+      <w:proofErr w:type="gramEnd"/>
+    </w:p>
+    <w:p>
+      <w:pPr>
+        <w:numPr>
+          <w:ilvl w:val="0"/>
+          <w:numId w:val="33"/>
+        </w:numPr>
+      </w:pPr>
+      <w:r>
+        <w:rPr>
+          <w:b/>
+          <w:bCs/>
+        </w:rPr>
+        <w:t xml:space="preserve">El control &lt;input </w:t>
+      </w:r>
+      <w:proofErr w:type="spellStart"/>
+      <w:r>
+        <w:rPr>
+          <w:b/>
+          <w:bCs/>
+        </w:rPr>
+        <w:t>type</w:t>
+      </w:r>
+      <w:proofErr w:type="spellEnd"/>
+      <w:r>
+        <w:rPr>
+          <w:b/>
+          <w:bCs/>
+        </w:rPr>
+        <w:t xml:space="preserve">="file" </w:t>
+      </w:r>
+      <w:proofErr w:type="spellStart"/>
+      <w:r>
+        <w:rPr>
+          <w:b/>
+          <w:bCs/>
+        </w:rPr>
+        <w:t>runat</w:t>
+      </w:r>
+      <w:proofErr w:type="spellEnd"/>
+      <w:r>
+        <w:rPr>
+          <w:b/>
+          <w:bCs/>
+        </w:rPr>
+        <w:t>="server"&gt;:</w:t>
+      </w:r>
+      <w:r>
+        <w:t xml:space="preserve"> Aunque existen controles propios de ASP.NET para subir archivos (como </w:t>
+      </w:r>
+      <w:proofErr w:type="spellStart"/>
+      <w:r>
+        <w:t>FileUpload</w:t>
+      </w:r>
+      <w:proofErr w:type="spellEnd"/>
+      <w:r>
+        <w:t xml:space="preserve">), es totalmente válido utilizar un elemento estándar de HTML5 (&lt;input </w:t>
+      </w:r>
+      <w:proofErr w:type="spellStart"/>
+      <w:r>
+        <w:t>type</w:t>
+      </w:r>
+      <w:proofErr w:type="spellEnd"/>
+      <w:r>
+        <w:t xml:space="preserve">="file"&gt;) y agregarle el atributo </w:t>
+      </w:r>
+      <w:proofErr w:type="spellStart"/>
+      <w:r>
+        <w:t>runat</w:t>
+      </w:r>
+      <w:proofErr w:type="spellEnd"/>
+      <w:r>
+        <w:t>="server</w:t>
+      </w:r>
+      <w:proofErr w:type="gramStart"/>
+      <w:r>
+        <w:t>" .</w:t>
+      </w:r>
+      <w:proofErr w:type="gramEnd"/>
+      <w:r>
+        <w:t xml:space="preserve"> Esto permite que el archivo seleccionado por el usuario en el navegador viaje (POST) hacia el servidor y sea accesible desde el </w:t>
+      </w:r>
+      <w:proofErr w:type="spellStart"/>
+      <w:r>
+        <w:rPr>
+          <w:i/>
+          <w:iCs/>
+        </w:rPr>
+        <w:t>Code-Behind</w:t>
+      </w:r>
+      <w:proofErr w:type="spellEnd"/>
+      <w:r>
+        <w:t xml:space="preserve"> en C# a través de la </w:t>
+      </w:r>
+      <w:proofErr w:type="gramStart"/>
+      <w:r>
+        <w:t>propiedad .</w:t>
+      </w:r>
+      <w:proofErr w:type="spellStart"/>
+      <w:r>
+        <w:t>PostedFile</w:t>
+      </w:r>
+      <w:proofErr w:type="spellEnd"/>
+      <w:proofErr w:type="gramEnd"/>
+      <w:r>
+        <w:t>, la cual expone métodos como .</w:t>
+      </w:r>
+      <w:proofErr w:type="spellStart"/>
+      <w:r>
+        <w:t>SaveAs</w:t>
+      </w:r>
+      <w:proofErr w:type="spellEnd"/>
+      <w:r>
+        <w:t>(ruta) para guardar el archivo en el disco .</w:t>
+      </w:r>
+    </w:p>
+    <w:p>
+      <w:pPr>
+        <w:numPr>
+          <w:ilvl w:val="0"/>
+          <w:numId w:val="33"/>
+        </w:numPr>
+      </w:pPr>
+      <w:r>
+        <w:rPr>
+          <w:b/>
+          <w:bCs/>
+        </w:rPr>
+        <w:t>Manejo de Nombres Únicos:</w:t>
+      </w:r>
+      <w:r>
+        <w:t xml:space="preserve"> Para evitar que las imágenes subidas por distintos usuarios se sobrescriban si tienen el mismo nombre (</w:t>
+      </w:r>
+      <w:proofErr w:type="spellStart"/>
+      <w:r>
+        <w:t>ej</w:t>
+      </w:r>
+      <w:proofErr w:type="spellEnd"/>
+      <w:r>
+        <w:t>: foto.jpg), es crucial renombrarlas al guardarlas. Una estrategia común es utilizar el ID único del usuario extraído de la sesión (</w:t>
+      </w:r>
+      <w:proofErr w:type="spellStart"/>
+      <w:r>
+        <w:t>ej</w:t>
+      </w:r>
+      <w:proofErr w:type="spellEnd"/>
+      <w:r>
+        <w:t>: perfil-5.jpg).</w:t>
+      </w:r>
+    </w:p>
+    <w:p>
+      <w:pPr>
+        <w:numPr>
+          <w:ilvl w:val="0"/>
+          <w:numId w:val="33"/>
+        </w:numPr>
+      </w:pPr>
+      <w:r>
+        <w:rPr>
+          <w:b/>
+          <w:bCs/>
+        </w:rPr>
+        <w:t>Control de Nulos (</w:t>
+      </w:r>
+      <w:proofErr w:type="spellStart"/>
+      <w:r>
+        <w:rPr>
+          <w:b/>
+          <w:bCs/>
+        </w:rPr>
+        <w:t>DBNull</w:t>
+      </w:r>
+      <w:proofErr w:type="spellEnd"/>
+      <w:r>
+        <w:rPr>
+          <w:b/>
+          <w:bCs/>
+        </w:rPr>
+        <w:t>):</w:t>
+      </w:r>
+      <w:r>
+        <w:t xml:space="preserve"> Al modificar el método de </w:t>
+      </w:r>
+      <w:proofErr w:type="spellStart"/>
+      <w:r>
+        <w:t>Login</w:t>
+      </w:r>
+      <w:proofErr w:type="spellEnd"/>
+      <w:r>
+        <w:t xml:space="preserve"> para traer la columna </w:t>
+      </w:r>
+      <w:proofErr w:type="spellStart"/>
+      <w:r>
+        <w:t>ImagenPerfil</w:t>
+      </w:r>
+      <w:proofErr w:type="spellEnd"/>
+      <w:r>
+        <w:t xml:space="preserve"> desde SQL, debemos validar si ese campo viene vacío utilizando </w:t>
+      </w:r>
+      <w:proofErr w:type="spellStart"/>
+      <w:r>
+        <w:t>Convert.IsDBNull</w:t>
+      </w:r>
+      <w:proofErr w:type="spellEnd"/>
+      <w:r>
+        <w:t xml:space="preserve">(). Si intentamos castear un valor NULL de la base de datos directamente a un </w:t>
+      </w:r>
+      <w:proofErr w:type="spellStart"/>
+      <w:r>
+        <w:t>String</w:t>
+      </w:r>
+      <w:proofErr w:type="spellEnd"/>
+      <w:r>
+        <w:t xml:space="preserve"> en C#, se producirá una excepción en tiempo de </w:t>
+      </w:r>
+      <w:proofErr w:type="gramStart"/>
+      <w:r>
+        <w:t>ejecución .</w:t>
+      </w:r>
+      <w:proofErr w:type="gramEnd"/>
     </w:p>
     <w:p/>
     <w:p/>
@@ -11983,6 +12388,155 @@
         </w:tabs>
         <w:ind w:left="1440" w:hanging="360"/>
       </w:pPr>
+    </w:lvl>
+    <w:lvl w:ilvl="2" w:tentative="1">
+      <w:start w:val="1"/>
+      <w:numFmt w:val="bullet"/>
+      <w:lvlText w:val=""/>
+      <w:lvlJc w:val="left"/>
+      <w:pPr>
+        <w:tabs>
+          <w:tab w:val="num" w:pos="2160"/>
+        </w:tabs>
+        <w:ind w:left="2160" w:hanging="360"/>
+      </w:pPr>
+      <w:rPr>
+        <w:rFonts w:ascii="Wingdings" w:hAnsi="Wingdings" w:hint="default"/>
+        <w:sz w:val="20"/>
+      </w:rPr>
+    </w:lvl>
+    <w:lvl w:ilvl="3" w:tentative="1">
+      <w:start w:val="1"/>
+      <w:numFmt w:val="bullet"/>
+      <w:lvlText w:val=""/>
+      <w:lvlJc w:val="left"/>
+      <w:pPr>
+        <w:tabs>
+          <w:tab w:val="num" w:pos="2880"/>
+        </w:tabs>
+        <w:ind w:left="2880" w:hanging="360"/>
+      </w:pPr>
+      <w:rPr>
+        <w:rFonts w:ascii="Wingdings" w:hAnsi="Wingdings" w:hint="default"/>
+        <w:sz w:val="20"/>
+      </w:rPr>
+    </w:lvl>
+    <w:lvl w:ilvl="4" w:tentative="1">
+      <w:start w:val="1"/>
+      <w:numFmt w:val="bullet"/>
+      <w:lvlText w:val=""/>
+      <w:lvlJc w:val="left"/>
+      <w:pPr>
+        <w:tabs>
+          <w:tab w:val="num" w:pos="3600"/>
+        </w:tabs>
+        <w:ind w:left="3600" w:hanging="360"/>
+      </w:pPr>
+      <w:rPr>
+        <w:rFonts w:ascii="Wingdings" w:hAnsi="Wingdings" w:hint="default"/>
+        <w:sz w:val="20"/>
+      </w:rPr>
+    </w:lvl>
+    <w:lvl w:ilvl="5" w:tentative="1">
+      <w:start w:val="1"/>
+      <w:numFmt w:val="bullet"/>
+      <w:lvlText w:val=""/>
+      <w:lvlJc w:val="left"/>
+      <w:pPr>
+        <w:tabs>
+          <w:tab w:val="num" w:pos="4320"/>
+        </w:tabs>
+        <w:ind w:left="4320" w:hanging="360"/>
+      </w:pPr>
+      <w:rPr>
+        <w:rFonts w:ascii="Wingdings" w:hAnsi="Wingdings" w:hint="default"/>
+        <w:sz w:val="20"/>
+      </w:rPr>
+    </w:lvl>
+    <w:lvl w:ilvl="6" w:tentative="1">
+      <w:start w:val="1"/>
+      <w:numFmt w:val="bullet"/>
+      <w:lvlText w:val=""/>
+      <w:lvlJc w:val="left"/>
+      <w:pPr>
+        <w:tabs>
+          <w:tab w:val="num" w:pos="5040"/>
+        </w:tabs>
+        <w:ind w:left="5040" w:hanging="360"/>
+      </w:pPr>
+      <w:rPr>
+        <w:rFonts w:ascii="Wingdings" w:hAnsi="Wingdings" w:hint="default"/>
+        <w:sz w:val="20"/>
+      </w:rPr>
+    </w:lvl>
+    <w:lvl w:ilvl="7" w:tentative="1">
+      <w:start w:val="1"/>
+      <w:numFmt w:val="bullet"/>
+      <w:lvlText w:val=""/>
+      <w:lvlJc w:val="left"/>
+      <w:pPr>
+        <w:tabs>
+          <w:tab w:val="num" w:pos="5760"/>
+        </w:tabs>
+        <w:ind w:left="5760" w:hanging="360"/>
+      </w:pPr>
+      <w:rPr>
+        <w:rFonts w:ascii="Wingdings" w:hAnsi="Wingdings" w:hint="default"/>
+        <w:sz w:val="20"/>
+      </w:rPr>
+    </w:lvl>
+    <w:lvl w:ilvl="8" w:tentative="1">
+      <w:start w:val="1"/>
+      <w:numFmt w:val="bullet"/>
+      <w:lvlText w:val=""/>
+      <w:lvlJc w:val="left"/>
+      <w:pPr>
+        <w:tabs>
+          <w:tab w:val="num" w:pos="6480"/>
+        </w:tabs>
+        <w:ind w:left="6480" w:hanging="360"/>
+      </w:pPr>
+      <w:rPr>
+        <w:rFonts w:ascii="Wingdings" w:hAnsi="Wingdings" w:hint="default"/>
+        <w:sz w:val="20"/>
+      </w:rPr>
+    </w:lvl>
+  </w:abstractNum>
+  <w:abstractNum w:abstractNumId="32" w15:restartNumberingAfterBreak="0">
+    <w:nsid w:val="792F63CC"/>
+    <w:multiLevelType w:val="multilevel"/>
+    <w:tmpl w:val="8B8CE46C"/>
+    <w:lvl w:ilvl="0">
+      <w:start w:val="1"/>
+      <w:numFmt w:val="bullet"/>
+      <w:lvlText w:val=""/>
+      <w:lvlJc w:val="left"/>
+      <w:pPr>
+        <w:tabs>
+          <w:tab w:val="num" w:pos="720"/>
+        </w:tabs>
+        <w:ind w:left="720" w:hanging="360"/>
+      </w:pPr>
+      <w:rPr>
+        <w:rFonts w:ascii="Symbol" w:hAnsi="Symbol" w:hint="default"/>
+        <w:sz w:val="20"/>
+      </w:rPr>
+    </w:lvl>
+    <w:lvl w:ilvl="1">
+      <w:start w:val="1"/>
+      <w:numFmt w:val="bullet"/>
+      <w:lvlText w:val="o"/>
+      <w:lvlJc w:val="left"/>
+      <w:pPr>
+        <w:tabs>
+          <w:tab w:val="num" w:pos="1440"/>
+        </w:tabs>
+        <w:ind w:left="1440" w:hanging="360"/>
+      </w:pPr>
+      <w:rPr>
+        <w:rFonts w:ascii="Courier New" w:hAnsi="Courier New" w:hint="default"/>
+        <w:sz w:val="20"/>
+      </w:rPr>
     </w:lvl>
     <w:lvl w:ilvl="2" w:tentative="1">
       <w:start w:val="1"/>
@@ -12192,6 +12746,9 @@
   </w:num>
   <w:num w:numId="32" w16cid:durableId="1445613649">
     <w:abstractNumId w:val="25"/>
+  </w:num>
+  <w:num w:numId="33" w16cid:durableId="1602571387">
+    <w:abstractNumId w:val="32"/>
   </w:num>
 </w:numbering>
 </file>

</xml_diff>

<commit_message>
feat: Explicación del script de JS para previsualizar la imagen de perfil seleccionada.
</commit_message>
<xml_diff>
--- a/Unidad 5 - Pokedex Web/Documentación de Pokedex.docx
+++ b/Unidad 5 - Pokedex Web/Documentación de Pokedex.docx
@@ -831,7 +831,6 @@
         <w:t xml:space="preserve">Importancia del </w:t>
       </w:r>
       <w:proofErr w:type="spellStart"/>
-      <w:proofErr w:type="gramStart"/>
       <w:r>
         <w:rPr>
           <w:b/>
@@ -845,15 +844,7 @@
           <w:b/>
           <w:bCs/>
         </w:rPr>
-        <w:t>(</w:t>
-      </w:r>
-      <w:proofErr w:type="gramEnd"/>
-      <w:r>
-        <w:rPr>
-          <w:b/>
-          <w:bCs/>
-        </w:rPr>
-        <w:t>):</w:t>
+        <w:t>():</w:t>
       </w:r>
       <w:r>
         <w:t xml:space="preserve"> Sin la ejecución de este método en el servidor, la grilla no procesará el origen de datos y no se renderizará ninguna fila en el HTML final del cliente.</w:t>
@@ -1012,12 +1003,10 @@
         <w:t>="false". Esto obliga al desarrollador a definir cada columna mediante &lt;</w:t>
       </w:r>
       <w:proofErr w:type="spellStart"/>
-      <w:proofErr w:type="gramStart"/>
       <w:r>
         <w:t>asp:BoundField</w:t>
       </w:r>
       <w:proofErr w:type="spellEnd"/>
-      <w:proofErr w:type="gramEnd"/>
       <w:r>
         <w:t>&gt;.</w:t>
       </w:r>
@@ -7329,15 +7318,7 @@
       </w:r>
       <w:proofErr w:type="spellEnd"/>
       <w:r>
-        <w:t xml:space="preserve"> ASP.NET. Este </w:t>
-      </w:r>
-      <w:proofErr w:type="gramStart"/>
-      <w:r>
-        <w:t>método vacía completamente</w:t>
-      </w:r>
-      <w:proofErr w:type="gramEnd"/>
-      <w:r>
-        <w:t xml:space="preserve"> el diccionario de la sesión actual, eliminando no solo los datos de autenticación del usuario, sino cualquier otro dato temporal o lista almacenada en memoria, garantizando un cierre limpio y seguro.</w:t>
+        <w:t xml:space="preserve"> ASP.NET. Este método vacía completamente el diccionario de la sesión actual, eliminando no solo los datos de autenticación del usuario, sino cualquier otro dato temporal o lista almacenada en memoria, garantizando un cierre limpio y seguro.</w:t>
       </w:r>
     </w:p>
     <w:p>
@@ -7379,15 +7360,7 @@
       </w:r>
       <w:proofErr w:type="spellEnd"/>
       <w:r>
-        <w:t xml:space="preserve">(...) </w:t>
-      </w:r>
-      <w:proofErr w:type="gramStart"/>
-      <w:r>
-        <w:t>{ }</w:t>
-      </w:r>
-      <w:proofErr w:type="gramEnd"/>
-      <w:r>
-        <w:t xml:space="preserve"> </w:t>
+        <w:t xml:space="preserve">(...) { } </w:t>
       </w:r>
       <w:proofErr w:type="spellStart"/>
       <w:r>
@@ -7531,15 +7504,7 @@
       </w:r>
       <w:proofErr w:type="spellEnd"/>
       <w:r>
-        <w:t>(</w:t>
-      </w:r>
-      <w:proofErr w:type="gramStart"/>
-      <w:r>
-        <w:t>"./</w:t>
-      </w:r>
-      <w:proofErr w:type="gramEnd"/>
-      <w:r>
-        <w:t>Directorio/") .</w:t>
+        <w:t>("./Directorio/") .</w:t>
       </w:r>
     </w:p>
     <w:p>
@@ -7584,20 +7549,13 @@
         <w:t xml:space="preserve"> a un control &lt;</w:t>
       </w:r>
       <w:proofErr w:type="spellStart"/>
-      <w:proofErr w:type="gramStart"/>
       <w:r>
         <w:t>asp:Image</w:t>
       </w:r>
       <w:proofErr w:type="spellEnd"/>
-      <w:proofErr w:type="gramEnd"/>
-      <w:r>
-        <w:t xml:space="preserve">&gt;). El símbolo de virgulilla (~) en ASP.NET representa la raíz de la aplicación </w:t>
-      </w:r>
-      <w:proofErr w:type="gramStart"/>
-      <w:r>
-        <w:t>web .</w:t>
-      </w:r>
-      <w:proofErr w:type="gramEnd"/>
+      <w:r>
+        <w:t>&gt;). El símbolo de virgulilla (~) en ASP.NET representa la raíz de la aplicación web .</w:t>
+      </w:r>
     </w:p>
     <w:p>
       <w:pPr>
@@ -7672,11 +7630,9 @@
       <w:r>
         <w:t>="server</w:t>
       </w:r>
-      <w:proofErr w:type="gramStart"/>
-      <w:r>
-        <w:t>" .</w:t>
-      </w:r>
-      <w:proofErr w:type="gramEnd"/>
+      <w:r>
+        <w:t>”.</w:t>
+      </w:r>
       <w:r>
         <w:t xml:space="preserve"> Esto permite que el archivo seleccionado por el usuario en el navegador viaje (POST) hacia el servidor y sea accesible desde el </w:t>
       </w:r>
@@ -7690,18 +7646,13 @@
       </w:r>
       <w:proofErr w:type="spellEnd"/>
       <w:r>
-        <w:t xml:space="preserve"> en C# a través de la </w:t>
-      </w:r>
-      <w:proofErr w:type="gramStart"/>
-      <w:r>
-        <w:t>propiedad .</w:t>
+        <w:t xml:space="preserve"> en C# a través de la propiedad .</w:t>
       </w:r>
       <w:proofErr w:type="spellStart"/>
       <w:r>
         <w:t>PostedFile</w:t>
       </w:r>
       <w:proofErr w:type="spellEnd"/>
-      <w:proofErr w:type="gramEnd"/>
       <w:r>
         <w:t>, la cual expone métodos como .</w:t>
       </w:r>
@@ -7813,12 +7764,478 @@
       <w:r>
         <w:t xml:space="preserve"> en C#, se producirá una excepción en tiempo de </w:t>
       </w:r>
-      <w:proofErr w:type="gramStart"/>
-      <w:r>
-        <w:t>ejecución .</w:t>
-      </w:r>
-      <w:proofErr w:type="gramEnd"/>
-    </w:p>
+      <w:r>
+        <w:t>ejecución.</w:t>
+      </w:r>
+    </w:p>
+    <w:p>
+      <w:r>
+        <w:rPr>
+          <w:b/>
+          <w:bCs/>
+        </w:rPr>
+        <w:t>TEMA: Manejo de Fechas (</w:t>
+      </w:r>
+      <w:proofErr w:type="spellStart"/>
+      <w:r>
+        <w:rPr>
+          <w:b/>
+          <w:bCs/>
+        </w:rPr>
+        <w:t>DateTime</w:t>
+      </w:r>
+      <w:proofErr w:type="spellEnd"/>
+      <w:r>
+        <w:rPr>
+          <w:b/>
+          <w:bCs/>
+        </w:rPr>
+        <w:t>) en Aplicaciones Web (ASP.NET)</w:t>
+      </w:r>
+    </w:p>
+    <w:p>
+      <w:pPr>
+        <w:numPr>
+          <w:ilvl w:val="0"/>
+          <w:numId w:val="34"/>
+        </w:numPr>
+      </w:pPr>
+      <w:r>
+        <w:rPr>
+          <w:b/>
+          <w:bCs/>
+        </w:rPr>
+        <w:t xml:space="preserve">El control HTML5 &lt;input </w:t>
+      </w:r>
+      <w:proofErr w:type="spellStart"/>
+      <w:r>
+        <w:rPr>
+          <w:b/>
+          <w:bCs/>
+        </w:rPr>
+        <w:t>type</w:t>
+      </w:r>
+      <w:proofErr w:type="spellEnd"/>
+      <w:r>
+        <w:rPr>
+          <w:b/>
+          <w:bCs/>
+        </w:rPr>
+        <w:t>="date"&gt;:</w:t>
+      </w:r>
+      <w:r>
+        <w:t xml:space="preserve"> En ASP.NET Web </w:t>
+      </w:r>
+      <w:proofErr w:type="spellStart"/>
+      <w:r>
+        <w:t>Forms</w:t>
+      </w:r>
+      <w:proofErr w:type="spellEnd"/>
+      <w:r>
+        <w:t>, si utilizamos un &lt;</w:t>
+      </w:r>
+      <w:proofErr w:type="spellStart"/>
+      <w:r>
+        <w:t>asp:TextBox</w:t>
+      </w:r>
+      <w:proofErr w:type="spellEnd"/>
+      <w:r>
+        <w:t xml:space="preserve">&gt; estándar pero le agregamos la propiedad </w:t>
+      </w:r>
+      <w:proofErr w:type="spellStart"/>
+      <w:r>
+        <w:t>TextMode</w:t>
+      </w:r>
+      <w:proofErr w:type="spellEnd"/>
+      <w:r>
+        <w:t xml:space="preserve">="Date", el navegador lo renderizará como un calendario interactivo (date </w:t>
+      </w:r>
+      <w:proofErr w:type="spellStart"/>
+      <w:r>
+        <w:t>picker</w:t>
+      </w:r>
+      <w:proofErr w:type="spellEnd"/>
+      <w:r>
+        <w:t>) nativo de HTML5.</w:t>
+      </w:r>
+    </w:p>
+    <w:p>
+      <w:pPr>
+        <w:numPr>
+          <w:ilvl w:val="0"/>
+          <w:numId w:val="34"/>
+        </w:numPr>
+      </w:pPr>
+      <w:r>
+        <w:rPr>
+          <w:b/>
+          <w:bCs/>
+        </w:rPr>
+        <w:t xml:space="preserve">Captura y </w:t>
+      </w:r>
+      <w:proofErr w:type="spellStart"/>
+      <w:r>
+        <w:rPr>
+          <w:b/>
+          <w:bCs/>
+        </w:rPr>
+        <w:t>Parseo</w:t>
+      </w:r>
+      <w:proofErr w:type="spellEnd"/>
+      <w:r>
+        <w:rPr>
+          <w:b/>
+          <w:bCs/>
+        </w:rPr>
+        <w:t xml:space="preserve"> (De la UI al </w:t>
+      </w:r>
+      <w:proofErr w:type="spellStart"/>
+      <w:r>
+        <w:rPr>
+          <w:b/>
+          <w:bCs/>
+        </w:rPr>
+        <w:t>Backend</w:t>
+      </w:r>
+      <w:proofErr w:type="spellEnd"/>
+      <w:r>
+        <w:rPr>
+          <w:b/>
+          <w:bCs/>
+        </w:rPr>
+        <w:t>):</w:t>
+      </w:r>
+      <w:r>
+        <w:t xml:space="preserve"> Cuando el usuario selecciona una fecha, el navegador la envía al servidor como una cadena de texto (</w:t>
+      </w:r>
+      <w:proofErr w:type="spellStart"/>
+      <w:r>
+        <w:t>string</w:t>
+      </w:r>
+      <w:proofErr w:type="spellEnd"/>
+      <w:r>
+        <w:t xml:space="preserve">) basándose en la configuración regional. En C#, debemos convertir ese </w:t>
+      </w:r>
+      <w:proofErr w:type="spellStart"/>
+      <w:r>
+        <w:t>string</w:t>
+      </w:r>
+      <w:proofErr w:type="spellEnd"/>
+      <w:r>
+        <w:t xml:space="preserve"> a un objeto </w:t>
+      </w:r>
+      <w:proofErr w:type="spellStart"/>
+      <w:r>
+        <w:t>DateTime</w:t>
+      </w:r>
+      <w:proofErr w:type="spellEnd"/>
+      <w:r>
+        <w:t xml:space="preserve"> utilizando el método </w:t>
+      </w:r>
+      <w:proofErr w:type="spellStart"/>
+      <w:r>
+        <w:t>DateTime.Parse</w:t>
+      </w:r>
+      <w:proofErr w:type="spellEnd"/>
+      <w:r>
+        <w:t>(texto) antes de enviarlo a la base de datos.</w:t>
+      </w:r>
+    </w:p>
+    <w:p>
+      <w:pPr>
+        <w:numPr>
+          <w:ilvl w:val="0"/>
+          <w:numId w:val="34"/>
+        </w:numPr>
+      </w:pPr>
+      <w:r>
+        <w:rPr>
+          <w:b/>
+          <w:bCs/>
+        </w:rPr>
+        <w:t xml:space="preserve">Lectura y Formateo (Del </w:t>
+      </w:r>
+      <w:proofErr w:type="spellStart"/>
+      <w:r>
+        <w:rPr>
+          <w:b/>
+          <w:bCs/>
+        </w:rPr>
+        <w:t>Backend</w:t>
+      </w:r>
+      <w:proofErr w:type="spellEnd"/>
+      <w:r>
+        <w:rPr>
+          <w:b/>
+          <w:bCs/>
+        </w:rPr>
+        <w:t xml:space="preserve"> a la UI):</w:t>
+      </w:r>
+    </w:p>
+    <w:p>
+      <w:pPr>
+        <w:numPr>
+          <w:ilvl w:val="1"/>
+          <w:numId w:val="34"/>
+        </w:numPr>
+      </w:pPr>
+      <w:r>
+        <w:rPr>
+          <w:b/>
+          <w:bCs/>
+        </w:rPr>
+        <w:t>Lectura desde BD:</w:t>
+      </w:r>
+      <w:r>
+        <w:t xml:space="preserve"> Al leer desde SQL Server (</w:t>
+      </w:r>
+      <w:proofErr w:type="spellStart"/>
+      <w:r>
+        <w:t>datos.Lector</w:t>
+      </w:r>
+      <w:proofErr w:type="spellEnd"/>
+      <w:r>
+        <w:t>["</w:t>
+      </w:r>
+      <w:proofErr w:type="spellStart"/>
+      <w:r>
+        <w:t>FechaNacimiento</w:t>
+      </w:r>
+      <w:proofErr w:type="spellEnd"/>
+      <w:r>
+        <w:t xml:space="preserve">"]), el dato llega como un tipo </w:t>
+      </w:r>
+      <w:proofErr w:type="spellStart"/>
+      <w:r>
+        <w:t>object</w:t>
+      </w:r>
+      <w:proofErr w:type="spellEnd"/>
+      <w:r>
+        <w:t xml:space="preserve">. Debemos convertirlo primero a </w:t>
+      </w:r>
+      <w:proofErr w:type="spellStart"/>
+      <w:r>
+        <w:t>string</w:t>
+      </w:r>
+      <w:proofErr w:type="spellEnd"/>
+      <w:r>
+        <w:t xml:space="preserve"> (.</w:t>
+      </w:r>
+      <w:proofErr w:type="spellStart"/>
+      <w:r>
+        <w:t>ToString</w:t>
+      </w:r>
+      <w:proofErr w:type="spellEnd"/>
+      <w:r>
+        <w:t xml:space="preserve">()) y luego </w:t>
+      </w:r>
+      <w:proofErr w:type="spellStart"/>
+      <w:r>
+        <w:t>parsearlo</w:t>
+      </w:r>
+      <w:proofErr w:type="spellEnd"/>
+      <w:r>
+        <w:t xml:space="preserve"> a </w:t>
+      </w:r>
+      <w:proofErr w:type="spellStart"/>
+      <w:r>
+        <w:t>DateTime</w:t>
+      </w:r>
+      <w:proofErr w:type="spellEnd"/>
+      <w:r>
+        <w:t>.</w:t>
+      </w:r>
+    </w:p>
+    <w:p>
+      <w:pPr>
+        <w:numPr>
+          <w:ilvl w:val="1"/>
+          <w:numId w:val="34"/>
+        </w:numPr>
+      </w:pPr>
+      <w:r>
+        <w:rPr>
+          <w:b/>
+          <w:bCs/>
+        </w:rPr>
+        <w:lastRenderedPageBreak/>
+        <w:t>Asignación al Control Date:</w:t>
+      </w:r>
+      <w:r>
+        <w:t xml:space="preserve"> Para que el control &lt;input </w:t>
+      </w:r>
+      <w:proofErr w:type="spellStart"/>
+      <w:r>
+        <w:t>type</w:t>
+      </w:r>
+      <w:proofErr w:type="spellEnd"/>
+      <w:r>
+        <w:t xml:space="preserve">="date"&gt; pueda leer y </w:t>
+      </w:r>
+      <w:proofErr w:type="spellStart"/>
+      <w:r>
+        <w:t>pre-cargar</w:t>
+      </w:r>
+      <w:proofErr w:type="spellEnd"/>
+      <w:r>
+        <w:t xml:space="preserve"> una fecha previamente guardada, es </w:t>
+      </w:r>
+      <w:r>
+        <w:rPr>
+          <w:b/>
+          <w:bCs/>
+        </w:rPr>
+        <w:t>estrictamente necesario</w:t>
+      </w:r>
+      <w:r>
+        <w:t xml:space="preserve"> enviarle el texto en el formato universal </w:t>
+      </w:r>
+      <w:r>
+        <w:rPr>
+          <w:b/>
+          <w:bCs/>
+        </w:rPr>
+        <w:t>"</w:t>
+      </w:r>
+      <w:proofErr w:type="spellStart"/>
+      <w:r>
+        <w:rPr>
+          <w:b/>
+          <w:bCs/>
+        </w:rPr>
+        <w:t>yyyy</w:t>
+      </w:r>
+      <w:proofErr w:type="spellEnd"/>
+      <w:r>
+        <w:rPr>
+          <w:b/>
+          <w:bCs/>
+        </w:rPr>
+        <w:t>-MM-</w:t>
+      </w:r>
+      <w:proofErr w:type="spellStart"/>
+      <w:r>
+        <w:rPr>
+          <w:b/>
+          <w:bCs/>
+        </w:rPr>
+        <w:t>dd</w:t>
+      </w:r>
+      <w:proofErr w:type="spellEnd"/>
+      <w:r>
+        <w:rPr>
+          <w:b/>
+          <w:bCs/>
+        </w:rPr>
+        <w:t>"</w:t>
+      </w:r>
+      <w:r>
+        <w:t xml:space="preserve"> (Año-Mes-Día). Si se envía en otro formato (como "</w:t>
+      </w:r>
+      <w:proofErr w:type="spellStart"/>
+      <w:r>
+        <w:t>dd</w:t>
+      </w:r>
+      <w:proofErr w:type="spellEnd"/>
+      <w:r>
+        <w:t>/MM/</w:t>
+      </w:r>
+      <w:proofErr w:type="spellStart"/>
+      <w:r>
+        <w:t>yyyy</w:t>
+      </w:r>
+      <w:proofErr w:type="spellEnd"/>
+      <w:r>
+        <w:t>"), el control no lo reconocerá y aparecerá vacío.</w:t>
+      </w:r>
+    </w:p>
+    <w:p>
+      <w:pPr>
+        <w:numPr>
+          <w:ilvl w:val="0"/>
+          <w:numId w:val="34"/>
+        </w:numPr>
+      </w:pPr>
+      <w:r>
+        <w:rPr>
+          <w:b/>
+          <w:bCs/>
+        </w:rPr>
+        <w:t>Manejo de Nulos (</w:t>
+      </w:r>
+      <w:proofErr w:type="spellStart"/>
+      <w:r>
+        <w:rPr>
+          <w:b/>
+          <w:bCs/>
+        </w:rPr>
+        <w:t>DBNull</w:t>
+      </w:r>
+      <w:proofErr w:type="spellEnd"/>
+      <w:r>
+        <w:rPr>
+          <w:b/>
+          <w:bCs/>
+        </w:rPr>
+        <w:t>):</w:t>
+      </w:r>
+      <w:r>
+        <w:t xml:space="preserve"> Al igual que con las imágenes o los nombres, la fecha de nacimiento no es un campo obligatorio inicial. Por lo tanto, al leer la base de datos, siempre se debe validar </w:t>
+      </w:r>
+      <w:proofErr w:type="spellStart"/>
+      <w:r>
+        <w:t>if</w:t>
+      </w:r>
+      <w:proofErr w:type="spellEnd"/>
+      <w:r>
+        <w:t xml:space="preserve"> (!(</w:t>
+      </w:r>
+      <w:proofErr w:type="spellStart"/>
+      <w:r>
+        <w:t>datos.Lector</w:t>
+      </w:r>
+      <w:proofErr w:type="spellEnd"/>
+      <w:r>
+        <w:t>["</w:t>
+      </w:r>
+      <w:proofErr w:type="spellStart"/>
+      <w:r>
+        <w:t>FechaNacimiento</w:t>
+      </w:r>
+      <w:proofErr w:type="spellEnd"/>
+      <w:r>
+        <w:t xml:space="preserve">"] </w:t>
+      </w:r>
+      <w:proofErr w:type="spellStart"/>
+      <w:r>
+        <w:t>is</w:t>
+      </w:r>
+      <w:proofErr w:type="spellEnd"/>
+      <w:r>
+        <w:t xml:space="preserve"> </w:t>
+      </w:r>
+      <w:proofErr w:type="spellStart"/>
+      <w:r>
+        <w:t>DBNull</w:t>
+      </w:r>
+      <w:proofErr w:type="spellEnd"/>
+      <w:r>
+        <w:t xml:space="preserve">)) para evitar excepciones de tipo </w:t>
+      </w:r>
+      <w:proofErr w:type="spellStart"/>
+      <w:r>
+        <w:rPr>
+          <w:i/>
+          <w:iCs/>
+        </w:rPr>
+        <w:t>NullReferenceException</w:t>
+      </w:r>
+      <w:proofErr w:type="spellEnd"/>
+      <w:r>
+        <w:t>.</w:t>
+      </w:r>
+    </w:p>
+    <w:p/>
     <w:p/>
     <w:p/>
     <w:p/>
@@ -12506,6 +12923,155 @@
     <w:nsid w:val="792F63CC"/>
     <w:multiLevelType w:val="multilevel"/>
     <w:tmpl w:val="8B8CE46C"/>
+    <w:lvl w:ilvl="0">
+      <w:start w:val="1"/>
+      <w:numFmt w:val="bullet"/>
+      <w:lvlText w:val=""/>
+      <w:lvlJc w:val="left"/>
+      <w:pPr>
+        <w:tabs>
+          <w:tab w:val="num" w:pos="720"/>
+        </w:tabs>
+        <w:ind w:left="720" w:hanging="360"/>
+      </w:pPr>
+      <w:rPr>
+        <w:rFonts w:ascii="Symbol" w:hAnsi="Symbol" w:hint="default"/>
+        <w:sz w:val="20"/>
+      </w:rPr>
+    </w:lvl>
+    <w:lvl w:ilvl="1">
+      <w:start w:val="1"/>
+      <w:numFmt w:val="bullet"/>
+      <w:lvlText w:val="o"/>
+      <w:lvlJc w:val="left"/>
+      <w:pPr>
+        <w:tabs>
+          <w:tab w:val="num" w:pos="1440"/>
+        </w:tabs>
+        <w:ind w:left="1440" w:hanging="360"/>
+      </w:pPr>
+      <w:rPr>
+        <w:rFonts w:ascii="Courier New" w:hAnsi="Courier New" w:hint="default"/>
+        <w:sz w:val="20"/>
+      </w:rPr>
+    </w:lvl>
+    <w:lvl w:ilvl="2" w:tentative="1">
+      <w:start w:val="1"/>
+      <w:numFmt w:val="bullet"/>
+      <w:lvlText w:val=""/>
+      <w:lvlJc w:val="left"/>
+      <w:pPr>
+        <w:tabs>
+          <w:tab w:val="num" w:pos="2160"/>
+        </w:tabs>
+        <w:ind w:left="2160" w:hanging="360"/>
+      </w:pPr>
+      <w:rPr>
+        <w:rFonts w:ascii="Wingdings" w:hAnsi="Wingdings" w:hint="default"/>
+        <w:sz w:val="20"/>
+      </w:rPr>
+    </w:lvl>
+    <w:lvl w:ilvl="3" w:tentative="1">
+      <w:start w:val="1"/>
+      <w:numFmt w:val="bullet"/>
+      <w:lvlText w:val=""/>
+      <w:lvlJc w:val="left"/>
+      <w:pPr>
+        <w:tabs>
+          <w:tab w:val="num" w:pos="2880"/>
+        </w:tabs>
+        <w:ind w:left="2880" w:hanging="360"/>
+      </w:pPr>
+      <w:rPr>
+        <w:rFonts w:ascii="Wingdings" w:hAnsi="Wingdings" w:hint="default"/>
+        <w:sz w:val="20"/>
+      </w:rPr>
+    </w:lvl>
+    <w:lvl w:ilvl="4" w:tentative="1">
+      <w:start w:val="1"/>
+      <w:numFmt w:val="bullet"/>
+      <w:lvlText w:val=""/>
+      <w:lvlJc w:val="left"/>
+      <w:pPr>
+        <w:tabs>
+          <w:tab w:val="num" w:pos="3600"/>
+        </w:tabs>
+        <w:ind w:left="3600" w:hanging="360"/>
+      </w:pPr>
+      <w:rPr>
+        <w:rFonts w:ascii="Wingdings" w:hAnsi="Wingdings" w:hint="default"/>
+        <w:sz w:val="20"/>
+      </w:rPr>
+    </w:lvl>
+    <w:lvl w:ilvl="5" w:tentative="1">
+      <w:start w:val="1"/>
+      <w:numFmt w:val="bullet"/>
+      <w:lvlText w:val=""/>
+      <w:lvlJc w:val="left"/>
+      <w:pPr>
+        <w:tabs>
+          <w:tab w:val="num" w:pos="4320"/>
+        </w:tabs>
+        <w:ind w:left="4320" w:hanging="360"/>
+      </w:pPr>
+      <w:rPr>
+        <w:rFonts w:ascii="Wingdings" w:hAnsi="Wingdings" w:hint="default"/>
+        <w:sz w:val="20"/>
+      </w:rPr>
+    </w:lvl>
+    <w:lvl w:ilvl="6" w:tentative="1">
+      <w:start w:val="1"/>
+      <w:numFmt w:val="bullet"/>
+      <w:lvlText w:val=""/>
+      <w:lvlJc w:val="left"/>
+      <w:pPr>
+        <w:tabs>
+          <w:tab w:val="num" w:pos="5040"/>
+        </w:tabs>
+        <w:ind w:left="5040" w:hanging="360"/>
+      </w:pPr>
+      <w:rPr>
+        <w:rFonts w:ascii="Wingdings" w:hAnsi="Wingdings" w:hint="default"/>
+        <w:sz w:val="20"/>
+      </w:rPr>
+    </w:lvl>
+    <w:lvl w:ilvl="7" w:tentative="1">
+      <w:start w:val="1"/>
+      <w:numFmt w:val="bullet"/>
+      <w:lvlText w:val=""/>
+      <w:lvlJc w:val="left"/>
+      <w:pPr>
+        <w:tabs>
+          <w:tab w:val="num" w:pos="5760"/>
+        </w:tabs>
+        <w:ind w:left="5760" w:hanging="360"/>
+      </w:pPr>
+      <w:rPr>
+        <w:rFonts w:ascii="Wingdings" w:hAnsi="Wingdings" w:hint="default"/>
+        <w:sz w:val="20"/>
+      </w:rPr>
+    </w:lvl>
+    <w:lvl w:ilvl="8" w:tentative="1">
+      <w:start w:val="1"/>
+      <w:numFmt w:val="bullet"/>
+      <w:lvlText w:val=""/>
+      <w:lvlJc w:val="left"/>
+      <w:pPr>
+        <w:tabs>
+          <w:tab w:val="num" w:pos="6480"/>
+        </w:tabs>
+        <w:ind w:left="6480" w:hanging="360"/>
+      </w:pPr>
+      <w:rPr>
+        <w:rFonts w:ascii="Wingdings" w:hAnsi="Wingdings" w:hint="default"/>
+        <w:sz w:val="20"/>
+      </w:rPr>
+    </w:lvl>
+  </w:abstractNum>
+  <w:abstractNum w:abstractNumId="33" w15:restartNumberingAfterBreak="0">
+    <w:nsid w:val="7D0448E6"/>
+    <w:multiLevelType w:val="multilevel"/>
+    <w:tmpl w:val="BD18E44C"/>
     <w:lvl w:ilvl="0">
       <w:start w:val="1"/>
       <w:numFmt w:val="bullet"/>
@@ -12749,6 +13315,9 @@
   </w:num>
   <w:num w:numId="33" w16cid:durableId="1602571387">
     <w:abstractNumId w:val="32"/>
+  </w:num>
+  <w:num w:numId="34" w16cid:durableId="1750231285">
+    <w:abstractNumId w:val="33"/>
   </w:num>
 </w:numbering>
 </file>

</xml_diff>

<commit_message>
feat: implementar RequiredFieldValidator de ASP.NET en perfil. - Configuración del Web.config (ValidationSettings:UnobtrusiveValidationMode en None) para permitir el uso de validadores clásicos de ASP.NET sin dependencias externas de jQuery. - Integración de RequiredFieldValidator en MiPerfil.aspx para la validación del campo Nombre en el Front-End. - Implementación de Page.Validate() y verificación condicional de Page.IsValid en el evento btnGuardar_Click para abortar la ejecución hacia la base de datos en caso de invalidación. - Mejora de UI añadiendo indicación visual preventiva (asterisco rojo) para campos obligatorios.
</commit_message>
<xml_diff>
--- a/Unidad 5 - Pokedex Web/Documentación de Pokedex.docx
+++ b/Unidad 5 - Pokedex Web/Documentación de Pokedex.docx
@@ -10065,6 +10065,423 @@
       <w:proofErr w:type="spellEnd"/>
       <w:r>
         <w:t xml:space="preserve"> antes de redirigir, y recuperarlo al volver a cargar la pantalla.</w:t>
+      </w:r>
+    </w:p>
+    <w:p/>
+    <w:p>
+      <w:r>
+        <w:rPr>
+          <w:b/>
+          <w:bCs/>
+        </w:rPr>
+        <w:t xml:space="preserve">TEMA: ASP.NET </w:t>
+      </w:r>
+      <w:proofErr w:type="spellStart"/>
+      <w:r>
+        <w:rPr>
+          <w:b/>
+          <w:bCs/>
+        </w:rPr>
+        <w:t>Validators</w:t>
+      </w:r>
+      <w:proofErr w:type="spellEnd"/>
+      <w:r>
+        <w:rPr>
+          <w:b/>
+          <w:bCs/>
+        </w:rPr>
+        <w:t xml:space="preserve"> y </w:t>
+      </w:r>
+      <w:proofErr w:type="spellStart"/>
+      <w:r>
+        <w:rPr>
+          <w:b/>
+          <w:bCs/>
+        </w:rPr>
+        <w:t>Unobtrusive</w:t>
+      </w:r>
+      <w:proofErr w:type="spellEnd"/>
+      <w:r>
+        <w:rPr>
+          <w:b/>
+          <w:bCs/>
+        </w:rPr>
+        <w:t xml:space="preserve"> </w:t>
+      </w:r>
+      <w:proofErr w:type="spellStart"/>
+      <w:r>
+        <w:rPr>
+          <w:b/>
+          <w:bCs/>
+        </w:rPr>
+        <w:t>Validation</w:t>
+      </w:r>
+      <w:proofErr w:type="spellEnd"/>
+    </w:p>
+    <w:p>
+      <w:pPr>
+        <w:numPr>
+          <w:ilvl w:val="0"/>
+          <w:numId w:val="42"/>
+        </w:numPr>
+      </w:pPr>
+      <w:r>
+        <w:rPr>
+          <w:b/>
+          <w:bCs/>
+        </w:rPr>
+        <w:t xml:space="preserve">¿Qué son los ASP </w:t>
+      </w:r>
+      <w:proofErr w:type="spellStart"/>
+      <w:r>
+        <w:rPr>
+          <w:b/>
+          <w:bCs/>
+        </w:rPr>
+        <w:t>Validators</w:t>
+      </w:r>
+      <w:proofErr w:type="spellEnd"/>
+      <w:r>
+        <w:rPr>
+          <w:b/>
+          <w:bCs/>
+        </w:rPr>
+        <w:t>?</w:t>
+      </w:r>
+      <w:r>
+        <w:t xml:space="preserve"> Son controles de servidor (tienen </w:t>
+      </w:r>
+      <w:proofErr w:type="spellStart"/>
+      <w:r>
+        <w:t>runat</w:t>
+      </w:r>
+      <w:proofErr w:type="spellEnd"/>
+      <w:r>
+        <w:t xml:space="preserve">="server") diseñados exclusivamente para evaluar otros controles (ej. un </w:t>
+      </w:r>
+      <w:proofErr w:type="spellStart"/>
+      <w:r>
+        <w:t>TextBox</w:t>
+      </w:r>
+      <w:proofErr w:type="spellEnd"/>
+      <w:r>
+        <w:t>). Tienen la ventaja de generar automáticamente el JavaScript necesario para validar en el Front-</w:t>
+      </w:r>
+      <w:proofErr w:type="spellStart"/>
+      <w:r>
+        <w:t>End</w:t>
+      </w:r>
+      <w:proofErr w:type="spellEnd"/>
+      <w:r>
+        <w:t xml:space="preserve"> (navegador) y también validan en el Back-</w:t>
+      </w:r>
+      <w:proofErr w:type="spellStart"/>
+      <w:r>
+        <w:t>End</w:t>
+      </w:r>
+      <w:proofErr w:type="spellEnd"/>
+      <w:r>
+        <w:t xml:space="preserve"> (servidor) por seguridad.</w:t>
+      </w:r>
+    </w:p>
+    <w:p>
+      <w:pPr>
+        <w:numPr>
+          <w:ilvl w:val="0"/>
+          <w:numId w:val="42"/>
+        </w:numPr>
+      </w:pPr>
+      <w:proofErr w:type="spellStart"/>
+      <w:r>
+        <w:rPr>
+          <w:b/>
+          <w:bCs/>
+        </w:rPr>
+        <w:t>RequiredFieldValidator</w:t>
+      </w:r>
+      <w:proofErr w:type="spellEnd"/>
+      <w:r>
+        <w:rPr>
+          <w:b/>
+          <w:bCs/>
+        </w:rPr>
+        <w:t>:</w:t>
+      </w:r>
+      <w:r>
+        <w:t xml:space="preserve"> Es el validador más básico. Solo verifica que el control asignado (</w:t>
+      </w:r>
+      <w:proofErr w:type="spellStart"/>
+      <w:r>
+        <w:t>ControlToValidate</w:t>
+      </w:r>
+      <w:proofErr w:type="spellEnd"/>
+      <w:r>
+        <w:t>) no esté vacío.</w:t>
+      </w:r>
+    </w:p>
+    <w:p>
+      <w:pPr>
+        <w:numPr>
+          <w:ilvl w:val="0"/>
+          <w:numId w:val="42"/>
+        </w:numPr>
+      </w:pPr>
+      <w:r>
+        <w:rPr>
+          <w:b/>
+          <w:bCs/>
+        </w:rPr>
+        <w:t xml:space="preserve">El Problema del </w:t>
+      </w:r>
+      <w:proofErr w:type="spellStart"/>
+      <w:r>
+        <w:rPr>
+          <w:b/>
+          <w:bCs/>
+          <w:i/>
+          <w:iCs/>
+        </w:rPr>
+        <w:t>Unobtrusive</w:t>
+      </w:r>
+      <w:proofErr w:type="spellEnd"/>
+      <w:r>
+        <w:rPr>
+          <w:b/>
+          <w:bCs/>
+          <w:i/>
+          <w:iCs/>
+        </w:rPr>
+        <w:t xml:space="preserve"> </w:t>
+      </w:r>
+      <w:proofErr w:type="spellStart"/>
+      <w:r>
+        <w:rPr>
+          <w:b/>
+          <w:bCs/>
+          <w:i/>
+          <w:iCs/>
+        </w:rPr>
+        <w:t>Validation</w:t>
+      </w:r>
+      <w:proofErr w:type="spellEnd"/>
+      <w:r>
+        <w:rPr>
+          <w:b/>
+          <w:bCs/>
+          <w:i/>
+          <w:iCs/>
+        </w:rPr>
+        <w:t xml:space="preserve"> </w:t>
+      </w:r>
+      <w:proofErr w:type="spellStart"/>
+      <w:r>
+        <w:rPr>
+          <w:b/>
+          <w:bCs/>
+          <w:i/>
+          <w:iCs/>
+        </w:rPr>
+        <w:t>Mode</w:t>
+      </w:r>
+      <w:proofErr w:type="spellEnd"/>
+      <w:r>
+        <w:rPr>
+          <w:b/>
+          <w:bCs/>
+        </w:rPr>
+        <w:t>:</w:t>
+      </w:r>
+      <w:r>
+        <w:t xml:space="preserve"> En versiones de .NET Framework 4.5 en adelante, Microsoft intentó optimizar cómo se inyecta el JavaScript de estos validadores (haciéndolo "discreto" o centralizado). Si el proyecto no tiene configurada una librería central de JavaScript (como jQuery), la aplicación explota.</w:t>
+      </w:r>
+    </w:p>
+    <w:p>
+      <w:pPr>
+        <w:numPr>
+          <w:ilvl w:val="1"/>
+          <w:numId w:val="42"/>
+        </w:numPr>
+      </w:pPr>
+      <w:r>
+        <w:rPr>
+          <w:b/>
+          <w:bCs/>
+        </w:rPr>
+        <w:t>Solución 1 (Recomendada para proyectos chicos):</w:t>
+      </w:r>
+      <w:r>
+        <w:t xml:space="preserve"> Desactivar esta optimización agregando &lt;</w:t>
+      </w:r>
+      <w:proofErr w:type="spellStart"/>
+      <w:r>
+        <w:t>add</w:t>
+      </w:r>
+      <w:proofErr w:type="spellEnd"/>
+      <w:r>
+        <w:t xml:space="preserve"> </w:t>
+      </w:r>
+      <w:proofErr w:type="spellStart"/>
+      <w:r>
+        <w:t>key</w:t>
+      </w:r>
+      <w:proofErr w:type="spellEnd"/>
+      <w:r>
+        <w:t>="</w:t>
+      </w:r>
+      <w:proofErr w:type="spellStart"/>
+      <w:proofErr w:type="gramStart"/>
+      <w:r>
+        <w:t>ValidationSettings:UnobtrusiveValidationMode</w:t>
+      </w:r>
+      <w:proofErr w:type="spellEnd"/>
+      <w:proofErr w:type="gramEnd"/>
+      <w:r>
+        <w:t xml:space="preserve">" </w:t>
+      </w:r>
+      <w:proofErr w:type="spellStart"/>
+      <w:r>
+        <w:t>value</w:t>
+      </w:r>
+      <w:proofErr w:type="spellEnd"/>
+      <w:r>
+        <w:t>="</w:t>
+      </w:r>
+      <w:proofErr w:type="spellStart"/>
+      <w:r>
+        <w:t>None</w:t>
+      </w:r>
+      <w:proofErr w:type="spellEnd"/>
+      <w:r>
+        <w:t xml:space="preserve">" /&gt; en el </w:t>
+      </w:r>
+      <w:proofErr w:type="spellStart"/>
+      <w:r>
+        <w:t>Web.config</w:t>
+      </w:r>
+      <w:proofErr w:type="spellEnd"/>
+      <w:r>
+        <w:t>.</w:t>
+      </w:r>
+    </w:p>
+    <w:p>
+      <w:pPr>
+        <w:numPr>
+          <w:ilvl w:val="1"/>
+          <w:numId w:val="42"/>
+        </w:numPr>
+      </w:pPr>
+      <w:r>
+        <w:rPr>
+          <w:b/>
+          <w:bCs/>
+        </w:rPr>
+        <w:t>Solución 2:</w:t>
+      </w:r>
+      <w:r>
+        <w:t xml:space="preserve"> Registrar una CDN de jQuery en el </w:t>
+      </w:r>
+      <w:proofErr w:type="spellStart"/>
+      <w:r>
+        <w:t>Global.asax</w:t>
+      </w:r>
+      <w:proofErr w:type="spellEnd"/>
+      <w:r>
+        <w:t>.</w:t>
+      </w:r>
+    </w:p>
+    <w:p>
+      <w:pPr>
+        <w:numPr>
+          <w:ilvl w:val="0"/>
+          <w:numId w:val="42"/>
+        </w:numPr>
+      </w:pPr>
+      <w:r>
+        <w:rPr>
+          <w:b/>
+          <w:bCs/>
+        </w:rPr>
+        <w:t xml:space="preserve">Validación en </w:t>
+      </w:r>
+      <w:proofErr w:type="spellStart"/>
+      <w:r>
+        <w:rPr>
+          <w:b/>
+          <w:bCs/>
+        </w:rPr>
+        <w:t>Code-Behind</w:t>
+      </w:r>
+      <w:proofErr w:type="spellEnd"/>
+      <w:r>
+        <w:rPr>
+          <w:b/>
+          <w:bCs/>
+        </w:rPr>
+        <w:t xml:space="preserve"> (</w:t>
+      </w:r>
+      <w:proofErr w:type="spellStart"/>
+      <w:r>
+        <w:rPr>
+          <w:b/>
+          <w:bCs/>
+        </w:rPr>
+        <w:t>Page.IsValid</w:t>
+      </w:r>
+      <w:proofErr w:type="spellEnd"/>
+      <w:r>
+        <w:rPr>
+          <w:b/>
+          <w:bCs/>
+        </w:rPr>
+        <w:t>):</w:t>
+      </w:r>
+      <w:r>
+        <w:t xml:space="preserve"> Aunque el validador ASP bloquee la acción en el navegador usando JavaScript, siempre se debe </w:t>
+      </w:r>
+      <w:proofErr w:type="spellStart"/>
+      <w:r>
+        <w:t>re-validar</w:t>
+      </w:r>
+      <w:proofErr w:type="spellEnd"/>
+      <w:r>
+        <w:t xml:space="preserve"> en el servidor por seguridad (por si el usuario desactivó JS). Esto se hace ejecutando </w:t>
+      </w:r>
+      <w:proofErr w:type="spellStart"/>
+      <w:r>
+        <w:t>Page.Validate</w:t>
+      </w:r>
+      <w:proofErr w:type="spellEnd"/>
+      <w:r>
+        <w:t xml:space="preserve">() y luego preguntando </w:t>
+      </w:r>
+      <w:proofErr w:type="spellStart"/>
+      <w:r>
+        <w:t>if</w:t>
+      </w:r>
+      <w:proofErr w:type="spellEnd"/>
+      <w:r>
+        <w:t xml:space="preserve"> </w:t>
+      </w:r>
+      <w:proofErr w:type="gramStart"/>
+      <w:r>
+        <w:t>(!</w:t>
+      </w:r>
+      <w:proofErr w:type="spellStart"/>
+      <w:r>
+        <w:t>Page.IsValid</w:t>
+      </w:r>
+      <w:proofErr w:type="spellEnd"/>
+      <w:proofErr w:type="gramEnd"/>
+      <w:r>
+        <w:t xml:space="preserve">) al principio del evento (ej. en el clic de Guardar). Si la página no es válida, se utiliza </w:t>
+      </w:r>
+      <w:proofErr w:type="spellStart"/>
+      <w:r>
+        <w:t>return</w:t>
+      </w:r>
+      <w:proofErr w:type="spellEnd"/>
+      <w:r>
+        <w:t>; para abortar la ejecución del método y evitar viajes inútiles a la base de datos.</w:t>
       </w:r>
     </w:p>
     <w:p>
@@ -10676,6 +11093,155 @@
     </w:lvl>
   </w:abstractNum>
   <w:abstractNum w:abstractNumId="4" w15:restartNumberingAfterBreak="0">
+    <w:nsid w:val="09DE2918"/>
+    <w:multiLevelType w:val="multilevel"/>
+    <w:tmpl w:val="700A892E"/>
+    <w:lvl w:ilvl="0">
+      <w:start w:val="1"/>
+      <w:numFmt w:val="bullet"/>
+      <w:lvlText w:val=""/>
+      <w:lvlJc w:val="left"/>
+      <w:pPr>
+        <w:tabs>
+          <w:tab w:val="num" w:pos="720"/>
+        </w:tabs>
+        <w:ind w:left="720" w:hanging="360"/>
+      </w:pPr>
+      <w:rPr>
+        <w:rFonts w:ascii="Symbol" w:hAnsi="Symbol" w:hint="default"/>
+        <w:sz w:val="20"/>
+      </w:rPr>
+    </w:lvl>
+    <w:lvl w:ilvl="1">
+      <w:start w:val="1"/>
+      <w:numFmt w:val="bullet"/>
+      <w:lvlText w:val="o"/>
+      <w:lvlJc w:val="left"/>
+      <w:pPr>
+        <w:tabs>
+          <w:tab w:val="num" w:pos="1440"/>
+        </w:tabs>
+        <w:ind w:left="1440" w:hanging="360"/>
+      </w:pPr>
+      <w:rPr>
+        <w:rFonts w:ascii="Courier New" w:hAnsi="Courier New" w:hint="default"/>
+        <w:sz w:val="20"/>
+      </w:rPr>
+    </w:lvl>
+    <w:lvl w:ilvl="2" w:tentative="1">
+      <w:start w:val="1"/>
+      <w:numFmt w:val="bullet"/>
+      <w:lvlText w:val=""/>
+      <w:lvlJc w:val="left"/>
+      <w:pPr>
+        <w:tabs>
+          <w:tab w:val="num" w:pos="2160"/>
+        </w:tabs>
+        <w:ind w:left="2160" w:hanging="360"/>
+      </w:pPr>
+      <w:rPr>
+        <w:rFonts w:ascii="Wingdings" w:hAnsi="Wingdings" w:hint="default"/>
+        <w:sz w:val="20"/>
+      </w:rPr>
+    </w:lvl>
+    <w:lvl w:ilvl="3" w:tentative="1">
+      <w:start w:val="1"/>
+      <w:numFmt w:val="bullet"/>
+      <w:lvlText w:val=""/>
+      <w:lvlJc w:val="left"/>
+      <w:pPr>
+        <w:tabs>
+          <w:tab w:val="num" w:pos="2880"/>
+        </w:tabs>
+        <w:ind w:left="2880" w:hanging="360"/>
+      </w:pPr>
+      <w:rPr>
+        <w:rFonts w:ascii="Wingdings" w:hAnsi="Wingdings" w:hint="default"/>
+        <w:sz w:val="20"/>
+      </w:rPr>
+    </w:lvl>
+    <w:lvl w:ilvl="4" w:tentative="1">
+      <w:start w:val="1"/>
+      <w:numFmt w:val="bullet"/>
+      <w:lvlText w:val=""/>
+      <w:lvlJc w:val="left"/>
+      <w:pPr>
+        <w:tabs>
+          <w:tab w:val="num" w:pos="3600"/>
+        </w:tabs>
+        <w:ind w:left="3600" w:hanging="360"/>
+      </w:pPr>
+      <w:rPr>
+        <w:rFonts w:ascii="Wingdings" w:hAnsi="Wingdings" w:hint="default"/>
+        <w:sz w:val="20"/>
+      </w:rPr>
+    </w:lvl>
+    <w:lvl w:ilvl="5" w:tentative="1">
+      <w:start w:val="1"/>
+      <w:numFmt w:val="bullet"/>
+      <w:lvlText w:val=""/>
+      <w:lvlJc w:val="left"/>
+      <w:pPr>
+        <w:tabs>
+          <w:tab w:val="num" w:pos="4320"/>
+        </w:tabs>
+        <w:ind w:left="4320" w:hanging="360"/>
+      </w:pPr>
+      <w:rPr>
+        <w:rFonts w:ascii="Wingdings" w:hAnsi="Wingdings" w:hint="default"/>
+        <w:sz w:val="20"/>
+      </w:rPr>
+    </w:lvl>
+    <w:lvl w:ilvl="6" w:tentative="1">
+      <w:start w:val="1"/>
+      <w:numFmt w:val="bullet"/>
+      <w:lvlText w:val=""/>
+      <w:lvlJc w:val="left"/>
+      <w:pPr>
+        <w:tabs>
+          <w:tab w:val="num" w:pos="5040"/>
+        </w:tabs>
+        <w:ind w:left="5040" w:hanging="360"/>
+      </w:pPr>
+      <w:rPr>
+        <w:rFonts w:ascii="Wingdings" w:hAnsi="Wingdings" w:hint="default"/>
+        <w:sz w:val="20"/>
+      </w:rPr>
+    </w:lvl>
+    <w:lvl w:ilvl="7" w:tentative="1">
+      <w:start w:val="1"/>
+      <w:numFmt w:val="bullet"/>
+      <w:lvlText w:val=""/>
+      <w:lvlJc w:val="left"/>
+      <w:pPr>
+        <w:tabs>
+          <w:tab w:val="num" w:pos="5760"/>
+        </w:tabs>
+        <w:ind w:left="5760" w:hanging="360"/>
+      </w:pPr>
+      <w:rPr>
+        <w:rFonts w:ascii="Wingdings" w:hAnsi="Wingdings" w:hint="default"/>
+        <w:sz w:val="20"/>
+      </w:rPr>
+    </w:lvl>
+    <w:lvl w:ilvl="8" w:tentative="1">
+      <w:start w:val="1"/>
+      <w:numFmt w:val="bullet"/>
+      <w:lvlText w:val=""/>
+      <w:lvlJc w:val="left"/>
+      <w:pPr>
+        <w:tabs>
+          <w:tab w:val="num" w:pos="6480"/>
+        </w:tabs>
+        <w:ind w:left="6480" w:hanging="360"/>
+      </w:pPr>
+      <w:rPr>
+        <w:rFonts w:ascii="Wingdings" w:hAnsi="Wingdings" w:hint="default"/>
+        <w:sz w:val="20"/>
+      </w:rPr>
+    </w:lvl>
+  </w:abstractNum>
+  <w:abstractNum w:abstractNumId="5" w15:restartNumberingAfterBreak="0">
     <w:nsid w:val="0ACD07DE"/>
     <w:multiLevelType w:val="multilevel"/>
     <w:tmpl w:val="DD209A82"/>
@@ -10824,7 +11390,7 @@
       </w:rPr>
     </w:lvl>
   </w:abstractNum>
-  <w:abstractNum w:abstractNumId="5" w15:restartNumberingAfterBreak="0">
+  <w:abstractNum w:abstractNumId="6" w15:restartNumberingAfterBreak="0">
     <w:nsid w:val="1A9C0DB3"/>
     <w:multiLevelType w:val="multilevel"/>
     <w:tmpl w:val="99E0C8C8"/>
@@ -10973,7 +11539,7 @@
       </w:rPr>
     </w:lvl>
   </w:abstractNum>
-  <w:abstractNum w:abstractNumId="6" w15:restartNumberingAfterBreak="0">
+  <w:abstractNum w:abstractNumId="7" w15:restartNumberingAfterBreak="0">
     <w:nsid w:val="1E2F16BF"/>
     <w:multiLevelType w:val="multilevel"/>
     <w:tmpl w:val="B8DEC6BE"/>
@@ -11122,7 +11688,7 @@
       </w:rPr>
     </w:lvl>
   </w:abstractNum>
-  <w:abstractNum w:abstractNumId="7" w15:restartNumberingAfterBreak="0">
+  <w:abstractNum w:abstractNumId="8" w15:restartNumberingAfterBreak="0">
     <w:nsid w:val="280324FF"/>
     <w:multiLevelType w:val="multilevel"/>
     <w:tmpl w:val="E4EE3730"/>
@@ -11271,7 +11837,7 @@
       </w:rPr>
     </w:lvl>
   </w:abstractNum>
-  <w:abstractNum w:abstractNumId="8" w15:restartNumberingAfterBreak="0">
+  <w:abstractNum w:abstractNumId="9" w15:restartNumberingAfterBreak="0">
     <w:nsid w:val="291F3F07"/>
     <w:multiLevelType w:val="multilevel"/>
     <w:tmpl w:val="6ED8BA0A"/>
@@ -11420,7 +11986,7 @@
       </w:rPr>
     </w:lvl>
   </w:abstractNum>
-  <w:abstractNum w:abstractNumId="9" w15:restartNumberingAfterBreak="0">
+  <w:abstractNum w:abstractNumId="10" w15:restartNumberingAfterBreak="0">
     <w:nsid w:val="30C06DE2"/>
     <w:multiLevelType w:val="multilevel"/>
     <w:tmpl w:val="865873C0"/>
@@ -11569,7 +12135,7 @@
       </w:rPr>
     </w:lvl>
   </w:abstractNum>
-  <w:abstractNum w:abstractNumId="10" w15:restartNumberingAfterBreak="0">
+  <w:abstractNum w:abstractNumId="11" w15:restartNumberingAfterBreak="0">
     <w:nsid w:val="365F1960"/>
     <w:multiLevelType w:val="multilevel"/>
     <w:tmpl w:val="4CA4C0FA"/>
@@ -11718,7 +12284,7 @@
       </w:rPr>
     </w:lvl>
   </w:abstractNum>
-  <w:abstractNum w:abstractNumId="11" w15:restartNumberingAfterBreak="0">
+  <w:abstractNum w:abstractNumId="12" w15:restartNumberingAfterBreak="0">
     <w:nsid w:val="376B325C"/>
     <w:multiLevelType w:val="multilevel"/>
     <w:tmpl w:val="85C0A918"/>
@@ -11867,7 +12433,7 @@
       </w:rPr>
     </w:lvl>
   </w:abstractNum>
-  <w:abstractNum w:abstractNumId="12" w15:restartNumberingAfterBreak="0">
+  <w:abstractNum w:abstractNumId="13" w15:restartNumberingAfterBreak="0">
     <w:nsid w:val="3C320E2E"/>
     <w:multiLevelType w:val="multilevel"/>
     <w:tmpl w:val="6396FB1C"/>
@@ -12012,7 +12578,7 @@
       </w:rPr>
     </w:lvl>
   </w:abstractNum>
-  <w:abstractNum w:abstractNumId="13" w15:restartNumberingAfterBreak="0">
+  <w:abstractNum w:abstractNumId="14" w15:restartNumberingAfterBreak="0">
     <w:nsid w:val="3DDF61CA"/>
     <w:multiLevelType w:val="multilevel"/>
     <w:tmpl w:val="ABFC856E"/>
@@ -12161,7 +12727,7 @@
       </w:rPr>
     </w:lvl>
   </w:abstractNum>
-  <w:abstractNum w:abstractNumId="14" w15:restartNumberingAfterBreak="0">
+  <w:abstractNum w:abstractNumId="15" w15:restartNumberingAfterBreak="0">
     <w:nsid w:val="3EC2497A"/>
     <w:multiLevelType w:val="multilevel"/>
     <w:tmpl w:val="038669AA"/>
@@ -12310,7 +12876,7 @@
       </w:rPr>
     </w:lvl>
   </w:abstractNum>
-  <w:abstractNum w:abstractNumId="15" w15:restartNumberingAfterBreak="0">
+  <w:abstractNum w:abstractNumId="16" w15:restartNumberingAfterBreak="0">
     <w:nsid w:val="43D6285F"/>
     <w:multiLevelType w:val="multilevel"/>
     <w:tmpl w:val="0CF470C0"/>
@@ -12459,7 +13025,7 @@
       </w:rPr>
     </w:lvl>
   </w:abstractNum>
-  <w:abstractNum w:abstractNumId="16" w15:restartNumberingAfterBreak="0">
+  <w:abstractNum w:abstractNumId="17" w15:restartNumberingAfterBreak="0">
     <w:nsid w:val="44F82DB6"/>
     <w:multiLevelType w:val="multilevel"/>
     <w:tmpl w:val="B590C8E6"/>
@@ -12608,7 +13174,7 @@
       </w:rPr>
     </w:lvl>
   </w:abstractNum>
-  <w:abstractNum w:abstractNumId="17" w15:restartNumberingAfterBreak="0">
+  <w:abstractNum w:abstractNumId="18" w15:restartNumberingAfterBreak="0">
     <w:nsid w:val="45FE6ABD"/>
     <w:multiLevelType w:val="multilevel"/>
     <w:tmpl w:val="1F9611C0"/>
@@ -12757,7 +13323,7 @@
       </w:rPr>
     </w:lvl>
   </w:abstractNum>
-  <w:abstractNum w:abstractNumId="18" w15:restartNumberingAfterBreak="0">
+  <w:abstractNum w:abstractNumId="19" w15:restartNumberingAfterBreak="0">
     <w:nsid w:val="478C0246"/>
     <w:multiLevelType w:val="multilevel"/>
     <w:tmpl w:val="A904AB1E"/>
@@ -12906,7 +13472,7 @@
       </w:rPr>
     </w:lvl>
   </w:abstractNum>
-  <w:abstractNum w:abstractNumId="19" w15:restartNumberingAfterBreak="0">
+  <w:abstractNum w:abstractNumId="20" w15:restartNumberingAfterBreak="0">
     <w:nsid w:val="47A256AC"/>
     <w:multiLevelType w:val="multilevel"/>
     <w:tmpl w:val="94784BE8"/>
@@ -13055,7 +13621,7 @@
       </w:rPr>
     </w:lvl>
   </w:abstractNum>
-  <w:abstractNum w:abstractNumId="20" w15:restartNumberingAfterBreak="0">
+  <w:abstractNum w:abstractNumId="21" w15:restartNumberingAfterBreak="0">
     <w:nsid w:val="496B4294"/>
     <w:multiLevelType w:val="multilevel"/>
     <w:tmpl w:val="EEAAA56C"/>
@@ -13204,7 +13770,7 @@
       </w:rPr>
     </w:lvl>
   </w:abstractNum>
-  <w:abstractNum w:abstractNumId="21" w15:restartNumberingAfterBreak="0">
+  <w:abstractNum w:abstractNumId="22" w15:restartNumberingAfterBreak="0">
     <w:nsid w:val="4A81710A"/>
     <w:multiLevelType w:val="multilevel"/>
     <w:tmpl w:val="9A424194"/>
@@ -13317,7 +13883,7 @@
       </w:pPr>
     </w:lvl>
   </w:abstractNum>
-  <w:abstractNum w:abstractNumId="22" w15:restartNumberingAfterBreak="0">
+  <w:abstractNum w:abstractNumId="23" w15:restartNumberingAfterBreak="0">
     <w:nsid w:val="4C5B7A63"/>
     <w:multiLevelType w:val="multilevel"/>
     <w:tmpl w:val="0E2AA2F4"/>
@@ -13466,7 +14032,7 @@
       </w:rPr>
     </w:lvl>
   </w:abstractNum>
-  <w:abstractNum w:abstractNumId="23" w15:restartNumberingAfterBreak="0">
+  <w:abstractNum w:abstractNumId="24" w15:restartNumberingAfterBreak="0">
     <w:nsid w:val="4CF22BBC"/>
     <w:multiLevelType w:val="multilevel"/>
     <w:tmpl w:val="F10638AA"/>
@@ -13615,7 +14181,7 @@
       </w:rPr>
     </w:lvl>
   </w:abstractNum>
-  <w:abstractNum w:abstractNumId="24" w15:restartNumberingAfterBreak="0">
+  <w:abstractNum w:abstractNumId="25" w15:restartNumberingAfterBreak="0">
     <w:nsid w:val="54D116A9"/>
     <w:multiLevelType w:val="multilevel"/>
     <w:tmpl w:val="170CA37A"/>
@@ -13764,7 +14330,7 @@
       </w:rPr>
     </w:lvl>
   </w:abstractNum>
-  <w:abstractNum w:abstractNumId="25" w15:restartNumberingAfterBreak="0">
+  <w:abstractNum w:abstractNumId="26" w15:restartNumberingAfterBreak="0">
     <w:nsid w:val="54E51710"/>
     <w:multiLevelType w:val="multilevel"/>
     <w:tmpl w:val="0BA86E48"/>
@@ -13913,7 +14479,7 @@
       </w:rPr>
     </w:lvl>
   </w:abstractNum>
-  <w:abstractNum w:abstractNumId="26" w15:restartNumberingAfterBreak="0">
+  <w:abstractNum w:abstractNumId="27" w15:restartNumberingAfterBreak="0">
     <w:nsid w:val="5AFF2E8D"/>
     <w:multiLevelType w:val="multilevel"/>
     <w:tmpl w:val="00E82A94"/>
@@ -14062,7 +14628,7 @@
       </w:rPr>
     </w:lvl>
   </w:abstractNum>
-  <w:abstractNum w:abstractNumId="27" w15:restartNumberingAfterBreak="0">
+  <w:abstractNum w:abstractNumId="28" w15:restartNumberingAfterBreak="0">
     <w:nsid w:val="5C491D25"/>
     <w:multiLevelType w:val="multilevel"/>
     <w:tmpl w:val="83B68182"/>
@@ -14211,7 +14777,7 @@
       </w:rPr>
     </w:lvl>
   </w:abstractNum>
-  <w:abstractNum w:abstractNumId="28" w15:restartNumberingAfterBreak="0">
+  <w:abstractNum w:abstractNumId="29" w15:restartNumberingAfterBreak="0">
     <w:nsid w:val="5D612526"/>
     <w:multiLevelType w:val="multilevel"/>
     <w:tmpl w:val="DB62DC76"/>
@@ -14360,7 +14926,7 @@
       </w:rPr>
     </w:lvl>
   </w:abstractNum>
-  <w:abstractNum w:abstractNumId="29" w15:restartNumberingAfterBreak="0">
+  <w:abstractNum w:abstractNumId="30" w15:restartNumberingAfterBreak="0">
     <w:nsid w:val="63FC054C"/>
     <w:multiLevelType w:val="multilevel"/>
     <w:tmpl w:val="D00A9D0A"/>
@@ -14505,7 +15071,7 @@
       </w:rPr>
     </w:lvl>
   </w:abstractNum>
-  <w:abstractNum w:abstractNumId="30" w15:restartNumberingAfterBreak="0">
+  <w:abstractNum w:abstractNumId="31" w15:restartNumberingAfterBreak="0">
     <w:nsid w:val="652D28C6"/>
     <w:multiLevelType w:val="multilevel"/>
     <w:tmpl w:val="C2969030"/>
@@ -14654,7 +15220,7 @@
       </w:rPr>
     </w:lvl>
   </w:abstractNum>
-  <w:abstractNum w:abstractNumId="31" w15:restartNumberingAfterBreak="0">
+  <w:abstractNum w:abstractNumId="32" w15:restartNumberingAfterBreak="0">
     <w:nsid w:val="69221DCE"/>
     <w:multiLevelType w:val="multilevel"/>
     <w:tmpl w:val="3C58754E"/>
@@ -14803,7 +15369,7 @@
       </w:rPr>
     </w:lvl>
   </w:abstractNum>
-  <w:abstractNum w:abstractNumId="32" w15:restartNumberingAfterBreak="0">
+  <w:abstractNum w:abstractNumId="33" w15:restartNumberingAfterBreak="0">
     <w:nsid w:val="6DBF7670"/>
     <w:multiLevelType w:val="multilevel"/>
     <w:tmpl w:val="CC963EBA"/>
@@ -14952,7 +15518,7 @@
       </w:rPr>
     </w:lvl>
   </w:abstractNum>
-  <w:abstractNum w:abstractNumId="33" w15:restartNumberingAfterBreak="0">
+  <w:abstractNum w:abstractNumId="34" w15:restartNumberingAfterBreak="0">
     <w:nsid w:val="6F4C7C29"/>
     <w:multiLevelType w:val="multilevel"/>
     <w:tmpl w:val="0CC08082"/>
@@ -15065,7 +15631,7 @@
       </w:pPr>
     </w:lvl>
   </w:abstractNum>
-  <w:abstractNum w:abstractNumId="34" w15:restartNumberingAfterBreak="0">
+  <w:abstractNum w:abstractNumId="35" w15:restartNumberingAfterBreak="0">
     <w:nsid w:val="71B169B8"/>
     <w:multiLevelType w:val="multilevel"/>
     <w:tmpl w:val="124416DC"/>
@@ -15210,7 +15776,7 @@
       </w:rPr>
     </w:lvl>
   </w:abstractNum>
-  <w:abstractNum w:abstractNumId="35" w15:restartNumberingAfterBreak="0">
+  <w:abstractNum w:abstractNumId="36" w15:restartNumberingAfterBreak="0">
     <w:nsid w:val="71DD7274"/>
     <w:multiLevelType w:val="multilevel"/>
     <w:tmpl w:val="2C645D04"/>
@@ -15323,7 +15889,7 @@
       </w:pPr>
     </w:lvl>
   </w:abstractNum>
-  <w:abstractNum w:abstractNumId="36" w15:restartNumberingAfterBreak="0">
+  <w:abstractNum w:abstractNumId="37" w15:restartNumberingAfterBreak="0">
     <w:nsid w:val="72380DDF"/>
     <w:multiLevelType w:val="multilevel"/>
     <w:tmpl w:val="B9CC6108"/>
@@ -15472,7 +16038,7 @@
       </w:rPr>
     </w:lvl>
   </w:abstractNum>
-  <w:abstractNum w:abstractNumId="37" w15:restartNumberingAfterBreak="0">
+  <w:abstractNum w:abstractNumId="38" w15:restartNumberingAfterBreak="0">
     <w:nsid w:val="73E15FBD"/>
     <w:multiLevelType w:val="multilevel"/>
     <w:tmpl w:val="481E18CC"/>
@@ -15617,7 +16183,7 @@
       </w:rPr>
     </w:lvl>
   </w:abstractNum>
-  <w:abstractNum w:abstractNumId="38" w15:restartNumberingAfterBreak="0">
+  <w:abstractNum w:abstractNumId="39" w15:restartNumberingAfterBreak="0">
     <w:nsid w:val="756F0061"/>
     <w:multiLevelType w:val="multilevel"/>
     <w:tmpl w:val="8092D744"/>
@@ -15766,7 +16332,7 @@
       </w:rPr>
     </w:lvl>
   </w:abstractNum>
-  <w:abstractNum w:abstractNumId="39" w15:restartNumberingAfterBreak="0">
+  <w:abstractNum w:abstractNumId="40" w15:restartNumberingAfterBreak="0">
     <w:nsid w:val="792F63CC"/>
     <w:multiLevelType w:val="multilevel"/>
     <w:tmpl w:val="8B8CE46C"/>
@@ -15915,7 +16481,7 @@
       </w:rPr>
     </w:lvl>
   </w:abstractNum>
-  <w:abstractNum w:abstractNumId="40" w15:restartNumberingAfterBreak="0">
+  <w:abstractNum w:abstractNumId="41" w15:restartNumberingAfterBreak="0">
     <w:nsid w:val="7D0448E6"/>
     <w:multiLevelType w:val="multilevel"/>
     <w:tmpl w:val="BD18E44C"/>
@@ -16065,31 +16631,31 @@
     </w:lvl>
   </w:abstractNum>
   <w:num w:numId="1" w16cid:durableId="340132085">
-    <w:abstractNumId w:val="14"/>
+    <w:abstractNumId w:val="15"/>
   </w:num>
   <w:num w:numId="2" w16cid:durableId="1890527785">
-    <w:abstractNumId w:val="4"/>
+    <w:abstractNumId w:val="5"/>
   </w:num>
   <w:num w:numId="3" w16cid:durableId="564411841">
-    <w:abstractNumId w:val="28"/>
+    <w:abstractNumId w:val="29"/>
   </w:num>
   <w:num w:numId="4" w16cid:durableId="495222279">
-    <w:abstractNumId w:val="13"/>
+    <w:abstractNumId w:val="14"/>
   </w:num>
   <w:num w:numId="5" w16cid:durableId="1905722608">
     <w:abstractNumId w:val="3"/>
   </w:num>
   <w:num w:numId="6" w16cid:durableId="2014138789">
-    <w:abstractNumId w:val="6"/>
+    <w:abstractNumId w:val="7"/>
   </w:num>
   <w:num w:numId="7" w16cid:durableId="1874030179">
-    <w:abstractNumId w:val="10"/>
+    <w:abstractNumId w:val="11"/>
   </w:num>
   <w:num w:numId="8" w16cid:durableId="1905289728">
-    <w:abstractNumId w:val="32"/>
+    <w:abstractNumId w:val="33"/>
   </w:num>
   <w:num w:numId="9" w16cid:durableId="903224478">
-    <w:abstractNumId w:val="33"/>
+    <w:abstractNumId w:val="34"/>
   </w:num>
   <w:num w:numId="10" w16cid:durableId="1389456004">
     <w:abstractNumId w:val="1"/>
@@ -16101,91 +16667,94 @@
     <w:abstractNumId w:val="0"/>
   </w:num>
   <w:num w:numId="13" w16cid:durableId="1358509900">
-    <w:abstractNumId w:val="11"/>
+    <w:abstractNumId w:val="12"/>
   </w:num>
   <w:num w:numId="14" w16cid:durableId="1263025117">
+    <w:abstractNumId w:val="21"/>
+  </w:num>
+  <w:num w:numId="15" w16cid:durableId="1706708101">
+    <w:abstractNumId w:val="36"/>
+  </w:num>
+  <w:num w:numId="16" w16cid:durableId="1900166956">
+    <w:abstractNumId w:val="27"/>
+  </w:num>
+  <w:num w:numId="17" w16cid:durableId="1088618782">
     <w:abstractNumId w:val="20"/>
   </w:num>
-  <w:num w:numId="15" w16cid:durableId="1706708101">
+  <w:num w:numId="18" w16cid:durableId="891696317">
     <w:abstractNumId w:val="35"/>
   </w:num>
-  <w:num w:numId="16" w16cid:durableId="1900166956">
+  <w:num w:numId="19" w16cid:durableId="1852720404">
+    <w:abstractNumId w:val="37"/>
+  </w:num>
+  <w:num w:numId="20" w16cid:durableId="2080328687">
+    <w:abstractNumId w:val="16"/>
+  </w:num>
+  <w:num w:numId="21" w16cid:durableId="2061400506">
+    <w:abstractNumId w:val="30"/>
+  </w:num>
+  <w:num w:numId="22" w16cid:durableId="322779506">
+    <w:abstractNumId w:val="13"/>
+  </w:num>
+  <w:num w:numId="23" w16cid:durableId="1742749278">
+    <w:abstractNumId w:val="28"/>
+  </w:num>
+  <w:num w:numId="24" w16cid:durableId="1272977281">
+    <w:abstractNumId w:val="8"/>
+  </w:num>
+  <w:num w:numId="25" w16cid:durableId="1997803170">
+    <w:abstractNumId w:val="23"/>
+  </w:num>
+  <w:num w:numId="26" w16cid:durableId="268512735">
+    <w:abstractNumId w:val="6"/>
+  </w:num>
+  <w:num w:numId="27" w16cid:durableId="638652703">
+    <w:abstractNumId w:val="18"/>
+  </w:num>
+  <w:num w:numId="28" w16cid:durableId="95559940">
+    <w:abstractNumId w:val="10"/>
+  </w:num>
+  <w:num w:numId="29" w16cid:durableId="1757095926">
+    <w:abstractNumId w:val="38"/>
+  </w:num>
+  <w:num w:numId="30" w16cid:durableId="1616064062">
+    <w:abstractNumId w:val="17"/>
+  </w:num>
+  <w:num w:numId="31" w16cid:durableId="351957631">
+    <w:abstractNumId w:val="25"/>
+  </w:num>
+  <w:num w:numId="32" w16cid:durableId="1445613649">
+    <w:abstractNumId w:val="32"/>
+  </w:num>
+  <w:num w:numId="33" w16cid:durableId="1602571387">
+    <w:abstractNumId w:val="40"/>
+  </w:num>
+  <w:num w:numId="34" w16cid:durableId="1750231285">
+    <w:abstractNumId w:val="41"/>
+  </w:num>
+  <w:num w:numId="35" w16cid:durableId="743337632">
+    <w:abstractNumId w:val="22"/>
+  </w:num>
+  <w:num w:numId="36" w16cid:durableId="2029598065">
+    <w:abstractNumId w:val="39"/>
+  </w:num>
+  <w:num w:numId="37" w16cid:durableId="2093895446">
+    <w:abstractNumId w:val="31"/>
+  </w:num>
+  <w:num w:numId="38" w16cid:durableId="554437177">
+    <w:abstractNumId w:val="24"/>
+  </w:num>
+  <w:num w:numId="39" w16cid:durableId="221916035">
     <w:abstractNumId w:val="26"/>
   </w:num>
-  <w:num w:numId="17" w16cid:durableId="1088618782">
+  <w:num w:numId="40" w16cid:durableId="1179465257">
+    <w:abstractNumId w:val="9"/>
+  </w:num>
+  <w:num w:numId="41" w16cid:durableId="614946474">
     <w:abstractNumId w:val="19"/>
   </w:num>
-  <w:num w:numId="18" w16cid:durableId="891696317">
-    <w:abstractNumId w:val="34"/>
-  </w:num>
-  <w:num w:numId="19" w16cid:durableId="1852720404">
-    <w:abstractNumId w:val="36"/>
-  </w:num>
-  <w:num w:numId="20" w16cid:durableId="2080328687">
-    <w:abstractNumId w:val="15"/>
-  </w:num>
-  <w:num w:numId="21" w16cid:durableId="2061400506">
-    <w:abstractNumId w:val="29"/>
-  </w:num>
-  <w:num w:numId="22" w16cid:durableId="322779506">
-    <w:abstractNumId w:val="12"/>
-  </w:num>
-  <w:num w:numId="23" w16cid:durableId="1742749278">
-    <w:abstractNumId w:val="27"/>
-  </w:num>
-  <w:num w:numId="24" w16cid:durableId="1272977281">
-    <w:abstractNumId w:val="7"/>
-  </w:num>
-  <w:num w:numId="25" w16cid:durableId="1997803170">
-    <w:abstractNumId w:val="22"/>
-  </w:num>
-  <w:num w:numId="26" w16cid:durableId="268512735">
-    <w:abstractNumId w:val="5"/>
-  </w:num>
-  <w:num w:numId="27" w16cid:durableId="638652703">
-    <w:abstractNumId w:val="17"/>
-  </w:num>
-  <w:num w:numId="28" w16cid:durableId="95559940">
-    <w:abstractNumId w:val="9"/>
-  </w:num>
-  <w:num w:numId="29" w16cid:durableId="1757095926">
-    <w:abstractNumId w:val="37"/>
-  </w:num>
-  <w:num w:numId="30" w16cid:durableId="1616064062">
-    <w:abstractNumId w:val="16"/>
-  </w:num>
-  <w:num w:numId="31" w16cid:durableId="351957631">
-    <w:abstractNumId w:val="24"/>
-  </w:num>
-  <w:num w:numId="32" w16cid:durableId="1445613649">
-    <w:abstractNumId w:val="31"/>
-  </w:num>
-  <w:num w:numId="33" w16cid:durableId="1602571387">
-    <w:abstractNumId w:val="39"/>
-  </w:num>
-  <w:num w:numId="34" w16cid:durableId="1750231285">
-    <w:abstractNumId w:val="40"/>
-  </w:num>
-  <w:num w:numId="35" w16cid:durableId="743337632">
-    <w:abstractNumId w:val="21"/>
-  </w:num>
-  <w:num w:numId="36" w16cid:durableId="2029598065">
-    <w:abstractNumId w:val="38"/>
-  </w:num>
-  <w:num w:numId="37" w16cid:durableId="2093895446">
-    <w:abstractNumId w:val="30"/>
-  </w:num>
-  <w:num w:numId="38" w16cid:durableId="554437177">
-    <w:abstractNumId w:val="23"/>
-  </w:num>
-  <w:num w:numId="39" w16cid:durableId="221916035">
-    <w:abstractNumId w:val="25"/>
-  </w:num>
-  <w:num w:numId="40" w16cid:durableId="1179465257">
-    <w:abstractNumId w:val="8"/>
-  </w:num>
-  <w:num w:numId="41" w16cid:durableId="614946474">
-    <w:abstractNumId w:val="18"/>
+  <w:num w:numId="42" w16cid:durableId="681054090">
+    <w:abstractNumId w:val="4"/>
   </w:num>
 </w:numbering>
 </file>

</xml_diff>